<commit_message>
add spring boot notes
</commit_message>
<xml_diff>
--- a/Docker.docx
+++ b/Docker.docx
@@ -315,9 +315,54 @@
           <w:szCs w:val="28"/>
           <w:u w:val="single"/>
         </w:rPr>
-        <w:t xml:space="preserve">Chapter </w:t>
-      </w:r>
-      <w:r>
+        <w:t>Chapter 2: Docker and container-related standards and projects:</w:t>
+      </w:r>
+    </w:p>
+    <w:p>
+      <w:pPr>
+        <w:rPr>
+          <w:color w:val="000000" w:themeColor="text1"/>
+          <w:sz w:val="22"/>
+          <w:szCs w:val="22"/>
+        </w:rPr>
+      </w:pPr>
+      <w:r>
+        <w:rPr>
+          <w:color w:val="000000" w:themeColor="text1"/>
+          <w:sz w:val="22"/>
+          <w:szCs w:val="22"/>
+        </w:rPr>
+        <w:t>The Docker platform is a neatly packaged collection of technologies for creating, managing, and orchestrating containers.</w:t>
+      </w:r>
+    </w:p>
+    <w:p>
+      <w:pPr>
+        <w:rPr>
+          <w:color w:val="000000" w:themeColor="text1"/>
+          <w:sz w:val="22"/>
+          <w:szCs w:val="22"/>
+        </w:rPr>
+      </w:pPr>
+      <w:r>
+        <w:rPr>
+          <w:color w:val="000000" w:themeColor="text1"/>
+          <w:sz w:val="22"/>
+          <w:szCs w:val="22"/>
+        </w:rPr>
+        <w:t>for the docker architecture looking from the high level we have the CLI and the Engine, the simple way to describe it is that we write commands in the CLI to manage containers and the engine gets an API call from the Cli over the network or in the same machine and then runs some daemon operations</w:t>
+      </w:r>
+    </w:p>
+    <w:p>
+      <w:pPr>
+        <w:rPr>
+          <w:color w:val="000000" w:themeColor="text1"/>
+          <w:sz w:val="22"/>
+          <w:szCs w:val="22"/>
+        </w:rPr>
+      </w:pPr>
+    </w:p>
+    <w:p>
+      <w:pPr>
         <w:rPr>
           <w:b/>
           <w:bCs/>
@@ -326,8 +371,7 @@
           <w:szCs w:val="28"/>
           <w:u w:val="single"/>
         </w:rPr>
-        <w:t>2: Docker and container-related standards and projects</w:t>
-      </w:r>
+      </w:pPr>
       <w:r>
         <w:rPr>
           <w:b/>
@@ -337,42 +381,89 @@
           <w:szCs w:val="28"/>
           <w:u w:val="single"/>
         </w:rPr>
-        <w:t>:</w:t>
-      </w:r>
-    </w:p>
-    <w:p>
-      <w:pPr>
-        <w:rPr>
-          <w:color w:val="000000" w:themeColor="text1"/>
-          <w:sz w:val="22"/>
-          <w:szCs w:val="22"/>
-        </w:rPr>
-      </w:pPr>
-      <w:r>
-        <w:rPr>
-          <w:color w:val="000000" w:themeColor="text1"/>
-          <w:sz w:val="22"/>
-          <w:szCs w:val="22"/>
-        </w:rPr>
-        <w:t>The Docker platform is a neatly packaged collection of technologies for creating, managing, and orchestrating containers.</w:t>
-      </w:r>
-    </w:p>
-    <w:p>
-      <w:pPr>
-        <w:rPr>
-          <w:color w:val="000000" w:themeColor="text1"/>
-          <w:sz w:val="22"/>
-          <w:szCs w:val="22"/>
-        </w:rPr>
-      </w:pPr>
-      <w:r>
-        <w:rPr>
-          <w:color w:val="000000" w:themeColor="text1"/>
-          <w:sz w:val="22"/>
-          <w:szCs w:val="22"/>
-        </w:rPr>
-        <w:t>for the docker architecture looking from the high level we have the CLI and the Engine, the simple way to describe it is that we write commands in the CLI to manage containers and the engine gets an API call from the Cli over the network or in the same machine and then runs some daemon operations</w:t>
-      </w:r>
+        <w:t>Chapter 3:</w:t>
+      </w:r>
+    </w:p>
+    <w:p>
+      <w:pPr>
+        <w:rPr>
+          <w:color w:val="000000" w:themeColor="text1"/>
+          <w:sz w:val="22"/>
+          <w:szCs w:val="22"/>
+        </w:rPr>
+      </w:pPr>
+      <w:r>
+        <w:rPr>
+          <w:color w:val="000000" w:themeColor="text1"/>
+          <w:sz w:val="22"/>
+          <w:szCs w:val="22"/>
+        </w:rPr>
+        <w:t xml:space="preserve">docker –version only returns the version while docker version returns the version and all the information known about the current version including the OS architecture which is by default </w:t>
+      </w:r>
+      <w:proofErr w:type="spellStart"/>
+      <w:r>
+        <w:rPr>
+          <w:color w:val="000000" w:themeColor="text1"/>
+          <w:sz w:val="22"/>
+          <w:szCs w:val="22"/>
+        </w:rPr>
+        <w:t>linux</w:t>
+      </w:r>
+      <w:proofErr w:type="spellEnd"/>
+      <w:r>
+        <w:rPr>
+          <w:color w:val="000000" w:themeColor="text1"/>
+          <w:sz w:val="22"/>
+          <w:szCs w:val="22"/>
+        </w:rPr>
+        <w:t xml:space="preserve"> since </w:t>
+      </w:r>
+      <w:proofErr w:type="gramStart"/>
+      <w:r>
+        <w:rPr>
+          <w:color w:val="000000" w:themeColor="text1"/>
+          <w:sz w:val="22"/>
+          <w:szCs w:val="22"/>
+        </w:rPr>
+        <w:t>its</w:t>
+      </w:r>
+      <w:proofErr w:type="gramEnd"/>
+      <w:r>
+        <w:rPr>
+          <w:color w:val="000000" w:themeColor="text1"/>
+          <w:sz w:val="22"/>
+          <w:szCs w:val="22"/>
+        </w:rPr>
+        <w:t xml:space="preserve"> always assumed that we are working with </w:t>
+      </w:r>
+      <w:proofErr w:type="spellStart"/>
+      <w:r>
+        <w:rPr>
+          <w:color w:val="000000" w:themeColor="text1"/>
+          <w:sz w:val="22"/>
+          <w:szCs w:val="22"/>
+        </w:rPr>
+        <w:t>linux</w:t>
+      </w:r>
+      <w:proofErr w:type="spellEnd"/>
+    </w:p>
+    <w:p>
+      <w:pPr>
+        <w:rPr>
+          <w:color w:val="000000" w:themeColor="text1"/>
+          <w:sz w:val="22"/>
+          <w:szCs w:val="22"/>
+        </w:rPr>
+      </w:pPr>
+    </w:p>
+    <w:p>
+      <w:pPr>
+        <w:rPr>
+          <w:color w:val="000000" w:themeColor="text1"/>
+          <w:sz w:val="22"/>
+          <w:szCs w:val="22"/>
+        </w:rPr>
+      </w:pPr>
     </w:p>
     <w:p>
       <w:pPr>
@@ -403,42 +494,256 @@
           <w:szCs w:val="28"/>
           <w:u w:val="single"/>
         </w:rPr>
-        <w:t>Chapter 3:</w:t>
-      </w:r>
-    </w:p>
-    <w:p>
-      <w:pPr>
-        <w:rPr>
-          <w:color w:val="000000" w:themeColor="text1"/>
-          <w:sz w:val="22"/>
-          <w:szCs w:val="22"/>
-        </w:rPr>
-      </w:pPr>
-      <w:r>
-        <w:rPr>
-          <w:color w:val="000000" w:themeColor="text1"/>
-          <w:sz w:val="22"/>
-          <w:szCs w:val="22"/>
-        </w:rPr>
-        <w:t xml:space="preserve">docker –version only returns the version while docker version returns the version and all the information known about the current version including the OS architecture which is by default </w:t>
+        <w:lastRenderedPageBreak/>
+        <w:t>Chapter 4: The big picture</w:t>
+      </w:r>
+    </w:p>
+    <w:p>
+      <w:pPr>
+        <w:rPr>
+          <w:color w:val="000000" w:themeColor="text1"/>
+          <w:sz w:val="22"/>
+          <w:szCs w:val="22"/>
+        </w:rPr>
+      </w:pPr>
+      <w:r>
+        <w:rPr>
+          <w:color w:val="000000" w:themeColor="text1"/>
+          <w:sz w:val="22"/>
+          <w:szCs w:val="22"/>
+        </w:rPr>
+        <w:t>we will split this into 2 sections the ops which handles containers and the dev focuses on building apps into images</w:t>
+      </w:r>
+    </w:p>
+    <w:p>
+      <w:pPr>
+        <w:rPr>
+          <w:b/>
+          <w:bCs/>
+          <w:color w:val="000000" w:themeColor="text1"/>
+          <w:sz w:val="22"/>
+          <w:szCs w:val="22"/>
+        </w:rPr>
+      </w:pPr>
+      <w:r>
+        <w:rPr>
+          <w:b/>
+          <w:bCs/>
+          <w:color w:val="000000" w:themeColor="text1"/>
+          <w:sz w:val="22"/>
+          <w:szCs w:val="22"/>
+        </w:rPr>
+        <w:t xml:space="preserve">The Ops </w:t>
       </w:r>
       <w:proofErr w:type="spellStart"/>
-      <w:r>
-        <w:rPr>
-          <w:color w:val="000000" w:themeColor="text1"/>
-          <w:sz w:val="22"/>
-          <w:szCs w:val="22"/>
-        </w:rPr>
-        <w:t>linux</w:t>
+      <w:proofErr w:type="gramStart"/>
+      <w:r>
+        <w:rPr>
+          <w:b/>
+          <w:bCs/>
+          <w:color w:val="000000" w:themeColor="text1"/>
+          <w:sz w:val="22"/>
+          <w:szCs w:val="22"/>
+        </w:rPr>
+        <w:t>Part:</w:t>
+      </w:r>
+      <w:r>
+        <w:rPr>
+          <w:color w:val="000000" w:themeColor="text1"/>
+          <w:sz w:val="22"/>
+          <w:szCs w:val="22"/>
+        </w:rPr>
+        <w:t>the</w:t>
       </w:r>
       <w:proofErr w:type="spellEnd"/>
-      <w:r>
-        <w:rPr>
-          <w:color w:val="000000" w:themeColor="text1"/>
-          <w:sz w:val="22"/>
-          <w:szCs w:val="22"/>
-        </w:rPr>
-        <w:t xml:space="preserve"> since </w:t>
+      <w:proofErr w:type="gramEnd"/>
+      <w:r>
+        <w:rPr>
+          <w:color w:val="000000" w:themeColor="text1"/>
+          <w:sz w:val="22"/>
+          <w:szCs w:val="22"/>
+        </w:rPr>
+        <w:t xml:space="preserve"> </w:t>
+      </w:r>
+      <w:proofErr w:type="spellStart"/>
+      <w:r>
+        <w:rPr>
+          <w:color w:val="000000" w:themeColor="text1"/>
+          <w:sz w:val="22"/>
+          <w:szCs w:val="22"/>
+        </w:rPr>
+        <w:t>opps</w:t>
+      </w:r>
+      <w:proofErr w:type="spellEnd"/>
+      <w:r>
+        <w:rPr>
+          <w:color w:val="000000" w:themeColor="text1"/>
+          <w:sz w:val="22"/>
+          <w:szCs w:val="22"/>
+        </w:rPr>
+        <w:t xml:space="preserve"> part handles these: download an image, run an image inside the container, delete a container, run commands inside the container, check docker container is working</w:t>
+      </w:r>
+    </w:p>
+    <w:p>
+      <w:pPr>
+        <w:rPr>
+          <w:color w:val="000000" w:themeColor="text1"/>
+          <w:sz w:val="22"/>
+          <w:szCs w:val="22"/>
+        </w:rPr>
+      </w:pPr>
+      <w:r>
+        <w:rPr>
+          <w:color w:val="000000" w:themeColor="text1"/>
+          <w:sz w:val="22"/>
+          <w:szCs w:val="22"/>
+        </w:rPr>
+        <w:t xml:space="preserve">running </w:t>
+      </w:r>
+      <w:r>
+        <w:rPr>
+          <w:color w:val="EE0000"/>
+          <w:sz w:val="22"/>
+          <w:szCs w:val="22"/>
+        </w:rPr>
+        <w:t xml:space="preserve">docker version </w:t>
+      </w:r>
+      <w:r>
+        <w:rPr>
+          <w:color w:val="000000" w:themeColor="text1"/>
+          <w:sz w:val="22"/>
+          <w:szCs w:val="22"/>
+        </w:rPr>
+        <w:t xml:space="preserve">we would normally get the client and the engine information since by default docker desktop installs them both on the local machine and configure them to talk to each other locally </w:t>
+      </w:r>
+    </w:p>
+    <w:p>
+      <w:pPr>
+        <w:rPr>
+          <w:b/>
+          <w:bCs/>
+          <w:color w:val="000000" w:themeColor="text1"/>
+          <w:sz w:val="22"/>
+          <w:szCs w:val="22"/>
+          <w:u w:val="single"/>
+        </w:rPr>
+      </w:pPr>
+      <w:r>
+        <w:rPr>
+          <w:b/>
+          <w:bCs/>
+          <w:color w:val="000000" w:themeColor="text1"/>
+          <w:sz w:val="22"/>
+          <w:szCs w:val="22"/>
+          <w:u w:val="single"/>
+        </w:rPr>
+        <w:t>Download an Image and what is an image:</w:t>
+      </w:r>
+    </w:p>
+    <w:p>
+      <w:pPr>
+        <w:rPr>
+          <w:color w:val="000000" w:themeColor="text1"/>
+          <w:sz w:val="22"/>
+          <w:szCs w:val="22"/>
+        </w:rPr>
+      </w:pPr>
+      <w:r>
+        <w:rPr>
+          <w:color w:val="000000" w:themeColor="text1"/>
+          <w:sz w:val="22"/>
+          <w:szCs w:val="22"/>
+        </w:rPr>
+        <w:t>A Docker image is a read-only template with layered filesystems. It contains:</w:t>
+      </w:r>
+      <w:r>
+        <w:rPr>
+          <w:color w:val="000000" w:themeColor="text1"/>
+          <w:sz w:val="22"/>
+          <w:szCs w:val="22"/>
+        </w:rPr>
+        <w:t xml:space="preserve"> </w:t>
+      </w:r>
+      <w:r>
+        <w:rPr>
+          <w:color w:val="000000" w:themeColor="text1"/>
+          <w:sz w:val="22"/>
+          <w:szCs w:val="22"/>
+        </w:rPr>
+        <w:t>A cut-down OS filesystem (e.g., Ubuntu, Alpine)</w:t>
+      </w:r>
+      <w:r>
+        <w:rPr>
+          <w:color w:val="000000" w:themeColor="text1"/>
+          <w:sz w:val="22"/>
+          <w:szCs w:val="22"/>
+        </w:rPr>
+        <w:t xml:space="preserve">, </w:t>
+      </w:r>
+      <w:r>
+        <w:rPr>
+          <w:color w:val="000000" w:themeColor="text1"/>
+          <w:sz w:val="22"/>
+          <w:szCs w:val="22"/>
+        </w:rPr>
+        <w:t>Your application code</w:t>
+      </w:r>
+      <w:r>
+        <w:rPr>
+          <w:color w:val="000000" w:themeColor="text1"/>
+          <w:sz w:val="22"/>
+          <w:szCs w:val="22"/>
+        </w:rPr>
+        <w:t xml:space="preserve">, </w:t>
+      </w:r>
+      <w:r>
+        <w:rPr>
+          <w:color w:val="000000" w:themeColor="text1"/>
+          <w:sz w:val="22"/>
+          <w:szCs w:val="22"/>
+        </w:rPr>
+        <w:t>Runtime, system tools, libraries, and dependencies</w:t>
+      </w:r>
+      <w:r>
+        <w:rPr>
+          <w:color w:val="000000" w:themeColor="text1"/>
+          <w:sz w:val="22"/>
+          <w:szCs w:val="22"/>
+        </w:rPr>
+        <w:t xml:space="preserve">, </w:t>
+      </w:r>
+      <w:r>
+        <w:rPr>
+          <w:color w:val="000000" w:themeColor="text1"/>
+          <w:sz w:val="22"/>
+          <w:szCs w:val="22"/>
+        </w:rPr>
+        <w:t>Environment variables &amp; default run commands</w:t>
+      </w:r>
+      <w:r>
+        <w:rPr>
+          <w:color w:val="000000" w:themeColor="text1"/>
+          <w:sz w:val="22"/>
+          <w:szCs w:val="22"/>
+        </w:rPr>
+        <w:t>.</w:t>
+      </w:r>
+    </w:p>
+    <w:p>
+      <w:pPr>
+        <w:rPr>
+          <w:color w:val="000000" w:themeColor="text1"/>
+          <w:sz w:val="22"/>
+          <w:szCs w:val="22"/>
+        </w:rPr>
+      </w:pPr>
+      <w:r>
+        <w:rPr>
+          <w:color w:val="000000" w:themeColor="text1"/>
+          <w:sz w:val="22"/>
+          <w:szCs w:val="22"/>
+        </w:rPr>
+        <w:t xml:space="preserve">an image is like a class in dev </w:t>
       </w:r>
       <w:proofErr w:type="gramStart"/>
       <w:r>
@@ -456,36 +761,632 @@
           <w:sz w:val="22"/>
           <w:szCs w:val="22"/>
         </w:rPr>
-        <w:t xml:space="preserve"> always assumed that we are working with </w:t>
+        <w:t xml:space="preserve"> just a blue print which can be used with multiple different instances, so each image can be passed different values and be ran into a new container</w:t>
+      </w:r>
+    </w:p>
+    <w:p>
+      <w:pPr>
+        <w:rPr>
+          <w:color w:val="000000" w:themeColor="text1"/>
+          <w:sz w:val="22"/>
+          <w:szCs w:val="22"/>
+        </w:rPr>
+      </w:pPr>
+      <w:r>
+        <w:rPr>
+          <w:color w:val="000000" w:themeColor="text1"/>
+          <w:sz w:val="22"/>
+          <w:szCs w:val="22"/>
+        </w:rPr>
+        <w:t xml:space="preserve">running </w:t>
+      </w:r>
+      <w:r>
+        <w:rPr>
+          <w:color w:val="EE0000"/>
+          <w:sz w:val="22"/>
+          <w:szCs w:val="22"/>
+        </w:rPr>
+        <w:t>docker images</w:t>
+      </w:r>
+      <w:r>
+        <w:rPr>
+          <w:color w:val="EE0000"/>
+          <w:sz w:val="22"/>
+          <w:szCs w:val="22"/>
+        </w:rPr>
+        <w:t xml:space="preserve"> </w:t>
+      </w:r>
+      <w:r>
+        <w:rPr>
+          <w:color w:val="000000" w:themeColor="text1"/>
+          <w:sz w:val="22"/>
+          <w:szCs w:val="22"/>
+        </w:rPr>
+        <w:t>returns the names, image id and size of all images that we currently have on docker</w:t>
+      </w:r>
+    </w:p>
+    <w:p>
+      <w:pPr>
+        <w:rPr>
+          <w:color w:val="000000" w:themeColor="text1"/>
+          <w:sz w:val="22"/>
+          <w:szCs w:val="22"/>
+        </w:rPr>
+      </w:pPr>
+      <w:r>
+        <w:rPr>
+          <w:color w:val="EE0000"/>
+          <w:sz w:val="22"/>
+          <w:szCs w:val="22"/>
+        </w:rPr>
+        <w:t xml:space="preserve">docker pull </w:t>
       </w:r>
       <w:proofErr w:type="spellStart"/>
       <w:r>
         <w:rPr>
-          <w:color w:val="000000" w:themeColor="text1"/>
-          <w:sz w:val="22"/>
-          <w:szCs w:val="22"/>
-        </w:rPr>
-        <w:t>linux</w:t>
+          <w:color w:val="EE0000"/>
+          <w:sz w:val="22"/>
+          <w:szCs w:val="22"/>
+        </w:rPr>
+        <w:t>image_</w:t>
+      </w:r>
+      <w:proofErr w:type="gramStart"/>
+      <w:r>
+        <w:rPr>
+          <w:color w:val="EE0000"/>
+          <w:sz w:val="22"/>
+          <w:szCs w:val="22"/>
+        </w:rPr>
+        <w:t>name</w:t>
       </w:r>
       <w:proofErr w:type="spellEnd"/>
-    </w:p>
-    <w:p>
-      <w:pPr>
-        <w:rPr>
-          <w:color w:val="000000" w:themeColor="text1"/>
-          <w:sz w:val="22"/>
-          <w:szCs w:val="22"/>
-        </w:rPr>
-      </w:pPr>
-    </w:p>
-    <w:p>
-      <w:pPr>
-        <w:rPr>
-          <w:color w:val="000000" w:themeColor="text1"/>
-          <w:sz w:val="22"/>
-          <w:szCs w:val="22"/>
-        </w:rPr>
-      </w:pPr>
+      <w:r>
+        <w:rPr>
+          <w:color w:val="EE0000"/>
+          <w:sz w:val="22"/>
+          <w:szCs w:val="22"/>
+        </w:rPr>
+        <w:t xml:space="preserve"> :</w:t>
+      </w:r>
+      <w:proofErr w:type="spellStart"/>
+      <w:r>
+        <w:rPr>
+          <w:color w:val="EE0000"/>
+          <w:sz w:val="22"/>
+          <w:szCs w:val="22"/>
+        </w:rPr>
+        <w:t>image</w:t>
+      </w:r>
+      <w:proofErr w:type="gramEnd"/>
+      <w:r>
+        <w:rPr>
+          <w:color w:val="EE0000"/>
+          <w:sz w:val="22"/>
+          <w:szCs w:val="22"/>
+        </w:rPr>
+        <w:t>_version</w:t>
+      </w:r>
+      <w:proofErr w:type="spellEnd"/>
+      <w:r>
+        <w:rPr>
+          <w:color w:val="000000" w:themeColor="text1"/>
+          <w:sz w:val="22"/>
+          <w:szCs w:val="22"/>
+        </w:rPr>
+        <w:t xml:space="preserve"> </w:t>
+      </w:r>
+      <w:r>
+        <w:rPr>
+          <w:color w:val="000000" w:themeColor="text1"/>
+          <w:sz w:val="22"/>
+          <w:szCs w:val="22"/>
+        </w:rPr>
+        <w:sym w:font="Wingdings" w:char="F0E0"/>
+      </w:r>
+      <w:r>
+        <w:rPr>
+          <w:color w:val="000000" w:themeColor="text1"/>
+          <w:sz w:val="22"/>
+          <w:szCs w:val="22"/>
+        </w:rPr>
+        <w:t xml:space="preserve"> this copies a new image into our docker so we can use it </w:t>
+      </w:r>
+      <w:r>
+        <w:rPr>
+          <w:color w:val="000000" w:themeColor="text1"/>
+          <w:sz w:val="22"/>
+          <w:szCs w:val="22"/>
+        </w:rPr>
+        <w:t xml:space="preserve">no spaces between the image name and its version </w:t>
+      </w:r>
+    </w:p>
+    <w:p>
+      <w:pPr>
+        <w:rPr>
+          <w:color w:val="000000" w:themeColor="text1"/>
+          <w:sz w:val="22"/>
+          <w:szCs w:val="22"/>
+        </w:rPr>
+      </w:pPr>
+      <w:r>
+        <w:rPr>
+          <w:color w:val="000000" w:themeColor="text1"/>
+          <w:sz w:val="22"/>
+          <w:szCs w:val="22"/>
+        </w:rPr>
+        <w:t xml:space="preserve">you can use the </w:t>
+      </w:r>
+      <w:r>
+        <w:rPr>
+          <w:color w:val="EE0000"/>
+          <w:sz w:val="22"/>
+          <w:szCs w:val="22"/>
+        </w:rPr>
+        <w:t>docker run</w:t>
+      </w:r>
+      <w:r>
+        <w:rPr>
+          <w:color w:val="EE0000"/>
+          <w:sz w:val="22"/>
+          <w:szCs w:val="22"/>
+        </w:rPr>
+        <w:t xml:space="preserve"> </w:t>
+      </w:r>
+      <w:proofErr w:type="spellStart"/>
+      <w:r>
+        <w:rPr>
+          <w:color w:val="EE0000"/>
+          <w:sz w:val="22"/>
+          <w:szCs w:val="22"/>
+        </w:rPr>
+        <w:t>image_name</w:t>
+      </w:r>
+      <w:proofErr w:type="spellEnd"/>
+      <w:r>
+        <w:rPr>
+          <w:color w:val="000000" w:themeColor="text1"/>
+          <w:sz w:val="22"/>
+          <w:szCs w:val="22"/>
+        </w:rPr>
+        <w:t xml:space="preserve"> command to start a container from</w:t>
+      </w:r>
+      <w:r>
+        <w:rPr>
+          <w:color w:val="000000" w:themeColor="text1"/>
+          <w:sz w:val="22"/>
+          <w:szCs w:val="22"/>
+        </w:rPr>
+        <w:t xml:space="preserve"> one of our installed images</w:t>
+      </w:r>
+    </w:p>
+    <w:p>
+      <w:pPr>
+        <w:rPr>
+          <w:color w:val="000000" w:themeColor="text1"/>
+          <w:sz w:val="22"/>
+          <w:szCs w:val="22"/>
+        </w:rPr>
+      </w:pPr>
+      <w:r>
+        <w:rPr>
+          <w:color w:val="EE0000"/>
+          <w:sz w:val="22"/>
+          <w:szCs w:val="22"/>
+        </w:rPr>
+        <w:t>docker run--name</w:t>
+      </w:r>
+      <w:r>
+        <w:rPr>
+          <w:color w:val="000000" w:themeColor="text1"/>
+          <w:sz w:val="22"/>
+          <w:szCs w:val="22"/>
+        </w:rPr>
+        <w:t xml:space="preserve"> test</w:t>
+      </w:r>
+      <w:r>
+        <w:rPr>
+          <w:color w:val="000000" w:themeColor="text1"/>
+          <w:sz w:val="22"/>
+          <w:szCs w:val="22"/>
+        </w:rPr>
+        <w:t xml:space="preserve"> </w:t>
+      </w:r>
+      <w:r>
+        <w:rPr>
+          <w:color w:val="000000" w:themeColor="text1"/>
+          <w:sz w:val="22"/>
+          <w:szCs w:val="22"/>
+        </w:rPr>
+        <w:sym w:font="Wingdings" w:char="F0E0"/>
+      </w:r>
+      <w:r>
+        <w:rPr>
+          <w:color w:val="000000" w:themeColor="text1"/>
+          <w:sz w:val="22"/>
+          <w:szCs w:val="22"/>
+        </w:rPr>
+        <w:t xml:space="preserve"> the – - name is to give the container a name that we choose</w:t>
+      </w:r>
+    </w:p>
+    <w:p>
+      <w:pPr>
+        <w:rPr>
+          <w:color w:val="000000" w:themeColor="text1"/>
+          <w:sz w:val="22"/>
+          <w:szCs w:val="22"/>
+        </w:rPr>
+      </w:pPr>
+      <w:r>
+        <w:rPr>
+          <w:color w:val="EE0000"/>
+          <w:sz w:val="22"/>
+          <w:szCs w:val="22"/>
+        </w:rPr>
+        <w:t xml:space="preserve">docker run -it </w:t>
+      </w:r>
+      <w:proofErr w:type="spellStart"/>
+      <w:proofErr w:type="gramStart"/>
+      <w:r>
+        <w:rPr>
+          <w:color w:val="EE0000"/>
+          <w:sz w:val="22"/>
+          <w:szCs w:val="22"/>
+        </w:rPr>
+        <w:t>ubuntu:latest</w:t>
+      </w:r>
+      <w:proofErr w:type="spellEnd"/>
+      <w:proofErr w:type="gramEnd"/>
+      <w:r>
+        <w:rPr>
+          <w:color w:val="EE0000"/>
+          <w:sz w:val="22"/>
+          <w:szCs w:val="22"/>
+        </w:rPr>
+        <w:t xml:space="preserve"> bash</w:t>
+      </w:r>
+      <w:r>
+        <w:rPr>
+          <w:color w:val="000000" w:themeColor="text1"/>
+          <w:sz w:val="22"/>
+          <w:szCs w:val="22"/>
+        </w:rPr>
+        <w:t xml:space="preserve">   -</w:t>
+      </w:r>
+      <w:r>
+        <w:rPr>
+          <w:color w:val="000000" w:themeColor="text1"/>
+          <w:sz w:val="22"/>
+          <w:szCs w:val="22"/>
+        </w:rPr>
+        <w:sym w:font="Wingdings" w:char="F0E0"/>
+      </w:r>
+      <w:r>
+        <w:rPr>
+          <w:color w:val="000000" w:themeColor="text1"/>
+          <w:sz w:val="22"/>
+          <w:szCs w:val="22"/>
+        </w:rPr>
+        <w:t xml:space="preserve"> -it is to run it in interactive mode bash is to be able to write bash</w:t>
+      </w:r>
+    </w:p>
+    <w:p>
+      <w:pPr>
+        <w:rPr>
+          <w:color w:val="000000" w:themeColor="text1"/>
+          <w:sz w:val="22"/>
+          <w:szCs w:val="22"/>
+        </w:rPr>
+      </w:pPr>
+      <w:r>
+        <w:rPr>
+          <w:color w:val="EE0000"/>
+          <w:sz w:val="22"/>
+          <w:szCs w:val="22"/>
+        </w:rPr>
+        <w:t xml:space="preserve">docker </w:t>
+      </w:r>
+      <w:proofErr w:type="spellStart"/>
+      <w:r>
+        <w:rPr>
+          <w:color w:val="EE0000"/>
+          <w:sz w:val="22"/>
+          <w:szCs w:val="22"/>
+        </w:rPr>
+        <w:t>ps</w:t>
+      </w:r>
+      <w:proofErr w:type="spellEnd"/>
+      <w:r>
+        <w:rPr>
+          <w:color w:val="000000" w:themeColor="text1"/>
+          <w:sz w:val="22"/>
+          <w:szCs w:val="22"/>
+        </w:rPr>
+        <w:t xml:space="preserve">  </w:t>
+      </w:r>
+      <w:r>
+        <w:rPr>
+          <w:color w:val="000000" w:themeColor="text1"/>
+          <w:sz w:val="22"/>
+          <w:szCs w:val="22"/>
+        </w:rPr>
+        <w:sym w:font="Wingdings" w:char="F0E0"/>
+      </w:r>
+      <w:r>
+        <w:rPr>
+          <w:color w:val="000000" w:themeColor="text1"/>
+          <w:sz w:val="22"/>
+          <w:szCs w:val="22"/>
+        </w:rPr>
+        <w:t xml:space="preserve"> command to check for what containers are up and running </w:t>
+      </w:r>
+    </w:p>
+    <w:p>
+      <w:pPr>
+        <w:rPr>
+          <w:color w:val="000000" w:themeColor="text1"/>
+          <w:sz w:val="22"/>
+          <w:szCs w:val="22"/>
+        </w:rPr>
+      </w:pPr>
+      <w:r>
+        <w:rPr>
+          <w:color w:val="EE0000"/>
+          <w:sz w:val="22"/>
+          <w:szCs w:val="22"/>
+        </w:rPr>
+        <w:t xml:space="preserve">docker start </w:t>
+      </w:r>
+      <w:proofErr w:type="spellStart"/>
+      <w:r>
+        <w:rPr>
+          <w:color w:val="EE0000"/>
+          <w:sz w:val="22"/>
+          <w:szCs w:val="22"/>
+        </w:rPr>
+        <w:t>container_name</w:t>
+      </w:r>
+      <w:proofErr w:type="spellEnd"/>
+      <w:r>
+        <w:rPr>
+          <w:color w:val="EE0000"/>
+          <w:sz w:val="22"/>
+          <w:szCs w:val="22"/>
+        </w:rPr>
+        <w:t xml:space="preserve"> </w:t>
+      </w:r>
+      <w:r>
+        <w:rPr>
+          <w:color w:val="000000" w:themeColor="text1"/>
+          <w:sz w:val="22"/>
+          <w:szCs w:val="22"/>
+        </w:rPr>
+        <w:t>---</w:t>
+      </w:r>
+      <w:r>
+        <w:rPr>
+          <w:color w:val="000000" w:themeColor="text1"/>
+          <w:sz w:val="22"/>
+          <w:szCs w:val="22"/>
+        </w:rPr>
+        <w:sym w:font="Wingdings" w:char="F0E0"/>
+      </w:r>
+      <w:r>
+        <w:rPr>
+          <w:color w:val="000000" w:themeColor="text1"/>
+          <w:sz w:val="22"/>
+          <w:szCs w:val="22"/>
+        </w:rPr>
+        <w:t xml:space="preserve"> to start a docker container that is not working but was created </w:t>
+      </w:r>
+    </w:p>
+    <w:p>
+      <w:pPr>
+        <w:rPr>
+          <w:color w:val="000000" w:themeColor="text1"/>
+          <w:sz w:val="22"/>
+          <w:szCs w:val="22"/>
+        </w:rPr>
+      </w:pPr>
+      <w:r>
+        <w:rPr>
+          <w:color w:val="EE0000"/>
+          <w:sz w:val="22"/>
+          <w:szCs w:val="22"/>
+        </w:rPr>
+        <w:t>docker attach</w:t>
+      </w:r>
+      <w:r>
+        <w:rPr>
+          <w:color w:val="EE0000"/>
+          <w:sz w:val="22"/>
+          <w:szCs w:val="22"/>
+        </w:rPr>
+        <w:t xml:space="preserve"> </w:t>
+      </w:r>
+      <w:proofErr w:type="spellStart"/>
+      <w:r>
+        <w:rPr>
+          <w:color w:val="EE0000"/>
+          <w:sz w:val="22"/>
+          <w:szCs w:val="22"/>
+        </w:rPr>
+        <w:t>container_name</w:t>
+      </w:r>
+      <w:proofErr w:type="spellEnd"/>
+      <w:r>
+        <w:rPr>
+          <w:color w:val="000000" w:themeColor="text1"/>
+          <w:sz w:val="22"/>
+          <w:szCs w:val="22"/>
+        </w:rPr>
+        <w:t xml:space="preserve"> </w:t>
+      </w:r>
+      <w:r>
+        <w:rPr>
+          <w:color w:val="000000" w:themeColor="text1"/>
+          <w:sz w:val="22"/>
+          <w:szCs w:val="22"/>
+        </w:rPr>
+        <w:sym w:font="Wingdings" w:char="F0E0"/>
+      </w:r>
+      <w:r>
+        <w:rPr>
+          <w:color w:val="000000" w:themeColor="text1"/>
+          <w:sz w:val="22"/>
+          <w:szCs w:val="22"/>
+        </w:rPr>
+        <w:t xml:space="preserve"> this runs the container not in the background we can see the logs and what the container is doing, but we cannot see the logs</w:t>
+      </w:r>
+      <w:r>
+        <w:rPr>
+          <w:color w:val="000000" w:themeColor="text1"/>
+          <w:sz w:val="22"/>
+          <w:szCs w:val="22"/>
+        </w:rPr>
+        <w:t xml:space="preserve"> that happened before the container is attached.</w:t>
+      </w:r>
+    </w:p>
+    <w:p>
+      <w:pPr>
+        <w:rPr>
+          <w:color w:val="000000" w:themeColor="text1"/>
+          <w:sz w:val="22"/>
+          <w:szCs w:val="22"/>
+        </w:rPr>
+      </w:pPr>
+      <w:r>
+        <w:rPr>
+          <w:color w:val="EE0000"/>
+          <w:sz w:val="22"/>
+          <w:szCs w:val="22"/>
+        </w:rPr>
+        <w:t>docker stop</w:t>
+      </w:r>
+      <w:r>
+        <w:rPr>
+          <w:color w:val="000000" w:themeColor="text1"/>
+          <w:sz w:val="22"/>
+          <w:szCs w:val="22"/>
+        </w:rPr>
+        <w:t xml:space="preserve"> </w:t>
+      </w:r>
+      <w:r>
+        <w:rPr>
+          <w:color w:val="000000" w:themeColor="text1"/>
+          <w:sz w:val="22"/>
+          <w:szCs w:val="22"/>
+        </w:rPr>
+        <w:sym w:font="Wingdings" w:char="F0E0"/>
+      </w:r>
+      <w:r>
+        <w:rPr>
+          <w:color w:val="000000" w:themeColor="text1"/>
+          <w:sz w:val="22"/>
+          <w:szCs w:val="22"/>
+        </w:rPr>
+        <w:t xml:space="preserve"> to stop a running container and </w:t>
+      </w:r>
+      <w:r>
+        <w:rPr>
+          <w:color w:val="EE0000"/>
+          <w:sz w:val="22"/>
+          <w:szCs w:val="22"/>
+        </w:rPr>
+        <w:t>docker rm</w:t>
+      </w:r>
+      <w:r>
+        <w:rPr>
+          <w:color w:val="000000" w:themeColor="text1"/>
+          <w:sz w:val="22"/>
+          <w:szCs w:val="22"/>
+        </w:rPr>
+        <w:t xml:space="preserve"> to remove the container</w:t>
+      </w:r>
+    </w:p>
+    <w:p>
+      <w:pPr>
+        <w:rPr>
+          <w:color w:val="000000" w:themeColor="text1"/>
+          <w:sz w:val="22"/>
+          <w:szCs w:val="22"/>
+        </w:rPr>
+      </w:pPr>
+      <w:r>
+        <w:rPr>
+          <w:color w:val="EE0000"/>
+          <w:sz w:val="22"/>
+          <w:szCs w:val="22"/>
+        </w:rPr>
+        <w:t xml:space="preserve">docker </w:t>
+      </w:r>
+      <w:proofErr w:type="spellStart"/>
+      <w:r>
+        <w:rPr>
+          <w:color w:val="EE0000"/>
+          <w:sz w:val="22"/>
+          <w:szCs w:val="22"/>
+        </w:rPr>
+        <w:t>ps</w:t>
+      </w:r>
+      <w:proofErr w:type="spellEnd"/>
+      <w:r>
+        <w:rPr>
+          <w:color w:val="EE0000"/>
+          <w:sz w:val="22"/>
+          <w:szCs w:val="22"/>
+        </w:rPr>
+        <w:t xml:space="preserve"> -a</w:t>
+      </w:r>
+      <w:r>
+        <w:rPr>
+          <w:color w:val="000000" w:themeColor="text1"/>
+          <w:sz w:val="22"/>
+          <w:szCs w:val="22"/>
+        </w:rPr>
+        <w:t xml:space="preserve"> </w:t>
+      </w:r>
+      <w:r>
+        <w:rPr>
+          <w:color w:val="000000" w:themeColor="text1"/>
+          <w:sz w:val="22"/>
+          <w:szCs w:val="22"/>
+        </w:rPr>
+        <w:sym w:font="Wingdings" w:char="F0E0"/>
+      </w:r>
+      <w:r>
+        <w:rPr>
+          <w:color w:val="000000" w:themeColor="text1"/>
+          <w:sz w:val="22"/>
+          <w:szCs w:val="22"/>
+        </w:rPr>
+        <w:t xml:space="preserve"> lists all the containers that are running and paused. it does not list any deleted containers </w:t>
+      </w:r>
+      <w:r>
+        <w:rPr>
+          <w:color w:val="EE0000"/>
+          <w:sz w:val="22"/>
+          <w:szCs w:val="22"/>
+        </w:rPr>
+        <w:t xml:space="preserve">docker </w:t>
+      </w:r>
+      <w:proofErr w:type="spellStart"/>
+      <w:r>
+        <w:rPr>
+          <w:color w:val="EE0000"/>
+          <w:sz w:val="22"/>
+          <w:szCs w:val="22"/>
+        </w:rPr>
+        <w:t>ps</w:t>
+      </w:r>
+      <w:proofErr w:type="spellEnd"/>
+      <w:r>
+        <w:rPr>
+          <w:color w:val="000000" w:themeColor="text1"/>
+          <w:sz w:val="22"/>
+          <w:szCs w:val="22"/>
+        </w:rPr>
+        <w:t xml:space="preserve"> only lists running containers</w:t>
+      </w:r>
     </w:p>
     <w:p>
       <w:pPr>
@@ -516,7 +1417,6 @@
           <w:szCs w:val="28"/>
           <w:u w:val="single"/>
         </w:rPr>
-        <w:lastRenderedPageBreak/>
         <w:t xml:space="preserve">Chapter </w:t>
       </w:r>
       <w:r>
@@ -528,25 +1428,61 @@
           <w:szCs w:val="28"/>
           <w:u w:val="single"/>
         </w:rPr>
-        <w:t>4: The big picture</w:t>
-      </w:r>
-    </w:p>
-    <w:p>
-      <w:pPr>
-        <w:rPr>
-          <w:color w:val="000000" w:themeColor="text1"/>
-          <w:sz w:val="22"/>
-          <w:szCs w:val="22"/>
-        </w:rPr>
-      </w:pPr>
-      <w:r>
-        <w:rPr>
-          <w:color w:val="000000" w:themeColor="text1"/>
-          <w:sz w:val="22"/>
-          <w:szCs w:val="22"/>
-        </w:rPr>
-        <w:t>we will split this into 2 sections the ops which handles containers and the dev focuses on building apps into images</w:t>
-      </w:r>
+        <w:t>5: The Docker Engine</w:t>
+      </w:r>
+    </w:p>
+    <w:p>
+      <w:pPr>
+        <w:rPr>
+          <w:color w:val="000000" w:themeColor="text1"/>
+          <w:sz w:val="22"/>
+          <w:szCs w:val="22"/>
+        </w:rPr>
+      </w:pPr>
+    </w:p>
+    <w:p>
+      <w:pPr>
+        <w:rPr>
+          <w:color w:val="000000" w:themeColor="text1"/>
+          <w:sz w:val="22"/>
+          <w:szCs w:val="22"/>
+        </w:rPr>
+      </w:pPr>
+      <w:r>
+        <w:rPr>
+          <w:color w:val="000000" w:themeColor="text1"/>
+          <w:sz w:val="22"/>
+          <w:szCs w:val="22"/>
+        </w:rPr>
+        <w:t xml:space="preserve">at the beginning docker was monolithic where everything was built on the top of a </w:t>
+      </w:r>
+      <w:proofErr w:type="spellStart"/>
+      <w:r>
+        <w:rPr>
+          <w:color w:val="000000" w:themeColor="text1"/>
+          <w:sz w:val="22"/>
+          <w:szCs w:val="22"/>
+        </w:rPr>
+        <w:t>monolothical</w:t>
+      </w:r>
+      <w:proofErr w:type="spellEnd"/>
+      <w:r>
+        <w:rPr>
+          <w:color w:val="000000" w:themeColor="text1"/>
+          <w:sz w:val="22"/>
+          <w:szCs w:val="22"/>
+        </w:rPr>
+        <w:t xml:space="preserve"> daemon of docker, from building images to volumes. but having a monolithic platform makes it harder to continue to develop it and much slower. this came from depending on LXC </w:t>
+      </w:r>
+    </w:p>
+    <w:p>
+      <w:pPr>
+        <w:rPr>
+          <w:color w:val="000000" w:themeColor="text1"/>
+          <w:sz w:val="22"/>
+          <w:szCs w:val="22"/>
+        </w:rPr>
+      </w:pPr>
     </w:p>
     <w:p>
       <w:pPr>
@@ -554,8 +1490,9 @@
           <w:b/>
           <w:bCs/>
           <w:color w:val="000000" w:themeColor="text1"/>
-          <w:sz w:val="22"/>
-          <w:szCs w:val="22"/>
+          <w:sz w:val="28"/>
+          <w:szCs w:val="28"/>
+          <w:u w:val="single"/>
         </w:rPr>
       </w:pPr>
       <w:r>
@@ -563,130 +1500,57 @@
           <w:b/>
           <w:bCs/>
           <w:color w:val="000000" w:themeColor="text1"/>
-          <w:sz w:val="22"/>
-          <w:szCs w:val="22"/>
-        </w:rPr>
-        <w:t>The Ops Part:</w:t>
-      </w:r>
-    </w:p>
-    <w:p>
-      <w:pPr>
-        <w:rPr>
-          <w:color w:val="000000" w:themeColor="text1"/>
-          <w:sz w:val="22"/>
-          <w:szCs w:val="22"/>
-        </w:rPr>
-      </w:pPr>
-      <w:r>
-        <w:rPr>
-          <w:color w:val="000000" w:themeColor="text1"/>
-          <w:sz w:val="22"/>
-          <w:szCs w:val="22"/>
-        </w:rPr>
-        <w:t xml:space="preserve">the </w:t>
-      </w:r>
-      <w:proofErr w:type="spellStart"/>
-      <w:r>
-        <w:rPr>
-          <w:color w:val="000000" w:themeColor="text1"/>
-          <w:sz w:val="22"/>
-          <w:szCs w:val="22"/>
-        </w:rPr>
-        <w:t>opps</w:t>
-      </w:r>
-      <w:proofErr w:type="spellEnd"/>
-      <w:r>
-        <w:rPr>
-          <w:color w:val="000000" w:themeColor="text1"/>
-          <w:sz w:val="22"/>
-          <w:szCs w:val="22"/>
-        </w:rPr>
-        <w:t xml:space="preserve"> part handles these: download an image, run an image inside the container, delete a container, run commands inside the container, check docker container is working</w:t>
-      </w:r>
-    </w:p>
-    <w:p>
-      <w:pPr>
-        <w:rPr>
-          <w:color w:val="000000" w:themeColor="text1"/>
-          <w:sz w:val="22"/>
-          <w:szCs w:val="22"/>
-        </w:rPr>
-      </w:pPr>
-      <w:r>
-        <w:rPr>
-          <w:color w:val="000000" w:themeColor="text1"/>
-          <w:sz w:val="22"/>
-          <w:szCs w:val="22"/>
-        </w:rPr>
-        <w:t xml:space="preserve">running </w:t>
-      </w:r>
-      <w:r>
-        <w:rPr>
-          <w:color w:val="EE0000"/>
-          <w:sz w:val="22"/>
-          <w:szCs w:val="22"/>
-        </w:rPr>
-        <w:t xml:space="preserve">docker version </w:t>
-      </w:r>
-      <w:r>
-        <w:rPr>
-          <w:color w:val="000000" w:themeColor="text1"/>
-          <w:sz w:val="22"/>
-          <w:szCs w:val="22"/>
-        </w:rPr>
-        <w:t xml:space="preserve">we would normally get the client and the engine information since by default docker desktop installs them both on the local machine and configure them to talk to each other locally </w:t>
-      </w:r>
-    </w:p>
-    <w:p>
-      <w:pPr>
-        <w:rPr>
-          <w:color w:val="000000" w:themeColor="text1"/>
-          <w:sz w:val="22"/>
-          <w:szCs w:val="22"/>
-        </w:rPr>
-      </w:pPr>
-    </w:p>
-    <w:p>
-      <w:pPr>
+          <w:sz w:val="28"/>
+          <w:szCs w:val="28"/>
+          <w:u w:val="single"/>
+        </w:rPr>
+        <w:t>6: Working with Images</w:t>
+      </w:r>
+      <w:r>
         <w:rPr>
           <w:b/>
           <w:bCs/>
           <w:color w:val="000000" w:themeColor="text1"/>
-          <w:sz w:val="22"/>
-          <w:szCs w:val="22"/>
+          <w:sz w:val="28"/>
+          <w:szCs w:val="28"/>
           <w:u w:val="single"/>
         </w:rPr>
-      </w:pPr>
-      <w:r>
+        <w:t>:</w:t>
+      </w:r>
+    </w:p>
+    <w:p>
+      <w:pPr>
         <w:rPr>
           <w:b/>
           <w:bCs/>
           <w:color w:val="000000" w:themeColor="text1"/>
           <w:sz w:val="22"/>
           <w:szCs w:val="22"/>
-          <w:u w:val="single"/>
-        </w:rPr>
-        <w:t>Download an Image and what is an image:</w:t>
-      </w:r>
-    </w:p>
-    <w:p>
-      <w:pPr>
-        <w:rPr>
-          <w:color w:val="000000" w:themeColor="text1"/>
-          <w:sz w:val="22"/>
-          <w:szCs w:val="22"/>
-        </w:rPr>
-      </w:pPr>
-      <w:r>
-        <w:rPr>
-          <w:color w:val="000000" w:themeColor="text1"/>
-          <w:sz w:val="22"/>
-          <w:szCs w:val="22"/>
-        </w:rPr>
-        <w:t>A Docker image is a read-only template with layered filesystems. It contains:</w:t>
-      </w:r>
-      <w:r>
-        <w:rPr>
+        </w:rPr>
+      </w:pPr>
+    </w:p>
+    <w:p>
+      <w:pPr>
+        <w:rPr>
+          <w:color w:val="000000" w:themeColor="text1"/>
+          <w:sz w:val="22"/>
+          <w:szCs w:val="22"/>
+        </w:rPr>
+      </w:pPr>
+      <w:r>
+        <w:rPr>
+          <w:b/>
+          <w:bCs/>
+          <w:color w:val="000000" w:themeColor="text1"/>
+          <w:sz w:val="22"/>
+          <w:szCs w:val="22"/>
+        </w:rPr>
+        <w:t>image TLDR:</w:t>
+      </w:r>
+      <w:r>
+        <w:rPr>
+          <w:b/>
+          <w:bCs/>
           <w:color w:val="000000" w:themeColor="text1"/>
           <w:sz w:val="22"/>
           <w:szCs w:val="22"/>
@@ -699,80 +1563,234 @@
           <w:sz w:val="22"/>
           <w:szCs w:val="22"/>
         </w:rPr>
-        <w:t>A cut-down OS filesystem (e.g., Ubuntu, Alpine)</w:t>
-      </w:r>
-      <w:r>
-        <w:rPr>
-          <w:color w:val="000000" w:themeColor="text1"/>
-          <w:sz w:val="22"/>
-          <w:szCs w:val="22"/>
-        </w:rPr>
-        <w:t xml:space="preserve">, </w:t>
-      </w:r>
-      <w:r>
-        <w:rPr>
-          <w:color w:val="000000" w:themeColor="text1"/>
-          <w:sz w:val="22"/>
-          <w:szCs w:val="22"/>
-        </w:rPr>
-        <w:t>Your application code</w:t>
-      </w:r>
-      <w:r>
-        <w:rPr>
-          <w:color w:val="000000" w:themeColor="text1"/>
-          <w:sz w:val="22"/>
-          <w:szCs w:val="22"/>
-        </w:rPr>
-        <w:t xml:space="preserve">, </w:t>
-      </w:r>
-      <w:r>
-        <w:rPr>
-          <w:color w:val="000000" w:themeColor="text1"/>
-          <w:sz w:val="22"/>
-          <w:szCs w:val="22"/>
-        </w:rPr>
-        <w:t>Runtime, system tools, libraries, and dependencies</w:t>
-      </w:r>
-      <w:r>
-        <w:rPr>
-          <w:color w:val="000000" w:themeColor="text1"/>
-          <w:sz w:val="22"/>
-          <w:szCs w:val="22"/>
-        </w:rPr>
-        <w:t xml:space="preserve">, </w:t>
-      </w:r>
-      <w:r>
-        <w:rPr>
-          <w:color w:val="000000" w:themeColor="text1"/>
-          <w:sz w:val="22"/>
-          <w:szCs w:val="22"/>
-        </w:rPr>
-        <w:t>Environment variables &amp; default run commands</w:t>
-      </w:r>
-      <w:r>
-        <w:rPr>
-          <w:color w:val="000000" w:themeColor="text1"/>
-          <w:sz w:val="22"/>
-          <w:szCs w:val="22"/>
-        </w:rPr>
-        <w:t>.</w:t>
-      </w:r>
-    </w:p>
-    <w:p>
-      <w:pPr>
-        <w:rPr>
-          <w:color w:val="000000" w:themeColor="text1"/>
-          <w:sz w:val="22"/>
-          <w:szCs w:val="22"/>
-        </w:rPr>
-      </w:pPr>
-      <w:r>
-        <w:rPr>
-          <w:color w:val="000000" w:themeColor="text1"/>
-          <w:sz w:val="22"/>
-          <w:szCs w:val="22"/>
-        </w:rPr>
-        <w:t xml:space="preserve">an image is like a class in dev </w:t>
+        <w:t>An</w:t>
+      </w:r>
+      <w:r>
+        <w:rPr>
+          <w:color w:val="000000" w:themeColor="text1"/>
+          <w:sz w:val="22"/>
+          <w:szCs w:val="22"/>
+        </w:rPr>
+        <w:t xml:space="preserve"> </w:t>
+      </w:r>
+      <w:r>
+        <w:rPr>
+          <w:color w:val="000000" w:themeColor="text1"/>
+          <w:sz w:val="22"/>
+          <w:szCs w:val="22"/>
+        </w:rPr>
+        <w:t>image is a read-only package containing everything you need to run an application. This means they include application code, dependencies, a minimal set of OS constructs, and metadata. You can start multiple containers from a single image.</w:t>
+      </w:r>
+    </w:p>
+    <w:p>
+      <w:pPr>
+        <w:rPr>
+          <w:color w:val="000000" w:themeColor="text1"/>
+          <w:sz w:val="22"/>
+          <w:szCs w:val="22"/>
+        </w:rPr>
+      </w:pPr>
+      <w:r>
+        <w:rPr>
+          <w:color w:val="000000" w:themeColor="text1"/>
+          <w:sz w:val="22"/>
+          <w:szCs w:val="22"/>
+        </w:rPr>
+        <w:t>an image is like what we have mentioned before like a snapshot of the running VM, this means it’s a snapshot of a running container but much more lightweight than a VM</w:t>
+      </w:r>
+    </w:p>
+    <w:p>
+      <w:pPr>
+        <w:rPr>
+          <w:color w:val="000000" w:themeColor="text1"/>
+          <w:sz w:val="22"/>
+          <w:szCs w:val="22"/>
+        </w:rPr>
+      </w:pPr>
+      <w:r>
+        <w:rPr>
+          <w:color w:val="000000" w:themeColor="text1"/>
+          <w:sz w:val="22"/>
+          <w:szCs w:val="22"/>
+        </w:rPr>
+        <w:t>images are made by stacking multiple independent layers where each layer include one thing, one layer maybe for the OS one layer for the code, and so on.</w:t>
+      </w:r>
+    </w:p>
+    <w:p>
+      <w:pPr>
+        <w:rPr>
+          <w:color w:val="000000" w:themeColor="text1"/>
+          <w:sz w:val="22"/>
+          <w:szCs w:val="22"/>
+        </w:rPr>
+      </w:pPr>
+    </w:p>
+    <w:p>
+      <w:pPr>
+        <w:rPr>
+          <w:color w:val="000000" w:themeColor="text1"/>
+          <w:sz w:val="22"/>
+          <w:szCs w:val="22"/>
+        </w:rPr>
+      </w:pPr>
+      <w:r>
+        <w:rPr>
+          <w:b/>
+          <w:bCs/>
+          <w:color w:val="000000" w:themeColor="text1"/>
+          <w:sz w:val="22"/>
+          <w:szCs w:val="22"/>
+        </w:rPr>
+        <w:t>Intro to images</w:t>
+      </w:r>
+      <w:r>
+        <w:rPr>
+          <w:b/>
+          <w:bCs/>
+          <w:color w:val="000000" w:themeColor="text1"/>
+          <w:sz w:val="22"/>
+          <w:szCs w:val="22"/>
+        </w:rPr>
+        <w:t xml:space="preserve">: </w:t>
+      </w:r>
+      <w:r>
+        <w:rPr>
+          <w:color w:val="000000" w:themeColor="text1"/>
+          <w:sz w:val="22"/>
+          <w:szCs w:val="22"/>
+        </w:rPr>
+        <w:t xml:space="preserve">You can even stop a con </w:t>
+      </w:r>
+      <w:proofErr w:type="spellStart"/>
+      <w:r>
+        <w:rPr>
+          <w:color w:val="000000" w:themeColor="text1"/>
+          <w:sz w:val="22"/>
+          <w:szCs w:val="22"/>
+        </w:rPr>
+        <w:t>tainer</w:t>
+      </w:r>
+      <w:proofErr w:type="spellEnd"/>
+      <w:r>
+        <w:rPr>
+          <w:color w:val="000000" w:themeColor="text1"/>
+          <w:sz w:val="22"/>
+          <w:szCs w:val="22"/>
+        </w:rPr>
+        <w:t xml:space="preserve"> and create a new image from it.</w:t>
+      </w:r>
+    </w:p>
+    <w:p>
+      <w:pPr>
+        <w:rPr>
+          <w:color w:val="000000" w:themeColor="text1"/>
+          <w:sz w:val="22"/>
+          <w:szCs w:val="22"/>
+        </w:rPr>
+      </w:pPr>
+      <w:r>
+        <w:rPr>
+          <w:color w:val="000000" w:themeColor="text1"/>
+          <w:sz w:val="22"/>
+          <w:szCs w:val="22"/>
+        </w:rPr>
+        <w:t xml:space="preserve">we cannot delete an image as long as all the containers using that image are first stopped then deleted. using </w:t>
+      </w:r>
+      <w:r>
+        <w:rPr>
+          <w:color w:val="EE0000"/>
+          <w:sz w:val="22"/>
+          <w:szCs w:val="22"/>
+        </w:rPr>
+        <w:t xml:space="preserve">docker </w:t>
+      </w:r>
+      <w:proofErr w:type="spellStart"/>
+      <w:r>
+        <w:rPr>
+          <w:color w:val="EE0000"/>
+          <w:sz w:val="22"/>
+          <w:szCs w:val="22"/>
+        </w:rPr>
+        <w:t>rmi</w:t>
+      </w:r>
+      <w:proofErr w:type="spellEnd"/>
+      <w:r>
+        <w:rPr>
+          <w:color w:val="EE0000"/>
+          <w:sz w:val="22"/>
+          <w:szCs w:val="22"/>
+        </w:rPr>
+        <w:t xml:space="preserve"> </w:t>
+      </w:r>
+      <w:proofErr w:type="spellStart"/>
+      <w:r>
+        <w:rPr>
+          <w:color w:val="EE0000"/>
+          <w:sz w:val="22"/>
+          <w:szCs w:val="22"/>
+        </w:rPr>
+        <w:t>image_name</w:t>
+      </w:r>
+      <w:proofErr w:type="spellEnd"/>
+      <w:r>
+        <w:rPr>
+          <w:color w:val="EE0000"/>
+          <w:sz w:val="22"/>
+          <w:szCs w:val="22"/>
+        </w:rPr>
+        <w:t xml:space="preserve">… </w:t>
+      </w:r>
+    </w:p>
+    <w:p>
+      <w:pPr>
+        <w:rPr>
+          <w:color w:val="000000" w:themeColor="text1"/>
+          <w:sz w:val="22"/>
+          <w:szCs w:val="22"/>
+        </w:rPr>
+      </w:pPr>
+      <w:r>
+        <w:rPr>
+          <w:color w:val="000000" w:themeColor="text1"/>
+          <w:sz w:val="22"/>
+          <w:szCs w:val="22"/>
+        </w:rPr>
+        <w:t xml:space="preserve">Containers are designed to run a single application or microservice. As such, they should only contain application code and dependencies. You should not include </w:t>
+      </w:r>
+      <w:proofErr w:type="spellStart"/>
+      <w:r>
+        <w:rPr>
+          <w:color w:val="000000" w:themeColor="text1"/>
+          <w:sz w:val="22"/>
+          <w:szCs w:val="22"/>
+        </w:rPr>
+        <w:t>non essentials</w:t>
+      </w:r>
+      <w:proofErr w:type="spellEnd"/>
+      <w:r>
+        <w:rPr>
+          <w:color w:val="000000" w:themeColor="text1"/>
+          <w:sz w:val="22"/>
+          <w:szCs w:val="22"/>
+        </w:rPr>
+        <w:t xml:space="preserve"> such as build tools or troubleshooting tools.</w:t>
+      </w:r>
+    </w:p>
+    <w:p>
+      <w:pPr>
+        <w:rPr>
+          <w:color w:val="000000" w:themeColor="text1"/>
+          <w:sz w:val="22"/>
+          <w:szCs w:val="22"/>
+        </w:rPr>
+      </w:pPr>
+      <w:r>
+        <w:rPr>
+          <w:color w:val="000000" w:themeColor="text1"/>
+          <w:sz w:val="22"/>
+          <w:szCs w:val="22"/>
+        </w:rPr>
+        <w:t xml:space="preserve">by </w:t>
       </w:r>
       <w:proofErr w:type="gramStart"/>
       <w:r>
@@ -781,7 +1799,7 @@
           <w:sz w:val="22"/>
           <w:szCs w:val="22"/>
         </w:rPr>
-        <w:t>its</w:t>
+        <w:t>default</w:t>
       </w:r>
       <w:proofErr w:type="gramEnd"/>
       <w:r>
@@ -790,65 +1808,94 @@
           <w:sz w:val="22"/>
           <w:szCs w:val="22"/>
         </w:rPr>
-        <w:t xml:space="preserve"> just a blue print which can be used with multiple different instances, so each image can be passed different values and be ran into a new container</w:t>
-      </w:r>
-    </w:p>
-    <w:p>
-      <w:pPr>
-        <w:rPr>
-          <w:color w:val="000000" w:themeColor="text1"/>
-          <w:sz w:val="22"/>
-          <w:szCs w:val="22"/>
-        </w:rPr>
-      </w:pPr>
-      <w:r>
-        <w:rPr>
-          <w:color w:val="000000" w:themeColor="text1"/>
-          <w:sz w:val="22"/>
-          <w:szCs w:val="22"/>
-        </w:rPr>
-        <w:t xml:space="preserve">running </w:t>
-      </w:r>
-      <w:r>
-        <w:rPr>
-          <w:color w:val="EE0000"/>
-          <w:sz w:val="22"/>
-          <w:szCs w:val="22"/>
-        </w:rPr>
-        <w:t>docker images</w:t>
-      </w:r>
-      <w:r>
-        <w:rPr>
-          <w:color w:val="EE0000"/>
-          <w:sz w:val="22"/>
-          <w:szCs w:val="22"/>
-        </w:rPr>
-        <w:t xml:space="preserve"> </w:t>
-      </w:r>
-      <w:r>
-        <w:rPr>
-          <w:color w:val="000000" w:themeColor="text1"/>
-          <w:sz w:val="22"/>
-          <w:szCs w:val="22"/>
-        </w:rPr>
-        <w:t>returns the names, image id and size of all images that we currently have on docker</w:t>
-      </w:r>
-    </w:p>
-    <w:p>
-      <w:pPr>
-        <w:rPr>
-          <w:color w:val="000000" w:themeColor="text1"/>
-          <w:sz w:val="22"/>
-          <w:szCs w:val="22"/>
-        </w:rPr>
-      </w:pPr>
-      <w:r>
-        <w:rPr>
-          <w:color w:val="EE0000"/>
-          <w:sz w:val="22"/>
-          <w:szCs w:val="22"/>
-        </w:rPr>
-        <w:t xml:space="preserve">docker pull </w:t>
+        <w:t xml:space="preserve"> docker when pulling an image, it assumes we want to pull from docker hub and it assumes we want to pull the latest image. </w:t>
+      </w:r>
+      <w:proofErr w:type="gramStart"/>
+      <w:r>
+        <w:rPr>
+          <w:color w:val="000000" w:themeColor="text1"/>
+          <w:sz w:val="22"/>
+          <w:szCs w:val="22"/>
+        </w:rPr>
+        <w:t>however</w:t>
+      </w:r>
+      <w:proofErr w:type="gramEnd"/>
+      <w:r>
+        <w:rPr>
+          <w:color w:val="000000" w:themeColor="text1"/>
+          <w:sz w:val="22"/>
+          <w:szCs w:val="22"/>
+        </w:rPr>
+        <w:t xml:space="preserve"> we can still override this behavior.</w:t>
+      </w:r>
+    </w:p>
+    <w:p>
+      <w:pPr>
+        <w:rPr>
+          <w:color w:val="000000" w:themeColor="text1"/>
+          <w:sz w:val="22"/>
+          <w:szCs w:val="22"/>
+        </w:rPr>
+      </w:pPr>
+    </w:p>
+    <w:p>
+      <w:pPr>
+        <w:rPr>
+          <w:color w:val="000000" w:themeColor="text1"/>
+          <w:sz w:val="22"/>
+          <w:szCs w:val="22"/>
+        </w:rPr>
+      </w:pPr>
+      <w:r>
+        <w:rPr>
+          <w:color w:val="000000" w:themeColor="text1"/>
+          <w:sz w:val="22"/>
+          <w:szCs w:val="22"/>
+        </w:rPr>
+        <w:t>we can specify the version or tag of the image we want to pull by simply including the name of the image we want to pull and the tag example: docker pull mongo:7.0.3</w:t>
+      </w:r>
+    </w:p>
+    <w:p>
+      <w:pPr>
+        <w:rPr>
+          <w:color w:val="000000" w:themeColor="text1"/>
+          <w:sz w:val="22"/>
+          <w:szCs w:val="22"/>
+        </w:rPr>
+      </w:pPr>
+      <w:r>
+        <w:rPr>
+          <w:color w:val="000000" w:themeColor="text1"/>
+          <w:sz w:val="22"/>
+          <w:szCs w:val="22"/>
+        </w:rPr>
+        <w:t>Images tagged as latest are not guaranteed to be the most up-to-date in the repository.</w:t>
+      </w:r>
+    </w:p>
+    <w:p>
+      <w:pPr>
+        <w:rPr>
+          <w:color w:val="000000" w:themeColor="text1"/>
+          <w:sz w:val="22"/>
+          <w:szCs w:val="22"/>
+        </w:rPr>
+      </w:pPr>
+      <w:r>
+        <w:rPr>
+          <w:color w:val="000000" w:themeColor="text1"/>
+          <w:sz w:val="22"/>
+          <w:szCs w:val="22"/>
+        </w:rPr>
+        <w:lastRenderedPageBreak/>
+        <w:t xml:space="preserve">to pull from an untrusted repo or person on docker hub all we need to do is to add the user-name of the user followed by the image name for example: </w:t>
+      </w:r>
+      <w:r>
+        <w:rPr>
+          <w:color w:val="EE0000"/>
+          <w:sz w:val="22"/>
+          <w:szCs w:val="22"/>
+        </w:rPr>
+        <w:t>docker pull ghcr.io/</w:t>
       </w:r>
       <w:proofErr w:type="spellStart"/>
       <w:r>
@@ -857,16 +1904,7 @@
           <w:sz w:val="22"/>
           <w:szCs w:val="22"/>
         </w:rPr>
-        <w:t>image_</w:t>
-      </w:r>
-      <w:proofErr w:type="gramStart"/>
-      <w:r>
-        <w:rPr>
-          <w:color w:val="EE0000"/>
-          <w:sz w:val="22"/>
-          <w:szCs w:val="22"/>
-        </w:rPr>
-        <w:t>name</w:t>
+        <w:t>regclient</w:t>
       </w:r>
       <w:proofErr w:type="spellEnd"/>
       <w:r>
@@ -875,183 +1913,7 @@
           <w:sz w:val="22"/>
           <w:szCs w:val="22"/>
         </w:rPr>
-        <w:t xml:space="preserve"> :</w:t>
-      </w:r>
-      <w:proofErr w:type="spellStart"/>
-      <w:r>
-        <w:rPr>
-          <w:color w:val="EE0000"/>
-          <w:sz w:val="22"/>
-          <w:szCs w:val="22"/>
-        </w:rPr>
-        <w:t>image</w:t>
-      </w:r>
-      <w:proofErr w:type="gramEnd"/>
-      <w:r>
-        <w:rPr>
-          <w:color w:val="EE0000"/>
-          <w:sz w:val="22"/>
-          <w:szCs w:val="22"/>
-        </w:rPr>
-        <w:t>_version</w:t>
-      </w:r>
-      <w:proofErr w:type="spellEnd"/>
-      <w:r>
-        <w:rPr>
-          <w:color w:val="000000" w:themeColor="text1"/>
-          <w:sz w:val="22"/>
-          <w:szCs w:val="22"/>
-        </w:rPr>
-        <w:t xml:space="preserve"> </w:t>
-      </w:r>
-      <w:r>
-        <w:rPr>
-          <w:color w:val="000000" w:themeColor="text1"/>
-          <w:sz w:val="22"/>
-          <w:szCs w:val="22"/>
-        </w:rPr>
-        <w:sym w:font="Wingdings" w:char="F0E0"/>
-      </w:r>
-      <w:r>
-        <w:rPr>
-          <w:color w:val="000000" w:themeColor="text1"/>
-          <w:sz w:val="22"/>
-          <w:szCs w:val="22"/>
-        </w:rPr>
-        <w:t xml:space="preserve"> this copies a new image into our docker so we can use it </w:t>
-      </w:r>
-      <w:r>
-        <w:rPr>
-          <w:color w:val="000000" w:themeColor="text1"/>
-          <w:sz w:val="22"/>
-          <w:szCs w:val="22"/>
-        </w:rPr>
-        <w:t xml:space="preserve">no spaces between the image name and its version </w:t>
-      </w:r>
-    </w:p>
-    <w:p>
-      <w:pPr>
-        <w:rPr>
-          <w:color w:val="000000" w:themeColor="text1"/>
-          <w:sz w:val="22"/>
-          <w:szCs w:val="22"/>
-        </w:rPr>
-      </w:pPr>
-      <w:r>
-        <w:rPr>
-          <w:color w:val="000000" w:themeColor="text1"/>
-          <w:sz w:val="22"/>
-          <w:szCs w:val="22"/>
-        </w:rPr>
-        <w:t xml:space="preserve">you can use the </w:t>
-      </w:r>
-      <w:r>
-        <w:rPr>
-          <w:color w:val="EE0000"/>
-          <w:sz w:val="22"/>
-          <w:szCs w:val="22"/>
-        </w:rPr>
-        <w:t>docker run</w:t>
-      </w:r>
-      <w:r>
-        <w:rPr>
-          <w:color w:val="EE0000"/>
-          <w:sz w:val="22"/>
-          <w:szCs w:val="22"/>
-        </w:rPr>
-        <w:t xml:space="preserve"> </w:t>
-      </w:r>
-      <w:proofErr w:type="spellStart"/>
-      <w:r>
-        <w:rPr>
-          <w:color w:val="EE0000"/>
-          <w:sz w:val="22"/>
-          <w:szCs w:val="22"/>
-        </w:rPr>
-        <w:t>image_name</w:t>
-      </w:r>
-      <w:proofErr w:type="spellEnd"/>
-      <w:r>
-        <w:rPr>
-          <w:color w:val="000000" w:themeColor="text1"/>
-          <w:sz w:val="22"/>
-          <w:szCs w:val="22"/>
-        </w:rPr>
-        <w:t xml:space="preserve"> command to start a container from</w:t>
-      </w:r>
-      <w:r>
-        <w:rPr>
-          <w:color w:val="000000" w:themeColor="text1"/>
-          <w:sz w:val="22"/>
-          <w:szCs w:val="22"/>
-        </w:rPr>
-        <w:t xml:space="preserve"> one of our installed images</w:t>
-      </w:r>
-    </w:p>
-    <w:p>
-      <w:pPr>
-        <w:rPr>
-          <w:color w:val="000000" w:themeColor="text1"/>
-          <w:sz w:val="22"/>
-          <w:szCs w:val="22"/>
-        </w:rPr>
-      </w:pPr>
-      <w:r>
-        <w:rPr>
-          <w:color w:val="EE0000"/>
-          <w:sz w:val="22"/>
-          <w:szCs w:val="22"/>
-        </w:rPr>
-        <w:t>docker run--name</w:t>
-      </w:r>
-      <w:r>
-        <w:rPr>
-          <w:color w:val="000000" w:themeColor="text1"/>
-          <w:sz w:val="22"/>
-          <w:szCs w:val="22"/>
-        </w:rPr>
-        <w:t xml:space="preserve"> test</w:t>
-      </w:r>
-      <w:r>
-        <w:rPr>
-          <w:color w:val="000000" w:themeColor="text1"/>
-          <w:sz w:val="22"/>
-          <w:szCs w:val="22"/>
-        </w:rPr>
-        <w:t xml:space="preserve"> </w:t>
-      </w:r>
-      <w:r>
-        <w:rPr>
-          <w:color w:val="000000" w:themeColor="text1"/>
-          <w:sz w:val="22"/>
-          <w:szCs w:val="22"/>
-        </w:rPr>
-        <w:sym w:font="Wingdings" w:char="F0E0"/>
-      </w:r>
-      <w:r>
-        <w:rPr>
-          <w:color w:val="000000" w:themeColor="text1"/>
-          <w:sz w:val="22"/>
-          <w:szCs w:val="22"/>
-        </w:rPr>
-        <w:t xml:space="preserve"> the – - name is to give the container a name that we choose</w:t>
-      </w:r>
-    </w:p>
-    <w:p>
-      <w:pPr>
-        <w:rPr>
-          <w:color w:val="000000" w:themeColor="text1"/>
-          <w:sz w:val="22"/>
-          <w:szCs w:val="22"/>
-        </w:rPr>
-      </w:pPr>
-      <w:r>
-        <w:rPr>
-          <w:color w:val="EE0000"/>
-          <w:sz w:val="22"/>
-          <w:szCs w:val="22"/>
-        </w:rPr>
-        <w:t xml:space="preserve">docker run -it </w:t>
+        <w:t>/</w:t>
       </w:r>
       <w:proofErr w:type="spellStart"/>
       <w:proofErr w:type="gramStart"/>
@@ -1061,25 +1923,887 @@
           <w:sz w:val="22"/>
           <w:szCs w:val="22"/>
         </w:rPr>
-        <w:t>ubuntu:latest</w:t>
+        <w:t>regsync:latest</w:t>
       </w:r>
       <w:proofErr w:type="spellEnd"/>
       <w:proofErr w:type="gramEnd"/>
-      <w:r>
-        <w:rPr>
-          <w:color w:val="EE0000"/>
-          <w:sz w:val="22"/>
-          <w:szCs w:val="22"/>
-        </w:rPr>
-        <w:t xml:space="preserve"> bash</w:t>
-      </w:r>
-      <w:r>
-        <w:rPr>
-          <w:color w:val="000000" w:themeColor="text1"/>
-          <w:sz w:val="22"/>
-          <w:szCs w:val="22"/>
-        </w:rPr>
-        <w:t xml:space="preserve">   -</w:t>
+    </w:p>
+    <w:p>
+      <w:pPr>
+        <w:rPr>
+          <w:color w:val="000000" w:themeColor="text1"/>
+          <w:sz w:val="22"/>
+          <w:szCs w:val="22"/>
+        </w:rPr>
+      </w:pPr>
+    </w:p>
+    <w:p>
+      <w:pPr>
+        <w:rPr>
+          <w:color w:val="000000" w:themeColor="text1"/>
+          <w:sz w:val="22"/>
+          <w:szCs w:val="22"/>
+        </w:rPr>
+      </w:pPr>
+      <w:r>
+        <w:rPr>
+          <w:color w:val="000000" w:themeColor="text1"/>
+          <w:sz w:val="22"/>
+          <w:szCs w:val="22"/>
+        </w:rPr>
+        <w:t xml:space="preserve">when using </w:t>
+      </w:r>
+      <w:r>
+        <w:rPr>
+          <w:color w:val="EE0000"/>
+          <w:sz w:val="22"/>
+          <w:szCs w:val="22"/>
+        </w:rPr>
+        <w:t xml:space="preserve">docker pull </w:t>
+      </w:r>
+      <w:proofErr w:type="spellStart"/>
+      <w:proofErr w:type="gramStart"/>
+      <w:r>
+        <w:rPr>
+          <w:color w:val="EE0000"/>
+          <w:sz w:val="22"/>
+          <w:szCs w:val="22"/>
+        </w:rPr>
+        <w:t>mongo:latest</w:t>
+      </w:r>
+      <w:proofErr w:type="spellEnd"/>
+      <w:proofErr w:type="gramEnd"/>
+      <w:r>
+        <w:rPr>
+          <w:color w:val="EE0000"/>
+          <w:sz w:val="22"/>
+          <w:szCs w:val="22"/>
+        </w:rPr>
+        <w:t xml:space="preserve"> </w:t>
+      </w:r>
+      <w:r>
+        <w:rPr>
+          <w:color w:val="000000" w:themeColor="text1"/>
+          <w:sz w:val="22"/>
+          <w:szCs w:val="22"/>
+        </w:rPr>
+        <w:t xml:space="preserve">we pull the image of mongo tagged with latest when pulling the </w:t>
+      </w:r>
+      <w:proofErr w:type="gramStart"/>
+      <w:r>
+        <w:rPr>
+          <w:color w:val="000000" w:themeColor="text1"/>
+          <w:sz w:val="22"/>
+          <w:szCs w:val="22"/>
+        </w:rPr>
+        <w:t>image</w:t>
+      </w:r>
+      <w:proofErr w:type="gramEnd"/>
+      <w:r>
+        <w:rPr>
+          <w:color w:val="000000" w:themeColor="text1"/>
+          <w:sz w:val="22"/>
+          <w:szCs w:val="22"/>
+        </w:rPr>
+        <w:t xml:space="preserve"> we see different layers being pulled.</w:t>
+      </w:r>
+    </w:p>
+    <w:p>
+      <w:pPr>
+        <w:rPr>
+          <w:color w:val="000000" w:themeColor="text1"/>
+          <w:sz w:val="22"/>
+          <w:szCs w:val="22"/>
+        </w:rPr>
+      </w:pPr>
+      <w:r>
+        <w:rPr>
+          <w:color w:val="000000" w:themeColor="text1"/>
+          <w:sz w:val="22"/>
+          <w:szCs w:val="22"/>
+        </w:rPr>
+        <w:t xml:space="preserve">The </w:t>
+      </w:r>
+      <w:r>
+        <w:rPr>
+          <w:color w:val="EE0000"/>
+          <w:sz w:val="22"/>
+          <w:szCs w:val="22"/>
+        </w:rPr>
+        <w:t xml:space="preserve">docker inspect </w:t>
+      </w:r>
+      <w:r>
+        <w:rPr>
+          <w:color w:val="000000" w:themeColor="text1"/>
+          <w:sz w:val="22"/>
+          <w:szCs w:val="22"/>
+        </w:rPr>
+        <w:t>command</w:t>
+      </w:r>
+      <w:r>
+        <w:rPr>
+          <w:color w:val="000000" w:themeColor="text1"/>
+          <w:sz w:val="22"/>
+          <w:szCs w:val="22"/>
+        </w:rPr>
+        <w:t xml:space="preserve"> </w:t>
+      </w:r>
+      <w:r>
+        <w:rPr>
+          <w:color w:val="000000" w:themeColor="text1"/>
+          <w:sz w:val="22"/>
+          <w:szCs w:val="22"/>
+        </w:rPr>
+        <w:t>is great for getting detailed image information</w:t>
+      </w:r>
+    </w:p>
+    <w:p>
+      <w:pPr>
+        <w:rPr>
+          <w:b/>
+          <w:bCs/>
+          <w:color w:val="000000" w:themeColor="text1"/>
+          <w:sz w:val="22"/>
+          <w:szCs w:val="22"/>
+        </w:rPr>
+      </w:pPr>
+    </w:p>
+    <w:p>
+      <w:pPr>
+        <w:rPr>
+          <w:b/>
+          <w:bCs/>
+          <w:color w:val="000000" w:themeColor="text1"/>
+          <w:sz w:val="22"/>
+          <w:szCs w:val="22"/>
+        </w:rPr>
+      </w:pPr>
+      <w:r>
+        <w:rPr>
+          <w:b/>
+          <w:bCs/>
+          <w:color w:val="000000" w:themeColor="text1"/>
+          <w:sz w:val="22"/>
+          <w:szCs w:val="22"/>
+        </w:rPr>
+        <w:t>Base layers</w:t>
+      </w:r>
+      <w:r>
+        <w:rPr>
+          <w:b/>
+          <w:bCs/>
+          <w:color w:val="000000" w:themeColor="text1"/>
+          <w:sz w:val="22"/>
+          <w:szCs w:val="22"/>
+        </w:rPr>
+        <w:t>:</w:t>
+      </w:r>
+    </w:p>
+    <w:p>
+      <w:pPr>
+        <w:rPr>
+          <w:color w:val="000000" w:themeColor="text1"/>
+          <w:sz w:val="22"/>
+          <w:szCs w:val="22"/>
+        </w:rPr>
+      </w:pPr>
+      <w:r>
+        <w:rPr>
+          <w:color w:val="000000" w:themeColor="text1"/>
+          <w:sz w:val="22"/>
+          <w:szCs w:val="22"/>
+        </w:rPr>
+        <w:t>All Docker images start with a base layer, and every time you add new content, Docker adds a new</w:t>
+      </w:r>
+      <w:r>
+        <w:rPr>
+          <w:color w:val="000000" w:themeColor="text1"/>
+          <w:sz w:val="22"/>
+          <w:szCs w:val="22"/>
+        </w:rPr>
+        <w:t xml:space="preserve"> </w:t>
+      </w:r>
+      <w:r>
+        <w:rPr>
+          <w:color w:val="000000" w:themeColor="text1"/>
+          <w:sz w:val="22"/>
+          <w:szCs w:val="22"/>
+        </w:rPr>
+        <w:t>layer.</w:t>
+      </w:r>
+    </w:p>
+    <w:p>
+      <w:pPr>
+        <w:rPr>
+          <w:b/>
+          <w:bCs/>
+          <w:color w:val="000000" w:themeColor="text1"/>
+          <w:sz w:val="22"/>
+          <w:szCs w:val="22"/>
+        </w:rPr>
+      </w:pPr>
+    </w:p>
+    <w:p>
+      <w:pPr>
+        <w:rPr>
+          <w:b/>
+          <w:bCs/>
+          <w:color w:val="000000" w:themeColor="text1"/>
+          <w:sz w:val="22"/>
+          <w:szCs w:val="22"/>
+        </w:rPr>
+      </w:pPr>
+      <w:r>
+        <w:rPr>
+          <w:b/>
+          <w:bCs/>
+          <w:color w:val="000000" w:themeColor="text1"/>
+          <w:sz w:val="22"/>
+          <w:szCs w:val="22"/>
+        </w:rPr>
+        <w:t>Sharing image layers</w:t>
+      </w:r>
+      <w:r>
+        <w:rPr>
+          <w:b/>
+          <w:bCs/>
+          <w:color w:val="000000" w:themeColor="text1"/>
+          <w:sz w:val="22"/>
+          <w:szCs w:val="22"/>
+        </w:rPr>
+        <w:t>:</w:t>
+      </w:r>
+    </w:p>
+    <w:p>
+      <w:pPr>
+        <w:rPr>
+          <w:color w:val="000000" w:themeColor="text1"/>
+          <w:sz w:val="22"/>
+          <w:szCs w:val="22"/>
+        </w:rPr>
+      </w:pPr>
+      <w:r>
+        <w:rPr>
+          <w:color w:val="000000" w:themeColor="text1"/>
+          <w:sz w:val="22"/>
+          <w:szCs w:val="22"/>
+        </w:rPr>
+        <w:t>and that means that when pulling an image if it has a layer that already exists in some other image it will not be pulled that layer will be simply shared. this increases performance efficiency and space efficiency.</w:t>
+      </w:r>
+    </w:p>
+    <w:p>
+      <w:pPr>
+        <w:rPr>
+          <w:color w:val="000000" w:themeColor="text1"/>
+          <w:sz w:val="22"/>
+          <w:szCs w:val="22"/>
+        </w:rPr>
+      </w:pPr>
+      <w:r>
+        <w:rPr>
+          <w:color w:val="000000" w:themeColor="text1"/>
+          <w:sz w:val="22"/>
+          <w:szCs w:val="22"/>
+        </w:rPr>
+        <w:t>Layers are also shared on the registry side. This means you can store lots of similar images in a registry, and the registry will save space by never storing more than a single copy of any layer.</w:t>
+      </w:r>
+      <w:r>
+        <w:rPr>
+          <w:color w:val="000000" w:themeColor="text1"/>
+          <w:sz w:val="22"/>
+          <w:szCs w:val="22"/>
+        </w:rPr>
+        <w:t xml:space="preserve"> it means that it works on docker hub the same way it works on our local machine, we can create a </w:t>
+      </w:r>
+      <w:proofErr w:type="spellStart"/>
+      <w:r>
+        <w:rPr>
+          <w:color w:val="000000" w:themeColor="text1"/>
+          <w:sz w:val="22"/>
+          <w:szCs w:val="22"/>
+        </w:rPr>
+        <w:t>registery</w:t>
+      </w:r>
+      <w:proofErr w:type="spellEnd"/>
+      <w:r>
+        <w:rPr>
+          <w:color w:val="000000" w:themeColor="text1"/>
+          <w:sz w:val="22"/>
+          <w:szCs w:val="22"/>
+        </w:rPr>
+        <w:t xml:space="preserve"> (repo) and push many images that all share one same layer, the </w:t>
+      </w:r>
+      <w:proofErr w:type="spellStart"/>
+      <w:r>
+        <w:rPr>
+          <w:color w:val="000000" w:themeColor="text1"/>
+          <w:sz w:val="22"/>
+          <w:szCs w:val="22"/>
+        </w:rPr>
+        <w:t>registery</w:t>
+      </w:r>
+      <w:proofErr w:type="spellEnd"/>
+      <w:r>
+        <w:rPr>
+          <w:color w:val="000000" w:themeColor="text1"/>
+          <w:sz w:val="22"/>
+          <w:szCs w:val="22"/>
+        </w:rPr>
+        <w:t xml:space="preserve"> will only store one instance of that layer.</w:t>
+      </w:r>
+    </w:p>
+    <w:p>
+      <w:pPr>
+        <w:rPr>
+          <w:color w:val="000000" w:themeColor="text1"/>
+          <w:sz w:val="22"/>
+          <w:szCs w:val="22"/>
+        </w:rPr>
+      </w:pPr>
+      <w:r>
+        <w:rPr>
+          <w:color w:val="000000" w:themeColor="text1"/>
+          <w:sz w:val="22"/>
+          <w:szCs w:val="22"/>
+        </w:rPr>
+        <w:t xml:space="preserve">a digest is an image fingerprint that uniquely identifies it, so when we pull an </w:t>
+      </w:r>
+      <w:proofErr w:type="gramStart"/>
+      <w:r>
+        <w:rPr>
+          <w:color w:val="000000" w:themeColor="text1"/>
+          <w:sz w:val="22"/>
+          <w:szCs w:val="22"/>
+        </w:rPr>
+        <w:t>image</w:t>
+      </w:r>
+      <w:proofErr w:type="gramEnd"/>
+      <w:r>
+        <w:rPr>
+          <w:color w:val="000000" w:themeColor="text1"/>
+          <w:sz w:val="22"/>
+          <w:szCs w:val="22"/>
+        </w:rPr>
+        <w:t xml:space="preserve"> we can always pull the same using its digest.</w:t>
+      </w:r>
+    </w:p>
+    <w:p>
+      <w:pPr>
+        <w:rPr>
+          <w:color w:val="EE0000"/>
+          <w:sz w:val="22"/>
+          <w:szCs w:val="22"/>
+        </w:rPr>
+      </w:pPr>
+      <w:r>
+        <w:rPr>
+          <w:color w:val="EE0000"/>
+          <w:sz w:val="22"/>
+          <w:szCs w:val="22"/>
+        </w:rPr>
+        <w:t xml:space="preserve">docker images - -digests </w:t>
+      </w:r>
+      <w:proofErr w:type="spellStart"/>
+      <w:r>
+        <w:rPr>
+          <w:color w:val="EE0000"/>
+          <w:sz w:val="22"/>
+          <w:szCs w:val="22"/>
+        </w:rPr>
+        <w:t>image_name</w:t>
+      </w:r>
+      <w:proofErr w:type="spellEnd"/>
+    </w:p>
+    <w:p>
+      <w:pPr>
+        <w:rPr>
+          <w:color w:val="000000" w:themeColor="text1"/>
+          <w:sz w:val="22"/>
+          <w:szCs w:val="22"/>
+        </w:rPr>
+      </w:pPr>
+    </w:p>
+    <w:p>
+      <w:pPr>
+        <w:rPr>
+          <w:b/>
+          <w:bCs/>
+          <w:color w:val="000000" w:themeColor="text1"/>
+          <w:sz w:val="22"/>
+          <w:szCs w:val="22"/>
+        </w:rPr>
+      </w:pPr>
+      <w:r>
+        <w:rPr>
+          <w:b/>
+          <w:bCs/>
+          <w:color w:val="000000" w:themeColor="text1"/>
+          <w:sz w:val="22"/>
+          <w:szCs w:val="22"/>
+        </w:rPr>
+        <w:t>Vulnerability scanning with Docker Scout</w:t>
+      </w:r>
+      <w:r>
+        <w:rPr>
+          <w:b/>
+          <w:bCs/>
+          <w:color w:val="000000" w:themeColor="text1"/>
+          <w:sz w:val="22"/>
+          <w:szCs w:val="22"/>
+        </w:rPr>
+        <w:t>:</w:t>
+      </w:r>
+    </w:p>
+    <w:p>
+      <w:pPr>
+        <w:rPr>
+          <w:color w:val="EE0000"/>
+          <w:sz w:val="22"/>
+          <w:szCs w:val="22"/>
+        </w:rPr>
+      </w:pPr>
+      <w:r>
+        <w:rPr>
+          <w:color w:val="EE0000"/>
+          <w:sz w:val="22"/>
+          <w:szCs w:val="22"/>
+        </w:rPr>
+        <w:t xml:space="preserve">docker scout </w:t>
+      </w:r>
+      <w:proofErr w:type="spellStart"/>
+      <w:r>
+        <w:rPr>
+          <w:color w:val="EE0000"/>
+          <w:sz w:val="22"/>
+          <w:szCs w:val="22"/>
+        </w:rPr>
+        <w:t>quickview</w:t>
+      </w:r>
+      <w:proofErr w:type="spellEnd"/>
+      <w:r>
+        <w:rPr>
+          <w:color w:val="EE0000"/>
+          <w:sz w:val="22"/>
+          <w:szCs w:val="22"/>
+        </w:rPr>
+        <w:t xml:space="preserve"> </w:t>
+      </w:r>
+      <w:proofErr w:type="spellStart"/>
+      <w:r>
+        <w:rPr>
+          <w:color w:val="EE0000"/>
+          <w:sz w:val="22"/>
+          <w:szCs w:val="22"/>
+        </w:rPr>
+        <w:t>image_name</w:t>
+      </w:r>
+      <w:proofErr w:type="spellEnd"/>
+      <w:r>
+        <w:rPr>
+          <w:color w:val="EE0000"/>
+          <w:sz w:val="22"/>
+          <w:szCs w:val="22"/>
+        </w:rPr>
+        <w:t xml:space="preserve"> </w:t>
+      </w:r>
+    </w:p>
+    <w:p>
+      <w:pPr>
+        <w:rPr>
+          <w:color w:val="EE0000"/>
+          <w:sz w:val="22"/>
+          <w:szCs w:val="22"/>
+        </w:rPr>
+      </w:pPr>
+      <w:r>
+        <w:rPr>
+          <w:color w:val="EE0000"/>
+          <w:sz w:val="22"/>
+          <w:szCs w:val="22"/>
+        </w:rPr>
+        <w:t xml:space="preserve">docker scout </w:t>
+      </w:r>
+      <w:proofErr w:type="spellStart"/>
+      <w:r>
+        <w:rPr>
+          <w:color w:val="EE0000"/>
+          <w:sz w:val="22"/>
+          <w:szCs w:val="22"/>
+        </w:rPr>
+        <w:t>cves</w:t>
+      </w:r>
+      <w:proofErr w:type="spellEnd"/>
+      <w:r>
+        <w:rPr>
+          <w:color w:val="EE0000"/>
+          <w:sz w:val="22"/>
+          <w:szCs w:val="22"/>
+        </w:rPr>
+        <w:t xml:space="preserve"> </w:t>
+      </w:r>
+      <w:proofErr w:type="spellStart"/>
+      <w:r>
+        <w:rPr>
+          <w:color w:val="EE0000"/>
+          <w:sz w:val="22"/>
+          <w:szCs w:val="22"/>
+        </w:rPr>
+        <w:t>image_name</w:t>
+      </w:r>
+      <w:proofErr w:type="spellEnd"/>
+      <w:r>
+        <w:rPr>
+          <w:color w:val="EE0000"/>
+          <w:sz w:val="22"/>
+          <w:szCs w:val="22"/>
+        </w:rPr>
+        <w:t xml:space="preserve"> </w:t>
+      </w:r>
+    </w:p>
+    <w:p>
+      <w:pPr>
+        <w:rPr>
+          <w:color w:val="000000" w:themeColor="text1"/>
+          <w:sz w:val="22"/>
+          <w:szCs w:val="22"/>
+        </w:rPr>
+      </w:pPr>
+    </w:p>
+    <w:p>
+      <w:pPr>
+        <w:rPr>
+          <w:color w:val="000000" w:themeColor="text1"/>
+          <w:sz w:val="22"/>
+          <w:szCs w:val="22"/>
+        </w:rPr>
+      </w:pPr>
+    </w:p>
+    <w:p>
+      <w:pPr>
+        <w:rPr>
+          <w:color w:val="000000" w:themeColor="text1"/>
+          <w:sz w:val="22"/>
+          <w:szCs w:val="22"/>
+        </w:rPr>
+      </w:pPr>
+    </w:p>
+    <w:p>
+      <w:pPr>
+        <w:jc w:val="center"/>
+        <w:rPr>
+          <w:b/>
+          <w:bCs/>
+          <w:color w:val="000000" w:themeColor="text1"/>
+          <w:sz w:val="28"/>
+          <w:szCs w:val="28"/>
+          <w:u w:val="single"/>
+        </w:rPr>
+      </w:pPr>
+      <w:r>
+        <w:rPr>
+          <w:b/>
+          <w:bCs/>
+          <w:color w:val="000000" w:themeColor="text1"/>
+          <w:sz w:val="28"/>
+          <w:szCs w:val="28"/>
+          <w:u w:val="single"/>
+        </w:rPr>
+        <w:lastRenderedPageBreak/>
+        <w:t>Chapter 7 Working with Containers</w:t>
+      </w:r>
+    </w:p>
+    <w:p>
+      <w:pPr>
+        <w:rPr>
+          <w:color w:val="000000" w:themeColor="text1"/>
+          <w:sz w:val="22"/>
+          <w:szCs w:val="22"/>
+        </w:rPr>
+      </w:pPr>
+      <w:r>
+        <w:rPr>
+          <w:color w:val="000000" w:themeColor="text1"/>
+          <w:sz w:val="22"/>
+          <w:szCs w:val="22"/>
+        </w:rPr>
+        <w:t>Containers are run-time instances of images, and you can start one or more containers from a single image.</w:t>
+      </w:r>
+      <w:r>
+        <w:rPr>
+          <w:color w:val="000000" w:themeColor="text1"/>
+          <w:sz w:val="22"/>
+          <w:szCs w:val="22"/>
+        </w:rPr>
+        <w:t xml:space="preserve"> where we can write to a container unlike an image.</w:t>
+      </w:r>
+    </w:p>
+    <w:p>
+      <w:pPr>
+        <w:rPr>
+          <w:color w:val="000000" w:themeColor="text1"/>
+          <w:sz w:val="22"/>
+          <w:szCs w:val="22"/>
+        </w:rPr>
+      </w:pPr>
+      <w:r>
+        <w:rPr>
+          <w:color w:val="000000" w:themeColor="text1"/>
+          <w:sz w:val="22"/>
+          <w:szCs w:val="22"/>
+        </w:rPr>
+        <w:t>containers are stateless and more light weight. containers are used in microservices.</w:t>
+      </w:r>
+    </w:p>
+    <w:p>
+      <w:pPr>
+        <w:rPr>
+          <w:color w:val="000000" w:themeColor="text1"/>
+          <w:sz w:val="22"/>
+          <w:szCs w:val="22"/>
+        </w:rPr>
+      </w:pPr>
+      <w:proofErr w:type="spellStart"/>
+      <w:r>
+        <w:rPr>
+          <w:color w:val="000000" w:themeColor="text1"/>
+          <w:sz w:val="22"/>
+          <w:szCs w:val="22"/>
+        </w:rPr>
+        <w:t>VMsvirtualize</w:t>
+      </w:r>
+      <w:proofErr w:type="spellEnd"/>
+      <w:r>
+        <w:rPr>
+          <w:color w:val="000000" w:themeColor="text1"/>
+          <w:sz w:val="22"/>
+          <w:szCs w:val="22"/>
+        </w:rPr>
+        <w:t xml:space="preserve"> </w:t>
+      </w:r>
+      <w:proofErr w:type="gramStart"/>
+      <w:r>
+        <w:rPr>
+          <w:color w:val="000000" w:themeColor="text1"/>
+          <w:sz w:val="22"/>
+          <w:szCs w:val="22"/>
+        </w:rPr>
+        <w:t xml:space="preserve">hardware </w:t>
+      </w:r>
+      <w:r>
+        <w:rPr>
+          <w:color w:val="000000" w:themeColor="text1"/>
+          <w:sz w:val="22"/>
+          <w:szCs w:val="22"/>
+        </w:rPr>
+        <w:t>,</w:t>
+      </w:r>
+      <w:proofErr w:type="gramEnd"/>
+      <w:r>
+        <w:rPr>
+          <w:color w:val="000000" w:themeColor="text1"/>
+          <w:sz w:val="22"/>
+          <w:szCs w:val="22"/>
+        </w:rPr>
+        <w:t xml:space="preserve"> Containers virtualize operating systems</w:t>
+      </w:r>
+      <w:r>
+        <w:rPr>
+          <w:color w:val="000000" w:themeColor="text1"/>
+          <w:sz w:val="22"/>
+          <w:szCs w:val="22"/>
+        </w:rPr>
+        <w:t>; however, they both are used to run anywhere, on the local machine, cloud, servers anywhere.</w:t>
+      </w:r>
+    </w:p>
+    <w:p>
+      <w:pPr>
+        <w:rPr>
+          <w:color w:val="000000" w:themeColor="text1"/>
+          <w:sz w:val="22"/>
+          <w:szCs w:val="22"/>
+        </w:rPr>
+      </w:pPr>
+      <w:r>
+        <w:rPr>
+          <w:color w:val="000000" w:themeColor="text1"/>
+          <w:sz w:val="22"/>
+          <w:szCs w:val="22"/>
+        </w:rPr>
+        <w:t xml:space="preserve">Containers are smaller and more portable  </w:t>
+      </w:r>
+    </w:p>
+    <w:p>
+      <w:pPr>
+        <w:rPr>
+          <w:color w:val="000000" w:themeColor="text1"/>
+          <w:sz w:val="22"/>
+          <w:szCs w:val="22"/>
+        </w:rPr>
+      </w:pPr>
+      <w:r>
+        <w:rPr>
+          <w:color w:val="000000" w:themeColor="text1"/>
+          <w:sz w:val="22"/>
+          <w:szCs w:val="22"/>
+        </w:rPr>
+        <w:t>You</w:t>
+      </w:r>
+      <w:r>
+        <w:rPr>
+          <w:color w:val="000000" w:themeColor="text1"/>
+          <w:sz w:val="22"/>
+          <w:szCs w:val="22"/>
+        </w:rPr>
+        <w:t xml:space="preserve"> </w:t>
+      </w:r>
+      <w:r>
+        <w:rPr>
+          <w:color w:val="000000" w:themeColor="text1"/>
+          <w:sz w:val="22"/>
+          <w:szCs w:val="22"/>
+        </w:rPr>
+        <w:t>can</w:t>
+      </w:r>
+      <w:r>
+        <w:rPr>
+          <w:color w:val="000000" w:themeColor="text1"/>
+          <w:sz w:val="22"/>
+          <w:szCs w:val="22"/>
+        </w:rPr>
+        <w:t xml:space="preserve"> </w:t>
+      </w:r>
+      <w:r>
+        <w:rPr>
+          <w:color w:val="000000" w:themeColor="text1"/>
+          <w:sz w:val="22"/>
+          <w:szCs w:val="22"/>
+        </w:rPr>
+        <w:t>run</w:t>
+      </w:r>
+      <w:r>
+        <w:rPr>
+          <w:color w:val="000000" w:themeColor="text1"/>
+          <w:sz w:val="22"/>
+          <w:szCs w:val="22"/>
+        </w:rPr>
+        <w:t xml:space="preserve"> </w:t>
+      </w:r>
+      <w:r>
+        <w:rPr>
+          <w:color w:val="000000" w:themeColor="text1"/>
+          <w:sz w:val="22"/>
+          <w:szCs w:val="22"/>
+        </w:rPr>
+        <w:t>more</w:t>
+      </w:r>
+      <w:r>
+        <w:rPr>
+          <w:color w:val="000000" w:themeColor="text1"/>
+          <w:sz w:val="22"/>
+          <w:szCs w:val="22"/>
+        </w:rPr>
+        <w:t xml:space="preserve"> </w:t>
+      </w:r>
+      <w:r>
+        <w:rPr>
+          <w:color w:val="000000" w:themeColor="text1"/>
+          <w:sz w:val="22"/>
+          <w:szCs w:val="22"/>
+        </w:rPr>
+        <w:t xml:space="preserve">containers on your infrastructure  </w:t>
+      </w:r>
+    </w:p>
+    <w:p>
+      <w:pPr>
+        <w:rPr>
+          <w:color w:val="000000" w:themeColor="text1"/>
+          <w:sz w:val="22"/>
+          <w:szCs w:val="22"/>
+        </w:rPr>
+      </w:pPr>
+      <w:r>
+        <w:rPr>
+          <w:color w:val="000000" w:themeColor="text1"/>
+          <w:sz w:val="22"/>
+          <w:szCs w:val="22"/>
+        </w:rPr>
+        <w:t xml:space="preserve">Containers start faster </w:t>
+      </w:r>
+    </w:p>
+    <w:p>
+      <w:pPr>
+        <w:rPr>
+          <w:color w:val="000000" w:themeColor="text1"/>
+          <w:sz w:val="22"/>
+          <w:szCs w:val="22"/>
+        </w:rPr>
+      </w:pPr>
+      <w:r>
+        <w:rPr>
+          <w:color w:val="000000" w:themeColor="text1"/>
+          <w:sz w:val="22"/>
+          <w:szCs w:val="22"/>
+        </w:rPr>
+        <w:t xml:space="preserve">Containers reduce the number of operating systems you need to manage (patch, update, etc.) </w:t>
+      </w:r>
+    </w:p>
+    <w:p>
+      <w:pPr>
+        <w:rPr>
+          <w:color w:val="000000" w:themeColor="text1"/>
+          <w:sz w:val="22"/>
+          <w:szCs w:val="22"/>
+        </w:rPr>
+      </w:pPr>
+      <w:r>
+        <w:rPr>
+          <w:color w:val="000000" w:themeColor="text1"/>
+          <w:sz w:val="22"/>
+          <w:szCs w:val="22"/>
+        </w:rPr>
+        <w:t>Containers present a smaller attack surface</w:t>
+      </w:r>
+    </w:p>
+    <w:p>
+      <w:pPr>
+        <w:rPr>
+          <w:color w:val="000000" w:themeColor="text1"/>
+          <w:sz w:val="22"/>
+          <w:szCs w:val="22"/>
+        </w:rPr>
+      </w:pPr>
+      <w:r>
+        <w:rPr>
+          <w:color w:val="000000" w:themeColor="text1"/>
+          <w:sz w:val="22"/>
+          <w:szCs w:val="22"/>
+        </w:rPr>
+        <w:t>images are shared by all containers created from it, an image is a read only, while a container has a read write option, each container has a read/write we can pause it and the changes are going to be saved, however these changes don’t affect the image. and when we delete the container the read/write of it is gone</w:t>
+      </w:r>
+    </w:p>
+    <w:p>
+      <w:pPr>
+        <w:rPr>
+          <w:color w:val="000000" w:themeColor="text1"/>
+          <w:sz w:val="22"/>
+          <w:szCs w:val="22"/>
+        </w:rPr>
+      </w:pPr>
+      <w:r>
+        <w:rPr>
+          <w:color w:val="EE0000"/>
+          <w:sz w:val="22"/>
+          <w:szCs w:val="22"/>
+        </w:rPr>
+        <w:t>docker inspect mint</w:t>
+      </w:r>
+      <w:r>
+        <w:rPr>
+          <w:color w:val="EE0000"/>
+          <w:sz w:val="22"/>
+          <w:szCs w:val="22"/>
+        </w:rPr>
+        <w:t xml:space="preserve"> </w:t>
       </w:r>
       <w:r>
         <w:rPr>
@@ -1095,58 +2819,7 @@
           <w:sz w:val="22"/>
           <w:szCs w:val="22"/>
         </w:rPr>
-        <w:t xml:space="preserve"> -it is to run it in interactive mode bash is to be able to write bash</w:t>
-      </w:r>
-    </w:p>
-    <w:p>
-      <w:pPr>
-        <w:rPr>
-          <w:color w:val="000000" w:themeColor="text1"/>
-          <w:sz w:val="22"/>
-          <w:szCs w:val="22"/>
-        </w:rPr>
-      </w:pPr>
-      <w:r>
-        <w:rPr>
-          <w:color w:val="EE0000"/>
-          <w:sz w:val="22"/>
-          <w:szCs w:val="22"/>
-        </w:rPr>
-        <w:t xml:space="preserve">docker </w:t>
-      </w:r>
-      <w:proofErr w:type="spellStart"/>
-      <w:r>
-        <w:rPr>
-          <w:color w:val="EE0000"/>
-          <w:sz w:val="22"/>
-          <w:szCs w:val="22"/>
-        </w:rPr>
-        <w:t>ps</w:t>
-      </w:r>
-      <w:proofErr w:type="spellEnd"/>
-      <w:r>
-        <w:rPr>
-          <w:color w:val="000000" w:themeColor="text1"/>
-          <w:sz w:val="22"/>
-          <w:szCs w:val="22"/>
-        </w:rPr>
-        <w:t xml:space="preserve">  </w:t>
-      </w:r>
-      <w:r>
-        <w:rPr>
-          <w:color w:val="000000" w:themeColor="text1"/>
-          <w:sz w:val="22"/>
-          <w:szCs w:val="22"/>
-        </w:rPr>
-        <w:sym w:font="Wingdings" w:char="F0E0"/>
-      </w:r>
-      <w:r>
-        <w:rPr>
-          <w:color w:val="000000" w:themeColor="text1"/>
-          <w:sz w:val="22"/>
-          <w:szCs w:val="22"/>
-        </w:rPr>
-        <w:t xml:space="preserve"> command to check for what containers are up and running </w:t>
+        <w:t xml:space="preserve"> this returns the metadata of an image, including its entry points the digests of each layer, how many layers exists and so on.</w:t>
       </w:r>
     </w:p>
     <w:p>

</xml_diff>

<commit_message>
add docker notes chapter 7 unfinished
</commit_message>
<xml_diff>
--- a/Docker.docx
+++ b/Docker.docx
@@ -1193,15 +1193,7 @@
           <w:sz w:val="22"/>
           <w:szCs w:val="22"/>
         </w:rPr>
-        <w:t>docker attach</w:t>
-      </w:r>
-      <w:r>
-        <w:rPr>
-          <w:color w:val="EE0000"/>
-          <w:sz w:val="22"/>
-          <w:szCs w:val="22"/>
-        </w:rPr>
-        <w:t xml:space="preserve"> </w:t>
+        <w:t xml:space="preserve">docker attach </w:t>
       </w:r>
       <w:proofErr w:type="spellStart"/>
       <w:r>
@@ -1504,9 +1496,935 @@
           <w:szCs w:val="28"/>
           <w:u w:val="single"/>
         </w:rPr>
-        <w:t>6: Working with Images</w:t>
-      </w:r>
-      <w:r>
+        <w:t>6: Working with Images:</w:t>
+      </w:r>
+    </w:p>
+    <w:p>
+      <w:pPr>
+        <w:rPr>
+          <w:b/>
+          <w:bCs/>
+          <w:color w:val="000000" w:themeColor="text1"/>
+          <w:sz w:val="22"/>
+          <w:szCs w:val="22"/>
+        </w:rPr>
+      </w:pPr>
+    </w:p>
+    <w:p>
+      <w:pPr>
+        <w:rPr>
+          <w:color w:val="000000" w:themeColor="text1"/>
+          <w:sz w:val="22"/>
+          <w:szCs w:val="22"/>
+        </w:rPr>
+      </w:pPr>
+      <w:r>
+        <w:rPr>
+          <w:b/>
+          <w:bCs/>
+          <w:color w:val="000000" w:themeColor="text1"/>
+          <w:sz w:val="22"/>
+          <w:szCs w:val="22"/>
+        </w:rPr>
+        <w:t>image TLDR:</w:t>
+      </w:r>
+      <w:r>
+        <w:rPr>
+          <w:b/>
+          <w:bCs/>
+          <w:color w:val="000000" w:themeColor="text1"/>
+          <w:sz w:val="22"/>
+          <w:szCs w:val="22"/>
+        </w:rPr>
+        <w:t xml:space="preserve"> </w:t>
+      </w:r>
+      <w:r>
+        <w:rPr>
+          <w:color w:val="000000" w:themeColor="text1"/>
+          <w:sz w:val="22"/>
+          <w:szCs w:val="22"/>
+        </w:rPr>
+        <w:t>An image is a read-only package containing everything you need to run an application. This means they include application code, dependencies, a minimal set of OS constructs, and metadata. You can start multiple containers from a single image.</w:t>
+      </w:r>
+    </w:p>
+    <w:p>
+      <w:pPr>
+        <w:rPr>
+          <w:color w:val="000000" w:themeColor="text1"/>
+          <w:sz w:val="22"/>
+          <w:szCs w:val="22"/>
+        </w:rPr>
+      </w:pPr>
+      <w:r>
+        <w:rPr>
+          <w:color w:val="000000" w:themeColor="text1"/>
+          <w:sz w:val="22"/>
+          <w:szCs w:val="22"/>
+        </w:rPr>
+        <w:t>an image is like what we have mentioned before like a snapshot of the running VM, this means it’s a snapshot of a running container but much more lightweight than a VM</w:t>
+      </w:r>
+    </w:p>
+    <w:p>
+      <w:pPr>
+        <w:rPr>
+          <w:color w:val="000000" w:themeColor="text1"/>
+          <w:sz w:val="22"/>
+          <w:szCs w:val="22"/>
+        </w:rPr>
+      </w:pPr>
+      <w:r>
+        <w:rPr>
+          <w:color w:val="000000" w:themeColor="text1"/>
+          <w:sz w:val="22"/>
+          <w:szCs w:val="22"/>
+        </w:rPr>
+        <w:t>images are made by stacking multiple independent layers where each layer include one thing, one layer maybe for the OS one layer for the code, and so on.</w:t>
+      </w:r>
+    </w:p>
+    <w:p>
+      <w:pPr>
+        <w:rPr>
+          <w:color w:val="000000" w:themeColor="text1"/>
+          <w:sz w:val="22"/>
+          <w:szCs w:val="22"/>
+        </w:rPr>
+      </w:pPr>
+    </w:p>
+    <w:p>
+      <w:pPr>
+        <w:rPr>
+          <w:color w:val="000000" w:themeColor="text1"/>
+          <w:sz w:val="22"/>
+          <w:szCs w:val="22"/>
+        </w:rPr>
+      </w:pPr>
+      <w:r>
+        <w:rPr>
+          <w:b/>
+          <w:bCs/>
+          <w:color w:val="000000" w:themeColor="text1"/>
+          <w:sz w:val="22"/>
+          <w:szCs w:val="22"/>
+        </w:rPr>
+        <w:t>Intro to images</w:t>
+      </w:r>
+      <w:r>
+        <w:rPr>
+          <w:b/>
+          <w:bCs/>
+          <w:color w:val="000000" w:themeColor="text1"/>
+          <w:sz w:val="22"/>
+          <w:szCs w:val="22"/>
+        </w:rPr>
+        <w:t xml:space="preserve">: </w:t>
+      </w:r>
+      <w:r>
+        <w:rPr>
+          <w:color w:val="000000" w:themeColor="text1"/>
+          <w:sz w:val="22"/>
+          <w:szCs w:val="22"/>
+        </w:rPr>
+        <w:t xml:space="preserve">You can even stop a con </w:t>
+      </w:r>
+      <w:proofErr w:type="spellStart"/>
+      <w:r>
+        <w:rPr>
+          <w:color w:val="000000" w:themeColor="text1"/>
+          <w:sz w:val="22"/>
+          <w:szCs w:val="22"/>
+        </w:rPr>
+        <w:t>tainer</w:t>
+      </w:r>
+      <w:proofErr w:type="spellEnd"/>
+      <w:r>
+        <w:rPr>
+          <w:color w:val="000000" w:themeColor="text1"/>
+          <w:sz w:val="22"/>
+          <w:szCs w:val="22"/>
+        </w:rPr>
+        <w:t xml:space="preserve"> and create a new image from it.</w:t>
+      </w:r>
+    </w:p>
+    <w:p>
+      <w:pPr>
+        <w:rPr>
+          <w:color w:val="000000" w:themeColor="text1"/>
+          <w:sz w:val="22"/>
+          <w:szCs w:val="22"/>
+        </w:rPr>
+      </w:pPr>
+      <w:r>
+        <w:rPr>
+          <w:color w:val="000000" w:themeColor="text1"/>
+          <w:sz w:val="22"/>
+          <w:szCs w:val="22"/>
+        </w:rPr>
+        <w:t xml:space="preserve">we cannot delete an image as long as all the containers using that image are first stopped then deleted. using </w:t>
+      </w:r>
+      <w:r>
+        <w:rPr>
+          <w:color w:val="EE0000"/>
+          <w:sz w:val="22"/>
+          <w:szCs w:val="22"/>
+        </w:rPr>
+        <w:t xml:space="preserve">docker </w:t>
+      </w:r>
+      <w:proofErr w:type="spellStart"/>
+      <w:r>
+        <w:rPr>
+          <w:color w:val="EE0000"/>
+          <w:sz w:val="22"/>
+          <w:szCs w:val="22"/>
+        </w:rPr>
+        <w:t>rmi</w:t>
+      </w:r>
+      <w:proofErr w:type="spellEnd"/>
+      <w:r>
+        <w:rPr>
+          <w:color w:val="EE0000"/>
+          <w:sz w:val="22"/>
+          <w:szCs w:val="22"/>
+        </w:rPr>
+        <w:t xml:space="preserve"> </w:t>
+      </w:r>
+      <w:proofErr w:type="spellStart"/>
+      <w:r>
+        <w:rPr>
+          <w:color w:val="EE0000"/>
+          <w:sz w:val="22"/>
+          <w:szCs w:val="22"/>
+        </w:rPr>
+        <w:t>image_name</w:t>
+      </w:r>
+      <w:proofErr w:type="spellEnd"/>
+      <w:r>
+        <w:rPr>
+          <w:color w:val="EE0000"/>
+          <w:sz w:val="22"/>
+          <w:szCs w:val="22"/>
+        </w:rPr>
+        <w:t xml:space="preserve">… </w:t>
+      </w:r>
+    </w:p>
+    <w:p>
+      <w:pPr>
+        <w:rPr>
+          <w:color w:val="000000" w:themeColor="text1"/>
+          <w:sz w:val="22"/>
+          <w:szCs w:val="22"/>
+        </w:rPr>
+      </w:pPr>
+      <w:r>
+        <w:rPr>
+          <w:color w:val="000000" w:themeColor="text1"/>
+          <w:sz w:val="22"/>
+          <w:szCs w:val="22"/>
+        </w:rPr>
+        <w:t xml:space="preserve">Containers are designed to run a single application or microservice. As such, they should only contain application code and dependencies. You should not include </w:t>
+      </w:r>
+      <w:proofErr w:type="spellStart"/>
+      <w:r>
+        <w:rPr>
+          <w:color w:val="000000" w:themeColor="text1"/>
+          <w:sz w:val="22"/>
+          <w:szCs w:val="22"/>
+        </w:rPr>
+        <w:t>non essentials</w:t>
+      </w:r>
+      <w:proofErr w:type="spellEnd"/>
+      <w:r>
+        <w:rPr>
+          <w:color w:val="000000" w:themeColor="text1"/>
+          <w:sz w:val="22"/>
+          <w:szCs w:val="22"/>
+        </w:rPr>
+        <w:t xml:space="preserve"> such as build tools or troubleshooting tools.</w:t>
+      </w:r>
+    </w:p>
+    <w:p>
+      <w:pPr>
+        <w:rPr>
+          <w:color w:val="000000" w:themeColor="text1"/>
+          <w:sz w:val="22"/>
+          <w:szCs w:val="22"/>
+        </w:rPr>
+      </w:pPr>
+      <w:r>
+        <w:rPr>
+          <w:color w:val="000000" w:themeColor="text1"/>
+          <w:sz w:val="22"/>
+          <w:szCs w:val="22"/>
+        </w:rPr>
+        <w:t xml:space="preserve">by </w:t>
+      </w:r>
+      <w:proofErr w:type="gramStart"/>
+      <w:r>
+        <w:rPr>
+          <w:color w:val="000000" w:themeColor="text1"/>
+          <w:sz w:val="22"/>
+          <w:szCs w:val="22"/>
+        </w:rPr>
+        <w:t>default</w:t>
+      </w:r>
+      <w:proofErr w:type="gramEnd"/>
+      <w:r>
+        <w:rPr>
+          <w:color w:val="000000" w:themeColor="text1"/>
+          <w:sz w:val="22"/>
+          <w:szCs w:val="22"/>
+        </w:rPr>
+        <w:t xml:space="preserve"> docker when pulling an image, it assumes we want to pull from docker hub and it assumes we want to pull the latest image. </w:t>
+      </w:r>
+      <w:proofErr w:type="gramStart"/>
+      <w:r>
+        <w:rPr>
+          <w:color w:val="000000" w:themeColor="text1"/>
+          <w:sz w:val="22"/>
+          <w:szCs w:val="22"/>
+        </w:rPr>
+        <w:t>however</w:t>
+      </w:r>
+      <w:proofErr w:type="gramEnd"/>
+      <w:r>
+        <w:rPr>
+          <w:color w:val="000000" w:themeColor="text1"/>
+          <w:sz w:val="22"/>
+          <w:szCs w:val="22"/>
+        </w:rPr>
+        <w:t xml:space="preserve"> we can still override this behavior.</w:t>
+      </w:r>
+    </w:p>
+    <w:p>
+      <w:pPr>
+        <w:rPr>
+          <w:color w:val="000000" w:themeColor="text1"/>
+          <w:sz w:val="22"/>
+          <w:szCs w:val="22"/>
+        </w:rPr>
+      </w:pPr>
+    </w:p>
+    <w:p>
+      <w:pPr>
+        <w:rPr>
+          <w:color w:val="000000" w:themeColor="text1"/>
+          <w:sz w:val="22"/>
+          <w:szCs w:val="22"/>
+        </w:rPr>
+      </w:pPr>
+      <w:r>
+        <w:rPr>
+          <w:color w:val="000000" w:themeColor="text1"/>
+          <w:sz w:val="22"/>
+          <w:szCs w:val="22"/>
+        </w:rPr>
+        <w:t>we can specify the version or tag of the image we want to pull by simply including the name of the image we want to pull and the tag example: docker pull mongo:7.0.3</w:t>
+      </w:r>
+    </w:p>
+    <w:p>
+      <w:pPr>
+        <w:rPr>
+          <w:color w:val="000000" w:themeColor="text1"/>
+          <w:sz w:val="22"/>
+          <w:szCs w:val="22"/>
+        </w:rPr>
+      </w:pPr>
+      <w:r>
+        <w:rPr>
+          <w:color w:val="000000" w:themeColor="text1"/>
+          <w:sz w:val="22"/>
+          <w:szCs w:val="22"/>
+        </w:rPr>
+        <w:t>Images tagged as latest are not guaranteed to be the most up-to-date in the repository.</w:t>
+      </w:r>
+    </w:p>
+    <w:p>
+      <w:pPr>
+        <w:rPr>
+          <w:color w:val="000000" w:themeColor="text1"/>
+          <w:sz w:val="22"/>
+          <w:szCs w:val="22"/>
+        </w:rPr>
+      </w:pPr>
+      <w:r>
+        <w:rPr>
+          <w:color w:val="000000" w:themeColor="text1"/>
+          <w:sz w:val="22"/>
+          <w:szCs w:val="22"/>
+        </w:rPr>
+        <w:lastRenderedPageBreak/>
+        <w:t xml:space="preserve">to pull from an untrusted repo or person on docker hub all we need to do is to add the user-name of the user followed by the image name for example: </w:t>
+      </w:r>
+      <w:r>
+        <w:rPr>
+          <w:color w:val="EE0000"/>
+          <w:sz w:val="22"/>
+          <w:szCs w:val="22"/>
+        </w:rPr>
+        <w:t>docker pull ghcr.io/</w:t>
+      </w:r>
+      <w:proofErr w:type="spellStart"/>
+      <w:r>
+        <w:rPr>
+          <w:color w:val="EE0000"/>
+          <w:sz w:val="22"/>
+          <w:szCs w:val="22"/>
+        </w:rPr>
+        <w:t>regclient</w:t>
+      </w:r>
+      <w:proofErr w:type="spellEnd"/>
+      <w:r>
+        <w:rPr>
+          <w:color w:val="EE0000"/>
+          <w:sz w:val="22"/>
+          <w:szCs w:val="22"/>
+        </w:rPr>
+        <w:t>/</w:t>
+      </w:r>
+      <w:proofErr w:type="spellStart"/>
+      <w:proofErr w:type="gramStart"/>
+      <w:r>
+        <w:rPr>
+          <w:color w:val="EE0000"/>
+          <w:sz w:val="22"/>
+          <w:szCs w:val="22"/>
+        </w:rPr>
+        <w:t>regsync:latest</w:t>
+      </w:r>
+      <w:proofErr w:type="spellEnd"/>
+      <w:proofErr w:type="gramEnd"/>
+    </w:p>
+    <w:p>
+      <w:pPr>
+        <w:rPr>
+          <w:color w:val="000000" w:themeColor="text1"/>
+          <w:sz w:val="22"/>
+          <w:szCs w:val="22"/>
+        </w:rPr>
+      </w:pPr>
+    </w:p>
+    <w:p>
+      <w:pPr>
+        <w:rPr>
+          <w:color w:val="000000" w:themeColor="text1"/>
+          <w:sz w:val="22"/>
+          <w:szCs w:val="22"/>
+        </w:rPr>
+      </w:pPr>
+      <w:r>
+        <w:rPr>
+          <w:color w:val="000000" w:themeColor="text1"/>
+          <w:sz w:val="22"/>
+          <w:szCs w:val="22"/>
+        </w:rPr>
+        <w:t xml:space="preserve">when using </w:t>
+      </w:r>
+      <w:r>
+        <w:rPr>
+          <w:color w:val="EE0000"/>
+          <w:sz w:val="22"/>
+          <w:szCs w:val="22"/>
+        </w:rPr>
+        <w:t xml:space="preserve">docker pull </w:t>
+      </w:r>
+      <w:proofErr w:type="spellStart"/>
+      <w:proofErr w:type="gramStart"/>
+      <w:r>
+        <w:rPr>
+          <w:color w:val="EE0000"/>
+          <w:sz w:val="22"/>
+          <w:szCs w:val="22"/>
+        </w:rPr>
+        <w:t>mongo:latest</w:t>
+      </w:r>
+      <w:proofErr w:type="spellEnd"/>
+      <w:proofErr w:type="gramEnd"/>
+      <w:r>
+        <w:rPr>
+          <w:color w:val="EE0000"/>
+          <w:sz w:val="22"/>
+          <w:szCs w:val="22"/>
+        </w:rPr>
+        <w:t xml:space="preserve"> </w:t>
+      </w:r>
+      <w:r>
+        <w:rPr>
+          <w:color w:val="000000" w:themeColor="text1"/>
+          <w:sz w:val="22"/>
+          <w:szCs w:val="22"/>
+        </w:rPr>
+        <w:t xml:space="preserve">we pull the image of mongo tagged with latest when pulling the </w:t>
+      </w:r>
+      <w:proofErr w:type="gramStart"/>
+      <w:r>
+        <w:rPr>
+          <w:color w:val="000000" w:themeColor="text1"/>
+          <w:sz w:val="22"/>
+          <w:szCs w:val="22"/>
+        </w:rPr>
+        <w:t>image</w:t>
+      </w:r>
+      <w:proofErr w:type="gramEnd"/>
+      <w:r>
+        <w:rPr>
+          <w:color w:val="000000" w:themeColor="text1"/>
+          <w:sz w:val="22"/>
+          <w:szCs w:val="22"/>
+        </w:rPr>
+        <w:t xml:space="preserve"> we see different layers being pulled.</w:t>
+      </w:r>
+    </w:p>
+    <w:p>
+      <w:pPr>
+        <w:rPr>
+          <w:color w:val="000000" w:themeColor="text1"/>
+          <w:sz w:val="22"/>
+          <w:szCs w:val="22"/>
+        </w:rPr>
+      </w:pPr>
+      <w:r>
+        <w:rPr>
+          <w:color w:val="000000" w:themeColor="text1"/>
+          <w:sz w:val="22"/>
+          <w:szCs w:val="22"/>
+        </w:rPr>
+        <w:t xml:space="preserve">The </w:t>
+      </w:r>
+      <w:r>
+        <w:rPr>
+          <w:color w:val="EE0000"/>
+          <w:sz w:val="22"/>
+          <w:szCs w:val="22"/>
+        </w:rPr>
+        <w:t xml:space="preserve">docker inspect </w:t>
+      </w:r>
+      <w:r>
+        <w:rPr>
+          <w:color w:val="000000" w:themeColor="text1"/>
+          <w:sz w:val="22"/>
+          <w:szCs w:val="22"/>
+        </w:rPr>
+        <w:t>command</w:t>
+      </w:r>
+      <w:r>
+        <w:rPr>
+          <w:color w:val="000000" w:themeColor="text1"/>
+          <w:sz w:val="22"/>
+          <w:szCs w:val="22"/>
+        </w:rPr>
+        <w:t xml:space="preserve"> </w:t>
+      </w:r>
+      <w:r>
+        <w:rPr>
+          <w:color w:val="000000" w:themeColor="text1"/>
+          <w:sz w:val="22"/>
+          <w:szCs w:val="22"/>
+        </w:rPr>
+        <w:t>is great for getting detailed image information</w:t>
+      </w:r>
+    </w:p>
+    <w:p>
+      <w:pPr>
+        <w:rPr>
+          <w:b/>
+          <w:bCs/>
+          <w:color w:val="000000" w:themeColor="text1"/>
+          <w:sz w:val="22"/>
+          <w:szCs w:val="22"/>
+        </w:rPr>
+      </w:pPr>
+    </w:p>
+    <w:p>
+      <w:pPr>
+        <w:rPr>
+          <w:b/>
+          <w:bCs/>
+          <w:color w:val="000000" w:themeColor="text1"/>
+          <w:sz w:val="22"/>
+          <w:szCs w:val="22"/>
+        </w:rPr>
+      </w:pPr>
+      <w:r>
+        <w:rPr>
+          <w:b/>
+          <w:bCs/>
+          <w:color w:val="000000" w:themeColor="text1"/>
+          <w:sz w:val="22"/>
+          <w:szCs w:val="22"/>
+        </w:rPr>
+        <w:t>Base layers:</w:t>
+      </w:r>
+    </w:p>
+    <w:p>
+      <w:pPr>
+        <w:rPr>
+          <w:color w:val="000000" w:themeColor="text1"/>
+          <w:sz w:val="22"/>
+          <w:szCs w:val="22"/>
+        </w:rPr>
+      </w:pPr>
+      <w:r>
+        <w:rPr>
+          <w:color w:val="000000" w:themeColor="text1"/>
+          <w:sz w:val="22"/>
+          <w:szCs w:val="22"/>
+        </w:rPr>
+        <w:t>All Docker images start with a base layer, and every time you add new content, Docker adds a new</w:t>
+      </w:r>
+      <w:r>
+        <w:rPr>
+          <w:color w:val="000000" w:themeColor="text1"/>
+          <w:sz w:val="22"/>
+          <w:szCs w:val="22"/>
+        </w:rPr>
+        <w:t xml:space="preserve"> </w:t>
+      </w:r>
+      <w:r>
+        <w:rPr>
+          <w:color w:val="000000" w:themeColor="text1"/>
+          <w:sz w:val="22"/>
+          <w:szCs w:val="22"/>
+        </w:rPr>
+        <w:t>layer.</w:t>
+      </w:r>
+    </w:p>
+    <w:p>
+      <w:pPr>
+        <w:rPr>
+          <w:b/>
+          <w:bCs/>
+          <w:color w:val="000000" w:themeColor="text1"/>
+          <w:sz w:val="22"/>
+          <w:szCs w:val="22"/>
+        </w:rPr>
+      </w:pPr>
+    </w:p>
+    <w:p>
+      <w:pPr>
+        <w:rPr>
+          <w:b/>
+          <w:bCs/>
+          <w:color w:val="000000" w:themeColor="text1"/>
+          <w:sz w:val="22"/>
+          <w:szCs w:val="22"/>
+        </w:rPr>
+      </w:pPr>
+      <w:r>
+        <w:rPr>
+          <w:b/>
+          <w:bCs/>
+          <w:color w:val="000000" w:themeColor="text1"/>
+          <w:sz w:val="22"/>
+          <w:szCs w:val="22"/>
+        </w:rPr>
+        <w:t>Sharing image layers:</w:t>
+      </w:r>
+    </w:p>
+    <w:p>
+      <w:pPr>
+        <w:rPr>
+          <w:color w:val="000000" w:themeColor="text1"/>
+          <w:sz w:val="22"/>
+          <w:szCs w:val="22"/>
+        </w:rPr>
+      </w:pPr>
+      <w:r>
+        <w:rPr>
+          <w:color w:val="000000" w:themeColor="text1"/>
+          <w:sz w:val="22"/>
+          <w:szCs w:val="22"/>
+        </w:rPr>
+        <w:t>and that means that when pulling an image if it has a layer that already exists in some other image it will not be pulled that layer will be simply shared. this increases performance efficiency and space efficiency.</w:t>
+      </w:r>
+    </w:p>
+    <w:p>
+      <w:pPr>
+        <w:rPr>
+          <w:color w:val="000000" w:themeColor="text1"/>
+          <w:sz w:val="22"/>
+          <w:szCs w:val="22"/>
+        </w:rPr>
+      </w:pPr>
+      <w:r>
+        <w:rPr>
+          <w:color w:val="000000" w:themeColor="text1"/>
+          <w:sz w:val="22"/>
+          <w:szCs w:val="22"/>
+        </w:rPr>
+        <w:t>Layers are also shared on the registry side. This means you can store lots of similar images in a registry, and the registry will save space by never storing more than a single copy of any layer.</w:t>
+      </w:r>
+      <w:r>
+        <w:rPr>
+          <w:color w:val="000000" w:themeColor="text1"/>
+          <w:sz w:val="22"/>
+          <w:szCs w:val="22"/>
+        </w:rPr>
+        <w:t xml:space="preserve"> it means that it works on docker hub the same way it works on our local machine, we can create a </w:t>
+      </w:r>
+      <w:proofErr w:type="spellStart"/>
+      <w:r>
+        <w:rPr>
+          <w:color w:val="000000" w:themeColor="text1"/>
+          <w:sz w:val="22"/>
+          <w:szCs w:val="22"/>
+        </w:rPr>
+        <w:t>registery</w:t>
+      </w:r>
+      <w:proofErr w:type="spellEnd"/>
+      <w:r>
+        <w:rPr>
+          <w:color w:val="000000" w:themeColor="text1"/>
+          <w:sz w:val="22"/>
+          <w:szCs w:val="22"/>
+        </w:rPr>
+        <w:t xml:space="preserve"> (repo) and push many images that all share one same layer, the </w:t>
+      </w:r>
+      <w:proofErr w:type="spellStart"/>
+      <w:r>
+        <w:rPr>
+          <w:color w:val="000000" w:themeColor="text1"/>
+          <w:sz w:val="22"/>
+          <w:szCs w:val="22"/>
+        </w:rPr>
+        <w:t>registery</w:t>
+      </w:r>
+      <w:proofErr w:type="spellEnd"/>
+      <w:r>
+        <w:rPr>
+          <w:color w:val="000000" w:themeColor="text1"/>
+          <w:sz w:val="22"/>
+          <w:szCs w:val="22"/>
+        </w:rPr>
+        <w:t xml:space="preserve"> will only store one instance of that layer.</w:t>
+      </w:r>
+    </w:p>
+    <w:p>
+      <w:pPr>
+        <w:rPr>
+          <w:color w:val="000000" w:themeColor="text1"/>
+          <w:sz w:val="22"/>
+          <w:szCs w:val="22"/>
+        </w:rPr>
+      </w:pPr>
+      <w:r>
+        <w:rPr>
+          <w:color w:val="000000" w:themeColor="text1"/>
+          <w:sz w:val="22"/>
+          <w:szCs w:val="22"/>
+        </w:rPr>
+        <w:t xml:space="preserve">a digest is an image fingerprint that uniquely identifies it, so when we pull an </w:t>
+      </w:r>
+      <w:proofErr w:type="gramStart"/>
+      <w:r>
+        <w:rPr>
+          <w:color w:val="000000" w:themeColor="text1"/>
+          <w:sz w:val="22"/>
+          <w:szCs w:val="22"/>
+        </w:rPr>
+        <w:t>image</w:t>
+      </w:r>
+      <w:proofErr w:type="gramEnd"/>
+      <w:r>
+        <w:rPr>
+          <w:color w:val="000000" w:themeColor="text1"/>
+          <w:sz w:val="22"/>
+          <w:szCs w:val="22"/>
+        </w:rPr>
+        <w:t xml:space="preserve"> we can always pull the same using its digest.</w:t>
+      </w:r>
+    </w:p>
+    <w:p>
+      <w:pPr>
+        <w:rPr>
+          <w:color w:val="EE0000"/>
+          <w:sz w:val="22"/>
+          <w:szCs w:val="22"/>
+        </w:rPr>
+      </w:pPr>
+      <w:r>
+        <w:rPr>
+          <w:color w:val="EE0000"/>
+          <w:sz w:val="22"/>
+          <w:szCs w:val="22"/>
+        </w:rPr>
+        <w:t xml:space="preserve">docker images - -digests </w:t>
+      </w:r>
+      <w:proofErr w:type="spellStart"/>
+      <w:r>
+        <w:rPr>
+          <w:color w:val="EE0000"/>
+          <w:sz w:val="22"/>
+          <w:szCs w:val="22"/>
+        </w:rPr>
+        <w:t>image_name</w:t>
+      </w:r>
+      <w:proofErr w:type="spellEnd"/>
+    </w:p>
+    <w:p>
+      <w:pPr>
+        <w:rPr>
+          <w:color w:val="000000" w:themeColor="text1"/>
+          <w:sz w:val="22"/>
+          <w:szCs w:val="22"/>
+        </w:rPr>
+      </w:pPr>
+    </w:p>
+    <w:p>
+      <w:pPr>
+        <w:rPr>
+          <w:b/>
+          <w:bCs/>
+          <w:color w:val="000000" w:themeColor="text1"/>
+          <w:sz w:val="22"/>
+          <w:szCs w:val="22"/>
+        </w:rPr>
+      </w:pPr>
+      <w:r>
+        <w:rPr>
+          <w:b/>
+          <w:bCs/>
+          <w:color w:val="000000" w:themeColor="text1"/>
+          <w:sz w:val="22"/>
+          <w:szCs w:val="22"/>
+        </w:rPr>
+        <w:t>Vulnerability scanning with Docker Scout:</w:t>
+      </w:r>
+    </w:p>
+    <w:p>
+      <w:pPr>
+        <w:rPr>
+          <w:color w:val="EE0000"/>
+          <w:sz w:val="22"/>
+          <w:szCs w:val="22"/>
+        </w:rPr>
+      </w:pPr>
+      <w:r>
+        <w:rPr>
+          <w:color w:val="EE0000"/>
+          <w:sz w:val="22"/>
+          <w:szCs w:val="22"/>
+        </w:rPr>
+        <w:t xml:space="preserve">docker scout </w:t>
+      </w:r>
+      <w:proofErr w:type="spellStart"/>
+      <w:r>
+        <w:rPr>
+          <w:color w:val="EE0000"/>
+          <w:sz w:val="22"/>
+          <w:szCs w:val="22"/>
+        </w:rPr>
+        <w:t>quickview</w:t>
+      </w:r>
+      <w:proofErr w:type="spellEnd"/>
+      <w:r>
+        <w:rPr>
+          <w:color w:val="EE0000"/>
+          <w:sz w:val="22"/>
+          <w:szCs w:val="22"/>
+        </w:rPr>
+        <w:t xml:space="preserve"> </w:t>
+      </w:r>
+      <w:proofErr w:type="spellStart"/>
+      <w:r>
+        <w:rPr>
+          <w:color w:val="EE0000"/>
+          <w:sz w:val="22"/>
+          <w:szCs w:val="22"/>
+        </w:rPr>
+        <w:t>image_name</w:t>
+      </w:r>
+      <w:proofErr w:type="spellEnd"/>
+      <w:r>
+        <w:rPr>
+          <w:color w:val="EE0000"/>
+          <w:sz w:val="22"/>
+          <w:szCs w:val="22"/>
+        </w:rPr>
+        <w:t xml:space="preserve"> </w:t>
+      </w:r>
+    </w:p>
+    <w:p>
+      <w:pPr>
+        <w:rPr>
+          <w:color w:val="EE0000"/>
+          <w:sz w:val="22"/>
+          <w:szCs w:val="22"/>
+        </w:rPr>
+      </w:pPr>
+      <w:r>
+        <w:rPr>
+          <w:color w:val="EE0000"/>
+          <w:sz w:val="22"/>
+          <w:szCs w:val="22"/>
+        </w:rPr>
+        <w:t xml:space="preserve">docker scout </w:t>
+      </w:r>
+      <w:proofErr w:type="spellStart"/>
+      <w:r>
+        <w:rPr>
+          <w:color w:val="EE0000"/>
+          <w:sz w:val="22"/>
+          <w:szCs w:val="22"/>
+        </w:rPr>
+        <w:t>cves</w:t>
+      </w:r>
+      <w:proofErr w:type="spellEnd"/>
+      <w:r>
+        <w:rPr>
+          <w:color w:val="EE0000"/>
+          <w:sz w:val="22"/>
+          <w:szCs w:val="22"/>
+        </w:rPr>
+        <w:t xml:space="preserve"> </w:t>
+      </w:r>
+      <w:proofErr w:type="spellStart"/>
+      <w:r>
+        <w:rPr>
+          <w:color w:val="EE0000"/>
+          <w:sz w:val="22"/>
+          <w:szCs w:val="22"/>
+        </w:rPr>
+        <w:t>image_name</w:t>
+      </w:r>
+      <w:proofErr w:type="spellEnd"/>
+      <w:r>
+        <w:rPr>
+          <w:color w:val="EE0000"/>
+          <w:sz w:val="22"/>
+          <w:szCs w:val="22"/>
+        </w:rPr>
+        <w:t xml:space="preserve"> </w:t>
+      </w:r>
+    </w:p>
+    <w:p>
+      <w:pPr>
+        <w:rPr>
+          <w:color w:val="000000" w:themeColor="text1"/>
+          <w:sz w:val="22"/>
+          <w:szCs w:val="22"/>
+        </w:rPr>
+      </w:pPr>
+    </w:p>
+    <w:p>
+      <w:pPr>
+        <w:rPr>
+          <w:color w:val="000000" w:themeColor="text1"/>
+          <w:sz w:val="22"/>
+          <w:szCs w:val="22"/>
+        </w:rPr>
+      </w:pPr>
+    </w:p>
+    <w:p>
+      <w:pPr>
+        <w:rPr>
+          <w:color w:val="000000" w:themeColor="text1"/>
+          <w:sz w:val="22"/>
+          <w:szCs w:val="22"/>
+        </w:rPr>
+      </w:pPr>
+    </w:p>
+    <w:p>
+      <w:pPr>
+        <w:jc w:val="center"/>
         <w:rPr>
           <w:b/>
           <w:bCs/>
@@ -1515,981 +2433,8 @@
           <w:szCs w:val="28"/>
           <w:u w:val="single"/>
         </w:rPr>
-        <w:t>:</w:t>
-      </w:r>
-    </w:p>
-    <w:p>
-      <w:pPr>
-        <w:rPr>
-          <w:b/>
-          <w:bCs/>
-          <w:color w:val="000000" w:themeColor="text1"/>
-          <w:sz w:val="22"/>
-          <w:szCs w:val="22"/>
-        </w:rPr>
-      </w:pPr>
-    </w:p>
-    <w:p>
-      <w:pPr>
-        <w:rPr>
-          <w:color w:val="000000" w:themeColor="text1"/>
-          <w:sz w:val="22"/>
-          <w:szCs w:val="22"/>
-        </w:rPr>
-      </w:pPr>
-      <w:r>
-        <w:rPr>
-          <w:b/>
-          <w:bCs/>
-          <w:color w:val="000000" w:themeColor="text1"/>
-          <w:sz w:val="22"/>
-          <w:szCs w:val="22"/>
-        </w:rPr>
-        <w:t>image TLDR:</w:t>
-      </w:r>
-      <w:r>
-        <w:rPr>
-          <w:b/>
-          <w:bCs/>
-          <w:color w:val="000000" w:themeColor="text1"/>
-          <w:sz w:val="22"/>
-          <w:szCs w:val="22"/>
-        </w:rPr>
-        <w:t xml:space="preserve"> </w:t>
-      </w:r>
-      <w:r>
-        <w:rPr>
-          <w:color w:val="000000" w:themeColor="text1"/>
-          <w:sz w:val="22"/>
-          <w:szCs w:val="22"/>
-        </w:rPr>
-        <w:t>An</w:t>
-      </w:r>
-      <w:r>
-        <w:rPr>
-          <w:color w:val="000000" w:themeColor="text1"/>
-          <w:sz w:val="22"/>
-          <w:szCs w:val="22"/>
-        </w:rPr>
-        <w:t xml:space="preserve"> </w:t>
-      </w:r>
-      <w:r>
-        <w:rPr>
-          <w:color w:val="000000" w:themeColor="text1"/>
-          <w:sz w:val="22"/>
-          <w:szCs w:val="22"/>
-        </w:rPr>
-        <w:t>image is a read-only package containing everything you need to run an application. This means they include application code, dependencies, a minimal set of OS constructs, and metadata. You can start multiple containers from a single image.</w:t>
-      </w:r>
-    </w:p>
-    <w:p>
-      <w:pPr>
-        <w:rPr>
-          <w:color w:val="000000" w:themeColor="text1"/>
-          <w:sz w:val="22"/>
-          <w:szCs w:val="22"/>
-        </w:rPr>
-      </w:pPr>
-      <w:r>
-        <w:rPr>
-          <w:color w:val="000000" w:themeColor="text1"/>
-          <w:sz w:val="22"/>
-          <w:szCs w:val="22"/>
-        </w:rPr>
-        <w:t>an image is like what we have mentioned before like a snapshot of the running VM, this means it’s a snapshot of a running container but much more lightweight than a VM</w:t>
-      </w:r>
-    </w:p>
-    <w:p>
-      <w:pPr>
-        <w:rPr>
-          <w:color w:val="000000" w:themeColor="text1"/>
-          <w:sz w:val="22"/>
-          <w:szCs w:val="22"/>
-        </w:rPr>
-      </w:pPr>
-      <w:r>
-        <w:rPr>
-          <w:color w:val="000000" w:themeColor="text1"/>
-          <w:sz w:val="22"/>
-          <w:szCs w:val="22"/>
-        </w:rPr>
-        <w:t>images are made by stacking multiple independent layers where each layer include one thing, one layer maybe for the OS one layer for the code, and so on.</w:t>
-      </w:r>
-    </w:p>
-    <w:p>
-      <w:pPr>
-        <w:rPr>
-          <w:color w:val="000000" w:themeColor="text1"/>
-          <w:sz w:val="22"/>
-          <w:szCs w:val="22"/>
-        </w:rPr>
-      </w:pPr>
-    </w:p>
-    <w:p>
-      <w:pPr>
-        <w:rPr>
-          <w:color w:val="000000" w:themeColor="text1"/>
-          <w:sz w:val="22"/>
-          <w:szCs w:val="22"/>
-        </w:rPr>
-      </w:pPr>
-      <w:r>
-        <w:rPr>
-          <w:b/>
-          <w:bCs/>
-          <w:color w:val="000000" w:themeColor="text1"/>
-          <w:sz w:val="22"/>
-          <w:szCs w:val="22"/>
-        </w:rPr>
-        <w:t>Intro to images</w:t>
-      </w:r>
-      <w:r>
-        <w:rPr>
-          <w:b/>
-          <w:bCs/>
-          <w:color w:val="000000" w:themeColor="text1"/>
-          <w:sz w:val="22"/>
-          <w:szCs w:val="22"/>
-        </w:rPr>
-        <w:t xml:space="preserve">: </w:t>
-      </w:r>
-      <w:r>
-        <w:rPr>
-          <w:color w:val="000000" w:themeColor="text1"/>
-          <w:sz w:val="22"/>
-          <w:szCs w:val="22"/>
-        </w:rPr>
-        <w:t xml:space="preserve">You can even stop a con </w:t>
-      </w:r>
-      <w:proofErr w:type="spellStart"/>
-      <w:r>
-        <w:rPr>
-          <w:color w:val="000000" w:themeColor="text1"/>
-          <w:sz w:val="22"/>
-          <w:szCs w:val="22"/>
-        </w:rPr>
-        <w:t>tainer</w:t>
-      </w:r>
-      <w:proofErr w:type="spellEnd"/>
-      <w:r>
-        <w:rPr>
-          <w:color w:val="000000" w:themeColor="text1"/>
-          <w:sz w:val="22"/>
-          <w:szCs w:val="22"/>
-        </w:rPr>
-        <w:t xml:space="preserve"> and create a new image from it.</w:t>
-      </w:r>
-    </w:p>
-    <w:p>
-      <w:pPr>
-        <w:rPr>
-          <w:color w:val="000000" w:themeColor="text1"/>
-          <w:sz w:val="22"/>
-          <w:szCs w:val="22"/>
-        </w:rPr>
-      </w:pPr>
-      <w:r>
-        <w:rPr>
-          <w:color w:val="000000" w:themeColor="text1"/>
-          <w:sz w:val="22"/>
-          <w:szCs w:val="22"/>
-        </w:rPr>
-        <w:t xml:space="preserve">we cannot delete an image as long as all the containers using that image are first stopped then deleted. using </w:t>
-      </w:r>
-      <w:r>
-        <w:rPr>
-          <w:color w:val="EE0000"/>
-          <w:sz w:val="22"/>
-          <w:szCs w:val="22"/>
-        </w:rPr>
-        <w:t xml:space="preserve">docker </w:t>
-      </w:r>
-      <w:proofErr w:type="spellStart"/>
-      <w:r>
-        <w:rPr>
-          <w:color w:val="EE0000"/>
-          <w:sz w:val="22"/>
-          <w:szCs w:val="22"/>
-        </w:rPr>
-        <w:t>rmi</w:t>
-      </w:r>
-      <w:proofErr w:type="spellEnd"/>
-      <w:r>
-        <w:rPr>
-          <w:color w:val="EE0000"/>
-          <w:sz w:val="22"/>
-          <w:szCs w:val="22"/>
-        </w:rPr>
-        <w:t xml:space="preserve"> </w:t>
-      </w:r>
-      <w:proofErr w:type="spellStart"/>
-      <w:r>
-        <w:rPr>
-          <w:color w:val="EE0000"/>
-          <w:sz w:val="22"/>
-          <w:szCs w:val="22"/>
-        </w:rPr>
-        <w:t>image_name</w:t>
-      </w:r>
-      <w:proofErr w:type="spellEnd"/>
-      <w:r>
-        <w:rPr>
-          <w:color w:val="EE0000"/>
-          <w:sz w:val="22"/>
-          <w:szCs w:val="22"/>
-        </w:rPr>
-        <w:t xml:space="preserve">… </w:t>
-      </w:r>
-    </w:p>
-    <w:p>
-      <w:pPr>
-        <w:rPr>
-          <w:color w:val="000000" w:themeColor="text1"/>
-          <w:sz w:val="22"/>
-          <w:szCs w:val="22"/>
-        </w:rPr>
-      </w:pPr>
-      <w:r>
-        <w:rPr>
-          <w:color w:val="000000" w:themeColor="text1"/>
-          <w:sz w:val="22"/>
-          <w:szCs w:val="22"/>
-        </w:rPr>
-        <w:t xml:space="preserve">Containers are designed to run a single application or microservice. As such, they should only contain application code and dependencies. You should not include </w:t>
-      </w:r>
-      <w:proofErr w:type="spellStart"/>
-      <w:r>
-        <w:rPr>
-          <w:color w:val="000000" w:themeColor="text1"/>
-          <w:sz w:val="22"/>
-          <w:szCs w:val="22"/>
-        </w:rPr>
-        <w:t>non essentials</w:t>
-      </w:r>
-      <w:proofErr w:type="spellEnd"/>
-      <w:r>
-        <w:rPr>
-          <w:color w:val="000000" w:themeColor="text1"/>
-          <w:sz w:val="22"/>
-          <w:szCs w:val="22"/>
-        </w:rPr>
-        <w:t xml:space="preserve"> such as build tools or troubleshooting tools.</w:t>
-      </w:r>
-    </w:p>
-    <w:p>
-      <w:pPr>
-        <w:rPr>
-          <w:color w:val="000000" w:themeColor="text1"/>
-          <w:sz w:val="22"/>
-          <w:szCs w:val="22"/>
-        </w:rPr>
-      </w:pPr>
-      <w:r>
-        <w:rPr>
-          <w:color w:val="000000" w:themeColor="text1"/>
-          <w:sz w:val="22"/>
-          <w:szCs w:val="22"/>
-        </w:rPr>
-        <w:t xml:space="preserve">by </w:t>
-      </w:r>
-      <w:proofErr w:type="gramStart"/>
-      <w:r>
-        <w:rPr>
-          <w:color w:val="000000" w:themeColor="text1"/>
-          <w:sz w:val="22"/>
-          <w:szCs w:val="22"/>
-        </w:rPr>
-        <w:t>default</w:t>
-      </w:r>
-      <w:proofErr w:type="gramEnd"/>
-      <w:r>
-        <w:rPr>
-          <w:color w:val="000000" w:themeColor="text1"/>
-          <w:sz w:val="22"/>
-          <w:szCs w:val="22"/>
-        </w:rPr>
-        <w:t xml:space="preserve"> docker when pulling an image, it assumes we want to pull from docker hub and it assumes we want to pull the latest image. </w:t>
-      </w:r>
-      <w:proofErr w:type="gramStart"/>
-      <w:r>
-        <w:rPr>
-          <w:color w:val="000000" w:themeColor="text1"/>
-          <w:sz w:val="22"/>
-          <w:szCs w:val="22"/>
-        </w:rPr>
-        <w:t>however</w:t>
-      </w:r>
-      <w:proofErr w:type="gramEnd"/>
-      <w:r>
-        <w:rPr>
-          <w:color w:val="000000" w:themeColor="text1"/>
-          <w:sz w:val="22"/>
-          <w:szCs w:val="22"/>
-        </w:rPr>
-        <w:t xml:space="preserve"> we can still override this behavior.</w:t>
-      </w:r>
-    </w:p>
-    <w:p>
-      <w:pPr>
-        <w:rPr>
-          <w:color w:val="000000" w:themeColor="text1"/>
-          <w:sz w:val="22"/>
-          <w:szCs w:val="22"/>
-        </w:rPr>
-      </w:pPr>
-    </w:p>
-    <w:p>
-      <w:pPr>
-        <w:rPr>
-          <w:color w:val="000000" w:themeColor="text1"/>
-          <w:sz w:val="22"/>
-          <w:szCs w:val="22"/>
-        </w:rPr>
-      </w:pPr>
-      <w:r>
-        <w:rPr>
-          <w:color w:val="000000" w:themeColor="text1"/>
-          <w:sz w:val="22"/>
-          <w:szCs w:val="22"/>
-        </w:rPr>
-        <w:t>we can specify the version or tag of the image we want to pull by simply including the name of the image we want to pull and the tag example: docker pull mongo:7.0.3</w:t>
-      </w:r>
-    </w:p>
-    <w:p>
-      <w:pPr>
-        <w:rPr>
-          <w:color w:val="000000" w:themeColor="text1"/>
-          <w:sz w:val="22"/>
-          <w:szCs w:val="22"/>
-        </w:rPr>
-      </w:pPr>
-      <w:r>
-        <w:rPr>
-          <w:color w:val="000000" w:themeColor="text1"/>
-          <w:sz w:val="22"/>
-          <w:szCs w:val="22"/>
-        </w:rPr>
-        <w:t>Images tagged as latest are not guaranteed to be the most up-to-date in the repository.</w:t>
-      </w:r>
-    </w:p>
-    <w:p>
-      <w:pPr>
-        <w:rPr>
-          <w:color w:val="000000" w:themeColor="text1"/>
-          <w:sz w:val="22"/>
-          <w:szCs w:val="22"/>
-        </w:rPr>
-      </w:pPr>
-      <w:r>
-        <w:rPr>
-          <w:color w:val="000000" w:themeColor="text1"/>
-          <w:sz w:val="22"/>
-          <w:szCs w:val="22"/>
-        </w:rPr>
-        <w:lastRenderedPageBreak/>
-        <w:t xml:space="preserve">to pull from an untrusted repo or person on docker hub all we need to do is to add the user-name of the user followed by the image name for example: </w:t>
-      </w:r>
-      <w:r>
-        <w:rPr>
-          <w:color w:val="EE0000"/>
-          <w:sz w:val="22"/>
-          <w:szCs w:val="22"/>
-        </w:rPr>
-        <w:t>docker pull ghcr.io/</w:t>
-      </w:r>
-      <w:proofErr w:type="spellStart"/>
-      <w:r>
-        <w:rPr>
-          <w:color w:val="EE0000"/>
-          <w:sz w:val="22"/>
-          <w:szCs w:val="22"/>
-        </w:rPr>
-        <w:t>regclient</w:t>
-      </w:r>
-      <w:proofErr w:type="spellEnd"/>
-      <w:r>
-        <w:rPr>
-          <w:color w:val="EE0000"/>
-          <w:sz w:val="22"/>
-          <w:szCs w:val="22"/>
-        </w:rPr>
-        <w:t>/</w:t>
-      </w:r>
-      <w:proofErr w:type="spellStart"/>
-      <w:proofErr w:type="gramStart"/>
-      <w:r>
-        <w:rPr>
-          <w:color w:val="EE0000"/>
-          <w:sz w:val="22"/>
-          <w:szCs w:val="22"/>
-        </w:rPr>
-        <w:t>regsync:latest</w:t>
-      </w:r>
-      <w:proofErr w:type="spellEnd"/>
-      <w:proofErr w:type="gramEnd"/>
-    </w:p>
-    <w:p>
-      <w:pPr>
-        <w:rPr>
-          <w:color w:val="000000" w:themeColor="text1"/>
-          <w:sz w:val="22"/>
-          <w:szCs w:val="22"/>
-        </w:rPr>
-      </w:pPr>
-    </w:p>
-    <w:p>
-      <w:pPr>
-        <w:rPr>
-          <w:color w:val="000000" w:themeColor="text1"/>
-          <w:sz w:val="22"/>
-          <w:szCs w:val="22"/>
-        </w:rPr>
-      </w:pPr>
-      <w:r>
-        <w:rPr>
-          <w:color w:val="000000" w:themeColor="text1"/>
-          <w:sz w:val="22"/>
-          <w:szCs w:val="22"/>
-        </w:rPr>
-        <w:t xml:space="preserve">when using </w:t>
-      </w:r>
-      <w:r>
-        <w:rPr>
-          <w:color w:val="EE0000"/>
-          <w:sz w:val="22"/>
-          <w:szCs w:val="22"/>
-        </w:rPr>
-        <w:t xml:space="preserve">docker pull </w:t>
-      </w:r>
-      <w:proofErr w:type="spellStart"/>
-      <w:proofErr w:type="gramStart"/>
-      <w:r>
-        <w:rPr>
-          <w:color w:val="EE0000"/>
-          <w:sz w:val="22"/>
-          <w:szCs w:val="22"/>
-        </w:rPr>
-        <w:t>mongo:latest</w:t>
-      </w:r>
-      <w:proofErr w:type="spellEnd"/>
-      <w:proofErr w:type="gramEnd"/>
-      <w:r>
-        <w:rPr>
-          <w:color w:val="EE0000"/>
-          <w:sz w:val="22"/>
-          <w:szCs w:val="22"/>
-        </w:rPr>
-        <w:t xml:space="preserve"> </w:t>
-      </w:r>
-      <w:r>
-        <w:rPr>
-          <w:color w:val="000000" w:themeColor="text1"/>
-          <w:sz w:val="22"/>
-          <w:szCs w:val="22"/>
-        </w:rPr>
-        <w:t xml:space="preserve">we pull the image of mongo tagged with latest when pulling the </w:t>
-      </w:r>
-      <w:proofErr w:type="gramStart"/>
-      <w:r>
-        <w:rPr>
-          <w:color w:val="000000" w:themeColor="text1"/>
-          <w:sz w:val="22"/>
-          <w:szCs w:val="22"/>
-        </w:rPr>
-        <w:t>image</w:t>
-      </w:r>
-      <w:proofErr w:type="gramEnd"/>
-      <w:r>
-        <w:rPr>
-          <w:color w:val="000000" w:themeColor="text1"/>
-          <w:sz w:val="22"/>
-          <w:szCs w:val="22"/>
-        </w:rPr>
-        <w:t xml:space="preserve"> we see different layers being pulled.</w:t>
-      </w:r>
-    </w:p>
-    <w:p>
-      <w:pPr>
-        <w:rPr>
-          <w:color w:val="000000" w:themeColor="text1"/>
-          <w:sz w:val="22"/>
-          <w:szCs w:val="22"/>
-        </w:rPr>
-      </w:pPr>
-      <w:r>
-        <w:rPr>
-          <w:color w:val="000000" w:themeColor="text1"/>
-          <w:sz w:val="22"/>
-          <w:szCs w:val="22"/>
-        </w:rPr>
-        <w:t xml:space="preserve">The </w:t>
-      </w:r>
-      <w:r>
-        <w:rPr>
-          <w:color w:val="EE0000"/>
-          <w:sz w:val="22"/>
-          <w:szCs w:val="22"/>
-        </w:rPr>
-        <w:t xml:space="preserve">docker inspect </w:t>
-      </w:r>
-      <w:r>
-        <w:rPr>
-          <w:color w:val="000000" w:themeColor="text1"/>
-          <w:sz w:val="22"/>
-          <w:szCs w:val="22"/>
-        </w:rPr>
-        <w:t>command</w:t>
-      </w:r>
-      <w:r>
-        <w:rPr>
-          <w:color w:val="000000" w:themeColor="text1"/>
-          <w:sz w:val="22"/>
-          <w:szCs w:val="22"/>
-        </w:rPr>
-        <w:t xml:space="preserve"> </w:t>
-      </w:r>
-      <w:r>
-        <w:rPr>
-          <w:color w:val="000000" w:themeColor="text1"/>
-          <w:sz w:val="22"/>
-          <w:szCs w:val="22"/>
-        </w:rPr>
-        <w:t>is great for getting detailed image information</w:t>
-      </w:r>
-    </w:p>
-    <w:p>
-      <w:pPr>
-        <w:rPr>
-          <w:b/>
-          <w:bCs/>
-          <w:color w:val="000000" w:themeColor="text1"/>
-          <w:sz w:val="22"/>
-          <w:szCs w:val="22"/>
-        </w:rPr>
-      </w:pPr>
-    </w:p>
-    <w:p>
-      <w:pPr>
-        <w:rPr>
-          <w:b/>
-          <w:bCs/>
-          <w:color w:val="000000" w:themeColor="text1"/>
-          <w:sz w:val="22"/>
-          <w:szCs w:val="22"/>
-        </w:rPr>
-      </w:pPr>
-      <w:r>
-        <w:rPr>
-          <w:b/>
-          <w:bCs/>
-          <w:color w:val="000000" w:themeColor="text1"/>
-          <w:sz w:val="22"/>
-          <w:szCs w:val="22"/>
-        </w:rPr>
-        <w:t>Base layers</w:t>
-      </w:r>
-      <w:r>
-        <w:rPr>
-          <w:b/>
-          <w:bCs/>
-          <w:color w:val="000000" w:themeColor="text1"/>
-          <w:sz w:val="22"/>
-          <w:szCs w:val="22"/>
-        </w:rPr>
-        <w:t>:</w:t>
-      </w:r>
-    </w:p>
-    <w:p>
-      <w:pPr>
-        <w:rPr>
-          <w:color w:val="000000" w:themeColor="text1"/>
-          <w:sz w:val="22"/>
-          <w:szCs w:val="22"/>
-        </w:rPr>
-      </w:pPr>
-      <w:r>
-        <w:rPr>
-          <w:color w:val="000000" w:themeColor="text1"/>
-          <w:sz w:val="22"/>
-          <w:szCs w:val="22"/>
-        </w:rPr>
-        <w:t>All Docker images start with a base layer, and every time you add new content, Docker adds a new</w:t>
-      </w:r>
-      <w:r>
-        <w:rPr>
-          <w:color w:val="000000" w:themeColor="text1"/>
-          <w:sz w:val="22"/>
-          <w:szCs w:val="22"/>
-        </w:rPr>
-        <w:t xml:space="preserve"> </w:t>
-      </w:r>
-      <w:r>
-        <w:rPr>
-          <w:color w:val="000000" w:themeColor="text1"/>
-          <w:sz w:val="22"/>
-          <w:szCs w:val="22"/>
-        </w:rPr>
-        <w:t>layer.</w:t>
-      </w:r>
-    </w:p>
-    <w:p>
-      <w:pPr>
-        <w:rPr>
-          <w:b/>
-          <w:bCs/>
-          <w:color w:val="000000" w:themeColor="text1"/>
-          <w:sz w:val="22"/>
-          <w:szCs w:val="22"/>
-        </w:rPr>
-      </w:pPr>
-    </w:p>
-    <w:p>
-      <w:pPr>
-        <w:rPr>
-          <w:b/>
-          <w:bCs/>
-          <w:color w:val="000000" w:themeColor="text1"/>
-          <w:sz w:val="22"/>
-          <w:szCs w:val="22"/>
-        </w:rPr>
-      </w:pPr>
-      <w:r>
-        <w:rPr>
-          <w:b/>
-          <w:bCs/>
-          <w:color w:val="000000" w:themeColor="text1"/>
-          <w:sz w:val="22"/>
-          <w:szCs w:val="22"/>
-        </w:rPr>
-        <w:t>Sharing image layers</w:t>
-      </w:r>
-      <w:r>
-        <w:rPr>
-          <w:b/>
-          <w:bCs/>
-          <w:color w:val="000000" w:themeColor="text1"/>
-          <w:sz w:val="22"/>
-          <w:szCs w:val="22"/>
-        </w:rPr>
-        <w:t>:</w:t>
-      </w:r>
-    </w:p>
-    <w:p>
-      <w:pPr>
-        <w:rPr>
-          <w:color w:val="000000" w:themeColor="text1"/>
-          <w:sz w:val="22"/>
-          <w:szCs w:val="22"/>
-        </w:rPr>
-      </w:pPr>
-      <w:r>
-        <w:rPr>
-          <w:color w:val="000000" w:themeColor="text1"/>
-          <w:sz w:val="22"/>
-          <w:szCs w:val="22"/>
-        </w:rPr>
-        <w:t>and that means that when pulling an image if it has a layer that already exists in some other image it will not be pulled that layer will be simply shared. this increases performance efficiency and space efficiency.</w:t>
-      </w:r>
-    </w:p>
-    <w:p>
-      <w:pPr>
-        <w:rPr>
-          <w:color w:val="000000" w:themeColor="text1"/>
-          <w:sz w:val="22"/>
-          <w:szCs w:val="22"/>
-        </w:rPr>
-      </w:pPr>
-      <w:r>
-        <w:rPr>
-          <w:color w:val="000000" w:themeColor="text1"/>
-          <w:sz w:val="22"/>
-          <w:szCs w:val="22"/>
-        </w:rPr>
-        <w:t>Layers are also shared on the registry side. This means you can store lots of similar images in a registry, and the registry will save space by never storing more than a single copy of any layer.</w:t>
-      </w:r>
-      <w:r>
-        <w:rPr>
-          <w:color w:val="000000" w:themeColor="text1"/>
-          <w:sz w:val="22"/>
-          <w:szCs w:val="22"/>
-        </w:rPr>
-        <w:t xml:space="preserve"> it means that it works on docker hub the same way it works on our local machine, we can create a </w:t>
-      </w:r>
-      <w:proofErr w:type="spellStart"/>
-      <w:r>
-        <w:rPr>
-          <w:color w:val="000000" w:themeColor="text1"/>
-          <w:sz w:val="22"/>
-          <w:szCs w:val="22"/>
-        </w:rPr>
-        <w:t>registery</w:t>
-      </w:r>
-      <w:proofErr w:type="spellEnd"/>
-      <w:r>
-        <w:rPr>
-          <w:color w:val="000000" w:themeColor="text1"/>
-          <w:sz w:val="22"/>
-          <w:szCs w:val="22"/>
-        </w:rPr>
-        <w:t xml:space="preserve"> (repo) and push many images that all share one same layer, the </w:t>
-      </w:r>
-      <w:proofErr w:type="spellStart"/>
-      <w:r>
-        <w:rPr>
-          <w:color w:val="000000" w:themeColor="text1"/>
-          <w:sz w:val="22"/>
-          <w:szCs w:val="22"/>
-        </w:rPr>
-        <w:t>registery</w:t>
-      </w:r>
-      <w:proofErr w:type="spellEnd"/>
-      <w:r>
-        <w:rPr>
-          <w:color w:val="000000" w:themeColor="text1"/>
-          <w:sz w:val="22"/>
-          <w:szCs w:val="22"/>
-        </w:rPr>
-        <w:t xml:space="preserve"> will only store one instance of that layer.</w:t>
-      </w:r>
-    </w:p>
-    <w:p>
-      <w:pPr>
-        <w:rPr>
-          <w:color w:val="000000" w:themeColor="text1"/>
-          <w:sz w:val="22"/>
-          <w:szCs w:val="22"/>
-        </w:rPr>
-      </w:pPr>
-      <w:r>
-        <w:rPr>
-          <w:color w:val="000000" w:themeColor="text1"/>
-          <w:sz w:val="22"/>
-          <w:szCs w:val="22"/>
-        </w:rPr>
-        <w:t xml:space="preserve">a digest is an image fingerprint that uniquely identifies it, so when we pull an </w:t>
-      </w:r>
-      <w:proofErr w:type="gramStart"/>
-      <w:r>
-        <w:rPr>
-          <w:color w:val="000000" w:themeColor="text1"/>
-          <w:sz w:val="22"/>
-          <w:szCs w:val="22"/>
-        </w:rPr>
-        <w:t>image</w:t>
-      </w:r>
-      <w:proofErr w:type="gramEnd"/>
-      <w:r>
-        <w:rPr>
-          <w:color w:val="000000" w:themeColor="text1"/>
-          <w:sz w:val="22"/>
-          <w:szCs w:val="22"/>
-        </w:rPr>
-        <w:t xml:space="preserve"> we can always pull the same using its digest.</w:t>
-      </w:r>
-    </w:p>
-    <w:p>
-      <w:pPr>
-        <w:rPr>
-          <w:color w:val="EE0000"/>
-          <w:sz w:val="22"/>
-          <w:szCs w:val="22"/>
-        </w:rPr>
-      </w:pPr>
-      <w:r>
-        <w:rPr>
-          <w:color w:val="EE0000"/>
-          <w:sz w:val="22"/>
-          <w:szCs w:val="22"/>
-        </w:rPr>
-        <w:t xml:space="preserve">docker images - -digests </w:t>
-      </w:r>
-      <w:proofErr w:type="spellStart"/>
-      <w:r>
-        <w:rPr>
-          <w:color w:val="EE0000"/>
-          <w:sz w:val="22"/>
-          <w:szCs w:val="22"/>
-        </w:rPr>
-        <w:t>image_name</w:t>
-      </w:r>
-      <w:proofErr w:type="spellEnd"/>
-    </w:p>
-    <w:p>
-      <w:pPr>
-        <w:rPr>
-          <w:color w:val="000000" w:themeColor="text1"/>
-          <w:sz w:val="22"/>
-          <w:szCs w:val="22"/>
-        </w:rPr>
-      </w:pPr>
-    </w:p>
-    <w:p>
-      <w:pPr>
-        <w:rPr>
-          <w:b/>
-          <w:bCs/>
-          <w:color w:val="000000" w:themeColor="text1"/>
-          <w:sz w:val="22"/>
-          <w:szCs w:val="22"/>
-        </w:rPr>
-      </w:pPr>
-      <w:r>
-        <w:rPr>
-          <w:b/>
-          <w:bCs/>
-          <w:color w:val="000000" w:themeColor="text1"/>
-          <w:sz w:val="22"/>
-          <w:szCs w:val="22"/>
-        </w:rPr>
-        <w:t>Vulnerability scanning with Docker Scout</w:t>
-      </w:r>
-      <w:r>
-        <w:rPr>
-          <w:b/>
-          <w:bCs/>
-          <w:color w:val="000000" w:themeColor="text1"/>
-          <w:sz w:val="22"/>
-          <w:szCs w:val="22"/>
-        </w:rPr>
-        <w:t>:</w:t>
-      </w:r>
-    </w:p>
-    <w:p>
-      <w:pPr>
-        <w:rPr>
-          <w:color w:val="EE0000"/>
-          <w:sz w:val="22"/>
-          <w:szCs w:val="22"/>
-        </w:rPr>
-      </w:pPr>
-      <w:r>
-        <w:rPr>
-          <w:color w:val="EE0000"/>
-          <w:sz w:val="22"/>
-          <w:szCs w:val="22"/>
-        </w:rPr>
-        <w:t xml:space="preserve">docker scout </w:t>
-      </w:r>
-      <w:proofErr w:type="spellStart"/>
-      <w:r>
-        <w:rPr>
-          <w:color w:val="EE0000"/>
-          <w:sz w:val="22"/>
-          <w:szCs w:val="22"/>
-        </w:rPr>
-        <w:t>quickview</w:t>
-      </w:r>
-      <w:proofErr w:type="spellEnd"/>
-      <w:r>
-        <w:rPr>
-          <w:color w:val="EE0000"/>
-          <w:sz w:val="22"/>
-          <w:szCs w:val="22"/>
-        </w:rPr>
-        <w:t xml:space="preserve"> </w:t>
-      </w:r>
-      <w:proofErr w:type="spellStart"/>
-      <w:r>
-        <w:rPr>
-          <w:color w:val="EE0000"/>
-          <w:sz w:val="22"/>
-          <w:szCs w:val="22"/>
-        </w:rPr>
-        <w:t>image_name</w:t>
-      </w:r>
-      <w:proofErr w:type="spellEnd"/>
-      <w:r>
-        <w:rPr>
-          <w:color w:val="EE0000"/>
-          <w:sz w:val="22"/>
-          <w:szCs w:val="22"/>
-        </w:rPr>
-        <w:t xml:space="preserve"> </w:t>
-      </w:r>
-    </w:p>
-    <w:p>
-      <w:pPr>
-        <w:rPr>
-          <w:color w:val="EE0000"/>
-          <w:sz w:val="22"/>
-          <w:szCs w:val="22"/>
-        </w:rPr>
-      </w:pPr>
-      <w:r>
-        <w:rPr>
-          <w:color w:val="EE0000"/>
-          <w:sz w:val="22"/>
-          <w:szCs w:val="22"/>
-        </w:rPr>
-        <w:t xml:space="preserve">docker scout </w:t>
-      </w:r>
-      <w:proofErr w:type="spellStart"/>
-      <w:r>
-        <w:rPr>
-          <w:color w:val="EE0000"/>
-          <w:sz w:val="22"/>
-          <w:szCs w:val="22"/>
-        </w:rPr>
-        <w:t>cves</w:t>
-      </w:r>
-      <w:proofErr w:type="spellEnd"/>
-      <w:r>
-        <w:rPr>
-          <w:color w:val="EE0000"/>
-          <w:sz w:val="22"/>
-          <w:szCs w:val="22"/>
-        </w:rPr>
-        <w:t xml:space="preserve"> </w:t>
-      </w:r>
-      <w:proofErr w:type="spellStart"/>
-      <w:r>
-        <w:rPr>
-          <w:color w:val="EE0000"/>
-          <w:sz w:val="22"/>
-          <w:szCs w:val="22"/>
-        </w:rPr>
-        <w:t>image_name</w:t>
-      </w:r>
-      <w:proofErr w:type="spellEnd"/>
-      <w:r>
-        <w:rPr>
-          <w:color w:val="EE0000"/>
-          <w:sz w:val="22"/>
-          <w:szCs w:val="22"/>
-        </w:rPr>
-        <w:t xml:space="preserve"> </w:t>
-      </w:r>
-    </w:p>
-    <w:p>
-      <w:pPr>
-        <w:rPr>
-          <w:color w:val="000000" w:themeColor="text1"/>
-          <w:sz w:val="22"/>
-          <w:szCs w:val="22"/>
-        </w:rPr>
-      </w:pPr>
-    </w:p>
-    <w:p>
-      <w:pPr>
-        <w:rPr>
-          <w:color w:val="000000" w:themeColor="text1"/>
-          <w:sz w:val="22"/>
-          <w:szCs w:val="22"/>
-        </w:rPr>
-      </w:pPr>
-    </w:p>
-    <w:p>
-      <w:pPr>
-        <w:rPr>
-          <w:color w:val="000000" w:themeColor="text1"/>
-          <w:sz w:val="22"/>
-          <w:szCs w:val="22"/>
-        </w:rPr>
-      </w:pPr>
-    </w:p>
-    <w:p>
-      <w:pPr>
-        <w:jc w:val="center"/>
+      </w:pPr>
+      <w:r>
         <w:rPr>
           <w:b/>
           <w:bCs/>
@@ -2498,8 +2443,628 @@
           <w:szCs w:val="28"/>
           <w:u w:val="single"/>
         </w:rPr>
-      </w:pPr>
-      <w:r>
+        <w:lastRenderedPageBreak/>
+        <w:t>Chapter 7 Working with Containers</w:t>
+      </w:r>
+    </w:p>
+    <w:p>
+      <w:pPr>
+        <w:rPr>
+          <w:color w:val="000000" w:themeColor="text1"/>
+          <w:sz w:val="22"/>
+          <w:szCs w:val="22"/>
+        </w:rPr>
+      </w:pPr>
+      <w:r>
+        <w:rPr>
+          <w:color w:val="000000" w:themeColor="text1"/>
+          <w:sz w:val="22"/>
+          <w:szCs w:val="22"/>
+        </w:rPr>
+        <w:t>Containers are run-time instances of images, and you can start one or more containers from a single image.</w:t>
+      </w:r>
+      <w:r>
+        <w:rPr>
+          <w:color w:val="000000" w:themeColor="text1"/>
+          <w:sz w:val="22"/>
+          <w:szCs w:val="22"/>
+        </w:rPr>
+        <w:t xml:space="preserve"> where we can write to a container unlike an image.</w:t>
+      </w:r>
+    </w:p>
+    <w:p>
+      <w:pPr>
+        <w:rPr>
+          <w:color w:val="000000" w:themeColor="text1"/>
+          <w:sz w:val="22"/>
+          <w:szCs w:val="22"/>
+        </w:rPr>
+      </w:pPr>
+      <w:r>
+        <w:rPr>
+          <w:color w:val="000000" w:themeColor="text1"/>
+          <w:sz w:val="22"/>
+          <w:szCs w:val="22"/>
+        </w:rPr>
+        <w:t>containers are stateless and more light weight. containers are used in microservices.</w:t>
+      </w:r>
+    </w:p>
+    <w:p>
+      <w:pPr>
+        <w:rPr>
+          <w:color w:val="000000" w:themeColor="text1"/>
+          <w:sz w:val="22"/>
+          <w:szCs w:val="22"/>
+        </w:rPr>
+      </w:pPr>
+      <w:proofErr w:type="spellStart"/>
+      <w:r>
+        <w:rPr>
+          <w:color w:val="000000" w:themeColor="text1"/>
+          <w:sz w:val="22"/>
+          <w:szCs w:val="22"/>
+        </w:rPr>
+        <w:t>VMsvirtualize</w:t>
+      </w:r>
+      <w:proofErr w:type="spellEnd"/>
+      <w:r>
+        <w:rPr>
+          <w:color w:val="000000" w:themeColor="text1"/>
+          <w:sz w:val="22"/>
+          <w:szCs w:val="22"/>
+        </w:rPr>
+        <w:t xml:space="preserve"> </w:t>
+      </w:r>
+      <w:proofErr w:type="gramStart"/>
+      <w:r>
+        <w:rPr>
+          <w:color w:val="000000" w:themeColor="text1"/>
+          <w:sz w:val="22"/>
+          <w:szCs w:val="22"/>
+        </w:rPr>
+        <w:t xml:space="preserve">hardware </w:t>
+      </w:r>
+      <w:r>
+        <w:rPr>
+          <w:color w:val="000000" w:themeColor="text1"/>
+          <w:sz w:val="22"/>
+          <w:szCs w:val="22"/>
+        </w:rPr>
+        <w:t>,</w:t>
+      </w:r>
+      <w:proofErr w:type="gramEnd"/>
+      <w:r>
+        <w:rPr>
+          <w:color w:val="000000" w:themeColor="text1"/>
+          <w:sz w:val="22"/>
+          <w:szCs w:val="22"/>
+        </w:rPr>
+        <w:t xml:space="preserve"> Containers virtualize operating systems</w:t>
+      </w:r>
+      <w:r>
+        <w:rPr>
+          <w:color w:val="000000" w:themeColor="text1"/>
+          <w:sz w:val="22"/>
+          <w:szCs w:val="22"/>
+        </w:rPr>
+        <w:t>; however, they both are used to run anywhere, on the local machine, cloud, servers anywhere.</w:t>
+      </w:r>
+    </w:p>
+    <w:p>
+      <w:pPr>
+        <w:rPr>
+          <w:color w:val="000000" w:themeColor="text1"/>
+          <w:sz w:val="22"/>
+          <w:szCs w:val="22"/>
+        </w:rPr>
+      </w:pPr>
+      <w:r>
+        <w:rPr>
+          <w:color w:val="000000" w:themeColor="text1"/>
+          <w:sz w:val="22"/>
+          <w:szCs w:val="22"/>
+        </w:rPr>
+        <w:t xml:space="preserve">Containers are smaller and more portable  </w:t>
+      </w:r>
+    </w:p>
+    <w:p>
+      <w:pPr>
+        <w:rPr>
+          <w:color w:val="000000" w:themeColor="text1"/>
+          <w:sz w:val="22"/>
+          <w:szCs w:val="22"/>
+        </w:rPr>
+      </w:pPr>
+      <w:r>
+        <w:rPr>
+          <w:color w:val="000000" w:themeColor="text1"/>
+          <w:sz w:val="22"/>
+          <w:szCs w:val="22"/>
+        </w:rPr>
+        <w:t>You</w:t>
+      </w:r>
+      <w:r>
+        <w:rPr>
+          <w:color w:val="000000" w:themeColor="text1"/>
+          <w:sz w:val="22"/>
+          <w:szCs w:val="22"/>
+        </w:rPr>
+        <w:t xml:space="preserve"> </w:t>
+      </w:r>
+      <w:r>
+        <w:rPr>
+          <w:color w:val="000000" w:themeColor="text1"/>
+          <w:sz w:val="22"/>
+          <w:szCs w:val="22"/>
+        </w:rPr>
+        <w:t>can</w:t>
+      </w:r>
+      <w:r>
+        <w:rPr>
+          <w:color w:val="000000" w:themeColor="text1"/>
+          <w:sz w:val="22"/>
+          <w:szCs w:val="22"/>
+        </w:rPr>
+        <w:t xml:space="preserve"> </w:t>
+      </w:r>
+      <w:r>
+        <w:rPr>
+          <w:color w:val="000000" w:themeColor="text1"/>
+          <w:sz w:val="22"/>
+          <w:szCs w:val="22"/>
+        </w:rPr>
+        <w:t>run</w:t>
+      </w:r>
+      <w:r>
+        <w:rPr>
+          <w:color w:val="000000" w:themeColor="text1"/>
+          <w:sz w:val="22"/>
+          <w:szCs w:val="22"/>
+        </w:rPr>
+        <w:t xml:space="preserve"> </w:t>
+      </w:r>
+      <w:r>
+        <w:rPr>
+          <w:color w:val="000000" w:themeColor="text1"/>
+          <w:sz w:val="22"/>
+          <w:szCs w:val="22"/>
+        </w:rPr>
+        <w:t>more</w:t>
+      </w:r>
+      <w:r>
+        <w:rPr>
+          <w:color w:val="000000" w:themeColor="text1"/>
+          <w:sz w:val="22"/>
+          <w:szCs w:val="22"/>
+        </w:rPr>
+        <w:t xml:space="preserve"> </w:t>
+      </w:r>
+      <w:r>
+        <w:rPr>
+          <w:color w:val="000000" w:themeColor="text1"/>
+          <w:sz w:val="22"/>
+          <w:szCs w:val="22"/>
+        </w:rPr>
+        <w:t xml:space="preserve">containers on your infrastructure  </w:t>
+      </w:r>
+    </w:p>
+    <w:p>
+      <w:pPr>
+        <w:rPr>
+          <w:color w:val="000000" w:themeColor="text1"/>
+          <w:sz w:val="22"/>
+          <w:szCs w:val="22"/>
+        </w:rPr>
+      </w:pPr>
+      <w:r>
+        <w:rPr>
+          <w:color w:val="000000" w:themeColor="text1"/>
+          <w:sz w:val="22"/>
+          <w:szCs w:val="22"/>
+        </w:rPr>
+        <w:t xml:space="preserve">Containers start faster </w:t>
+      </w:r>
+    </w:p>
+    <w:p>
+      <w:pPr>
+        <w:rPr>
+          <w:color w:val="000000" w:themeColor="text1"/>
+          <w:sz w:val="22"/>
+          <w:szCs w:val="22"/>
+        </w:rPr>
+      </w:pPr>
+      <w:r>
+        <w:rPr>
+          <w:color w:val="000000" w:themeColor="text1"/>
+          <w:sz w:val="22"/>
+          <w:szCs w:val="22"/>
+        </w:rPr>
+        <w:t xml:space="preserve">Containers reduce the number of operating systems you need to manage (patch, update, etc.) </w:t>
+      </w:r>
+    </w:p>
+    <w:p>
+      <w:pPr>
+        <w:rPr>
+          <w:color w:val="000000" w:themeColor="text1"/>
+          <w:sz w:val="22"/>
+          <w:szCs w:val="22"/>
+        </w:rPr>
+      </w:pPr>
+      <w:r>
+        <w:rPr>
+          <w:color w:val="000000" w:themeColor="text1"/>
+          <w:sz w:val="22"/>
+          <w:szCs w:val="22"/>
+        </w:rPr>
+        <w:t>Containers present a smaller attack surface</w:t>
+      </w:r>
+    </w:p>
+    <w:p>
+      <w:pPr>
+        <w:rPr>
+          <w:color w:val="000000" w:themeColor="text1"/>
+          <w:sz w:val="22"/>
+          <w:szCs w:val="22"/>
+        </w:rPr>
+      </w:pPr>
+      <w:r>
+        <w:rPr>
+          <w:color w:val="000000" w:themeColor="text1"/>
+          <w:sz w:val="22"/>
+          <w:szCs w:val="22"/>
+        </w:rPr>
+        <w:t>images are shared by all containers created from it, an image is a read only, while a container has a read write option, each container has a read/write we can pause it and the changes are going to be saved, however these changes don’t affect the image. and when we delete the container the read/write of it is gone</w:t>
+      </w:r>
+    </w:p>
+    <w:p>
+      <w:pPr>
+        <w:rPr>
+          <w:color w:val="000000" w:themeColor="text1"/>
+          <w:sz w:val="22"/>
+          <w:szCs w:val="22"/>
+        </w:rPr>
+      </w:pPr>
+      <w:r>
+        <w:rPr>
+          <w:color w:val="EE0000"/>
+          <w:sz w:val="22"/>
+          <w:szCs w:val="22"/>
+        </w:rPr>
+        <w:t xml:space="preserve">docker inspect mint </w:t>
+      </w:r>
+      <w:r>
+        <w:rPr>
+          <w:color w:val="000000" w:themeColor="text1"/>
+          <w:sz w:val="22"/>
+          <w:szCs w:val="22"/>
+        </w:rPr>
+        <w:sym w:font="Wingdings" w:char="F0E0"/>
+      </w:r>
+      <w:r>
+        <w:rPr>
+          <w:color w:val="000000" w:themeColor="text1"/>
+          <w:sz w:val="22"/>
+          <w:szCs w:val="22"/>
+        </w:rPr>
+        <w:t xml:space="preserve"> this returns the metadata of an image, including its entry points the digests of each layer, how many layers exists and so on.</w:t>
+      </w:r>
+    </w:p>
+    <w:p>
+      <w:pPr>
+        <w:rPr>
+          <w:color w:val="000000" w:themeColor="text1"/>
+          <w:sz w:val="22"/>
+          <w:szCs w:val="22"/>
+        </w:rPr>
+      </w:pPr>
+    </w:p>
+    <w:p>
+      <w:pPr>
+        <w:rPr>
+          <w:color w:val="000000" w:themeColor="text1"/>
+          <w:sz w:val="22"/>
+          <w:szCs w:val="22"/>
+        </w:rPr>
+      </w:pPr>
+      <w:proofErr w:type="spellStart"/>
+      <w:r>
+        <w:rPr>
+          <w:color w:val="000000" w:themeColor="text1"/>
+          <w:sz w:val="22"/>
+          <w:szCs w:val="22"/>
+        </w:rPr>
+        <w:t>i</w:t>
+      </w:r>
+      <w:proofErr w:type="spellEnd"/>
+      <w:r>
+        <w:rPr>
+          <w:color w:val="000000" w:themeColor="text1"/>
+          <w:sz w:val="22"/>
+          <w:szCs w:val="22"/>
+        </w:rPr>
+        <w:t xml:space="preserve"> </w:t>
+      </w:r>
+      <w:r>
+        <w:rPr>
+          <w:color w:val="000000" w:themeColor="text1"/>
+          <w:sz w:val="22"/>
+          <w:szCs w:val="22"/>
+        </w:rPr>
+        <w:t>will be</w:t>
+      </w:r>
+      <w:r>
+        <w:rPr>
+          <w:color w:val="000000" w:themeColor="text1"/>
+          <w:sz w:val="22"/>
+          <w:szCs w:val="22"/>
+        </w:rPr>
+        <w:t xml:space="preserve"> run</w:t>
+      </w:r>
+      <w:r>
+        <w:rPr>
+          <w:color w:val="000000" w:themeColor="text1"/>
+          <w:sz w:val="22"/>
+          <w:szCs w:val="22"/>
+        </w:rPr>
+        <w:t>ning</w:t>
+      </w:r>
+      <w:r>
+        <w:rPr>
+          <w:color w:val="000000" w:themeColor="text1"/>
+          <w:sz w:val="22"/>
+          <w:szCs w:val="22"/>
+        </w:rPr>
+        <w:t xml:space="preserve"> almost every docker container in detached mood, until </w:t>
+      </w:r>
+      <w:r>
+        <w:rPr>
+          <w:color w:val="000000" w:themeColor="text1"/>
+          <w:sz w:val="22"/>
+          <w:szCs w:val="22"/>
+        </w:rPr>
+        <w:t xml:space="preserve">we </w:t>
+      </w:r>
+      <w:r>
+        <w:rPr>
+          <w:color w:val="000000" w:themeColor="text1"/>
+          <w:sz w:val="22"/>
+          <w:szCs w:val="22"/>
+        </w:rPr>
+        <w:t xml:space="preserve">need to interact with it inside </w:t>
+      </w:r>
+      <w:r>
+        <w:rPr>
+          <w:color w:val="000000" w:themeColor="text1"/>
+          <w:sz w:val="22"/>
+          <w:szCs w:val="22"/>
+        </w:rPr>
+        <w:t>our</w:t>
+      </w:r>
+      <w:r>
+        <w:rPr>
+          <w:color w:val="000000" w:themeColor="text1"/>
+          <w:sz w:val="22"/>
+          <w:szCs w:val="22"/>
+        </w:rPr>
+        <w:t xml:space="preserve"> docker terminal</w:t>
+      </w:r>
+      <w:r>
+        <w:rPr>
+          <w:color w:val="000000" w:themeColor="text1"/>
+          <w:sz w:val="22"/>
+          <w:szCs w:val="22"/>
+        </w:rPr>
+        <w:t>, most common for databases and APIs, only if we need to see logs of the container or debug it or use it in -it mode.</w:t>
+      </w:r>
+    </w:p>
+    <w:p>
+      <w:pPr>
+        <w:rPr>
+          <w:color w:val="000000" w:themeColor="text1"/>
+          <w:sz w:val="22"/>
+          <w:szCs w:val="22"/>
+        </w:rPr>
+      </w:pPr>
+    </w:p>
+    <w:p>
+      <w:pPr>
+        <w:rPr>
+          <w:color w:val="000000" w:themeColor="text1"/>
+          <w:sz w:val="22"/>
+          <w:szCs w:val="22"/>
+        </w:rPr>
+      </w:pPr>
+      <w:r>
+        <w:rPr>
+          <w:color w:val="EE0000"/>
+          <w:sz w:val="22"/>
+          <w:szCs w:val="22"/>
+        </w:rPr>
+        <w:t xml:space="preserve">docker inspect </w:t>
+      </w:r>
+      <w:proofErr w:type="spellStart"/>
+      <w:r>
+        <w:rPr>
+          <w:color w:val="EE0000"/>
+          <w:sz w:val="22"/>
+          <w:szCs w:val="22"/>
+        </w:rPr>
+        <w:t>image_name</w:t>
+      </w:r>
+      <w:proofErr w:type="spellEnd"/>
+      <w:r>
+        <w:rPr>
+          <w:color w:val="EE0000"/>
+          <w:sz w:val="22"/>
+          <w:szCs w:val="22"/>
+        </w:rPr>
+        <w:t xml:space="preserve"> | grep </w:t>
+      </w:r>
+      <w:proofErr w:type="spellStart"/>
+      <w:r>
+        <w:rPr>
+          <w:color w:val="EE0000"/>
+          <w:sz w:val="22"/>
+          <w:szCs w:val="22"/>
+        </w:rPr>
+        <w:t>Entrypoint</w:t>
+      </w:r>
+      <w:proofErr w:type="spellEnd"/>
+      <w:r>
+        <w:rPr>
+          <w:color w:val="EE0000"/>
+          <w:sz w:val="22"/>
+          <w:szCs w:val="22"/>
+        </w:rPr>
+        <w:t>-A 3</w:t>
+      </w:r>
+      <w:r>
+        <w:rPr>
+          <w:color w:val="EE0000"/>
+          <w:sz w:val="22"/>
+          <w:szCs w:val="22"/>
+        </w:rPr>
+        <w:t xml:space="preserve"> </w:t>
+      </w:r>
+      <w:r>
+        <w:rPr>
+          <w:color w:val="EE0000"/>
+          <w:sz w:val="22"/>
+          <w:szCs w:val="22"/>
+        </w:rPr>
+        <w:sym w:font="Wingdings" w:char="F0E0"/>
+      </w:r>
+      <w:r>
+        <w:rPr>
+          <w:color w:val="EE0000"/>
+          <w:sz w:val="22"/>
+          <w:szCs w:val="22"/>
+        </w:rPr>
+        <w:t xml:space="preserve"> </w:t>
+      </w:r>
+      <w:r>
+        <w:rPr>
+          <w:color w:val="000000" w:themeColor="text1"/>
+          <w:sz w:val="22"/>
+          <w:szCs w:val="22"/>
+        </w:rPr>
+        <w:t xml:space="preserve">docker inspect shows the metadata of a certain image or container, </w:t>
+      </w:r>
+    </w:p>
+    <w:p>
+      <w:pPr>
+        <w:rPr>
+          <w:color w:val="000000" w:themeColor="text1"/>
+          <w:sz w:val="22"/>
+          <w:szCs w:val="22"/>
+        </w:rPr>
+      </w:pPr>
+      <w:r>
+        <w:rPr>
+          <w:color w:val="000000" w:themeColor="text1"/>
+          <w:sz w:val="22"/>
+          <w:szCs w:val="22"/>
+        </w:rPr>
+        <w:t xml:space="preserve">grep is a keyword that searches for text patterns. inside files or output and returns the lines that contains this keyword, </w:t>
+      </w:r>
+      <w:proofErr w:type="spellStart"/>
+      <w:r>
+        <w:rPr>
+          <w:color w:val="000000" w:themeColor="text1"/>
+          <w:sz w:val="22"/>
+          <w:szCs w:val="22"/>
+        </w:rPr>
+        <w:t>entrypoint</w:t>
+      </w:r>
+      <w:proofErr w:type="spellEnd"/>
+      <w:r>
+        <w:rPr>
+          <w:color w:val="000000" w:themeColor="text1"/>
+          <w:sz w:val="22"/>
+          <w:szCs w:val="22"/>
+        </w:rPr>
+        <w:t xml:space="preserve"> is the keyword</w:t>
+      </w:r>
+    </w:p>
+    <w:p>
+      <w:pPr>
+        <w:rPr>
+          <w:color w:val="000000" w:themeColor="text1"/>
+          <w:sz w:val="22"/>
+          <w:szCs w:val="22"/>
+        </w:rPr>
+      </w:pPr>
+      <w:r>
+        <w:rPr>
+          <w:color w:val="000000" w:themeColor="text1"/>
+          <w:sz w:val="22"/>
+          <w:szCs w:val="22"/>
+        </w:rPr>
+        <w:t xml:space="preserve">-A 3 </w:t>
+      </w:r>
+      <w:r>
+        <w:rPr>
+          <w:color w:val="000000" w:themeColor="text1"/>
+          <w:sz w:val="22"/>
+          <w:szCs w:val="22"/>
+        </w:rPr>
+        <w:sym w:font="Wingdings" w:char="F0E0"/>
+      </w:r>
+      <w:r>
+        <w:rPr>
+          <w:color w:val="000000" w:themeColor="text1"/>
+          <w:sz w:val="22"/>
+          <w:szCs w:val="22"/>
+        </w:rPr>
+        <w:t xml:space="preserve"> means show me 3 lines after the keyword is found, -B means before the keyword</w:t>
+      </w:r>
+    </w:p>
+    <w:p>
+      <w:pPr>
+        <w:rPr>
+          <w:color w:val="000000" w:themeColor="text1"/>
+          <w:sz w:val="22"/>
+          <w:szCs w:val="22"/>
+        </w:rPr>
+      </w:pPr>
+      <w:r>
+        <w:rPr>
+          <w:color w:val="000000" w:themeColor="text1"/>
+          <w:sz w:val="22"/>
+          <w:szCs w:val="22"/>
+        </w:rPr>
+        <w:t>And -C means 3 before and 3 after</w:t>
+      </w:r>
+    </w:p>
+    <w:p>
+      <w:pPr>
+        <w:rPr>
+          <w:color w:val="000000" w:themeColor="text1"/>
+          <w:sz w:val="22"/>
+          <w:szCs w:val="22"/>
+        </w:rPr>
+      </w:pPr>
+    </w:p>
+    <w:p>
+      <w:pPr>
+        <w:rPr>
+          <w:color w:val="000000" w:themeColor="text1"/>
+          <w:sz w:val="22"/>
+          <w:szCs w:val="22"/>
+        </w:rPr>
+      </w:pPr>
+    </w:p>
+    <w:p>
+      <w:pPr>
+        <w:rPr>
+          <w:color w:val="000000" w:themeColor="text1"/>
+          <w:sz w:val="22"/>
+          <w:szCs w:val="22"/>
+        </w:rPr>
+      </w:pPr>
+    </w:p>
+    <w:p>
+      <w:pPr>
         <w:rPr>
           <w:b/>
           <w:bCs/>
@@ -2508,78 +3073,131 @@
           <w:szCs w:val="28"/>
           <w:u w:val="single"/>
         </w:rPr>
+      </w:pPr>
+      <w:r>
+        <w:rPr>
+          <w:b/>
+          <w:bCs/>
+          <w:color w:val="000000" w:themeColor="text1"/>
+          <w:sz w:val="28"/>
+          <w:szCs w:val="28"/>
+          <w:u w:val="single"/>
+        </w:rPr>
         <w:lastRenderedPageBreak/>
-        <w:t>Chapter 7 Working with Containers</w:t>
-      </w:r>
-    </w:p>
-    <w:p>
-      <w:pPr>
-        <w:rPr>
-          <w:color w:val="000000" w:themeColor="text1"/>
-          <w:sz w:val="22"/>
-          <w:szCs w:val="22"/>
-        </w:rPr>
-      </w:pPr>
-      <w:r>
-        <w:rPr>
-          <w:color w:val="000000" w:themeColor="text1"/>
-          <w:sz w:val="22"/>
-          <w:szCs w:val="22"/>
-        </w:rPr>
-        <w:t>Containers are run-time instances of images, and you can start one or more containers from a single image.</w:t>
-      </w:r>
-      <w:r>
-        <w:rPr>
-          <w:color w:val="000000" w:themeColor="text1"/>
-          <w:sz w:val="22"/>
-          <w:szCs w:val="22"/>
-        </w:rPr>
-        <w:t xml:space="preserve"> where we can write to a container unlike an image.</w:t>
-      </w:r>
-    </w:p>
-    <w:p>
-      <w:pPr>
-        <w:rPr>
-          <w:color w:val="000000" w:themeColor="text1"/>
-          <w:sz w:val="22"/>
-          <w:szCs w:val="22"/>
-        </w:rPr>
-      </w:pPr>
-      <w:r>
-        <w:rPr>
-          <w:color w:val="000000" w:themeColor="text1"/>
-          <w:sz w:val="22"/>
-          <w:szCs w:val="22"/>
-        </w:rPr>
-        <w:t>containers are stateless and more light weight. containers are used in microservices.</w:t>
-      </w:r>
-    </w:p>
-    <w:p>
-      <w:pPr>
-        <w:rPr>
-          <w:color w:val="000000" w:themeColor="text1"/>
-          <w:sz w:val="22"/>
-          <w:szCs w:val="22"/>
-        </w:rPr>
-      </w:pPr>
+        <w:t>Connecting to a container</w:t>
+      </w:r>
+      <w:r>
+        <w:rPr>
+          <w:b/>
+          <w:bCs/>
+          <w:color w:val="000000" w:themeColor="text1"/>
+          <w:sz w:val="28"/>
+          <w:szCs w:val="28"/>
+          <w:u w:val="single"/>
+        </w:rPr>
+        <w:t>:</w:t>
+      </w:r>
+    </w:p>
+    <w:p>
+      <w:pPr>
+        <w:rPr>
+          <w:color w:val="000000" w:themeColor="text1"/>
+          <w:sz w:val="22"/>
+          <w:szCs w:val="22"/>
+        </w:rPr>
+      </w:pPr>
+      <w:r>
+        <w:rPr>
+          <w:color w:val="EE0000"/>
+          <w:sz w:val="22"/>
+          <w:szCs w:val="22"/>
+        </w:rPr>
+        <w:t xml:space="preserve">docker exec-it webserver </w:t>
+      </w:r>
       <w:proofErr w:type="spellStart"/>
       <w:r>
         <w:rPr>
-          <w:color w:val="000000" w:themeColor="text1"/>
-          <w:sz w:val="22"/>
-          <w:szCs w:val="22"/>
-        </w:rPr>
-        <w:t>VMsvirtualize</w:t>
+          <w:color w:val="EE0000"/>
+          <w:sz w:val="22"/>
+          <w:szCs w:val="22"/>
+        </w:rPr>
+        <w:t>sh</w:t>
       </w:r>
       <w:proofErr w:type="spellEnd"/>
       <w:r>
         <w:rPr>
-          <w:color w:val="000000" w:themeColor="text1"/>
+          <w:color w:val="EE0000"/>
           <w:sz w:val="22"/>
           <w:szCs w:val="22"/>
         </w:rPr>
         <w:t xml:space="preserve"> </w:t>
       </w:r>
+      <w:r>
+        <w:rPr>
+          <w:color w:val="000000" w:themeColor="text1"/>
+          <w:sz w:val="22"/>
+          <w:szCs w:val="22"/>
+        </w:rPr>
+        <w:sym w:font="Wingdings" w:char="F0E0"/>
+      </w:r>
+      <w:r>
+        <w:rPr>
+          <w:color w:val="000000" w:themeColor="text1"/>
+          <w:sz w:val="22"/>
+          <w:szCs w:val="22"/>
+        </w:rPr>
+        <w:t xml:space="preserve"> lets jump deep into this command, here we are executing something inside a running container, -it </w:t>
+      </w:r>
+      <w:r>
+        <w:rPr>
+          <w:color w:val="000000" w:themeColor="text1"/>
+          <w:sz w:val="22"/>
+          <w:szCs w:val="22"/>
+        </w:rPr>
+        <w:sym w:font="Wingdings" w:char="F0E0"/>
+      </w:r>
+      <w:r>
+        <w:rPr>
+          <w:color w:val="000000" w:themeColor="text1"/>
+          <w:sz w:val="22"/>
+          <w:szCs w:val="22"/>
+        </w:rPr>
+        <w:t xml:space="preserve"> means interactive which means we can send more than just one message and interact with our container until we decide to stop. the container name is webserver no explanation needed, </w:t>
+      </w:r>
+      <w:proofErr w:type="spellStart"/>
+      <w:r>
+        <w:rPr>
+          <w:color w:val="000000" w:themeColor="text1"/>
+          <w:sz w:val="22"/>
+          <w:szCs w:val="22"/>
+        </w:rPr>
+        <w:t>sh</w:t>
+      </w:r>
+      <w:proofErr w:type="spellEnd"/>
+      <w:r>
+        <w:rPr>
+          <w:color w:val="000000" w:themeColor="text1"/>
+          <w:sz w:val="22"/>
+          <w:szCs w:val="22"/>
+        </w:rPr>
+        <w:t xml:space="preserve"> </w:t>
+      </w:r>
+      <w:r>
+        <w:rPr>
+          <w:color w:val="000000" w:themeColor="text1"/>
+          <w:sz w:val="22"/>
+          <w:szCs w:val="22"/>
+        </w:rPr>
+        <w:sym w:font="Wingdings" w:char="F0E0"/>
+      </w:r>
+      <w:r>
+        <w:rPr>
+          <w:color w:val="000000" w:themeColor="text1"/>
+          <w:sz w:val="22"/>
+          <w:szCs w:val="22"/>
+        </w:rPr>
+        <w:t xml:space="preserve"> this part here </w:t>
+      </w:r>
       <w:proofErr w:type="gramStart"/>
       <w:r>
         <w:rPr>
@@ -2587,15 +3205,7 @@
           <w:sz w:val="22"/>
           <w:szCs w:val="22"/>
         </w:rPr>
-        <w:t xml:space="preserve">hardware </w:t>
-      </w:r>
-      <w:r>
-        <w:rPr>
-          <w:color w:val="000000" w:themeColor="text1"/>
-          <w:sz w:val="22"/>
-          <w:szCs w:val="22"/>
-        </w:rPr>
-        <w:t>,</w:t>
+        <w:t>create</w:t>
       </w:r>
       <w:proofErr w:type="gramEnd"/>
       <w:r>
@@ -2604,53 +3214,66 @@
           <w:sz w:val="22"/>
           <w:szCs w:val="22"/>
         </w:rPr>
-        <w:t xml:space="preserve"> Containers virtualize operating systems</w:t>
-      </w:r>
-      <w:r>
-        <w:rPr>
-          <w:color w:val="000000" w:themeColor="text1"/>
-          <w:sz w:val="22"/>
-          <w:szCs w:val="22"/>
-        </w:rPr>
-        <w:t>; however, they both are used to run anywhere, on the local machine, cloud, servers anywhere.</w:t>
-      </w:r>
-    </w:p>
-    <w:p>
-      <w:pPr>
-        <w:rPr>
-          <w:color w:val="000000" w:themeColor="text1"/>
-          <w:sz w:val="22"/>
-          <w:szCs w:val="22"/>
-        </w:rPr>
-      </w:pPr>
-      <w:r>
-        <w:rPr>
-          <w:color w:val="000000" w:themeColor="text1"/>
-          <w:sz w:val="22"/>
-          <w:szCs w:val="22"/>
-        </w:rPr>
-        <w:t xml:space="preserve">Containers are smaller and more portable  </w:t>
-      </w:r>
-    </w:p>
-    <w:p>
-      <w:pPr>
-        <w:rPr>
-          <w:color w:val="000000" w:themeColor="text1"/>
-          <w:sz w:val="22"/>
-          <w:szCs w:val="22"/>
-        </w:rPr>
-      </w:pPr>
-      <w:r>
-        <w:rPr>
-          <w:color w:val="000000" w:themeColor="text1"/>
-          <w:sz w:val="22"/>
-          <w:szCs w:val="22"/>
-        </w:rPr>
-        <w:t>You</w:t>
-      </w:r>
-      <w:r>
-        <w:rPr>
-          <w:color w:val="000000" w:themeColor="text1"/>
+        <w:t xml:space="preserve"> a shell inside the container so we can interact through it. why would we have a shell? </w:t>
+      </w:r>
+      <w:proofErr w:type="spellStart"/>
+      <w:proofErr w:type="gramStart"/>
+      <w:r>
+        <w:rPr>
+          <w:color w:val="000000" w:themeColor="text1"/>
+          <w:sz w:val="22"/>
+          <w:szCs w:val="22"/>
+        </w:rPr>
+        <w:t>its</w:t>
+      </w:r>
+      <w:proofErr w:type="spellEnd"/>
+      <w:proofErr w:type="gramEnd"/>
+      <w:r>
+        <w:rPr>
+          <w:color w:val="000000" w:themeColor="text1"/>
+          <w:sz w:val="22"/>
+          <w:szCs w:val="22"/>
+        </w:rPr>
+        <w:t xml:space="preserve"> good for debugging, checking our environment variables, connections inside the container and so on.</w:t>
+      </w:r>
+    </w:p>
+    <w:p>
+      <w:pPr>
+        <w:rPr>
+          <w:color w:val="000000" w:themeColor="text1"/>
+          <w:sz w:val="22"/>
+          <w:szCs w:val="22"/>
+        </w:rPr>
+      </w:pPr>
+      <w:r>
+        <w:rPr>
+          <w:color w:val="EE0000"/>
+          <w:sz w:val="22"/>
+          <w:szCs w:val="22"/>
+        </w:rPr>
+        <w:t>docker exec -it mint-</w:t>
+      </w:r>
+      <w:proofErr w:type="spellStart"/>
+      <w:r>
+        <w:rPr>
+          <w:color w:val="EE0000"/>
+          <w:sz w:val="22"/>
+          <w:szCs w:val="22"/>
+        </w:rPr>
+        <w:t>contianer</w:t>
+      </w:r>
+      <w:proofErr w:type="spellEnd"/>
+      <w:r>
+        <w:rPr>
+          <w:color w:val="EE0000"/>
+          <w:sz w:val="22"/>
+          <w:szCs w:val="22"/>
+        </w:rPr>
+        <w:t xml:space="preserve"> bash</w:t>
+      </w:r>
+      <w:r>
+        <w:rPr>
+          <w:color w:val="EE0000"/>
           <w:sz w:val="22"/>
           <w:szCs w:val="22"/>
         </w:rPr>
@@ -2658,15 +3281,15 @@
       </w:r>
       <w:r>
         <w:rPr>
-          <w:color w:val="000000" w:themeColor="text1"/>
-          <w:sz w:val="22"/>
-          <w:szCs w:val="22"/>
-        </w:rPr>
-        <w:t>can</w:t>
-      </w:r>
-      <w:r>
-        <w:rPr>
-          <w:color w:val="000000" w:themeColor="text1"/>
+          <w:color w:val="EE0000"/>
+          <w:sz w:val="22"/>
+          <w:szCs w:val="22"/>
+        </w:rPr>
+        <w:sym w:font="Wingdings" w:char="F0E0"/>
+      </w:r>
+      <w:r>
+        <w:rPr>
+          <w:color w:val="EE0000"/>
           <w:sz w:val="22"/>
           <w:szCs w:val="22"/>
         </w:rPr>
@@ -2678,11 +3301,257 @@
           <w:sz w:val="22"/>
           <w:szCs w:val="22"/>
         </w:rPr>
-        <w:t>run</w:t>
-      </w:r>
-      <w:r>
-        <w:rPr>
-          <w:color w:val="000000" w:themeColor="text1"/>
+        <w:t>this is for docker windows this runs a bash or a shell to interact with the container from the inside</w:t>
+      </w:r>
+    </w:p>
+    <w:p>
+      <w:pPr>
+        <w:rPr>
+          <w:color w:val="000000" w:themeColor="text1"/>
+          <w:sz w:val="22"/>
+          <w:szCs w:val="22"/>
+        </w:rPr>
+      </w:pPr>
+    </w:p>
+    <w:p>
+      <w:pPr>
+        <w:rPr>
+          <w:b/>
+          <w:bCs/>
+          <w:color w:val="000000" w:themeColor="text1"/>
+          <w:sz w:val="28"/>
+          <w:szCs w:val="28"/>
+          <w:u w:val="single"/>
+        </w:rPr>
+      </w:pPr>
+      <w:r>
+        <w:rPr>
+          <w:b/>
+          <w:bCs/>
+          <w:color w:val="000000" w:themeColor="text1"/>
+          <w:sz w:val="28"/>
+          <w:szCs w:val="28"/>
+          <w:u w:val="single"/>
+        </w:rPr>
+        <w:t>Inspecting container processes</w:t>
+      </w:r>
+      <w:r>
+        <w:rPr>
+          <w:b/>
+          <w:bCs/>
+          <w:color w:val="000000" w:themeColor="text1"/>
+          <w:sz w:val="28"/>
+          <w:szCs w:val="28"/>
+          <w:u w:val="single"/>
+        </w:rPr>
+        <w:t>:</w:t>
+      </w:r>
+    </w:p>
+    <w:p>
+      <w:pPr>
+        <w:rPr>
+          <w:color w:val="000000" w:themeColor="text1"/>
+          <w:sz w:val="22"/>
+          <w:szCs w:val="22"/>
+        </w:rPr>
+      </w:pPr>
+      <w:r>
+        <w:rPr>
+          <w:color w:val="000000" w:themeColor="text1"/>
+          <w:sz w:val="22"/>
+          <w:szCs w:val="22"/>
+        </w:rPr>
+        <w:t xml:space="preserve">on docker windows to view all the processes running inside our container in the bash we write </w:t>
+      </w:r>
+      <w:proofErr w:type="spellStart"/>
+      <w:r>
+        <w:rPr>
+          <w:color w:val="000000" w:themeColor="text1"/>
+          <w:sz w:val="22"/>
+          <w:szCs w:val="22"/>
+        </w:rPr>
+        <w:t>ps</w:t>
+      </w:r>
+      <w:proofErr w:type="spellEnd"/>
+      <w:r>
+        <w:rPr>
+          <w:color w:val="000000" w:themeColor="text1"/>
+          <w:sz w:val="22"/>
+          <w:szCs w:val="22"/>
+        </w:rPr>
+        <w:t xml:space="preserve"> -e to show all the processes and the process with PID of 1, is the main process of the container usually each container runs only one process.</w:t>
+      </w:r>
+    </w:p>
+    <w:p>
+      <w:pPr>
+        <w:rPr>
+          <w:color w:val="000000" w:themeColor="text1"/>
+          <w:sz w:val="22"/>
+          <w:szCs w:val="22"/>
+        </w:rPr>
+      </w:pPr>
+    </w:p>
+    <w:p>
+      <w:pPr>
+        <w:rPr>
+          <w:color w:val="000000" w:themeColor="text1"/>
+          <w:sz w:val="22"/>
+          <w:szCs w:val="22"/>
+        </w:rPr>
+      </w:pPr>
+      <w:r>
+        <w:rPr>
+          <w:color w:val="000000" w:themeColor="text1"/>
+          <w:sz w:val="22"/>
+          <w:szCs w:val="22"/>
+        </w:rPr>
+        <w:t xml:space="preserve">now when we execute this on our running container: </w:t>
+      </w:r>
+      <w:r>
+        <w:rPr>
+          <w:color w:val="EE0000"/>
+          <w:sz w:val="22"/>
+          <w:szCs w:val="22"/>
+        </w:rPr>
+        <w:t xml:space="preserve">docker exec </w:t>
+      </w:r>
+      <w:r>
+        <w:rPr>
+          <w:color w:val="EE0000"/>
+          <w:sz w:val="22"/>
+          <w:szCs w:val="22"/>
+        </w:rPr>
+        <w:t xml:space="preserve">mint-container </w:t>
+      </w:r>
+      <w:proofErr w:type="spellStart"/>
+      <w:r>
+        <w:rPr>
+          <w:color w:val="EE0000"/>
+          <w:sz w:val="22"/>
+          <w:szCs w:val="22"/>
+        </w:rPr>
+        <w:t>ps</w:t>
+      </w:r>
+      <w:proofErr w:type="spellEnd"/>
+      <w:r>
+        <w:rPr>
+          <w:color w:val="EE0000"/>
+          <w:sz w:val="22"/>
+          <w:szCs w:val="22"/>
+        </w:rPr>
+        <w:t xml:space="preserve"> -e</w:t>
+      </w:r>
+    </w:p>
+    <w:p>
+      <w:pPr>
+        <w:rPr>
+          <w:color w:val="000000" w:themeColor="text1"/>
+          <w:sz w:val="22"/>
+          <w:szCs w:val="22"/>
+        </w:rPr>
+      </w:pPr>
+      <w:r>
+        <w:rPr>
+          <w:color w:val="000000" w:themeColor="text1"/>
+          <w:sz w:val="22"/>
+          <w:szCs w:val="22"/>
+        </w:rPr>
+        <w:t xml:space="preserve">it will send one </w:t>
+      </w:r>
+      <w:proofErr w:type="spellStart"/>
+      <w:r>
+        <w:rPr>
+          <w:color w:val="000000" w:themeColor="text1"/>
+          <w:sz w:val="22"/>
+          <w:szCs w:val="22"/>
+        </w:rPr>
+        <w:t>api</w:t>
+      </w:r>
+      <w:proofErr w:type="spellEnd"/>
+      <w:r>
+        <w:rPr>
+          <w:color w:val="000000" w:themeColor="text1"/>
+          <w:sz w:val="22"/>
+          <w:szCs w:val="22"/>
+        </w:rPr>
+        <w:t xml:space="preserve"> request to the running container then terminate the connection.</w:t>
+      </w:r>
+    </w:p>
+    <w:p>
+      <w:pPr>
+        <w:rPr>
+          <w:color w:val="000000" w:themeColor="text1"/>
+          <w:sz w:val="22"/>
+          <w:szCs w:val="22"/>
+        </w:rPr>
+      </w:pPr>
+    </w:p>
+    <w:p>
+      <w:pPr>
+        <w:rPr>
+          <w:color w:val="000000" w:themeColor="text1"/>
+          <w:sz w:val="22"/>
+          <w:szCs w:val="22"/>
+        </w:rPr>
+      </w:pPr>
+      <w:r>
+        <w:rPr>
+          <w:color w:val="EE0000"/>
+          <w:sz w:val="22"/>
+          <w:szCs w:val="22"/>
+        </w:rPr>
+        <w:t xml:space="preserve">docker inspect </w:t>
+      </w:r>
+      <w:proofErr w:type="spellStart"/>
+      <w:r>
+        <w:rPr>
+          <w:color w:val="EE0000"/>
+          <w:sz w:val="22"/>
+          <w:szCs w:val="22"/>
+        </w:rPr>
+        <w:t>running_container_name</w:t>
+      </w:r>
+      <w:proofErr w:type="spellEnd"/>
+      <w:r>
+        <w:rPr>
+          <w:color w:val="000000" w:themeColor="text1"/>
+          <w:sz w:val="22"/>
+          <w:szCs w:val="22"/>
+        </w:rPr>
+        <w:t xml:space="preserve"> returns all the meta data about the container </w:t>
+      </w:r>
+    </w:p>
+    <w:p>
+      <w:pPr>
+        <w:rPr>
+          <w:color w:val="000000" w:themeColor="text1"/>
+          <w:sz w:val="22"/>
+          <w:szCs w:val="22"/>
+        </w:rPr>
+      </w:pPr>
+      <w:r>
+        <w:rPr>
+          <w:color w:val="EE0000"/>
+          <w:sz w:val="22"/>
+          <w:szCs w:val="22"/>
+        </w:rPr>
+        <w:t xml:space="preserve">docker inspect </w:t>
+      </w:r>
+      <w:proofErr w:type="spellStart"/>
+      <w:proofErr w:type="gramStart"/>
+      <w:r>
+        <w:rPr>
+          <w:color w:val="EE0000"/>
+          <w:sz w:val="22"/>
+          <w:szCs w:val="22"/>
+        </w:rPr>
+        <w:t>image:tag</w:t>
+      </w:r>
+      <w:proofErr w:type="spellEnd"/>
+      <w:proofErr w:type="gramEnd"/>
+      <w:r>
+        <w:rPr>
+          <w:color w:val="EE0000"/>
           <w:sz w:val="22"/>
           <w:szCs w:val="22"/>
         </w:rPr>
@@ -2690,17 +3559,88 @@
       </w:r>
       <w:r>
         <w:rPr>
-          <w:color w:val="000000" w:themeColor="text1"/>
-          <w:sz w:val="22"/>
-          <w:szCs w:val="22"/>
-        </w:rPr>
-        <w:t>more</w:t>
-      </w:r>
-      <w:r>
-        <w:rPr>
-          <w:color w:val="000000" w:themeColor="text1"/>
-          <w:sz w:val="22"/>
-          <w:szCs w:val="22"/>
+          <w:color w:val="EE0000"/>
+          <w:sz w:val="22"/>
+          <w:szCs w:val="22"/>
+        </w:rPr>
+        <w:br/>
+      </w:r>
+    </w:p>
+    <w:p>
+      <w:pPr>
+        <w:rPr>
+          <w:color w:val="000000" w:themeColor="text1"/>
+          <w:sz w:val="22"/>
+          <w:szCs w:val="22"/>
+        </w:rPr>
+      </w:pPr>
+    </w:p>
+    <w:p>
+      <w:pPr>
+        <w:rPr>
+          <w:b/>
+          <w:bCs/>
+          <w:color w:val="000000" w:themeColor="text1"/>
+          <w:sz w:val="28"/>
+          <w:szCs w:val="28"/>
+          <w:u w:val="single"/>
+        </w:rPr>
+      </w:pPr>
+      <w:r>
+        <w:rPr>
+          <w:b/>
+          <w:bCs/>
+          <w:color w:val="000000" w:themeColor="text1"/>
+          <w:sz w:val="28"/>
+          <w:szCs w:val="28"/>
+          <w:u w:val="single"/>
+        </w:rPr>
+        <w:t>Writing data to a container</w:t>
+      </w:r>
+      <w:r>
+        <w:rPr>
+          <w:b/>
+          <w:bCs/>
+          <w:color w:val="000000" w:themeColor="text1"/>
+          <w:sz w:val="28"/>
+          <w:szCs w:val="28"/>
+          <w:u w:val="single"/>
+        </w:rPr>
+        <w:t>:</w:t>
+      </w:r>
+    </w:p>
+    <w:p>
+      <w:pPr>
+        <w:rPr>
+          <w:color w:val="000000" w:themeColor="text1"/>
+          <w:sz w:val="22"/>
+          <w:szCs w:val="22"/>
+        </w:rPr>
+      </w:pPr>
+    </w:p>
+    <w:p>
+      <w:pPr>
+        <w:rPr>
+          <w:color w:val="000000" w:themeColor="text1"/>
+          <w:sz w:val="22"/>
+          <w:szCs w:val="22"/>
+        </w:rPr>
+      </w:pPr>
+      <w:r>
+        <w:rPr>
+          <w:b/>
+          <w:bCs/>
+          <w:color w:val="EE0000"/>
+          <w:sz w:val="32"/>
+          <w:szCs w:val="32"/>
+        </w:rPr>
+        <w:t>WARNING:</w:t>
+      </w:r>
+      <w:r>
+        <w:rPr>
+          <w:color w:val="EE0000"/>
+          <w:sz w:val="32"/>
+          <w:szCs w:val="32"/>
         </w:rPr>
         <w:t xml:space="preserve"> </w:t>
       </w:r>
@@ -2710,96 +3650,11 @@
           <w:sz w:val="22"/>
           <w:szCs w:val="22"/>
         </w:rPr>
-        <w:t xml:space="preserve">containers on your infrastructure  </w:t>
-      </w:r>
-    </w:p>
-    <w:p>
-      <w:pPr>
-        <w:rPr>
-          <w:color w:val="000000" w:themeColor="text1"/>
-          <w:sz w:val="22"/>
-          <w:szCs w:val="22"/>
-        </w:rPr>
-      </w:pPr>
-      <w:r>
-        <w:rPr>
-          <w:color w:val="000000" w:themeColor="text1"/>
-          <w:sz w:val="22"/>
-          <w:szCs w:val="22"/>
-        </w:rPr>
-        <w:t xml:space="preserve">Containers start faster </w:t>
-      </w:r>
-    </w:p>
-    <w:p>
-      <w:pPr>
-        <w:rPr>
-          <w:color w:val="000000" w:themeColor="text1"/>
-          <w:sz w:val="22"/>
-          <w:szCs w:val="22"/>
-        </w:rPr>
-      </w:pPr>
-      <w:r>
-        <w:rPr>
-          <w:color w:val="000000" w:themeColor="text1"/>
-          <w:sz w:val="22"/>
-          <w:szCs w:val="22"/>
-        </w:rPr>
-        <w:t xml:space="preserve">Containers reduce the number of operating systems you need to manage (patch, update, etc.) </w:t>
-      </w:r>
-    </w:p>
-    <w:p>
-      <w:pPr>
-        <w:rPr>
-          <w:color w:val="000000" w:themeColor="text1"/>
-          <w:sz w:val="22"/>
-          <w:szCs w:val="22"/>
-        </w:rPr>
-      </w:pPr>
-      <w:r>
-        <w:rPr>
-          <w:color w:val="000000" w:themeColor="text1"/>
-          <w:sz w:val="22"/>
-          <w:szCs w:val="22"/>
-        </w:rPr>
-        <w:t>Containers present a smaller attack surface</w:t>
-      </w:r>
-    </w:p>
-    <w:p>
-      <w:pPr>
-        <w:rPr>
-          <w:color w:val="000000" w:themeColor="text1"/>
-          <w:sz w:val="22"/>
-          <w:szCs w:val="22"/>
-        </w:rPr>
-      </w:pPr>
-      <w:r>
-        <w:rPr>
-          <w:color w:val="000000" w:themeColor="text1"/>
-          <w:sz w:val="22"/>
-          <w:szCs w:val="22"/>
-        </w:rPr>
-        <w:t>images are shared by all containers created from it, an image is a read only, while a container has a read write option, each container has a read/write we can pause it and the changes are going to be saved, however these changes don’t affect the image. and when we delete the container the read/write of it is gone</w:t>
-      </w:r>
-    </w:p>
-    <w:p>
-      <w:pPr>
-        <w:rPr>
-          <w:color w:val="000000" w:themeColor="text1"/>
-          <w:sz w:val="22"/>
-          <w:szCs w:val="22"/>
-        </w:rPr>
-      </w:pPr>
-      <w:r>
-        <w:rPr>
-          <w:color w:val="EE0000"/>
-          <w:sz w:val="22"/>
-          <w:szCs w:val="22"/>
-        </w:rPr>
-        <w:t>docker inspect mint</w:t>
-      </w:r>
-      <w:r>
-        <w:rPr>
-          <w:color w:val="EE0000"/>
+        <w:t>This</w:t>
+      </w:r>
+      <w:r>
+        <w:rPr>
+          <w:color w:val="000000" w:themeColor="text1"/>
           <w:sz w:val="22"/>
           <w:szCs w:val="22"/>
         </w:rPr>
@@ -2811,6 +3666,31 @@
           <w:sz w:val="22"/>
           <w:szCs w:val="22"/>
         </w:rPr>
+        <w:t>section is for demonstration purposes only. In the real world, you shouldn’t change live containers like this. Any time you need to change a live container, you should create and test a new container with the required changes and then replace the existing container with the new one.</w:t>
+      </w:r>
+    </w:p>
+    <w:p>
+      <w:pPr>
+        <w:rPr>
+          <w:color w:val="000000" w:themeColor="text1"/>
+          <w:sz w:val="22"/>
+          <w:szCs w:val="22"/>
+        </w:rPr>
+      </w:pPr>
+      <w:r>
+        <w:rPr>
+          <w:color w:val="EE0000"/>
+          <w:sz w:val="22"/>
+          <w:szCs w:val="22"/>
+        </w:rPr>
+        <w:t xml:space="preserve">vi file </w:t>
+      </w:r>
+      <w:r>
+        <w:rPr>
+          <w:color w:val="000000" w:themeColor="text1"/>
+          <w:sz w:val="22"/>
+          <w:szCs w:val="22"/>
+        </w:rPr>
         <w:sym w:font="Wingdings" w:char="F0E0"/>
       </w:r>
       <w:r>
@@ -2819,26 +3699,269 @@
           <w:sz w:val="22"/>
           <w:szCs w:val="22"/>
         </w:rPr>
-        <w:t xml:space="preserve"> this returns the metadata of an image, including its entry points the digests of each layer, how many layers exists and so on.</w:t>
-      </w:r>
-    </w:p>
-    <w:p>
-      <w:pPr>
-        <w:rPr>
-          <w:color w:val="000000" w:themeColor="text1"/>
-          <w:sz w:val="22"/>
-          <w:szCs w:val="22"/>
-        </w:rPr>
-      </w:pPr>
-    </w:p>
-    <w:p>
-      <w:pPr>
-        <w:rPr>
-          <w:color w:val="000000" w:themeColor="text1"/>
-          <w:sz w:val="22"/>
-          <w:szCs w:val="22"/>
-        </w:rPr>
-      </w:pPr>
+        <w:t xml:space="preserve"> this command is not installed in the container or image by default but it can be installed manually and its for viewing a file.</w:t>
+      </w:r>
+    </w:p>
+    <w:p>
+      <w:pPr>
+        <w:rPr>
+          <w:color w:val="000000" w:themeColor="text1"/>
+          <w:sz w:val="22"/>
+          <w:szCs w:val="22"/>
+        </w:rPr>
+      </w:pPr>
+      <w:proofErr w:type="gramStart"/>
+      <w:r>
+        <w:rPr>
+          <w:color w:val="000000" w:themeColor="text1"/>
+          <w:sz w:val="22"/>
+          <w:szCs w:val="22"/>
+        </w:rPr>
+        <w:t>(</w:t>
+      </w:r>
+      <w:r>
+        <w:rPr>
+          <w:b/>
+          <w:bCs/>
+          <w:color w:val="000000" w:themeColor="text1"/>
+          <w:sz w:val="22"/>
+          <w:szCs w:val="22"/>
+        </w:rPr>
+        <w:t>:</w:t>
+      </w:r>
+      <w:proofErr w:type="spellStart"/>
+      <w:r>
+        <w:rPr>
+          <w:b/>
+          <w:bCs/>
+          <w:color w:val="000000" w:themeColor="text1"/>
+          <w:sz w:val="22"/>
+          <w:szCs w:val="22"/>
+        </w:rPr>
+        <w:t>wq</w:t>
+      </w:r>
+      <w:proofErr w:type="spellEnd"/>
+      <w:proofErr w:type="gramEnd"/>
+      <w:r>
+        <w:rPr>
+          <w:color w:val="000000" w:themeColor="text1"/>
+          <w:sz w:val="22"/>
+          <w:szCs w:val="22"/>
+        </w:rPr>
+        <w:t xml:space="preserve"> is short for write and quit)</w:t>
+      </w:r>
+    </w:p>
+    <w:tbl>
+      <w:tblPr>
+        <w:tblW w:w="11280" w:type="dxa"/>
+        <w:shd w:val="clear" w:color="auto" w:fill="FFFFFF"/>
+        <w:tblCellMar>
+          <w:top w:w="15" w:type="dxa"/>
+          <w:left w:w="15" w:type="dxa"/>
+          <w:bottom w:w="15" w:type="dxa"/>
+          <w:right w:w="15" w:type="dxa"/>
+        </w:tblCellMar>
+        <w:tblLook w:val="04A0" w:firstRow="1" w:lastRow="0" w:firstColumn="1" w:lastColumn="0" w:noHBand="0" w:noVBand="1"/>
+      </w:tblPr>
+      <w:tblGrid>
+        <w:gridCol w:w="2401"/>
+        <w:gridCol w:w="8879"/>
+      </w:tblGrid>
+      <w:tr>
+        <w:tc>
+          <w:tcPr>
+            <w:tcW w:w="0" w:type="auto"/>
+            <w:shd w:val="clear" w:color="auto" w:fill="FFFFFF"/>
+            <w:tcMar>
+              <w:top w:w="150" w:type="dxa"/>
+              <w:left w:w="0" w:type="dxa"/>
+              <w:bottom w:w="150" w:type="dxa"/>
+              <w:right w:w="240" w:type="dxa"/>
+            </w:tcMar>
+            <w:vAlign w:val="center"/>
+            <w:hideMark/>
+          </w:tcPr>
+          <w:p>
+            <w:pPr>
+              <w:rPr>
+                <w:color w:val="000000" w:themeColor="text1"/>
+                <w:sz w:val="22"/>
+                <w:szCs w:val="22"/>
+              </w:rPr>
+            </w:pPr>
+            <w:r>
+              <w:rPr>
+                <w:color w:val="000000" w:themeColor="text1"/>
+                <w:sz w:val="22"/>
+                <w:szCs w:val="22"/>
+              </w:rPr>
+              <w:lastRenderedPageBreak/>
+              <w:t>docker restart</w:t>
+            </w:r>
+          </w:p>
+        </w:tc>
+        <w:tc>
+          <w:tcPr>
+            <w:tcW w:w="0" w:type="auto"/>
+            <w:shd w:val="clear" w:color="auto" w:fill="FFFFFF"/>
+            <w:tcMar>
+              <w:top w:w="150" w:type="dxa"/>
+              <w:left w:w="240" w:type="dxa"/>
+              <w:bottom w:w="150" w:type="dxa"/>
+              <w:right w:w="0" w:type="dxa"/>
+            </w:tcMar>
+            <w:vAlign w:val="center"/>
+            <w:hideMark/>
+          </w:tcPr>
+          <w:p>
+            <w:pPr>
+              <w:rPr>
+                <w:color w:val="000000" w:themeColor="text1"/>
+                <w:sz w:val="22"/>
+                <w:szCs w:val="22"/>
+              </w:rPr>
+            </w:pPr>
+            <w:r>
+              <w:rPr>
+                <w:b/>
+                <w:bCs/>
+                <w:color w:val="000000" w:themeColor="text1"/>
+                <w:sz w:val="22"/>
+                <w:szCs w:val="22"/>
+              </w:rPr>
+              <w:t>Stops + starts</w:t>
+            </w:r>
+            <w:r>
+              <w:rPr>
+                <w:color w:val="000000" w:themeColor="text1"/>
+                <w:sz w:val="22"/>
+                <w:szCs w:val="22"/>
+              </w:rPr>
+              <w:t> a running container (or starts a stopped one)</w:t>
+            </w:r>
+          </w:p>
+        </w:tc>
+      </w:tr>
+    </w:tbl>
+    <w:p>
+      <w:pPr>
+        <w:rPr>
+          <w:color w:val="000000" w:themeColor="text1"/>
+          <w:sz w:val="22"/>
+          <w:szCs w:val="22"/>
+        </w:rPr>
+      </w:pPr>
+    </w:p>
+    <w:p>
+      <w:pPr>
+        <w:rPr>
+          <w:color w:val="000000" w:themeColor="text1"/>
+          <w:sz w:val="22"/>
+          <w:szCs w:val="22"/>
+        </w:rPr>
+      </w:pPr>
+      <w:r>
+        <w:rPr>
+          <w:color w:val="000000" w:themeColor="text1"/>
+          <w:sz w:val="22"/>
+          <w:szCs w:val="22"/>
+        </w:rPr>
+        <w:t>docker start just starts an exited container that still exists</w:t>
+      </w:r>
+    </w:p>
+    <w:p>
+      <w:pPr>
+        <w:rPr>
+          <w:color w:val="000000" w:themeColor="text1"/>
+          <w:sz w:val="22"/>
+          <w:szCs w:val="22"/>
+        </w:rPr>
+      </w:pPr>
+      <w:r>
+        <w:rPr>
+          <w:color w:val="EE0000"/>
+          <w:sz w:val="22"/>
+          <w:szCs w:val="22"/>
+        </w:rPr>
+        <w:t>docker rm -f webserver</w:t>
+      </w:r>
+      <w:r>
+        <w:rPr>
+          <w:color w:val="EE0000"/>
+          <w:sz w:val="22"/>
+          <w:szCs w:val="22"/>
+        </w:rPr>
+        <w:t xml:space="preserve"> </w:t>
+      </w:r>
+      <w:r>
+        <w:rPr>
+          <w:color w:val="000000" w:themeColor="text1"/>
+          <w:sz w:val="22"/>
+          <w:szCs w:val="22"/>
+        </w:rPr>
+        <w:t>it means force remove a running container</w:t>
+      </w:r>
+    </w:p>
+    <w:p>
+      <w:pPr>
+        <w:rPr>
+          <w:color w:val="000000" w:themeColor="text1"/>
+          <w:sz w:val="22"/>
+          <w:szCs w:val="22"/>
+        </w:rPr>
+      </w:pPr>
+    </w:p>
+    <w:p>
+      <w:pPr>
+        <w:rPr>
+          <w:color w:val="000000" w:themeColor="text1"/>
+          <w:sz w:val="22"/>
+          <w:szCs w:val="22"/>
+        </w:rPr>
+      </w:pPr>
+      <w:r>
+        <w:rPr>
+          <w:color w:val="000000" w:themeColor="text1"/>
+          <w:sz w:val="22"/>
+          <w:szCs w:val="22"/>
+        </w:rPr>
+        <w:t xml:space="preserve">if we kill the main process of the </w:t>
+      </w:r>
+      <w:proofErr w:type="gramStart"/>
+      <w:r>
+        <w:rPr>
+          <w:color w:val="000000" w:themeColor="text1"/>
+          <w:sz w:val="22"/>
+          <w:szCs w:val="22"/>
+        </w:rPr>
+        <w:t>container</w:t>
+      </w:r>
+      <w:proofErr w:type="gramEnd"/>
+      <w:r>
+        <w:rPr>
+          <w:color w:val="000000" w:themeColor="text1"/>
+          <w:sz w:val="22"/>
+          <w:szCs w:val="22"/>
+        </w:rPr>
+        <w:t xml:space="preserve"> we kill the container </w:t>
+      </w:r>
+    </w:p>
+    <w:p>
+      <w:pPr>
+        <w:rPr>
+          <w:color w:val="000000" w:themeColor="text1"/>
+          <w:sz w:val="22"/>
+          <w:szCs w:val="22"/>
+        </w:rPr>
+      </w:pPr>
+      <w:r>
+        <w:rPr>
+          <w:color w:val="000000" w:themeColor="text1"/>
+          <w:sz w:val="22"/>
+          <w:szCs w:val="22"/>
+        </w:rPr>
+        <w:t>page 91</w:t>
+      </w:r>
     </w:p>
     <w:sectPr>
       <w:pgSz w:w="12240" w:h="15840"/>
@@ -3001,8 +4124,160 @@
       </w:rPr>
     </w:lvl>
   </w:abstractNum>
+  <w:abstractNum w:abstractNumId="1" w15:restartNumberingAfterBreak="0">
+    <w:nsid w:val="753C4774"/>
+    <w:multiLevelType w:val="multilevel"/>
+    <w:tmpl w:val="BB3C8506"/>
+    <w:lvl w:ilvl="0">
+      <w:start w:val="1"/>
+      <w:numFmt w:val="bullet"/>
+      <w:lvlText w:val=""/>
+      <w:lvlJc w:val="left"/>
+      <w:pPr>
+        <w:tabs>
+          <w:tab w:val="num" w:pos="720"/>
+        </w:tabs>
+        <w:ind w:left="720" w:hanging="360"/>
+      </w:pPr>
+      <w:rPr>
+        <w:rFonts w:ascii="Symbol" w:hAnsi="Symbol" w:hint="default"/>
+        <w:sz w:val="20"/>
+      </w:rPr>
+    </w:lvl>
+    <w:lvl w:ilvl="1" w:tentative="1">
+      <w:start w:val="1"/>
+      <w:numFmt w:val="bullet"/>
+      <w:lvlText w:val="o"/>
+      <w:lvlJc w:val="left"/>
+      <w:pPr>
+        <w:tabs>
+          <w:tab w:val="num" w:pos="1440"/>
+        </w:tabs>
+        <w:ind w:left="1440" w:hanging="360"/>
+      </w:pPr>
+      <w:rPr>
+        <w:rFonts w:ascii="Courier New" w:hAnsi="Courier New" w:hint="default"/>
+        <w:sz w:val="20"/>
+      </w:rPr>
+    </w:lvl>
+    <w:lvl w:ilvl="2" w:tentative="1">
+      <w:start w:val="1"/>
+      <w:numFmt w:val="bullet"/>
+      <w:lvlText w:val=""/>
+      <w:lvlJc w:val="left"/>
+      <w:pPr>
+        <w:tabs>
+          <w:tab w:val="num" w:pos="2160"/>
+        </w:tabs>
+        <w:ind w:left="2160" w:hanging="360"/>
+      </w:pPr>
+      <w:rPr>
+        <w:rFonts w:ascii="Wingdings" w:hAnsi="Wingdings" w:hint="default"/>
+        <w:sz w:val="20"/>
+      </w:rPr>
+    </w:lvl>
+    <w:lvl w:ilvl="3" w:tentative="1">
+      <w:start w:val="1"/>
+      <w:numFmt w:val="bullet"/>
+      <w:lvlText w:val=""/>
+      <w:lvlJc w:val="left"/>
+      <w:pPr>
+        <w:tabs>
+          <w:tab w:val="num" w:pos="2880"/>
+        </w:tabs>
+        <w:ind w:left="2880" w:hanging="360"/>
+      </w:pPr>
+      <w:rPr>
+        <w:rFonts w:ascii="Wingdings" w:hAnsi="Wingdings" w:hint="default"/>
+        <w:sz w:val="20"/>
+      </w:rPr>
+    </w:lvl>
+    <w:lvl w:ilvl="4" w:tentative="1">
+      <w:start w:val="1"/>
+      <w:numFmt w:val="bullet"/>
+      <w:lvlText w:val=""/>
+      <w:lvlJc w:val="left"/>
+      <w:pPr>
+        <w:tabs>
+          <w:tab w:val="num" w:pos="3600"/>
+        </w:tabs>
+        <w:ind w:left="3600" w:hanging="360"/>
+      </w:pPr>
+      <w:rPr>
+        <w:rFonts w:ascii="Wingdings" w:hAnsi="Wingdings" w:hint="default"/>
+        <w:sz w:val="20"/>
+      </w:rPr>
+    </w:lvl>
+    <w:lvl w:ilvl="5" w:tentative="1">
+      <w:start w:val="1"/>
+      <w:numFmt w:val="bullet"/>
+      <w:lvlText w:val=""/>
+      <w:lvlJc w:val="left"/>
+      <w:pPr>
+        <w:tabs>
+          <w:tab w:val="num" w:pos="4320"/>
+        </w:tabs>
+        <w:ind w:left="4320" w:hanging="360"/>
+      </w:pPr>
+      <w:rPr>
+        <w:rFonts w:ascii="Wingdings" w:hAnsi="Wingdings" w:hint="default"/>
+        <w:sz w:val="20"/>
+      </w:rPr>
+    </w:lvl>
+    <w:lvl w:ilvl="6" w:tentative="1">
+      <w:start w:val="1"/>
+      <w:numFmt w:val="bullet"/>
+      <w:lvlText w:val=""/>
+      <w:lvlJc w:val="left"/>
+      <w:pPr>
+        <w:tabs>
+          <w:tab w:val="num" w:pos="5040"/>
+        </w:tabs>
+        <w:ind w:left="5040" w:hanging="360"/>
+      </w:pPr>
+      <w:rPr>
+        <w:rFonts w:ascii="Wingdings" w:hAnsi="Wingdings" w:hint="default"/>
+        <w:sz w:val="20"/>
+      </w:rPr>
+    </w:lvl>
+    <w:lvl w:ilvl="7" w:tentative="1">
+      <w:start w:val="1"/>
+      <w:numFmt w:val="bullet"/>
+      <w:lvlText w:val=""/>
+      <w:lvlJc w:val="left"/>
+      <w:pPr>
+        <w:tabs>
+          <w:tab w:val="num" w:pos="5760"/>
+        </w:tabs>
+        <w:ind w:left="5760" w:hanging="360"/>
+      </w:pPr>
+      <w:rPr>
+        <w:rFonts w:ascii="Wingdings" w:hAnsi="Wingdings" w:hint="default"/>
+        <w:sz w:val="20"/>
+      </w:rPr>
+    </w:lvl>
+    <w:lvl w:ilvl="8" w:tentative="1">
+      <w:start w:val="1"/>
+      <w:numFmt w:val="bullet"/>
+      <w:lvlText w:val=""/>
+      <w:lvlJc w:val="left"/>
+      <w:pPr>
+        <w:tabs>
+          <w:tab w:val="num" w:pos="6480"/>
+        </w:tabs>
+        <w:ind w:left="6480" w:hanging="360"/>
+      </w:pPr>
+      <w:rPr>
+        <w:rFonts w:ascii="Wingdings" w:hAnsi="Wingdings" w:hint="default"/>
+        <w:sz w:val="20"/>
+      </w:rPr>
+    </w:lvl>
+  </w:abstractNum>
   <w:num w:numId="1" w16cid:durableId="1063214761">
     <w:abstractNumId w:val="0"/>
+  </w:num>
+  <w:num w:numId="2" w16cid:durableId="1445148468">
+    <w:abstractNumId w:val="1"/>
   </w:num>
 </w:numbering>
 </file>

</xml_diff>

<commit_message>
add chapter 8 notes not finished
</commit_message>
<xml_diff>
--- a/Docker.docx
+++ b/Docker.docx
@@ -416,7 +416,25 @@
           <w:sz w:val="22"/>
           <w:szCs w:val="22"/>
         </w:rPr>
-        <w:t xml:space="preserve"> since its always assumed that we are working with </w:t>
+        <w:t xml:space="preserve"> since </w:t>
+      </w:r>
+      <w:proofErr w:type="gramStart"/>
+      <w:r>
+        <w:rPr>
+          <w:color w:val="000000" w:themeColor="text1"/>
+          <w:sz w:val="22"/>
+          <w:szCs w:val="22"/>
+        </w:rPr>
+        <w:t>its</w:t>
+      </w:r>
+      <w:proofErr w:type="gramEnd"/>
+      <w:r>
+        <w:rPr>
+          <w:color w:val="000000" w:themeColor="text1"/>
+          <w:sz w:val="22"/>
+          <w:szCs w:val="22"/>
+        </w:rPr>
+        <w:t xml:space="preserve"> always assumed that we are working with </w:t>
       </w:r>
       <w:proofErr w:type="spellStart"/>
       <w:r>
@@ -518,6 +536,7 @@
         <w:t xml:space="preserve">The Ops </w:t>
       </w:r>
       <w:proofErr w:type="spellStart"/>
+      <w:proofErr w:type="gramStart"/>
       <w:r>
         <w:rPr>
           <w:b/>
@@ -537,6 +556,7 @@
         <w:t>the</w:t>
       </w:r>
       <w:proofErr w:type="spellEnd"/>
+      <w:proofErr w:type="gramEnd"/>
       <w:r>
         <w:rPr>
           <w:color w:val="000000" w:themeColor="text1"/>
@@ -723,7 +743,25 @@
           <w:sz w:val="22"/>
           <w:szCs w:val="22"/>
         </w:rPr>
-        <w:t>an image is like a class in dev its just a blue print which can be used with multiple different instances, so each image can be passed different values and be ran into a new container</w:t>
+        <w:t xml:space="preserve">an image is like a class in dev </w:t>
+      </w:r>
+      <w:proofErr w:type="gramStart"/>
+      <w:r>
+        <w:rPr>
+          <w:color w:val="000000" w:themeColor="text1"/>
+          <w:sz w:val="22"/>
+          <w:szCs w:val="22"/>
+        </w:rPr>
+        <w:t>its</w:t>
+      </w:r>
+      <w:proofErr w:type="gramEnd"/>
+      <w:r>
+        <w:rPr>
+          <w:color w:val="000000" w:themeColor="text1"/>
+          <w:sz w:val="22"/>
+          <w:szCs w:val="22"/>
+        </w:rPr>
+        <w:t xml:space="preserve"> just a blue print which can be used with multiple different instances, so each image can be passed different values and be ran into a new container</w:t>
       </w:r>
     </w:p>
     <w:p>
@@ -790,194 +828,214 @@
           <w:sz w:val="22"/>
           <w:szCs w:val="22"/>
         </w:rPr>
+        <w:t>image_</w:t>
+      </w:r>
+      <w:proofErr w:type="gramStart"/>
+      <w:r>
+        <w:rPr>
+          <w:color w:val="EE0000"/>
+          <w:sz w:val="22"/>
+          <w:szCs w:val="22"/>
+        </w:rPr>
+        <w:t>name</w:t>
+      </w:r>
+      <w:proofErr w:type="spellEnd"/>
+      <w:r>
+        <w:rPr>
+          <w:color w:val="EE0000"/>
+          <w:sz w:val="22"/>
+          <w:szCs w:val="22"/>
+        </w:rPr>
+        <w:t xml:space="preserve"> :</w:t>
+      </w:r>
+      <w:proofErr w:type="spellStart"/>
+      <w:r>
+        <w:rPr>
+          <w:color w:val="EE0000"/>
+          <w:sz w:val="22"/>
+          <w:szCs w:val="22"/>
+        </w:rPr>
+        <w:t>image</w:t>
+      </w:r>
+      <w:proofErr w:type="gramEnd"/>
+      <w:r>
+        <w:rPr>
+          <w:color w:val="EE0000"/>
+          <w:sz w:val="22"/>
+          <w:szCs w:val="22"/>
+        </w:rPr>
+        <w:t>_version</w:t>
+      </w:r>
+      <w:proofErr w:type="spellEnd"/>
+      <w:r>
+        <w:rPr>
+          <w:color w:val="000000" w:themeColor="text1"/>
+          <w:sz w:val="22"/>
+          <w:szCs w:val="22"/>
+        </w:rPr>
+        <w:t xml:space="preserve"> </w:t>
+      </w:r>
+      <w:r>
+        <w:rPr>
+          <w:color w:val="000000" w:themeColor="text1"/>
+          <w:sz w:val="22"/>
+          <w:szCs w:val="22"/>
+        </w:rPr>
+        <w:sym w:font="Wingdings" w:char="F0E0"/>
+      </w:r>
+      <w:r>
+        <w:rPr>
+          <w:color w:val="000000" w:themeColor="text1"/>
+          <w:sz w:val="22"/>
+          <w:szCs w:val="22"/>
+        </w:rPr>
+        <w:t xml:space="preserve"> this copies a new image into our docker so we can use it </w:t>
+      </w:r>
+      <w:r>
+        <w:rPr>
+          <w:color w:val="000000" w:themeColor="text1"/>
+          <w:sz w:val="22"/>
+          <w:szCs w:val="22"/>
+        </w:rPr>
+        <w:t xml:space="preserve">no spaces between the image name and its version </w:t>
+      </w:r>
+    </w:p>
+    <w:p>
+      <w:pPr>
+        <w:rPr>
+          <w:color w:val="000000" w:themeColor="text1"/>
+          <w:sz w:val="22"/>
+          <w:szCs w:val="22"/>
+        </w:rPr>
+      </w:pPr>
+      <w:r>
+        <w:rPr>
+          <w:color w:val="000000" w:themeColor="text1"/>
+          <w:sz w:val="22"/>
+          <w:szCs w:val="22"/>
+        </w:rPr>
+        <w:t xml:space="preserve">you can use the </w:t>
+      </w:r>
+      <w:r>
+        <w:rPr>
+          <w:color w:val="EE0000"/>
+          <w:sz w:val="22"/>
+          <w:szCs w:val="22"/>
+        </w:rPr>
+        <w:t>docker run</w:t>
+      </w:r>
+      <w:r>
+        <w:rPr>
+          <w:color w:val="EE0000"/>
+          <w:sz w:val="22"/>
+          <w:szCs w:val="22"/>
+        </w:rPr>
+        <w:t xml:space="preserve"> </w:t>
+      </w:r>
+      <w:proofErr w:type="spellStart"/>
+      <w:r>
+        <w:rPr>
+          <w:color w:val="EE0000"/>
+          <w:sz w:val="22"/>
+          <w:szCs w:val="22"/>
+        </w:rPr>
         <w:t>image_name</w:t>
       </w:r>
       <w:proofErr w:type="spellEnd"/>
       <w:r>
         <w:rPr>
-          <w:color w:val="EE0000"/>
-          <w:sz w:val="22"/>
-          <w:szCs w:val="22"/>
-        </w:rPr>
-        <w:t xml:space="preserve"> :</w:t>
+          <w:color w:val="000000" w:themeColor="text1"/>
+          <w:sz w:val="22"/>
+          <w:szCs w:val="22"/>
+        </w:rPr>
+        <w:t xml:space="preserve"> command to start a container from</w:t>
+      </w:r>
+      <w:r>
+        <w:rPr>
+          <w:color w:val="000000" w:themeColor="text1"/>
+          <w:sz w:val="22"/>
+          <w:szCs w:val="22"/>
+        </w:rPr>
+        <w:t xml:space="preserve"> one of our installed images</w:t>
+      </w:r>
+    </w:p>
+    <w:p>
+      <w:pPr>
+        <w:rPr>
+          <w:color w:val="000000" w:themeColor="text1"/>
+          <w:sz w:val="22"/>
+          <w:szCs w:val="22"/>
+        </w:rPr>
+      </w:pPr>
+      <w:r>
+        <w:rPr>
+          <w:color w:val="EE0000"/>
+          <w:sz w:val="22"/>
+          <w:szCs w:val="22"/>
+        </w:rPr>
+        <w:t>docker run--name</w:t>
+      </w:r>
+      <w:r>
+        <w:rPr>
+          <w:color w:val="000000" w:themeColor="text1"/>
+          <w:sz w:val="22"/>
+          <w:szCs w:val="22"/>
+        </w:rPr>
+        <w:t xml:space="preserve"> test</w:t>
+      </w:r>
+      <w:r>
+        <w:rPr>
+          <w:color w:val="000000" w:themeColor="text1"/>
+          <w:sz w:val="22"/>
+          <w:szCs w:val="22"/>
+        </w:rPr>
+        <w:t xml:space="preserve"> </w:t>
+      </w:r>
+      <w:r>
+        <w:rPr>
+          <w:color w:val="000000" w:themeColor="text1"/>
+          <w:sz w:val="22"/>
+          <w:szCs w:val="22"/>
+        </w:rPr>
+        <w:sym w:font="Wingdings" w:char="F0E0"/>
+      </w:r>
+      <w:r>
+        <w:rPr>
+          <w:color w:val="000000" w:themeColor="text1"/>
+          <w:sz w:val="22"/>
+          <w:szCs w:val="22"/>
+        </w:rPr>
+        <w:t xml:space="preserve"> the – - name is to give the container a name that we choose</w:t>
+      </w:r>
+    </w:p>
+    <w:p>
+      <w:pPr>
+        <w:rPr>
+          <w:color w:val="000000" w:themeColor="text1"/>
+          <w:sz w:val="22"/>
+          <w:szCs w:val="22"/>
+        </w:rPr>
+      </w:pPr>
+      <w:r>
+        <w:rPr>
+          <w:color w:val="EE0000"/>
+          <w:sz w:val="22"/>
+          <w:szCs w:val="22"/>
+        </w:rPr>
+        <w:t xml:space="preserve">docker run -it </w:t>
       </w:r>
       <w:proofErr w:type="spellStart"/>
-      <w:r>
-        <w:rPr>
-          <w:color w:val="EE0000"/>
-          <w:sz w:val="22"/>
-          <w:szCs w:val="22"/>
-        </w:rPr>
-        <w:t>image_version</w:t>
+      <w:proofErr w:type="gramStart"/>
+      <w:r>
+        <w:rPr>
+          <w:color w:val="EE0000"/>
+          <w:sz w:val="22"/>
+          <w:szCs w:val="22"/>
+        </w:rPr>
+        <w:t>ubuntu:latest</w:t>
       </w:r>
       <w:proofErr w:type="spellEnd"/>
-      <w:r>
-        <w:rPr>
-          <w:color w:val="000000" w:themeColor="text1"/>
-          <w:sz w:val="22"/>
-          <w:szCs w:val="22"/>
-        </w:rPr>
-        <w:t xml:space="preserve"> </w:t>
-      </w:r>
-      <w:r>
-        <w:rPr>
-          <w:color w:val="000000" w:themeColor="text1"/>
-          <w:sz w:val="22"/>
-          <w:szCs w:val="22"/>
-        </w:rPr>
-        <w:sym w:font="Wingdings" w:char="F0E0"/>
-      </w:r>
-      <w:r>
-        <w:rPr>
-          <w:color w:val="000000" w:themeColor="text1"/>
-          <w:sz w:val="22"/>
-          <w:szCs w:val="22"/>
-        </w:rPr>
-        <w:t xml:space="preserve"> this copies a new image into our docker so we can use it </w:t>
-      </w:r>
-      <w:r>
-        <w:rPr>
-          <w:color w:val="000000" w:themeColor="text1"/>
-          <w:sz w:val="22"/>
-          <w:szCs w:val="22"/>
-        </w:rPr>
-        <w:t xml:space="preserve">no spaces between the image name and its version </w:t>
-      </w:r>
-    </w:p>
-    <w:p>
-      <w:pPr>
-        <w:rPr>
-          <w:color w:val="000000" w:themeColor="text1"/>
-          <w:sz w:val="22"/>
-          <w:szCs w:val="22"/>
-        </w:rPr>
-      </w:pPr>
-      <w:r>
-        <w:rPr>
-          <w:color w:val="000000" w:themeColor="text1"/>
-          <w:sz w:val="22"/>
-          <w:szCs w:val="22"/>
-        </w:rPr>
-        <w:t xml:space="preserve">you can use the </w:t>
-      </w:r>
-      <w:r>
-        <w:rPr>
-          <w:color w:val="EE0000"/>
-          <w:sz w:val="22"/>
-          <w:szCs w:val="22"/>
-        </w:rPr>
-        <w:t>docker run</w:t>
-      </w:r>
-      <w:r>
-        <w:rPr>
-          <w:color w:val="EE0000"/>
-          <w:sz w:val="22"/>
-          <w:szCs w:val="22"/>
-        </w:rPr>
-        <w:t xml:space="preserve"> </w:t>
-      </w:r>
-      <w:proofErr w:type="spellStart"/>
-      <w:r>
-        <w:rPr>
-          <w:color w:val="EE0000"/>
-          <w:sz w:val="22"/>
-          <w:szCs w:val="22"/>
-        </w:rPr>
-        <w:t>image_name</w:t>
-      </w:r>
-      <w:proofErr w:type="spellEnd"/>
-      <w:r>
-        <w:rPr>
-          <w:color w:val="000000" w:themeColor="text1"/>
-          <w:sz w:val="22"/>
-          <w:szCs w:val="22"/>
-        </w:rPr>
-        <w:t xml:space="preserve"> command to start a container from</w:t>
-      </w:r>
-      <w:r>
-        <w:rPr>
-          <w:color w:val="000000" w:themeColor="text1"/>
-          <w:sz w:val="22"/>
-          <w:szCs w:val="22"/>
-        </w:rPr>
-        <w:t xml:space="preserve"> one of our installed images</w:t>
-      </w:r>
-    </w:p>
-    <w:p>
-      <w:pPr>
-        <w:rPr>
-          <w:color w:val="000000" w:themeColor="text1"/>
-          <w:sz w:val="22"/>
-          <w:szCs w:val="22"/>
-        </w:rPr>
-      </w:pPr>
-      <w:r>
-        <w:rPr>
-          <w:color w:val="EE0000"/>
-          <w:sz w:val="22"/>
-          <w:szCs w:val="22"/>
-        </w:rPr>
-        <w:t>docker run--name</w:t>
-      </w:r>
-      <w:r>
-        <w:rPr>
-          <w:color w:val="000000" w:themeColor="text1"/>
-          <w:sz w:val="22"/>
-          <w:szCs w:val="22"/>
-        </w:rPr>
-        <w:t xml:space="preserve"> test</w:t>
-      </w:r>
-      <w:r>
-        <w:rPr>
-          <w:color w:val="000000" w:themeColor="text1"/>
-          <w:sz w:val="22"/>
-          <w:szCs w:val="22"/>
-        </w:rPr>
-        <w:t xml:space="preserve"> </w:t>
-      </w:r>
-      <w:r>
-        <w:rPr>
-          <w:color w:val="000000" w:themeColor="text1"/>
-          <w:sz w:val="22"/>
-          <w:szCs w:val="22"/>
-        </w:rPr>
-        <w:sym w:font="Wingdings" w:char="F0E0"/>
-      </w:r>
-      <w:r>
-        <w:rPr>
-          <w:color w:val="000000" w:themeColor="text1"/>
-          <w:sz w:val="22"/>
-          <w:szCs w:val="22"/>
-        </w:rPr>
-        <w:t xml:space="preserve"> the – - name is to give the container a name that we choose</w:t>
-      </w:r>
-    </w:p>
-    <w:p>
-      <w:pPr>
-        <w:rPr>
-          <w:color w:val="000000" w:themeColor="text1"/>
-          <w:sz w:val="22"/>
-          <w:szCs w:val="22"/>
-        </w:rPr>
-      </w:pPr>
-      <w:r>
-        <w:rPr>
-          <w:color w:val="EE0000"/>
-          <w:sz w:val="22"/>
-          <w:szCs w:val="22"/>
-        </w:rPr>
-        <w:t xml:space="preserve">docker run -it </w:t>
-      </w:r>
-      <w:proofErr w:type="spellStart"/>
-      <w:r>
-        <w:rPr>
-          <w:color w:val="EE0000"/>
-          <w:sz w:val="22"/>
-          <w:szCs w:val="22"/>
-        </w:rPr>
-        <w:t>ubuntu:latest</w:t>
-      </w:r>
-      <w:proofErr w:type="spellEnd"/>
+      <w:proofErr w:type="gramEnd"/>
       <w:r>
         <w:rPr>
           <w:color w:val="EE0000"/>
@@ -1697,7 +1755,43 @@
           <w:sz w:val="22"/>
           <w:szCs w:val="22"/>
         </w:rPr>
-        <w:t>by default docker when pulling an image, it assumes we want to pull from docker hub and it assumes we want to pull the latest image. however we can still override this behavior.</w:t>
+        <w:t xml:space="preserve">by </w:t>
+      </w:r>
+      <w:proofErr w:type="gramStart"/>
+      <w:r>
+        <w:rPr>
+          <w:color w:val="000000" w:themeColor="text1"/>
+          <w:sz w:val="22"/>
+          <w:szCs w:val="22"/>
+        </w:rPr>
+        <w:t>default</w:t>
+      </w:r>
+      <w:proofErr w:type="gramEnd"/>
+      <w:r>
+        <w:rPr>
+          <w:color w:val="000000" w:themeColor="text1"/>
+          <w:sz w:val="22"/>
+          <w:szCs w:val="22"/>
+        </w:rPr>
+        <w:t xml:space="preserve"> docker when pulling an image, it assumes we want to pull from docker hub and it assumes we want to pull the latest image. </w:t>
+      </w:r>
+      <w:proofErr w:type="gramStart"/>
+      <w:r>
+        <w:rPr>
+          <w:color w:val="000000" w:themeColor="text1"/>
+          <w:sz w:val="22"/>
+          <w:szCs w:val="22"/>
+        </w:rPr>
+        <w:t>however</w:t>
+      </w:r>
+      <w:proofErr w:type="gramEnd"/>
+      <w:r>
+        <w:rPr>
+          <w:color w:val="000000" w:themeColor="text1"/>
+          <w:sz w:val="22"/>
+          <w:szCs w:val="22"/>
+        </w:rPr>
+        <w:t xml:space="preserve"> we can still override this behavior.</w:t>
       </w:r>
     </w:p>
     <w:p>
@@ -1787,6 +1881,7 @@
         <w:t>/</w:t>
       </w:r>
       <w:proofErr w:type="spellStart"/>
+      <w:proofErr w:type="gramStart"/>
       <w:r>
         <w:rPr>
           <w:color w:val="EE0000"/>
@@ -1796,6 +1891,7 @@
         <w:t>regsync:latest</w:t>
       </w:r>
       <w:proofErr w:type="spellEnd"/>
+      <w:proofErr w:type="gramEnd"/>
     </w:p>
     <w:p>
       <w:pPr>
@@ -1831,6 +1927,7 @@
         <w:t xml:space="preserve">docker pull </w:t>
       </w:r>
       <w:proofErr w:type="spellStart"/>
+      <w:proofErr w:type="gramStart"/>
       <w:r>
         <w:rPr>
           <w:color w:val="EE0000"/>
@@ -1840,6 +1937,7 @@
         <w:t>mongo:latest</w:t>
       </w:r>
       <w:proofErr w:type="spellEnd"/>
+      <w:proofErr w:type="gramEnd"/>
       <w:r>
         <w:rPr>
           <w:color w:val="EE0000"/>
@@ -1854,7 +1952,25 @@
           <w:sz w:val="22"/>
           <w:szCs w:val="22"/>
         </w:rPr>
-        <w:t>we pull the image of mongo tagged with latest when pulling the image we see different layers being pulled.</w:t>
+        <w:t xml:space="preserve">we pull the image of mongo tagged with latest when pulling the </w:t>
+      </w:r>
+      <w:proofErr w:type="gramStart"/>
+      <w:r>
+        <w:rPr>
+          <w:color w:val="000000" w:themeColor="text1"/>
+          <w:sz w:val="22"/>
+          <w:szCs w:val="22"/>
+        </w:rPr>
+        <w:t>image</w:t>
+      </w:r>
+      <w:proofErr w:type="gramEnd"/>
+      <w:r>
+        <w:rPr>
+          <w:color w:val="000000" w:themeColor="text1"/>
+          <w:sz w:val="22"/>
+          <w:szCs w:val="22"/>
+        </w:rPr>
+        <w:t xml:space="preserve"> we see different layers being pulled.</w:t>
       </w:r>
     </w:p>
     <w:p>
@@ -2095,7 +2211,25 @@
           <w:sz w:val="22"/>
           <w:szCs w:val="22"/>
         </w:rPr>
-        <w:t>a digest is an image fingerprint that uniquely identifies it, so when we pull an image we can always pull the same using its digest.</w:t>
+        <w:t xml:space="preserve">a digest is an image fingerprint that uniquely identifies it, so when we pull an </w:t>
+      </w:r>
+      <w:proofErr w:type="gramStart"/>
+      <w:r>
+        <w:rPr>
+          <w:color w:val="000000" w:themeColor="text1"/>
+          <w:sz w:val="22"/>
+          <w:szCs w:val="22"/>
+        </w:rPr>
+        <w:t>image</w:t>
+      </w:r>
+      <w:proofErr w:type="gramEnd"/>
+      <w:r>
+        <w:rPr>
+          <w:color w:val="000000" w:themeColor="text1"/>
+          <w:sz w:val="22"/>
+          <w:szCs w:val="22"/>
+        </w:rPr>
+        <w:t xml:space="preserve"> we can always pull the same using its digest.</w:t>
       </w:r>
     </w:p>
     <w:p>
@@ -2379,7 +2513,16 @@
           <w:sz w:val="22"/>
           <w:szCs w:val="22"/>
         </w:rPr>
-        <w:t xml:space="preserve"> hardware </w:t>
+        <w:t xml:space="preserve"> </w:t>
+      </w:r>
+      <w:proofErr w:type="gramStart"/>
+      <w:r>
+        <w:rPr>
+          <w:color w:val="000000" w:themeColor="text1"/>
+          <w:sz w:val="22"/>
+          <w:szCs w:val="22"/>
+        </w:rPr>
+        <w:t xml:space="preserve">hardware </w:t>
       </w:r>
       <w:r>
         <w:rPr>
@@ -2389,6 +2532,7 @@
         </w:rPr>
         <w:t>,</w:t>
       </w:r>
+      <w:proofErr w:type="gramEnd"/>
       <w:r>
         <w:rPr>
           <w:color w:val="000000" w:themeColor="text1"/>
@@ -3041,9 +3185,28 @@
           <w:sz w:val="22"/>
           <w:szCs w:val="22"/>
         </w:rPr>
-        <w:t xml:space="preserve"> this part here create a shell inside the container so we can interact through it. why would we have a shell? </w:t>
+        <w:t xml:space="preserve"> this part here </w:t>
+      </w:r>
+      <w:proofErr w:type="gramStart"/>
+      <w:r>
+        <w:rPr>
+          <w:color w:val="000000" w:themeColor="text1"/>
+          <w:sz w:val="22"/>
+          <w:szCs w:val="22"/>
+        </w:rPr>
+        <w:t>create</w:t>
+      </w:r>
+      <w:proofErr w:type="gramEnd"/>
+      <w:r>
+        <w:rPr>
+          <w:color w:val="000000" w:themeColor="text1"/>
+          <w:sz w:val="22"/>
+          <w:szCs w:val="22"/>
+        </w:rPr>
+        <w:t xml:space="preserve"> a shell inside the container so we can interact through it. why would we have a shell? </w:t>
       </w:r>
       <w:proofErr w:type="spellStart"/>
+      <w:proofErr w:type="gramStart"/>
       <w:r>
         <w:rPr>
           <w:color w:val="000000" w:themeColor="text1"/>
@@ -3053,6 +3216,7 @@
         <w:t>its</w:t>
       </w:r>
       <w:proofErr w:type="spellEnd"/>
+      <w:proofErr w:type="gramEnd"/>
       <w:r>
         <w:rPr>
           <w:color w:val="000000" w:themeColor="text1"/>
@@ -3352,6 +3516,7 @@
         <w:t xml:space="preserve">docker inspect </w:t>
       </w:r>
       <w:proofErr w:type="spellStart"/>
+      <w:proofErr w:type="gramStart"/>
       <w:r>
         <w:rPr>
           <w:color w:val="EE0000"/>
@@ -3361,6 +3526,7 @@
         <w:t>image:tag</w:t>
       </w:r>
       <w:proofErr w:type="spellEnd"/>
+      <w:proofErr w:type="gramEnd"/>
       <w:r>
         <w:rPr>
           <w:color w:val="EE0000"/>
@@ -3511,6 +3677,7 @@
           <w:szCs w:val="22"/>
         </w:rPr>
       </w:pPr>
+      <w:proofErr w:type="gramStart"/>
       <w:r>
         <w:rPr>
           <w:color w:val="000000" w:themeColor="text1"/>
@@ -3541,6 +3708,7 @@
         <w:t>wq</w:t>
       </w:r>
       <w:proofErr w:type="spellEnd"/>
+      <w:proofErr w:type="gramEnd"/>
       <w:r>
         <w:rPr>
           <w:color w:val="000000" w:themeColor="text1"/>
@@ -3716,7 +3884,25 @@
           <w:sz w:val="22"/>
           <w:szCs w:val="22"/>
         </w:rPr>
-        <w:t xml:space="preserve">if we kill the main process of the container we kill the container </w:t>
+        <w:t xml:space="preserve">if we kill the main process of the </w:t>
+      </w:r>
+      <w:proofErr w:type="gramStart"/>
+      <w:r>
+        <w:rPr>
+          <w:color w:val="000000" w:themeColor="text1"/>
+          <w:sz w:val="22"/>
+          <w:szCs w:val="22"/>
+        </w:rPr>
+        <w:t>container</w:t>
+      </w:r>
+      <w:proofErr w:type="gramEnd"/>
+      <w:r>
+        <w:rPr>
+          <w:color w:val="000000" w:themeColor="text1"/>
+          <w:sz w:val="22"/>
+          <w:szCs w:val="22"/>
+        </w:rPr>
+        <w:t xml:space="preserve"> we kill the container </w:t>
       </w:r>
     </w:p>
     <w:p>
@@ -3828,7 +4014,16 @@
           <w:sz w:val="22"/>
           <w:szCs w:val="22"/>
         </w:rPr>
-        <w:t>docker exec</w:t>
+        <w:t xml:space="preserve">docker </w:t>
+      </w:r>
+      <w:proofErr w:type="gramStart"/>
+      <w:r>
+        <w:rPr>
+          <w:color w:val="EE0000"/>
+          <w:sz w:val="22"/>
+          <w:szCs w:val="22"/>
+        </w:rPr>
+        <w:t>exec</w:t>
       </w:r>
       <w:r>
         <w:rPr>
@@ -3844,7 +4039,16 @@
           <w:sz w:val="22"/>
           <w:szCs w:val="22"/>
         </w:rPr>
-        <w:t xml:space="preserve"> but it directly attaches the user into the container’s main process. </w:t>
+        <w:t xml:space="preserve"> but</w:t>
+      </w:r>
+      <w:proofErr w:type="gramEnd"/>
+      <w:r>
+        <w:rPr>
+          <w:color w:val="000000" w:themeColor="text1"/>
+          <w:sz w:val="22"/>
+          <w:szCs w:val="22"/>
+        </w:rPr>
+        <w:t xml:space="preserve"> it directly attaches the user into the container’s main process. </w:t>
       </w:r>
     </w:p>
     <w:p>
@@ -3872,16 +4076,7 @@
           <w:color w:val="000000" w:themeColor="text1"/>
           <w:u w:val="single"/>
         </w:rPr>
-        <w:t>Self-healing containers with restart policies</w:t>
-      </w:r>
-      <w:r>
-        <w:rPr>
-          <w:b/>
-          <w:bCs/>
-          <w:color w:val="000000" w:themeColor="text1"/>
-          <w:u w:val="single"/>
-        </w:rPr>
-        <w:t>:</w:t>
+        <w:t>Self-healing containers with restart policies:</w:t>
       </w:r>
     </w:p>
     <w:p>
@@ -4233,7 +4428,25 @@
           <w:sz w:val="22"/>
           <w:szCs w:val="22"/>
         </w:rPr>
-        <w:t xml:space="preserve">now after running this command we have an alpine container with only one process of the </w:t>
+        <w:t xml:space="preserve">now after running this </w:t>
+      </w:r>
+      <w:proofErr w:type="gramStart"/>
+      <w:r>
+        <w:rPr>
+          <w:color w:val="000000" w:themeColor="text1"/>
+          <w:sz w:val="22"/>
+          <w:szCs w:val="22"/>
+        </w:rPr>
+        <w:t>command</w:t>
+      </w:r>
+      <w:proofErr w:type="gramEnd"/>
+      <w:r>
+        <w:rPr>
+          <w:color w:val="000000" w:themeColor="text1"/>
+          <w:sz w:val="22"/>
+          <w:szCs w:val="22"/>
+        </w:rPr>
+        <w:t xml:space="preserve"> we have an alpine container with only one process of the </w:t>
       </w:r>
       <w:proofErr w:type="spellStart"/>
       <w:r>
@@ -4253,6 +4466,7 @@
         </w:rPr>
         <w:t xml:space="preserve">, once we write </w:t>
       </w:r>
+      <w:proofErr w:type="gramStart"/>
       <w:r>
         <w:rPr>
           <w:b/>
@@ -4269,7 +4483,16 @@
           <w:sz w:val="22"/>
           <w:szCs w:val="22"/>
         </w:rPr>
-        <w:t xml:space="preserve"> to the bash, we kill the main process which forces the container to exit, so the container </w:t>
+        <w:t xml:space="preserve"> to</w:t>
+      </w:r>
+      <w:proofErr w:type="gramEnd"/>
+      <w:r>
+        <w:rPr>
+          <w:color w:val="000000" w:themeColor="text1"/>
+          <w:sz w:val="22"/>
+          <w:szCs w:val="22"/>
+        </w:rPr>
+        <w:t xml:space="preserve"> the bash, we kill the main process which forces the container to exit, so the container </w:t>
       </w:r>
       <w:r>
         <w:rPr>
@@ -4305,43 +4528,54 @@
           <w:color w:val="000000" w:themeColor="text1"/>
           <w:u w:val="single"/>
         </w:rPr>
-        <w:t>Clean up</w:t>
-      </w:r>
-      <w:r>
-        <w:rPr>
-          <w:b/>
-          <w:bCs/>
-          <w:color w:val="000000" w:themeColor="text1"/>
-          <w:u w:val="single"/>
-        </w:rPr>
-        <w:t>:</w:t>
-      </w:r>
-    </w:p>
-    <w:p>
-      <w:pPr>
-        <w:rPr>
-          <w:color w:val="000000" w:themeColor="text1"/>
-          <w:sz w:val="22"/>
-          <w:szCs w:val="22"/>
-        </w:rPr>
-      </w:pPr>
-      <w:r>
-        <w:rPr>
-          <w:b/>
-          <w:bCs/>
-          <w:color w:val="000000" w:themeColor="text1"/>
-          <w:sz w:val="22"/>
-          <w:szCs w:val="22"/>
-        </w:rPr>
-        <w:t xml:space="preserve">docker rm &lt;container&gt; -f </w:t>
-      </w:r>
-      <w:r>
-        <w:rPr>
-          <w:color w:val="000000" w:themeColor="text1"/>
-          <w:sz w:val="22"/>
-          <w:szCs w:val="22"/>
-        </w:rPr>
-        <w:t xml:space="preserve"> the </w:t>
+        <w:t>Clean up:</w:t>
+      </w:r>
+    </w:p>
+    <w:p>
+      <w:pPr>
+        <w:rPr>
+          <w:color w:val="000000" w:themeColor="text1"/>
+          <w:sz w:val="22"/>
+          <w:szCs w:val="22"/>
+        </w:rPr>
+      </w:pPr>
+      <w:r>
+        <w:rPr>
+          <w:b/>
+          <w:bCs/>
+          <w:color w:val="000000" w:themeColor="text1"/>
+          <w:sz w:val="22"/>
+          <w:szCs w:val="22"/>
+        </w:rPr>
+        <w:t>docker rm &lt;container&gt; -</w:t>
+      </w:r>
+      <w:proofErr w:type="gramStart"/>
+      <w:r>
+        <w:rPr>
+          <w:b/>
+          <w:bCs/>
+          <w:color w:val="000000" w:themeColor="text1"/>
+          <w:sz w:val="22"/>
+          <w:szCs w:val="22"/>
+        </w:rPr>
+        <w:t xml:space="preserve">f </w:t>
+      </w:r>
+      <w:r>
+        <w:rPr>
+          <w:color w:val="000000" w:themeColor="text1"/>
+          <w:sz w:val="22"/>
+          <w:szCs w:val="22"/>
+        </w:rPr>
+        <w:t xml:space="preserve"> the</w:t>
+      </w:r>
+      <w:proofErr w:type="gramEnd"/>
+      <w:r>
+        <w:rPr>
+          <w:color w:val="000000" w:themeColor="text1"/>
+          <w:sz w:val="22"/>
+          <w:szCs w:val="22"/>
+        </w:rPr>
+        <w:t xml:space="preserve"> </w:t>
       </w:r>
       <w:r>
         <w:rPr>
@@ -4403,6 +4637,7 @@
         <w:t xml:space="preserve"> -</w:t>
       </w:r>
       <w:proofErr w:type="spellStart"/>
+      <w:proofErr w:type="gramStart"/>
       <w:r>
         <w:rPr>
           <w:b/>
@@ -4430,7 +4665,16 @@
           <w:sz w:val="22"/>
           <w:szCs w:val="22"/>
         </w:rPr>
-        <w:t xml:space="preserve"> this gives the docker containers digests aka IDs. </w:t>
+        <w:t xml:space="preserve"> this</w:t>
+      </w:r>
+      <w:proofErr w:type="gramEnd"/>
+      <w:r>
+        <w:rPr>
+          <w:color w:val="000000" w:themeColor="text1"/>
+          <w:sz w:val="22"/>
+          <w:szCs w:val="22"/>
+        </w:rPr>
+        <w:t xml:space="preserve"> gives the docker containers digests aka IDs. </w:t>
       </w:r>
     </w:p>
     <w:p>
@@ -4684,15 +4928,7 @@
           <w:sz w:val="22"/>
           <w:szCs w:val="22"/>
         </w:rPr>
-        <w:t>detach from a container without killing the process you’re attached to. You’ll use it frequently to detach from running containers without killing them.</w:t>
-      </w:r>
-      <w:r>
-        <w:rPr>
-          <w:color w:val="000000" w:themeColor="text1"/>
-          <w:sz w:val="22"/>
-          <w:szCs w:val="22"/>
-        </w:rPr>
-        <w:t xml:space="preserve"> </w:t>
+        <w:t xml:space="preserve">detach from a container without killing the process you’re attached to. You’ll use it frequently to detach from running containers without killing them. </w:t>
       </w:r>
     </w:p>
     <w:p>
@@ -4867,16 +5103,7 @@
           <w:color w:val="000000" w:themeColor="text1"/>
           <w:u w:val="single"/>
         </w:rPr>
-        <w:t>Containerizing an app– The TLDR</w:t>
-      </w:r>
-      <w:r>
-        <w:rPr>
-          <w:b/>
-          <w:bCs/>
-          <w:color w:val="000000" w:themeColor="text1"/>
-          <w:u w:val="single"/>
-        </w:rPr>
-        <w:t>:</w:t>
+        <w:t>Containerizing an app– The TLDR:</w:t>
       </w:r>
     </w:p>
     <w:p>
@@ -5122,6 +5349,1340 @@
         </w:rPr>
         <w:t>, and answering the questions.</w:t>
       </w:r>
+    </w:p>
+    <w:p>
+      <w:pPr>
+        <w:rPr>
+          <w:color w:val="000000" w:themeColor="text1"/>
+          <w:sz w:val="22"/>
+          <w:szCs w:val="22"/>
+        </w:rPr>
+      </w:pPr>
+    </w:p>
+    <w:p>
+      <w:pPr>
+        <w:rPr>
+          <w:b/>
+          <w:bCs/>
+          <w:color w:val="000000" w:themeColor="text1"/>
+          <w:sz w:val="28"/>
+          <w:szCs w:val="28"/>
+          <w:u w:val="single"/>
+        </w:rPr>
+      </w:pPr>
+      <w:r>
+        <w:rPr>
+          <w:b/>
+          <w:bCs/>
+          <w:color w:val="000000" w:themeColor="text1"/>
+          <w:sz w:val="28"/>
+          <w:szCs w:val="28"/>
+          <w:u w:val="single"/>
+        </w:rPr>
+        <w:t>Get the application code</w:t>
+      </w:r>
+      <w:r>
+        <w:rPr>
+          <w:b/>
+          <w:bCs/>
+          <w:color w:val="000000" w:themeColor="text1"/>
+          <w:sz w:val="28"/>
+          <w:szCs w:val="28"/>
+          <w:u w:val="single"/>
+        </w:rPr>
+        <w:t>:</w:t>
+      </w:r>
+    </w:p>
+    <w:p>
+      <w:pPr>
+        <w:rPr>
+          <w:color w:val="000000" w:themeColor="text1"/>
+          <w:sz w:val="22"/>
+          <w:szCs w:val="22"/>
+        </w:rPr>
+      </w:pPr>
+      <w:r>
+        <w:rPr>
+          <w:color w:val="000000" w:themeColor="text1"/>
+          <w:sz w:val="22"/>
+          <w:szCs w:val="22"/>
+        </w:rPr>
+        <w:t xml:space="preserve">for </w:t>
+      </w:r>
+      <w:proofErr w:type="gramStart"/>
+      <w:r>
+        <w:rPr>
+          <w:color w:val="000000" w:themeColor="text1"/>
+          <w:sz w:val="22"/>
+          <w:szCs w:val="22"/>
+        </w:rPr>
+        <w:t>example</w:t>
+      </w:r>
+      <w:proofErr w:type="gramEnd"/>
+      <w:r>
+        <w:rPr>
+          <w:color w:val="000000" w:themeColor="text1"/>
+          <w:sz w:val="22"/>
+          <w:szCs w:val="22"/>
+        </w:rPr>
+        <w:t xml:space="preserve"> here is my code and this directory is for java spring boot, and it has the pom</w:t>
+      </w:r>
+      <w:r>
+        <w:rPr>
+          <w:color w:val="000000" w:themeColor="text1"/>
+          <w:sz w:val="22"/>
+          <w:szCs w:val="22"/>
+        </w:rPr>
+        <w:t>.xml</w:t>
+      </w:r>
+      <w:r>
+        <w:rPr>
+          <w:color w:val="000000" w:themeColor="text1"/>
+          <w:sz w:val="22"/>
+          <w:szCs w:val="22"/>
+        </w:rPr>
+        <w:t xml:space="preserve"> file the </w:t>
+      </w:r>
+      <w:proofErr w:type="spellStart"/>
+      <w:r>
+        <w:rPr>
+          <w:color w:val="000000" w:themeColor="text1"/>
+          <w:sz w:val="22"/>
+          <w:szCs w:val="22"/>
+        </w:rPr>
+        <w:t>src</w:t>
+      </w:r>
+      <w:proofErr w:type="spellEnd"/>
+      <w:r>
+        <w:rPr>
+          <w:color w:val="000000" w:themeColor="text1"/>
+          <w:sz w:val="22"/>
+          <w:szCs w:val="22"/>
+        </w:rPr>
+        <w:t xml:space="preserve"> directory and the test</w:t>
+      </w:r>
+      <w:r>
+        <w:rPr>
+          <w:color w:val="000000" w:themeColor="text1"/>
+          <w:sz w:val="22"/>
+          <w:szCs w:val="22"/>
+        </w:rPr>
+        <w:t xml:space="preserve"> directory</w:t>
+      </w:r>
+      <w:r>
+        <w:rPr>
+          <w:color w:val="000000" w:themeColor="text1"/>
+          <w:sz w:val="22"/>
+          <w:szCs w:val="22"/>
+        </w:rPr>
+        <w:t xml:space="preserve"> and other dependencies</w:t>
+      </w:r>
+      <w:r>
+        <w:rPr>
+          <w:color w:val="000000" w:themeColor="text1"/>
+          <w:sz w:val="22"/>
+          <w:szCs w:val="22"/>
+        </w:rPr>
+        <w:t xml:space="preserve"> </w:t>
+      </w:r>
+      <w:r>
+        <w:rPr>
+          <w:color w:val="000000" w:themeColor="text1"/>
+          <w:sz w:val="22"/>
+          <w:szCs w:val="22"/>
+        </w:rPr>
+        <w:t>this</w:t>
+      </w:r>
+      <w:r>
+        <w:rPr>
+          <w:color w:val="000000" w:themeColor="text1"/>
+          <w:sz w:val="22"/>
+          <w:szCs w:val="22"/>
+        </w:rPr>
+        <w:t xml:space="preserve"> </w:t>
+      </w:r>
+      <w:r>
+        <w:rPr>
+          <w:color w:val="000000" w:themeColor="text1"/>
+          <w:sz w:val="22"/>
+          <w:szCs w:val="22"/>
+        </w:rPr>
+        <w:t xml:space="preserve">is the directory where </w:t>
+      </w:r>
+      <w:proofErr w:type="spellStart"/>
+      <w:r>
+        <w:rPr>
+          <w:color w:val="000000" w:themeColor="text1"/>
+          <w:sz w:val="22"/>
+          <w:szCs w:val="22"/>
+        </w:rPr>
+        <w:t>i</w:t>
+      </w:r>
+      <w:proofErr w:type="spellEnd"/>
+      <w:r>
+        <w:rPr>
+          <w:color w:val="000000" w:themeColor="text1"/>
+          <w:sz w:val="22"/>
+          <w:szCs w:val="22"/>
+        </w:rPr>
+        <w:t xml:space="preserve"> should do the docker </w:t>
+      </w:r>
+      <w:proofErr w:type="spellStart"/>
+      <w:r>
+        <w:rPr>
+          <w:color w:val="000000" w:themeColor="text1"/>
+          <w:sz w:val="22"/>
+          <w:szCs w:val="22"/>
+        </w:rPr>
+        <w:t>init</w:t>
+      </w:r>
+      <w:proofErr w:type="spellEnd"/>
+      <w:r>
+        <w:rPr>
+          <w:color w:val="000000" w:themeColor="text1"/>
+          <w:sz w:val="22"/>
+          <w:szCs w:val="22"/>
+        </w:rPr>
+        <w:t>??: C:\Users\M4800\Desktop\IntFFM\MIntFFM\MIntFFM</w:t>
+      </w:r>
+    </w:p>
+    <w:p>
+      <w:pPr>
+        <w:rPr>
+          <w:color w:val="000000" w:themeColor="text1"/>
+          <w:sz w:val="22"/>
+          <w:szCs w:val="22"/>
+        </w:rPr>
+      </w:pPr>
+    </w:p>
+    <w:p>
+      <w:pPr>
+        <w:rPr>
+          <w:color w:val="000000" w:themeColor="text1"/>
+          <w:sz w:val="22"/>
+          <w:szCs w:val="22"/>
+        </w:rPr>
+      </w:pPr>
+      <w:r>
+        <w:rPr>
+          <w:color w:val="000000" w:themeColor="text1"/>
+          <w:sz w:val="22"/>
+          <w:szCs w:val="22"/>
+        </w:rPr>
+        <w:t xml:space="preserve">In the past, you had to create </w:t>
+      </w:r>
+      <w:proofErr w:type="spellStart"/>
+      <w:r>
+        <w:rPr>
+          <w:color w:val="000000" w:themeColor="text1"/>
+          <w:sz w:val="22"/>
+          <w:szCs w:val="22"/>
+        </w:rPr>
+        <w:t>Dockerfiles</w:t>
+      </w:r>
+      <w:proofErr w:type="spellEnd"/>
+      <w:r>
+        <w:rPr>
+          <w:color w:val="000000" w:themeColor="text1"/>
+          <w:sz w:val="22"/>
+          <w:szCs w:val="22"/>
+        </w:rPr>
+        <w:t xml:space="preserve"> manually. Fortunately, newer versions of Docker support the docker </w:t>
+      </w:r>
+      <w:proofErr w:type="spellStart"/>
+      <w:r>
+        <w:rPr>
+          <w:color w:val="000000" w:themeColor="text1"/>
+          <w:sz w:val="22"/>
+          <w:szCs w:val="22"/>
+        </w:rPr>
+        <w:t>init</w:t>
+      </w:r>
+      <w:proofErr w:type="spellEnd"/>
+      <w:r>
+        <w:rPr>
+          <w:color w:val="000000" w:themeColor="text1"/>
+          <w:sz w:val="22"/>
+          <w:szCs w:val="22"/>
+        </w:rPr>
+        <w:t xml:space="preserve"> command that analyses applications and automatically creates </w:t>
+      </w:r>
+      <w:proofErr w:type="spellStart"/>
+      <w:r>
+        <w:rPr>
+          <w:color w:val="000000" w:themeColor="text1"/>
+          <w:sz w:val="22"/>
+          <w:szCs w:val="22"/>
+        </w:rPr>
+        <w:t>Dockerfiles</w:t>
+      </w:r>
+      <w:proofErr w:type="spellEnd"/>
+      <w:r>
+        <w:rPr>
+          <w:color w:val="000000" w:themeColor="text1"/>
+          <w:sz w:val="22"/>
+          <w:szCs w:val="22"/>
+        </w:rPr>
+        <w:t xml:space="preserve"> that implement good practices.</w:t>
+      </w:r>
+    </w:p>
+    <w:p>
+      <w:pPr>
+        <w:rPr>
+          <w:color w:val="000000" w:themeColor="text1"/>
+          <w:sz w:val="22"/>
+          <w:szCs w:val="22"/>
+        </w:rPr>
+      </w:pPr>
+    </w:p>
+    <w:p>
+      <w:pPr>
+        <w:rPr>
+          <w:color w:val="000000" w:themeColor="text1"/>
+          <w:sz w:val="22"/>
+          <w:szCs w:val="22"/>
+        </w:rPr>
+      </w:pPr>
+    </w:p>
+    <w:p>
+      <w:pPr>
+        <w:rPr>
+          <w:color w:val="000000" w:themeColor="text1"/>
+          <w:sz w:val="22"/>
+          <w:szCs w:val="22"/>
+        </w:rPr>
+      </w:pPr>
+    </w:p>
+    <w:p>
+      <w:pPr>
+        <w:rPr>
+          <w:color w:val="000000" w:themeColor="text1"/>
+          <w:sz w:val="22"/>
+          <w:szCs w:val="22"/>
+        </w:rPr>
+      </w:pPr>
+    </w:p>
+    <w:p>
+      <w:pPr>
+        <w:rPr>
+          <w:color w:val="000000" w:themeColor="text1"/>
+          <w:sz w:val="22"/>
+          <w:szCs w:val="22"/>
+        </w:rPr>
+      </w:pPr>
+    </w:p>
+    <w:p>
+      <w:pPr>
+        <w:rPr>
+          <w:color w:val="000000" w:themeColor="text1"/>
+          <w:sz w:val="22"/>
+          <w:szCs w:val="22"/>
+        </w:rPr>
+      </w:pPr>
+    </w:p>
+    <w:p>
+      <w:pPr>
+        <w:rPr>
+          <w:color w:val="000000" w:themeColor="text1"/>
+          <w:sz w:val="22"/>
+          <w:szCs w:val="22"/>
+        </w:rPr>
+      </w:pPr>
+      <w:r>
+        <w:rPr>
+          <w:color w:val="000000" w:themeColor="text1"/>
+          <w:sz w:val="22"/>
+          <w:szCs w:val="22"/>
+        </w:rPr>
+        <w:lastRenderedPageBreak/>
+        <w:t xml:space="preserve">? What application platform does your project use? </w:t>
+      </w:r>
+    </w:p>
+    <w:p>
+      <w:pPr>
+        <w:rPr>
+          <w:color w:val="000000" w:themeColor="text1"/>
+          <w:sz w:val="22"/>
+          <w:szCs w:val="22"/>
+        </w:rPr>
+      </w:pPr>
+      <w:r>
+        <w:rPr>
+          <w:color w:val="000000" w:themeColor="text1"/>
+          <w:sz w:val="22"/>
+          <w:szCs w:val="22"/>
+        </w:rPr>
+        <w:t xml:space="preserve">   → [Select] Java (or Spring Boot if listed specifically)</w:t>
+      </w:r>
+    </w:p>
+    <w:p>
+      <w:pPr>
+        <w:rPr>
+          <w:color w:val="000000" w:themeColor="text1"/>
+          <w:sz w:val="22"/>
+          <w:szCs w:val="22"/>
+        </w:rPr>
+      </w:pPr>
+      <w:r>
+        <w:rPr>
+          <w:color w:val="000000" w:themeColor="text1"/>
+          <w:sz w:val="22"/>
+          <w:szCs w:val="22"/>
+        </w:rPr>
+        <w:t>? What version of Java do you want to use? → [Select] 17 (or 11, 21 - whichever your project uses)</w:t>
+      </w:r>
+    </w:p>
+    <w:p>
+      <w:pPr>
+        <w:rPr>
+          <w:color w:val="000000" w:themeColor="text1"/>
+          <w:sz w:val="22"/>
+          <w:szCs w:val="22"/>
+        </w:rPr>
+      </w:pPr>
+      <w:r>
+        <w:rPr>
+          <w:color w:val="000000" w:themeColor="text1"/>
+          <w:sz w:val="22"/>
+          <w:szCs w:val="22"/>
+        </w:rPr>
+        <w:t>? Which build tool do you want to use?    → [Select] Maven</w:t>
+      </w:r>
+      <w:r>
+        <w:rPr>
+          <w:color w:val="000000" w:themeColor="text1"/>
+          <w:sz w:val="22"/>
+          <w:szCs w:val="22"/>
+        </w:rPr>
+        <w:t xml:space="preserve"> </w:t>
+      </w:r>
+    </w:p>
+    <w:p>
+      <w:pPr>
+        <w:rPr>
+          <w:color w:val="000000" w:themeColor="text1"/>
+          <w:sz w:val="22"/>
+          <w:szCs w:val="22"/>
+        </w:rPr>
+      </w:pPr>
+      <w:proofErr w:type="gramStart"/>
+      <w:r>
+        <w:rPr>
+          <w:color w:val="000000" w:themeColor="text1"/>
+          <w:sz w:val="22"/>
+          <w:szCs w:val="22"/>
+        </w:rPr>
+        <w:t>?What</w:t>
+      </w:r>
+      <w:proofErr w:type="gramEnd"/>
+      <w:r>
+        <w:rPr>
+          <w:color w:val="000000" w:themeColor="text1"/>
+          <w:sz w:val="22"/>
+          <w:szCs w:val="22"/>
+        </w:rPr>
+        <w:t xml:space="preserve"> command do you want to use to start the app?   → [Type</w:t>
+      </w:r>
+      <w:proofErr w:type="gramStart"/>
+      <w:r>
+        <w:rPr>
+          <w:color w:val="000000" w:themeColor="text1"/>
+          <w:sz w:val="22"/>
+          <w:szCs w:val="22"/>
+        </w:rPr>
+        <w:t>] .</w:t>
+      </w:r>
+      <w:proofErr w:type="gramEnd"/>
+      <w:r>
+        <w:rPr>
+          <w:color w:val="000000" w:themeColor="text1"/>
+          <w:sz w:val="22"/>
+          <w:szCs w:val="22"/>
+        </w:rPr>
+        <w:t>/</w:t>
+      </w:r>
+      <w:proofErr w:type="spellStart"/>
+      <w:r>
+        <w:rPr>
+          <w:color w:val="000000" w:themeColor="text1"/>
+          <w:sz w:val="22"/>
+          <w:szCs w:val="22"/>
+        </w:rPr>
+        <w:t>mvnw</w:t>
+      </w:r>
+      <w:proofErr w:type="spellEnd"/>
+      <w:r>
+        <w:rPr>
+          <w:color w:val="000000" w:themeColor="text1"/>
+          <w:sz w:val="22"/>
+          <w:szCs w:val="22"/>
+        </w:rPr>
+        <w:t xml:space="preserve"> </w:t>
+      </w:r>
+      <w:proofErr w:type="spellStart"/>
+      <w:r>
+        <w:rPr>
+          <w:color w:val="000000" w:themeColor="text1"/>
+          <w:sz w:val="22"/>
+          <w:szCs w:val="22"/>
+        </w:rPr>
+        <w:t>spring-</w:t>
+      </w:r>
+      <w:proofErr w:type="gramStart"/>
+      <w:r>
+        <w:rPr>
+          <w:color w:val="000000" w:themeColor="text1"/>
+          <w:sz w:val="22"/>
+          <w:szCs w:val="22"/>
+        </w:rPr>
+        <w:t>boot:run</w:t>
+      </w:r>
+      <w:proofErr w:type="spellEnd"/>
+      <w:proofErr w:type="gramEnd"/>
+      <w:r>
+        <w:rPr>
+          <w:color w:val="000000" w:themeColor="text1"/>
+          <w:sz w:val="22"/>
+          <w:szCs w:val="22"/>
+        </w:rPr>
+        <w:t xml:space="preserve">  </w:t>
+      </w:r>
+      <w:proofErr w:type="gramStart"/>
+      <w:r>
+        <w:rPr>
+          <w:color w:val="000000" w:themeColor="text1"/>
+          <w:sz w:val="22"/>
+          <w:szCs w:val="22"/>
+        </w:rPr>
+        <w:t>OR  java</w:t>
+      </w:r>
+      <w:proofErr w:type="gramEnd"/>
+      <w:r>
+        <w:rPr>
+          <w:color w:val="000000" w:themeColor="text1"/>
+          <w:sz w:val="22"/>
+          <w:szCs w:val="22"/>
+        </w:rPr>
+        <w:t xml:space="preserve"> -jar target/*.jar? </w:t>
+      </w:r>
+    </w:p>
+    <w:p>
+      <w:pPr>
+        <w:rPr>
+          <w:color w:val="000000" w:themeColor="text1"/>
+          <w:sz w:val="22"/>
+          <w:szCs w:val="22"/>
+        </w:rPr>
+      </w:pPr>
+      <w:r>
+        <w:rPr>
+          <w:color w:val="000000" w:themeColor="text1"/>
+          <w:sz w:val="22"/>
+          <w:szCs w:val="22"/>
+        </w:rPr>
+        <w:t>What port does your server listen on?   → [Type] 8080 (default for Spring Boot)</w:t>
+      </w:r>
+    </w:p>
+    <w:p>
+      <w:pPr>
+        <w:rPr>
+          <w:color w:val="000000" w:themeColor="text1"/>
+          <w:sz w:val="22"/>
+          <w:szCs w:val="22"/>
+        </w:rPr>
+      </w:pPr>
+    </w:p>
+    <w:p>
+      <w:pPr>
+        <w:rPr>
+          <w:color w:val="EE0000"/>
+        </w:rPr>
+      </w:pPr>
+      <w:r>
+        <w:rPr>
+          <w:color w:val="EE0000"/>
+        </w:rPr>
+        <w:t>docker build -t ddd-</w:t>
+      </w:r>
+      <w:proofErr w:type="gramStart"/>
+      <w:r>
+        <w:rPr>
+          <w:color w:val="EE0000"/>
+        </w:rPr>
+        <w:t>book:ch8.node</w:t>
+      </w:r>
+      <w:proofErr w:type="gramEnd"/>
+      <w:r>
+        <w:rPr>
+          <w:color w:val="EE0000"/>
+        </w:rPr>
+        <w:t xml:space="preserve"> .</w:t>
+      </w:r>
+      <w:r>
+        <w:rPr>
+          <w:color w:val="EE0000"/>
+        </w:rPr>
+        <w:t xml:space="preserve">   </w:t>
+      </w:r>
+      <w:r>
+        <w:rPr>
+          <w:color w:val="EE0000"/>
+        </w:rPr>
+        <w:sym w:font="Wingdings" w:char="F0E0"/>
+      </w:r>
+      <w:r>
+        <w:rPr>
+          <w:color w:val="EE0000"/>
+        </w:rPr>
+        <w:t xml:space="preserve"> explanation</w:t>
+      </w:r>
+    </w:p>
+    <w:p>
+      <w:pPr>
+        <w:rPr>
+          <w:color w:val="000000" w:themeColor="text1"/>
+          <w:sz w:val="22"/>
+          <w:szCs w:val="22"/>
+        </w:rPr>
+      </w:pPr>
+      <w:r>
+        <w:rPr>
+          <w:color w:val="000000" w:themeColor="text1"/>
+          <w:sz w:val="22"/>
+          <w:szCs w:val="22"/>
+        </w:rPr>
+        <w:t xml:space="preserve">docker build is the way to create an image from a docker file, the -t flag is to give that image a name instead of giving it a random id, and the </w:t>
+      </w:r>
+      <w:proofErr w:type="spellStart"/>
+      <w:r>
+        <w:rPr>
+          <w:color w:val="000000" w:themeColor="text1"/>
+          <w:sz w:val="22"/>
+          <w:szCs w:val="22"/>
+        </w:rPr>
+        <w:t>ddd</w:t>
+      </w:r>
+      <w:proofErr w:type="spellEnd"/>
+      <w:r>
+        <w:rPr>
+          <w:color w:val="000000" w:themeColor="text1"/>
+          <w:sz w:val="22"/>
+          <w:szCs w:val="22"/>
+        </w:rPr>
+        <w:t xml:space="preserve">-book </w:t>
+      </w:r>
+      <w:r>
+        <w:rPr>
+          <w:color w:val="000000" w:themeColor="text1"/>
+          <w:sz w:val="22"/>
+          <w:szCs w:val="22"/>
+        </w:rPr>
+        <w:sym w:font="Wingdings" w:char="F0E0"/>
+      </w:r>
+      <w:r>
+        <w:rPr>
+          <w:color w:val="000000" w:themeColor="text1"/>
+          <w:sz w:val="22"/>
+          <w:szCs w:val="22"/>
+        </w:rPr>
+        <w:t xml:space="preserve"> is the image name, the ch8.node is the version or tag name </w:t>
+      </w:r>
+      <w:proofErr w:type="gramStart"/>
+      <w:r>
+        <w:rPr>
+          <w:color w:val="000000" w:themeColor="text1"/>
+          <w:sz w:val="22"/>
+          <w:szCs w:val="22"/>
+        </w:rPr>
+        <w:t>the .</w:t>
+      </w:r>
+      <w:proofErr w:type="gramEnd"/>
+      <w:r>
+        <w:rPr>
+          <w:color w:val="000000" w:themeColor="text1"/>
+          <w:sz w:val="22"/>
+          <w:szCs w:val="22"/>
+        </w:rPr>
+        <w:t xml:space="preserve"> is to tell the docker terminal to look for the docker file in the current directory.</w:t>
+      </w:r>
+    </w:p>
+    <w:p>
+      <w:pPr>
+        <w:rPr>
+          <w:color w:val="000000" w:themeColor="text1"/>
+          <w:sz w:val="22"/>
+          <w:szCs w:val="22"/>
+        </w:rPr>
+      </w:pPr>
+    </w:p>
+    <w:p>
+      <w:pPr>
+        <w:rPr>
+          <w:color w:val="000000" w:themeColor="text1"/>
+          <w:sz w:val="22"/>
+          <w:szCs w:val="22"/>
+        </w:rPr>
+      </w:pPr>
+    </w:p>
+    <w:p>
+      <w:pPr>
+        <w:rPr>
+          <w:b/>
+          <w:bCs/>
+          <w:color w:val="000000" w:themeColor="text1"/>
+          <w:sz w:val="28"/>
+          <w:szCs w:val="28"/>
+          <w:u w:val="single"/>
+        </w:rPr>
+      </w:pPr>
+      <w:r>
+        <w:rPr>
+          <w:b/>
+          <w:bCs/>
+          <w:color w:val="000000" w:themeColor="text1"/>
+          <w:sz w:val="28"/>
+          <w:szCs w:val="28"/>
+          <w:u w:val="single"/>
+        </w:rPr>
+        <w:t>adding and pushing to docker hub:</w:t>
+      </w:r>
+    </w:p>
+    <w:p>
+      <w:pPr>
+        <w:rPr>
+          <w:color w:val="000000" w:themeColor="text1"/>
+          <w:sz w:val="22"/>
+          <w:szCs w:val="22"/>
+        </w:rPr>
+      </w:pPr>
+    </w:p>
+    <w:p>
+      <w:pPr>
+        <w:rPr>
+          <w:color w:val="EE0000"/>
+        </w:rPr>
+      </w:pPr>
+      <w:r>
+        <w:rPr>
+          <w:color w:val="EE0000"/>
+        </w:rPr>
+        <w:t>docker tag</w:t>
+      </w:r>
+    </w:p>
+    <w:p>
+      <w:pPr>
+        <w:rPr>
+          <w:color w:val="EE0000"/>
+        </w:rPr>
+      </w:pPr>
+      <w:r>
+        <w:rPr>
+          <w:color w:val="EE0000"/>
+        </w:rPr>
+        <w:t>YOUR_ORIGINAL_IMAGE_</w:t>
+      </w:r>
+      <w:proofErr w:type="gramStart"/>
+      <w:r>
+        <w:rPr>
+          <w:color w:val="EE0000"/>
+        </w:rPr>
+        <w:t>NAME:ORIGINAL</w:t>
+      </w:r>
+      <w:proofErr w:type="gramEnd"/>
+      <w:r>
+        <w:rPr>
+          <w:color w:val="EE0000"/>
+        </w:rPr>
+        <w:t>_TAG YOUR_DOCKERHUB_USERNAME/NEW_IMAGE_</w:t>
+      </w:r>
+      <w:proofErr w:type="gramStart"/>
+      <w:r>
+        <w:rPr>
+          <w:color w:val="EE0000"/>
+        </w:rPr>
+        <w:t>NAME:NEW</w:t>
+      </w:r>
+      <w:proofErr w:type="gramEnd"/>
+      <w:r>
+        <w:rPr>
+          <w:color w:val="EE0000"/>
+        </w:rPr>
+        <w:t>_TAG</w:t>
+      </w:r>
+    </w:p>
+    <w:p>
+      <w:pPr>
+        <w:rPr>
+          <w:color w:val="000000" w:themeColor="text1"/>
+          <w:sz w:val="22"/>
+          <w:szCs w:val="22"/>
+        </w:rPr>
+      </w:pPr>
+      <w:r>
+        <w:rPr>
+          <w:color w:val="000000" w:themeColor="text1"/>
+          <w:sz w:val="22"/>
+          <w:szCs w:val="22"/>
+        </w:rPr>
+        <w:t xml:space="preserve">this here </w:t>
+      </w:r>
+      <w:r>
+        <w:rPr>
+          <w:color w:val="000000" w:themeColor="text1"/>
+          <w:sz w:val="22"/>
+          <w:szCs w:val="22"/>
+        </w:rPr>
+        <w:t xml:space="preserve">creates a new tag out of an </w:t>
+      </w:r>
+      <w:proofErr w:type="gramStart"/>
+      <w:r>
+        <w:rPr>
+          <w:color w:val="000000" w:themeColor="text1"/>
+          <w:sz w:val="22"/>
+          <w:szCs w:val="22"/>
+        </w:rPr>
+        <w:t>existing images</w:t>
+      </w:r>
+      <w:proofErr w:type="gramEnd"/>
+      <w:r>
+        <w:rPr>
+          <w:color w:val="000000" w:themeColor="text1"/>
+          <w:sz w:val="22"/>
+          <w:szCs w:val="22"/>
+        </w:rPr>
+        <w:t xml:space="preserve"> </w:t>
+      </w:r>
+    </w:p>
+    <w:p>
+      <w:pPr>
+        <w:rPr>
+          <w:color w:val="EE0000"/>
+        </w:rPr>
+      </w:pPr>
+      <w:r>
+        <w:rPr>
+          <w:color w:val="EE0000"/>
+        </w:rPr>
+        <w:t>docker push YOUR_DOCKERHUB_USERNAME/IMAGE_</w:t>
+      </w:r>
+      <w:proofErr w:type="gramStart"/>
+      <w:r>
+        <w:rPr>
+          <w:color w:val="EE0000"/>
+        </w:rPr>
+        <w:t>NAME:TAG</w:t>
+      </w:r>
+      <w:proofErr w:type="gramEnd"/>
+    </w:p>
+    <w:p>
+      <w:pPr>
+        <w:rPr>
+          <w:color w:val="000000" w:themeColor="text1"/>
+          <w:sz w:val="22"/>
+          <w:szCs w:val="22"/>
+        </w:rPr>
+      </w:pPr>
+    </w:p>
+    <w:p>
+      <w:pPr>
+        <w:rPr>
+          <w:color w:val="000000" w:themeColor="text1"/>
+          <w:sz w:val="22"/>
+          <w:szCs w:val="22"/>
+        </w:rPr>
+      </w:pPr>
+      <w:r>
+        <w:rPr>
+          <w:color w:val="000000" w:themeColor="text1"/>
+          <w:sz w:val="22"/>
+          <w:szCs w:val="22"/>
+        </w:rPr>
+        <w:t>T</w:t>
+      </w:r>
+      <w:r>
+        <w:rPr>
+          <w:color w:val="000000" w:themeColor="text1"/>
+          <w:sz w:val="22"/>
+          <w:szCs w:val="22"/>
+        </w:rPr>
+        <w:t>he image name becomes a new repository on my docker hub</w:t>
+      </w:r>
+    </w:p>
+    <w:p>
+      <w:pPr>
+        <w:rPr>
+          <w:color w:val="000000" w:themeColor="text1"/>
+          <w:sz w:val="22"/>
+          <w:szCs w:val="22"/>
+        </w:rPr>
+      </w:pPr>
+      <w:r>
+        <w:rPr>
+          <w:color w:val="000000" w:themeColor="text1"/>
+          <w:sz w:val="22"/>
+          <w:szCs w:val="22"/>
+        </w:rPr>
+        <w:t>i</w:t>
+      </w:r>
+      <w:r>
+        <w:rPr>
+          <w:color w:val="000000" w:themeColor="text1"/>
+          <w:sz w:val="22"/>
+          <w:szCs w:val="22"/>
+        </w:rPr>
+        <w:t>f i add and push an image called my-app but with the tag v2 it will be in the same repo is my-</w:t>
+      </w:r>
+      <w:proofErr w:type="gramStart"/>
+      <w:r>
+        <w:rPr>
+          <w:color w:val="000000" w:themeColor="text1"/>
+          <w:sz w:val="22"/>
+          <w:szCs w:val="22"/>
+        </w:rPr>
+        <w:t>app:v</w:t>
+      </w:r>
+      <w:proofErr w:type="gramEnd"/>
+      <w:r>
+        <w:rPr>
+          <w:color w:val="000000" w:themeColor="text1"/>
+          <w:sz w:val="22"/>
+          <w:szCs w:val="22"/>
+        </w:rPr>
+        <w:t>2</w:t>
+      </w:r>
+    </w:p>
+    <w:p>
+      <w:pPr>
+        <w:rPr>
+          <w:color w:val="EE0000"/>
+        </w:rPr>
+      </w:pPr>
+    </w:p>
+    <w:p>
+      <w:pPr>
+        <w:rPr>
+          <w:color w:val="EE0000"/>
+        </w:rPr>
+      </w:pPr>
+    </w:p>
+    <w:p>
+      <w:pPr>
+        <w:rPr>
+          <w:color w:val="EE0000"/>
+        </w:rPr>
+      </w:pPr>
+      <w:r>
+        <w:rPr>
+          <w:color w:val="EE0000"/>
+        </w:rPr>
+        <w:lastRenderedPageBreak/>
+        <w:t>dock</w:t>
+      </w:r>
+      <w:r>
+        <w:rPr>
+          <w:color w:val="EE0000"/>
+        </w:rPr>
+        <w:t xml:space="preserve">er run-d--name c1 \-p 5005:8080 \ </w:t>
+      </w:r>
+      <w:proofErr w:type="spellStart"/>
+      <w:r>
+        <w:rPr>
+          <w:color w:val="EE0000"/>
+        </w:rPr>
+        <w:t>nigelpoulton</w:t>
+      </w:r>
+      <w:proofErr w:type="spellEnd"/>
+      <w:r>
+        <w:rPr>
+          <w:color w:val="EE0000"/>
+        </w:rPr>
+        <w:t>/ddd-</w:t>
+      </w:r>
+      <w:proofErr w:type="gramStart"/>
+      <w:r>
+        <w:rPr>
+          <w:color w:val="EE0000"/>
+        </w:rPr>
+        <w:t>book:ch8.node</w:t>
+      </w:r>
+      <w:proofErr w:type="gramEnd"/>
+    </w:p>
+    <w:p>
+      <w:pPr>
+        <w:rPr>
+          <w:color w:val="000000" w:themeColor="text1"/>
+          <w:sz w:val="22"/>
+          <w:szCs w:val="22"/>
+        </w:rPr>
+      </w:pPr>
+      <w:r>
+        <w:rPr>
+          <w:color w:val="000000" w:themeColor="text1"/>
+          <w:sz w:val="22"/>
+          <w:szCs w:val="22"/>
+        </w:rPr>
+        <w:t xml:space="preserve">so docker run creates a new container from an image -d runs in the background, --name is to name the container, -p means that our app is running on 5005 and the container is running on port 8080 the </w:t>
+      </w:r>
+      <w:proofErr w:type="spellStart"/>
+      <w:r>
+        <w:rPr>
+          <w:color w:val="000000" w:themeColor="text1"/>
+          <w:sz w:val="22"/>
+          <w:szCs w:val="22"/>
+        </w:rPr>
+        <w:t>nigelpoulton</w:t>
+      </w:r>
+      <w:proofErr w:type="spellEnd"/>
+      <w:r>
+        <w:rPr>
+          <w:color w:val="000000" w:themeColor="text1"/>
+          <w:sz w:val="22"/>
+          <w:szCs w:val="22"/>
+        </w:rPr>
+        <w:t>/ddd-</w:t>
+      </w:r>
+      <w:proofErr w:type="gramStart"/>
+      <w:r>
+        <w:rPr>
+          <w:color w:val="000000" w:themeColor="text1"/>
+          <w:sz w:val="22"/>
+          <w:szCs w:val="22"/>
+        </w:rPr>
+        <w:t>book:ch8.node</w:t>
+      </w:r>
+      <w:proofErr w:type="gramEnd"/>
+      <w:r>
+        <w:rPr>
+          <w:color w:val="000000" w:themeColor="text1"/>
+          <w:sz w:val="22"/>
+          <w:szCs w:val="22"/>
+        </w:rPr>
+        <w:t xml:space="preserve"> is the image name and tag</w:t>
+      </w:r>
+    </w:p>
+    <w:p>
+      <w:pPr>
+        <w:rPr>
+          <w:color w:val="000000" w:themeColor="text1"/>
+          <w:sz w:val="22"/>
+          <w:szCs w:val="22"/>
+        </w:rPr>
+      </w:pPr>
+    </w:p>
+    <w:p>
+      <w:pPr>
+        <w:rPr>
+          <w:color w:val="000000" w:themeColor="text1"/>
+          <w:sz w:val="22"/>
+          <w:szCs w:val="22"/>
+        </w:rPr>
+      </w:pPr>
+      <w:proofErr w:type="gramStart"/>
+      <w:r>
+        <w:rPr>
+          <w:color w:val="000000" w:themeColor="text1"/>
+          <w:sz w:val="22"/>
+          <w:szCs w:val="22"/>
+        </w:rPr>
+        <w:t>so</w:t>
+      </w:r>
+      <w:proofErr w:type="gramEnd"/>
+      <w:r>
+        <w:rPr>
+          <w:color w:val="000000" w:themeColor="text1"/>
+          <w:sz w:val="22"/>
+          <w:szCs w:val="22"/>
+        </w:rPr>
+        <w:t xml:space="preserve"> the 5005 means we are forcing our app to run on that specified port we don’t actually care what the code or the default of the app run on so when we go to the browser after running it on port </w:t>
+      </w:r>
+      <w:proofErr w:type="gramStart"/>
+      <w:r>
+        <w:rPr>
+          <w:color w:val="000000" w:themeColor="text1"/>
+          <w:sz w:val="22"/>
+          <w:szCs w:val="22"/>
+        </w:rPr>
+        <w:t>5005</w:t>
+      </w:r>
+      <w:proofErr w:type="gramEnd"/>
+      <w:r>
+        <w:rPr>
+          <w:color w:val="000000" w:themeColor="text1"/>
+          <w:sz w:val="22"/>
+          <w:szCs w:val="22"/>
+        </w:rPr>
+        <w:t xml:space="preserve"> we can expect it to be found on 5005 even if the app’s original code runs on 8081</w:t>
+      </w:r>
+    </w:p>
+    <w:p>
+      <w:pPr>
+        <w:rPr>
+          <w:color w:val="000000" w:themeColor="text1"/>
+          <w:sz w:val="22"/>
+          <w:szCs w:val="22"/>
+        </w:rPr>
+      </w:pPr>
+    </w:p>
+    <w:p>
+      <w:pPr>
+        <w:rPr>
+          <w:color w:val="000000" w:themeColor="text1"/>
+          <w:sz w:val="22"/>
+          <w:szCs w:val="22"/>
+        </w:rPr>
+      </w:pPr>
+      <w:r>
+        <w:rPr>
+          <w:color w:val="000000" w:themeColor="text1"/>
+          <w:sz w:val="22"/>
+          <w:szCs w:val="22"/>
+        </w:rPr>
+        <w:t xml:space="preserve">Examples of instructions that create new layers are </w:t>
+      </w:r>
+      <w:r>
+        <w:rPr>
+          <w:b/>
+          <w:bCs/>
+          <w:color w:val="000000" w:themeColor="text1"/>
+          <w:sz w:val="22"/>
+          <w:szCs w:val="22"/>
+        </w:rPr>
+        <w:t>FROM, RUN, COPY and WORKDIR.</w:t>
+      </w:r>
+      <w:r>
+        <w:rPr>
+          <w:color w:val="000000" w:themeColor="text1"/>
+          <w:sz w:val="22"/>
+          <w:szCs w:val="22"/>
+        </w:rPr>
+        <w:t xml:space="preserve"> </w:t>
+      </w:r>
+    </w:p>
+    <w:p>
+      <w:pPr>
+        <w:rPr>
+          <w:color w:val="000000" w:themeColor="text1"/>
+          <w:sz w:val="22"/>
+          <w:szCs w:val="22"/>
+        </w:rPr>
+      </w:pPr>
+      <w:r>
+        <w:rPr>
+          <w:color w:val="000000" w:themeColor="text1"/>
+          <w:sz w:val="22"/>
+          <w:szCs w:val="22"/>
+        </w:rPr>
+        <w:t xml:space="preserve">Examples that create metadata include </w:t>
+      </w:r>
+      <w:r>
+        <w:rPr>
+          <w:b/>
+          <w:bCs/>
+          <w:color w:val="000000" w:themeColor="text1"/>
+          <w:sz w:val="22"/>
+          <w:szCs w:val="22"/>
+        </w:rPr>
+        <w:t xml:space="preserve">EXPOSE, ENV, CMD, and ENTRYPOINT. </w:t>
+      </w:r>
+    </w:p>
+    <w:p>
+      <w:pPr>
+        <w:rPr>
+          <w:color w:val="000000" w:themeColor="text1"/>
+          <w:sz w:val="22"/>
+          <w:szCs w:val="22"/>
+        </w:rPr>
+      </w:pPr>
+      <w:r>
+        <w:rPr>
+          <w:color w:val="000000" w:themeColor="text1"/>
+          <w:sz w:val="22"/>
+          <w:szCs w:val="22"/>
+        </w:rPr>
+        <w:t xml:space="preserve">The premise is this: </w:t>
+      </w:r>
+    </w:p>
+    <w:p>
+      <w:pPr>
+        <w:ind w:left="720"/>
+        <w:rPr>
+          <w:color w:val="000000" w:themeColor="text1"/>
+          <w:sz w:val="22"/>
+          <w:szCs w:val="22"/>
+        </w:rPr>
+      </w:pPr>
+      <w:r>
+        <w:rPr>
+          <w:color w:val="000000" w:themeColor="text1"/>
+          <w:sz w:val="22"/>
+          <w:szCs w:val="22"/>
+        </w:rPr>
+        <w:t xml:space="preserve">• Instructions that add content, such as files and programs, create new layers </w:t>
+      </w:r>
+    </w:p>
+    <w:p>
+      <w:pPr>
+        <w:ind w:left="720"/>
+        <w:rPr>
+          <w:color w:val="000000" w:themeColor="text1"/>
+          <w:sz w:val="22"/>
+          <w:szCs w:val="22"/>
+        </w:rPr>
+      </w:pPr>
+      <w:r>
+        <w:rPr>
+          <w:color w:val="000000" w:themeColor="text1"/>
+          <w:sz w:val="22"/>
+          <w:szCs w:val="22"/>
+        </w:rPr>
+        <w:t>• Instructions that don’t add content don’t add layers and only create metadata</w:t>
+      </w:r>
+    </w:p>
+    <w:p>
+      <w:pPr>
+        <w:rPr>
+          <w:color w:val="000000" w:themeColor="text1"/>
+          <w:sz w:val="22"/>
+          <w:szCs w:val="22"/>
+        </w:rPr>
+      </w:pPr>
+      <w:r>
+        <w:rPr>
+          <w:color w:val="000000" w:themeColor="text1"/>
+          <w:sz w:val="22"/>
+          <w:szCs w:val="22"/>
+        </w:rPr>
+        <w:t>You can run a</w:t>
+      </w:r>
+      <w:r>
+        <w:rPr>
+          <w:color w:val="000000" w:themeColor="text1"/>
+          <w:sz w:val="22"/>
+          <w:szCs w:val="22"/>
+        </w:rPr>
+        <w:t xml:space="preserve"> </w:t>
+      </w:r>
+      <w:r>
+        <w:rPr>
+          <w:b/>
+          <w:bCs/>
+          <w:color w:val="000000" w:themeColor="text1"/>
+          <w:sz w:val="22"/>
+          <w:szCs w:val="22"/>
+        </w:rPr>
+        <w:t>docker history</w:t>
+      </w:r>
+      <w:r>
+        <w:rPr>
+          <w:color w:val="000000" w:themeColor="text1"/>
+          <w:sz w:val="22"/>
+          <w:szCs w:val="22"/>
+        </w:rPr>
+        <w:t xml:space="preserve"> command</w:t>
+      </w:r>
+      <w:r>
+        <w:rPr>
+          <w:color w:val="000000" w:themeColor="text1"/>
+          <w:sz w:val="22"/>
+          <w:szCs w:val="22"/>
+        </w:rPr>
+        <w:t xml:space="preserve"> </w:t>
+      </w:r>
+      <w:r>
+        <w:rPr>
+          <w:color w:val="000000" w:themeColor="text1"/>
+          <w:sz w:val="22"/>
+          <w:szCs w:val="22"/>
+        </w:rPr>
+        <w:t>against any image to see the instructions that created it.</w:t>
+      </w:r>
+    </w:p>
+    <w:p>
+      <w:pPr>
+        <w:rPr>
+          <w:color w:val="000000" w:themeColor="text1"/>
+          <w:sz w:val="22"/>
+          <w:szCs w:val="22"/>
+        </w:rPr>
+      </w:pPr>
+    </w:p>
+    <w:p>
+      <w:pPr>
+        <w:rPr>
+          <w:color w:val="000000" w:themeColor="text1"/>
+          <w:sz w:val="22"/>
+          <w:szCs w:val="22"/>
+        </w:rPr>
+      </w:pPr>
+    </w:p>
+    <w:p>
+      <w:pPr>
+        <w:rPr>
+          <w:b/>
+          <w:bCs/>
+          <w:color w:val="000000" w:themeColor="text1"/>
+          <w:sz w:val="28"/>
+          <w:szCs w:val="28"/>
+          <w:u w:val="single"/>
+        </w:rPr>
+      </w:pPr>
+      <w:r>
+        <w:rPr>
+          <w:b/>
+          <w:bCs/>
+          <w:color w:val="000000" w:themeColor="text1"/>
+          <w:sz w:val="28"/>
+          <w:szCs w:val="28"/>
+          <w:u w:val="single"/>
+        </w:rPr>
+        <w:t>Moving to production with multi-stage builds</w:t>
+      </w:r>
+      <w:r>
+        <w:rPr>
+          <w:b/>
+          <w:bCs/>
+          <w:color w:val="000000" w:themeColor="text1"/>
+          <w:sz w:val="28"/>
+          <w:szCs w:val="28"/>
+          <w:u w:val="single"/>
+        </w:rPr>
+        <w:t>:</w:t>
+      </w:r>
+    </w:p>
+    <w:p>
+      <w:pPr>
+        <w:rPr>
+          <w:color w:val="000000" w:themeColor="text1"/>
+          <w:sz w:val="22"/>
+          <w:szCs w:val="22"/>
+        </w:rPr>
+      </w:pPr>
+    </w:p>
+    <w:p>
+      <w:pPr>
+        <w:rPr>
+          <w:color w:val="000000" w:themeColor="text1"/>
+          <w:sz w:val="22"/>
+          <w:szCs w:val="22"/>
+        </w:rPr>
+      </w:pPr>
+      <w:r>
+        <w:rPr>
+          <w:color w:val="000000" w:themeColor="text1"/>
+          <w:sz w:val="22"/>
+          <w:szCs w:val="22"/>
+        </w:rPr>
+        <w:t>the bigger the image is the worse its is for production, bigger image means more vulnerabilities, slower run, larger service of attack</w:t>
+      </w:r>
+    </w:p>
+    <w:p>
+      <w:pPr>
+        <w:rPr>
+          <w:color w:val="000000" w:themeColor="text1"/>
+          <w:sz w:val="22"/>
+          <w:szCs w:val="22"/>
+        </w:rPr>
+      </w:pPr>
     </w:p>
     <w:sectPr>
       <w:pgSz w:w="12240" w:h="15840"/>

</xml_diff>

<commit_message>
add multi build stages example
</commit_message>
<xml_diff>
--- a/Docker.docx
+++ b/Docker.docx
@@ -5379,9 +5379,642 @@
           <w:szCs w:val="28"/>
           <w:u w:val="single"/>
         </w:rPr>
-        <w:t>Get the application code</w:t>
-      </w:r>
-      <w:r>
+        <w:t>Get the application code:</w:t>
+      </w:r>
+    </w:p>
+    <w:p>
+      <w:pPr>
+        <w:rPr>
+          <w:color w:val="000000" w:themeColor="text1"/>
+          <w:sz w:val="22"/>
+          <w:szCs w:val="22"/>
+        </w:rPr>
+      </w:pPr>
+      <w:r>
+        <w:rPr>
+          <w:color w:val="000000" w:themeColor="text1"/>
+          <w:sz w:val="22"/>
+          <w:szCs w:val="22"/>
+        </w:rPr>
+        <w:t xml:space="preserve">for </w:t>
+      </w:r>
+      <w:proofErr w:type="gramStart"/>
+      <w:r>
+        <w:rPr>
+          <w:color w:val="000000" w:themeColor="text1"/>
+          <w:sz w:val="22"/>
+          <w:szCs w:val="22"/>
+        </w:rPr>
+        <w:t>example</w:t>
+      </w:r>
+      <w:proofErr w:type="gramEnd"/>
+      <w:r>
+        <w:rPr>
+          <w:color w:val="000000" w:themeColor="text1"/>
+          <w:sz w:val="22"/>
+          <w:szCs w:val="22"/>
+        </w:rPr>
+        <w:t xml:space="preserve"> here is my code and this directory is for java spring boot, and it has the pom</w:t>
+      </w:r>
+      <w:r>
+        <w:rPr>
+          <w:color w:val="000000" w:themeColor="text1"/>
+          <w:sz w:val="22"/>
+          <w:szCs w:val="22"/>
+        </w:rPr>
+        <w:t>.xml</w:t>
+      </w:r>
+      <w:r>
+        <w:rPr>
+          <w:color w:val="000000" w:themeColor="text1"/>
+          <w:sz w:val="22"/>
+          <w:szCs w:val="22"/>
+        </w:rPr>
+        <w:t xml:space="preserve"> file the </w:t>
+      </w:r>
+      <w:proofErr w:type="spellStart"/>
+      <w:r>
+        <w:rPr>
+          <w:color w:val="000000" w:themeColor="text1"/>
+          <w:sz w:val="22"/>
+          <w:szCs w:val="22"/>
+        </w:rPr>
+        <w:t>src</w:t>
+      </w:r>
+      <w:proofErr w:type="spellEnd"/>
+      <w:r>
+        <w:rPr>
+          <w:color w:val="000000" w:themeColor="text1"/>
+          <w:sz w:val="22"/>
+          <w:szCs w:val="22"/>
+        </w:rPr>
+        <w:t xml:space="preserve"> directory and the test</w:t>
+      </w:r>
+      <w:r>
+        <w:rPr>
+          <w:color w:val="000000" w:themeColor="text1"/>
+          <w:sz w:val="22"/>
+          <w:szCs w:val="22"/>
+        </w:rPr>
+        <w:t xml:space="preserve"> directory</w:t>
+      </w:r>
+      <w:r>
+        <w:rPr>
+          <w:color w:val="000000" w:themeColor="text1"/>
+          <w:sz w:val="22"/>
+          <w:szCs w:val="22"/>
+        </w:rPr>
+        <w:t xml:space="preserve"> and other dependencies</w:t>
+      </w:r>
+      <w:r>
+        <w:rPr>
+          <w:color w:val="000000" w:themeColor="text1"/>
+          <w:sz w:val="22"/>
+          <w:szCs w:val="22"/>
+        </w:rPr>
+        <w:t xml:space="preserve"> </w:t>
+      </w:r>
+      <w:r>
+        <w:rPr>
+          <w:color w:val="000000" w:themeColor="text1"/>
+          <w:sz w:val="22"/>
+          <w:szCs w:val="22"/>
+        </w:rPr>
+        <w:t>this</w:t>
+      </w:r>
+      <w:r>
+        <w:rPr>
+          <w:color w:val="000000" w:themeColor="text1"/>
+          <w:sz w:val="22"/>
+          <w:szCs w:val="22"/>
+        </w:rPr>
+        <w:t xml:space="preserve"> </w:t>
+      </w:r>
+      <w:r>
+        <w:rPr>
+          <w:color w:val="000000" w:themeColor="text1"/>
+          <w:sz w:val="22"/>
+          <w:szCs w:val="22"/>
+        </w:rPr>
+        <w:t xml:space="preserve">is the directory where </w:t>
+      </w:r>
+      <w:proofErr w:type="spellStart"/>
+      <w:r>
+        <w:rPr>
+          <w:color w:val="000000" w:themeColor="text1"/>
+          <w:sz w:val="22"/>
+          <w:szCs w:val="22"/>
+        </w:rPr>
+        <w:t>i</w:t>
+      </w:r>
+      <w:proofErr w:type="spellEnd"/>
+      <w:r>
+        <w:rPr>
+          <w:color w:val="000000" w:themeColor="text1"/>
+          <w:sz w:val="22"/>
+          <w:szCs w:val="22"/>
+        </w:rPr>
+        <w:t xml:space="preserve"> should do the docker </w:t>
+      </w:r>
+      <w:proofErr w:type="spellStart"/>
+      <w:r>
+        <w:rPr>
+          <w:color w:val="000000" w:themeColor="text1"/>
+          <w:sz w:val="22"/>
+          <w:szCs w:val="22"/>
+        </w:rPr>
+        <w:t>init</w:t>
+      </w:r>
+      <w:proofErr w:type="spellEnd"/>
+      <w:r>
+        <w:rPr>
+          <w:color w:val="000000" w:themeColor="text1"/>
+          <w:sz w:val="22"/>
+          <w:szCs w:val="22"/>
+        </w:rPr>
+        <w:t>??: C:\Users\M4800\Desktop\IntFFM\MIntFFM\MIntFFM</w:t>
+      </w:r>
+    </w:p>
+    <w:p>
+      <w:pPr>
+        <w:rPr>
+          <w:color w:val="000000" w:themeColor="text1"/>
+          <w:sz w:val="22"/>
+          <w:szCs w:val="22"/>
+        </w:rPr>
+      </w:pPr>
+    </w:p>
+    <w:p>
+      <w:pPr>
+        <w:rPr>
+          <w:color w:val="000000" w:themeColor="text1"/>
+          <w:sz w:val="22"/>
+          <w:szCs w:val="22"/>
+        </w:rPr>
+      </w:pPr>
+      <w:r>
+        <w:rPr>
+          <w:color w:val="000000" w:themeColor="text1"/>
+          <w:sz w:val="22"/>
+          <w:szCs w:val="22"/>
+        </w:rPr>
+        <w:t xml:space="preserve">In the past, you had to create </w:t>
+      </w:r>
+      <w:proofErr w:type="spellStart"/>
+      <w:r>
+        <w:rPr>
+          <w:color w:val="000000" w:themeColor="text1"/>
+          <w:sz w:val="22"/>
+          <w:szCs w:val="22"/>
+        </w:rPr>
+        <w:t>Dockerfiles</w:t>
+      </w:r>
+      <w:proofErr w:type="spellEnd"/>
+      <w:r>
+        <w:rPr>
+          <w:color w:val="000000" w:themeColor="text1"/>
+          <w:sz w:val="22"/>
+          <w:szCs w:val="22"/>
+        </w:rPr>
+        <w:t xml:space="preserve"> manually. Fortunately, newer versions of Docker support the docker </w:t>
+      </w:r>
+      <w:proofErr w:type="spellStart"/>
+      <w:r>
+        <w:rPr>
+          <w:color w:val="000000" w:themeColor="text1"/>
+          <w:sz w:val="22"/>
+          <w:szCs w:val="22"/>
+        </w:rPr>
+        <w:t>init</w:t>
+      </w:r>
+      <w:proofErr w:type="spellEnd"/>
+      <w:r>
+        <w:rPr>
+          <w:color w:val="000000" w:themeColor="text1"/>
+          <w:sz w:val="22"/>
+          <w:szCs w:val="22"/>
+        </w:rPr>
+        <w:t xml:space="preserve"> command that analyses applications and automatically creates </w:t>
+      </w:r>
+      <w:proofErr w:type="spellStart"/>
+      <w:r>
+        <w:rPr>
+          <w:color w:val="000000" w:themeColor="text1"/>
+          <w:sz w:val="22"/>
+          <w:szCs w:val="22"/>
+        </w:rPr>
+        <w:t>Dockerfiles</w:t>
+      </w:r>
+      <w:proofErr w:type="spellEnd"/>
+      <w:r>
+        <w:rPr>
+          <w:color w:val="000000" w:themeColor="text1"/>
+          <w:sz w:val="22"/>
+          <w:szCs w:val="22"/>
+        </w:rPr>
+        <w:t xml:space="preserve"> that implement good practices.</w:t>
+      </w:r>
+    </w:p>
+    <w:p>
+      <w:pPr>
+        <w:rPr>
+          <w:color w:val="000000" w:themeColor="text1"/>
+          <w:sz w:val="22"/>
+          <w:szCs w:val="22"/>
+        </w:rPr>
+      </w:pPr>
+    </w:p>
+    <w:p>
+      <w:pPr>
+        <w:rPr>
+          <w:color w:val="000000" w:themeColor="text1"/>
+          <w:sz w:val="22"/>
+          <w:szCs w:val="22"/>
+        </w:rPr>
+      </w:pPr>
+    </w:p>
+    <w:p>
+      <w:pPr>
+        <w:rPr>
+          <w:color w:val="000000" w:themeColor="text1"/>
+          <w:sz w:val="22"/>
+          <w:szCs w:val="22"/>
+        </w:rPr>
+      </w:pPr>
+    </w:p>
+    <w:p>
+      <w:pPr>
+        <w:rPr>
+          <w:color w:val="000000" w:themeColor="text1"/>
+          <w:sz w:val="22"/>
+          <w:szCs w:val="22"/>
+        </w:rPr>
+      </w:pPr>
+    </w:p>
+    <w:p>
+      <w:pPr>
+        <w:rPr>
+          <w:color w:val="000000" w:themeColor="text1"/>
+          <w:sz w:val="22"/>
+          <w:szCs w:val="22"/>
+        </w:rPr>
+      </w:pPr>
+    </w:p>
+    <w:p>
+      <w:pPr>
+        <w:rPr>
+          <w:color w:val="000000" w:themeColor="text1"/>
+          <w:sz w:val="22"/>
+          <w:szCs w:val="22"/>
+        </w:rPr>
+      </w:pPr>
+    </w:p>
+    <w:p>
+      <w:pPr>
+        <w:rPr>
+          <w:color w:val="000000" w:themeColor="text1"/>
+          <w:sz w:val="22"/>
+          <w:szCs w:val="22"/>
+        </w:rPr>
+      </w:pPr>
+      <w:r>
+        <w:rPr>
+          <w:color w:val="000000" w:themeColor="text1"/>
+          <w:sz w:val="22"/>
+          <w:szCs w:val="22"/>
+        </w:rPr>
+        <w:lastRenderedPageBreak/>
+        <w:t xml:space="preserve">? What application platform does your project use? </w:t>
+      </w:r>
+    </w:p>
+    <w:p>
+      <w:pPr>
+        <w:rPr>
+          <w:color w:val="000000" w:themeColor="text1"/>
+          <w:sz w:val="22"/>
+          <w:szCs w:val="22"/>
+        </w:rPr>
+      </w:pPr>
+      <w:r>
+        <w:rPr>
+          <w:color w:val="000000" w:themeColor="text1"/>
+          <w:sz w:val="22"/>
+          <w:szCs w:val="22"/>
+        </w:rPr>
+        <w:t xml:space="preserve">   → [Select] Java (or Spring Boot if listed specifically)</w:t>
+      </w:r>
+    </w:p>
+    <w:p>
+      <w:pPr>
+        <w:rPr>
+          <w:color w:val="000000" w:themeColor="text1"/>
+          <w:sz w:val="22"/>
+          <w:szCs w:val="22"/>
+        </w:rPr>
+      </w:pPr>
+      <w:r>
+        <w:rPr>
+          <w:color w:val="000000" w:themeColor="text1"/>
+          <w:sz w:val="22"/>
+          <w:szCs w:val="22"/>
+        </w:rPr>
+        <w:t>? What version of Java do you want to use? → [Select] 17 (or 11, 21 - whichever your project uses)</w:t>
+      </w:r>
+    </w:p>
+    <w:p>
+      <w:pPr>
+        <w:rPr>
+          <w:color w:val="000000" w:themeColor="text1"/>
+          <w:sz w:val="22"/>
+          <w:szCs w:val="22"/>
+        </w:rPr>
+      </w:pPr>
+      <w:r>
+        <w:rPr>
+          <w:color w:val="000000" w:themeColor="text1"/>
+          <w:sz w:val="22"/>
+          <w:szCs w:val="22"/>
+        </w:rPr>
+        <w:t>? Which build tool do you want to use?    → [Select] Maven</w:t>
+      </w:r>
+      <w:r>
+        <w:rPr>
+          <w:color w:val="000000" w:themeColor="text1"/>
+          <w:sz w:val="22"/>
+          <w:szCs w:val="22"/>
+        </w:rPr>
+        <w:t xml:space="preserve"> </w:t>
+      </w:r>
+    </w:p>
+    <w:p>
+      <w:pPr>
+        <w:rPr>
+          <w:color w:val="000000" w:themeColor="text1"/>
+          <w:sz w:val="22"/>
+          <w:szCs w:val="22"/>
+        </w:rPr>
+      </w:pPr>
+      <w:proofErr w:type="gramStart"/>
+      <w:r>
+        <w:rPr>
+          <w:color w:val="000000" w:themeColor="text1"/>
+          <w:sz w:val="22"/>
+          <w:szCs w:val="22"/>
+        </w:rPr>
+        <w:t>?What</w:t>
+      </w:r>
+      <w:proofErr w:type="gramEnd"/>
+      <w:r>
+        <w:rPr>
+          <w:color w:val="000000" w:themeColor="text1"/>
+          <w:sz w:val="22"/>
+          <w:szCs w:val="22"/>
+        </w:rPr>
+        <w:t xml:space="preserve"> command do you want to use to start the app?   → [Type</w:t>
+      </w:r>
+      <w:proofErr w:type="gramStart"/>
+      <w:r>
+        <w:rPr>
+          <w:color w:val="000000" w:themeColor="text1"/>
+          <w:sz w:val="22"/>
+          <w:szCs w:val="22"/>
+        </w:rPr>
+        <w:t>] .</w:t>
+      </w:r>
+      <w:proofErr w:type="gramEnd"/>
+      <w:r>
+        <w:rPr>
+          <w:color w:val="000000" w:themeColor="text1"/>
+          <w:sz w:val="22"/>
+          <w:szCs w:val="22"/>
+        </w:rPr>
+        <w:t>/</w:t>
+      </w:r>
+      <w:proofErr w:type="spellStart"/>
+      <w:r>
+        <w:rPr>
+          <w:color w:val="000000" w:themeColor="text1"/>
+          <w:sz w:val="22"/>
+          <w:szCs w:val="22"/>
+        </w:rPr>
+        <w:t>mvnw</w:t>
+      </w:r>
+      <w:proofErr w:type="spellEnd"/>
+      <w:r>
+        <w:rPr>
+          <w:color w:val="000000" w:themeColor="text1"/>
+          <w:sz w:val="22"/>
+          <w:szCs w:val="22"/>
+        </w:rPr>
+        <w:t xml:space="preserve"> </w:t>
+      </w:r>
+      <w:proofErr w:type="spellStart"/>
+      <w:r>
+        <w:rPr>
+          <w:color w:val="000000" w:themeColor="text1"/>
+          <w:sz w:val="22"/>
+          <w:szCs w:val="22"/>
+        </w:rPr>
+        <w:t>spring-</w:t>
+      </w:r>
+      <w:proofErr w:type="gramStart"/>
+      <w:r>
+        <w:rPr>
+          <w:color w:val="000000" w:themeColor="text1"/>
+          <w:sz w:val="22"/>
+          <w:szCs w:val="22"/>
+        </w:rPr>
+        <w:t>boot:run</w:t>
+      </w:r>
+      <w:proofErr w:type="spellEnd"/>
+      <w:proofErr w:type="gramEnd"/>
+      <w:r>
+        <w:rPr>
+          <w:color w:val="000000" w:themeColor="text1"/>
+          <w:sz w:val="22"/>
+          <w:szCs w:val="22"/>
+        </w:rPr>
+        <w:t xml:space="preserve">  </w:t>
+      </w:r>
+      <w:proofErr w:type="gramStart"/>
+      <w:r>
+        <w:rPr>
+          <w:color w:val="000000" w:themeColor="text1"/>
+          <w:sz w:val="22"/>
+          <w:szCs w:val="22"/>
+        </w:rPr>
+        <w:t>OR  java</w:t>
+      </w:r>
+      <w:proofErr w:type="gramEnd"/>
+      <w:r>
+        <w:rPr>
+          <w:color w:val="000000" w:themeColor="text1"/>
+          <w:sz w:val="22"/>
+          <w:szCs w:val="22"/>
+        </w:rPr>
+        <w:t xml:space="preserve"> -jar target/*.jar? </w:t>
+      </w:r>
+    </w:p>
+    <w:p>
+      <w:pPr>
+        <w:rPr>
+          <w:color w:val="000000" w:themeColor="text1"/>
+          <w:sz w:val="22"/>
+          <w:szCs w:val="22"/>
+        </w:rPr>
+      </w:pPr>
+      <w:r>
+        <w:rPr>
+          <w:color w:val="000000" w:themeColor="text1"/>
+          <w:sz w:val="22"/>
+          <w:szCs w:val="22"/>
+        </w:rPr>
+        <w:t>What port does your server listen on?   → [Type] 8080 (default for Spring Boot)</w:t>
+      </w:r>
+    </w:p>
+    <w:p>
+      <w:pPr>
+        <w:rPr>
+          <w:color w:val="000000" w:themeColor="text1"/>
+          <w:sz w:val="22"/>
+          <w:szCs w:val="22"/>
+        </w:rPr>
+      </w:pPr>
+    </w:p>
+    <w:p>
+      <w:pPr>
+        <w:rPr>
+          <w:color w:val="EE0000"/>
+        </w:rPr>
+      </w:pPr>
+      <w:r>
+        <w:rPr>
+          <w:color w:val="EE0000"/>
+        </w:rPr>
+        <w:t>docker build -t ddd-</w:t>
+      </w:r>
+      <w:proofErr w:type="gramStart"/>
+      <w:r>
+        <w:rPr>
+          <w:color w:val="EE0000"/>
+        </w:rPr>
+        <w:t>book:ch8.node</w:t>
+      </w:r>
+      <w:proofErr w:type="gramEnd"/>
+      <w:r>
+        <w:rPr>
+          <w:color w:val="EE0000"/>
+        </w:rPr>
+        <w:t xml:space="preserve"> .</w:t>
+      </w:r>
+      <w:r>
+        <w:rPr>
+          <w:color w:val="EE0000"/>
+        </w:rPr>
+        <w:t xml:space="preserve">   </w:t>
+      </w:r>
+      <w:r>
+        <w:rPr>
+          <w:color w:val="EE0000"/>
+        </w:rPr>
+        <w:sym w:font="Wingdings" w:char="F0E0"/>
+      </w:r>
+      <w:r>
+        <w:rPr>
+          <w:color w:val="EE0000"/>
+        </w:rPr>
+        <w:t xml:space="preserve"> explanation</w:t>
+      </w:r>
+    </w:p>
+    <w:p>
+      <w:pPr>
+        <w:rPr>
+          <w:color w:val="000000" w:themeColor="text1"/>
+          <w:sz w:val="22"/>
+          <w:szCs w:val="22"/>
+        </w:rPr>
+      </w:pPr>
+      <w:r>
+        <w:rPr>
+          <w:color w:val="000000" w:themeColor="text1"/>
+          <w:sz w:val="22"/>
+          <w:szCs w:val="22"/>
+        </w:rPr>
+        <w:t xml:space="preserve">docker build is the way to create an image from a docker file, the -t flag is to give that image a name instead of giving it a random id, and the </w:t>
+      </w:r>
+      <w:proofErr w:type="spellStart"/>
+      <w:r>
+        <w:rPr>
+          <w:color w:val="000000" w:themeColor="text1"/>
+          <w:sz w:val="22"/>
+          <w:szCs w:val="22"/>
+        </w:rPr>
+        <w:t>ddd</w:t>
+      </w:r>
+      <w:proofErr w:type="spellEnd"/>
+      <w:r>
+        <w:rPr>
+          <w:color w:val="000000" w:themeColor="text1"/>
+          <w:sz w:val="22"/>
+          <w:szCs w:val="22"/>
+        </w:rPr>
+        <w:t xml:space="preserve">-book </w:t>
+      </w:r>
+      <w:r>
+        <w:rPr>
+          <w:color w:val="000000" w:themeColor="text1"/>
+          <w:sz w:val="22"/>
+          <w:szCs w:val="22"/>
+        </w:rPr>
+        <w:sym w:font="Wingdings" w:char="F0E0"/>
+      </w:r>
+      <w:r>
+        <w:rPr>
+          <w:color w:val="000000" w:themeColor="text1"/>
+          <w:sz w:val="22"/>
+          <w:szCs w:val="22"/>
+        </w:rPr>
+        <w:t xml:space="preserve"> is the image name, the ch8.node is the version or tag name </w:t>
+      </w:r>
+      <w:proofErr w:type="gramStart"/>
+      <w:r>
+        <w:rPr>
+          <w:color w:val="000000" w:themeColor="text1"/>
+          <w:sz w:val="22"/>
+          <w:szCs w:val="22"/>
+        </w:rPr>
+        <w:t>the .</w:t>
+      </w:r>
+      <w:proofErr w:type="gramEnd"/>
+      <w:r>
+        <w:rPr>
+          <w:color w:val="000000" w:themeColor="text1"/>
+          <w:sz w:val="22"/>
+          <w:szCs w:val="22"/>
+        </w:rPr>
+        <w:t xml:space="preserve"> is to tell the docker terminal to look for the docker file in the current directory.</w:t>
+      </w:r>
+    </w:p>
+    <w:p>
+      <w:pPr>
+        <w:rPr>
+          <w:color w:val="000000" w:themeColor="text1"/>
+          <w:sz w:val="22"/>
+          <w:szCs w:val="22"/>
+        </w:rPr>
+      </w:pPr>
+    </w:p>
+    <w:p>
+      <w:pPr>
+        <w:rPr>
+          <w:color w:val="000000" w:themeColor="text1"/>
+          <w:sz w:val="22"/>
+          <w:szCs w:val="22"/>
+        </w:rPr>
+      </w:pPr>
+    </w:p>
+    <w:p>
+      <w:pPr>
         <w:rPr>
           <w:b/>
           <w:bCs/>
@@ -5390,642 +6023,8 @@
           <w:szCs w:val="28"/>
           <w:u w:val="single"/>
         </w:rPr>
-        <w:t>:</w:t>
-      </w:r>
-    </w:p>
-    <w:p>
-      <w:pPr>
-        <w:rPr>
-          <w:color w:val="000000" w:themeColor="text1"/>
-          <w:sz w:val="22"/>
-          <w:szCs w:val="22"/>
-        </w:rPr>
-      </w:pPr>
-      <w:r>
-        <w:rPr>
-          <w:color w:val="000000" w:themeColor="text1"/>
-          <w:sz w:val="22"/>
-          <w:szCs w:val="22"/>
-        </w:rPr>
-        <w:t xml:space="preserve">for </w:t>
-      </w:r>
-      <w:proofErr w:type="gramStart"/>
-      <w:r>
-        <w:rPr>
-          <w:color w:val="000000" w:themeColor="text1"/>
-          <w:sz w:val="22"/>
-          <w:szCs w:val="22"/>
-        </w:rPr>
-        <w:t>example</w:t>
-      </w:r>
-      <w:proofErr w:type="gramEnd"/>
-      <w:r>
-        <w:rPr>
-          <w:color w:val="000000" w:themeColor="text1"/>
-          <w:sz w:val="22"/>
-          <w:szCs w:val="22"/>
-        </w:rPr>
-        <w:t xml:space="preserve"> here is my code and this directory is for java spring boot, and it has the pom</w:t>
-      </w:r>
-      <w:r>
-        <w:rPr>
-          <w:color w:val="000000" w:themeColor="text1"/>
-          <w:sz w:val="22"/>
-          <w:szCs w:val="22"/>
-        </w:rPr>
-        <w:t>.xml</w:t>
-      </w:r>
-      <w:r>
-        <w:rPr>
-          <w:color w:val="000000" w:themeColor="text1"/>
-          <w:sz w:val="22"/>
-          <w:szCs w:val="22"/>
-        </w:rPr>
-        <w:t xml:space="preserve"> file the </w:t>
-      </w:r>
-      <w:proofErr w:type="spellStart"/>
-      <w:r>
-        <w:rPr>
-          <w:color w:val="000000" w:themeColor="text1"/>
-          <w:sz w:val="22"/>
-          <w:szCs w:val="22"/>
-        </w:rPr>
-        <w:t>src</w:t>
-      </w:r>
-      <w:proofErr w:type="spellEnd"/>
-      <w:r>
-        <w:rPr>
-          <w:color w:val="000000" w:themeColor="text1"/>
-          <w:sz w:val="22"/>
-          <w:szCs w:val="22"/>
-        </w:rPr>
-        <w:t xml:space="preserve"> directory and the test</w:t>
-      </w:r>
-      <w:r>
-        <w:rPr>
-          <w:color w:val="000000" w:themeColor="text1"/>
-          <w:sz w:val="22"/>
-          <w:szCs w:val="22"/>
-        </w:rPr>
-        <w:t xml:space="preserve"> directory</w:t>
-      </w:r>
-      <w:r>
-        <w:rPr>
-          <w:color w:val="000000" w:themeColor="text1"/>
-          <w:sz w:val="22"/>
-          <w:szCs w:val="22"/>
-        </w:rPr>
-        <w:t xml:space="preserve"> and other dependencies</w:t>
-      </w:r>
-      <w:r>
-        <w:rPr>
-          <w:color w:val="000000" w:themeColor="text1"/>
-          <w:sz w:val="22"/>
-          <w:szCs w:val="22"/>
-        </w:rPr>
-        <w:t xml:space="preserve"> </w:t>
-      </w:r>
-      <w:r>
-        <w:rPr>
-          <w:color w:val="000000" w:themeColor="text1"/>
-          <w:sz w:val="22"/>
-          <w:szCs w:val="22"/>
-        </w:rPr>
-        <w:t>this</w:t>
-      </w:r>
-      <w:r>
-        <w:rPr>
-          <w:color w:val="000000" w:themeColor="text1"/>
-          <w:sz w:val="22"/>
-          <w:szCs w:val="22"/>
-        </w:rPr>
-        <w:t xml:space="preserve"> </w:t>
-      </w:r>
-      <w:r>
-        <w:rPr>
-          <w:color w:val="000000" w:themeColor="text1"/>
-          <w:sz w:val="22"/>
-          <w:szCs w:val="22"/>
-        </w:rPr>
-        <w:t xml:space="preserve">is the directory where </w:t>
-      </w:r>
-      <w:proofErr w:type="spellStart"/>
-      <w:r>
-        <w:rPr>
-          <w:color w:val="000000" w:themeColor="text1"/>
-          <w:sz w:val="22"/>
-          <w:szCs w:val="22"/>
-        </w:rPr>
-        <w:t>i</w:t>
-      </w:r>
-      <w:proofErr w:type="spellEnd"/>
-      <w:r>
-        <w:rPr>
-          <w:color w:val="000000" w:themeColor="text1"/>
-          <w:sz w:val="22"/>
-          <w:szCs w:val="22"/>
-        </w:rPr>
-        <w:t xml:space="preserve"> should do the docker </w:t>
-      </w:r>
-      <w:proofErr w:type="spellStart"/>
-      <w:r>
-        <w:rPr>
-          <w:color w:val="000000" w:themeColor="text1"/>
-          <w:sz w:val="22"/>
-          <w:szCs w:val="22"/>
-        </w:rPr>
-        <w:t>init</w:t>
-      </w:r>
-      <w:proofErr w:type="spellEnd"/>
-      <w:r>
-        <w:rPr>
-          <w:color w:val="000000" w:themeColor="text1"/>
-          <w:sz w:val="22"/>
-          <w:szCs w:val="22"/>
-        </w:rPr>
-        <w:t>??: C:\Users\M4800\Desktop\IntFFM\MIntFFM\MIntFFM</w:t>
-      </w:r>
-    </w:p>
-    <w:p>
-      <w:pPr>
-        <w:rPr>
-          <w:color w:val="000000" w:themeColor="text1"/>
-          <w:sz w:val="22"/>
-          <w:szCs w:val="22"/>
-        </w:rPr>
-      </w:pPr>
-    </w:p>
-    <w:p>
-      <w:pPr>
-        <w:rPr>
-          <w:color w:val="000000" w:themeColor="text1"/>
-          <w:sz w:val="22"/>
-          <w:szCs w:val="22"/>
-        </w:rPr>
-      </w:pPr>
-      <w:r>
-        <w:rPr>
-          <w:color w:val="000000" w:themeColor="text1"/>
-          <w:sz w:val="22"/>
-          <w:szCs w:val="22"/>
-        </w:rPr>
-        <w:t xml:space="preserve">In the past, you had to create </w:t>
-      </w:r>
-      <w:proofErr w:type="spellStart"/>
-      <w:r>
-        <w:rPr>
-          <w:color w:val="000000" w:themeColor="text1"/>
-          <w:sz w:val="22"/>
-          <w:szCs w:val="22"/>
-        </w:rPr>
-        <w:t>Dockerfiles</w:t>
-      </w:r>
-      <w:proofErr w:type="spellEnd"/>
-      <w:r>
-        <w:rPr>
-          <w:color w:val="000000" w:themeColor="text1"/>
-          <w:sz w:val="22"/>
-          <w:szCs w:val="22"/>
-        </w:rPr>
-        <w:t xml:space="preserve"> manually. Fortunately, newer versions of Docker support the docker </w:t>
-      </w:r>
-      <w:proofErr w:type="spellStart"/>
-      <w:r>
-        <w:rPr>
-          <w:color w:val="000000" w:themeColor="text1"/>
-          <w:sz w:val="22"/>
-          <w:szCs w:val="22"/>
-        </w:rPr>
-        <w:t>init</w:t>
-      </w:r>
-      <w:proofErr w:type="spellEnd"/>
-      <w:r>
-        <w:rPr>
-          <w:color w:val="000000" w:themeColor="text1"/>
-          <w:sz w:val="22"/>
-          <w:szCs w:val="22"/>
-        </w:rPr>
-        <w:t xml:space="preserve"> command that analyses applications and automatically creates </w:t>
-      </w:r>
-      <w:proofErr w:type="spellStart"/>
-      <w:r>
-        <w:rPr>
-          <w:color w:val="000000" w:themeColor="text1"/>
-          <w:sz w:val="22"/>
-          <w:szCs w:val="22"/>
-        </w:rPr>
-        <w:t>Dockerfiles</w:t>
-      </w:r>
-      <w:proofErr w:type="spellEnd"/>
-      <w:r>
-        <w:rPr>
-          <w:color w:val="000000" w:themeColor="text1"/>
-          <w:sz w:val="22"/>
-          <w:szCs w:val="22"/>
-        </w:rPr>
-        <w:t xml:space="preserve"> that implement good practices.</w:t>
-      </w:r>
-    </w:p>
-    <w:p>
-      <w:pPr>
-        <w:rPr>
-          <w:color w:val="000000" w:themeColor="text1"/>
-          <w:sz w:val="22"/>
-          <w:szCs w:val="22"/>
-        </w:rPr>
-      </w:pPr>
-    </w:p>
-    <w:p>
-      <w:pPr>
-        <w:rPr>
-          <w:color w:val="000000" w:themeColor="text1"/>
-          <w:sz w:val="22"/>
-          <w:szCs w:val="22"/>
-        </w:rPr>
-      </w:pPr>
-    </w:p>
-    <w:p>
-      <w:pPr>
-        <w:rPr>
-          <w:color w:val="000000" w:themeColor="text1"/>
-          <w:sz w:val="22"/>
-          <w:szCs w:val="22"/>
-        </w:rPr>
-      </w:pPr>
-    </w:p>
-    <w:p>
-      <w:pPr>
-        <w:rPr>
-          <w:color w:val="000000" w:themeColor="text1"/>
-          <w:sz w:val="22"/>
-          <w:szCs w:val="22"/>
-        </w:rPr>
-      </w:pPr>
-    </w:p>
-    <w:p>
-      <w:pPr>
-        <w:rPr>
-          <w:color w:val="000000" w:themeColor="text1"/>
-          <w:sz w:val="22"/>
-          <w:szCs w:val="22"/>
-        </w:rPr>
-      </w:pPr>
-    </w:p>
-    <w:p>
-      <w:pPr>
-        <w:rPr>
-          <w:color w:val="000000" w:themeColor="text1"/>
-          <w:sz w:val="22"/>
-          <w:szCs w:val="22"/>
-        </w:rPr>
-      </w:pPr>
-    </w:p>
-    <w:p>
-      <w:pPr>
-        <w:rPr>
-          <w:color w:val="000000" w:themeColor="text1"/>
-          <w:sz w:val="22"/>
-          <w:szCs w:val="22"/>
-        </w:rPr>
-      </w:pPr>
-      <w:r>
-        <w:rPr>
-          <w:color w:val="000000" w:themeColor="text1"/>
-          <w:sz w:val="22"/>
-          <w:szCs w:val="22"/>
-        </w:rPr>
-        <w:lastRenderedPageBreak/>
-        <w:t xml:space="preserve">? What application platform does your project use? </w:t>
-      </w:r>
-    </w:p>
-    <w:p>
-      <w:pPr>
-        <w:rPr>
-          <w:color w:val="000000" w:themeColor="text1"/>
-          <w:sz w:val="22"/>
-          <w:szCs w:val="22"/>
-        </w:rPr>
-      </w:pPr>
-      <w:r>
-        <w:rPr>
-          <w:color w:val="000000" w:themeColor="text1"/>
-          <w:sz w:val="22"/>
-          <w:szCs w:val="22"/>
-        </w:rPr>
-        <w:t xml:space="preserve">   → [Select] Java (or Spring Boot if listed specifically)</w:t>
-      </w:r>
-    </w:p>
-    <w:p>
-      <w:pPr>
-        <w:rPr>
-          <w:color w:val="000000" w:themeColor="text1"/>
-          <w:sz w:val="22"/>
-          <w:szCs w:val="22"/>
-        </w:rPr>
-      </w:pPr>
-      <w:r>
-        <w:rPr>
-          <w:color w:val="000000" w:themeColor="text1"/>
-          <w:sz w:val="22"/>
-          <w:szCs w:val="22"/>
-        </w:rPr>
-        <w:t>? What version of Java do you want to use? → [Select] 17 (or 11, 21 - whichever your project uses)</w:t>
-      </w:r>
-    </w:p>
-    <w:p>
-      <w:pPr>
-        <w:rPr>
-          <w:color w:val="000000" w:themeColor="text1"/>
-          <w:sz w:val="22"/>
-          <w:szCs w:val="22"/>
-        </w:rPr>
-      </w:pPr>
-      <w:r>
-        <w:rPr>
-          <w:color w:val="000000" w:themeColor="text1"/>
-          <w:sz w:val="22"/>
-          <w:szCs w:val="22"/>
-        </w:rPr>
-        <w:t>? Which build tool do you want to use?    → [Select] Maven</w:t>
-      </w:r>
-      <w:r>
-        <w:rPr>
-          <w:color w:val="000000" w:themeColor="text1"/>
-          <w:sz w:val="22"/>
-          <w:szCs w:val="22"/>
-        </w:rPr>
-        <w:t xml:space="preserve"> </w:t>
-      </w:r>
-    </w:p>
-    <w:p>
-      <w:pPr>
-        <w:rPr>
-          <w:color w:val="000000" w:themeColor="text1"/>
-          <w:sz w:val="22"/>
-          <w:szCs w:val="22"/>
-        </w:rPr>
-      </w:pPr>
-      <w:proofErr w:type="gramStart"/>
-      <w:r>
-        <w:rPr>
-          <w:color w:val="000000" w:themeColor="text1"/>
-          <w:sz w:val="22"/>
-          <w:szCs w:val="22"/>
-        </w:rPr>
-        <w:t>?What</w:t>
-      </w:r>
-      <w:proofErr w:type="gramEnd"/>
-      <w:r>
-        <w:rPr>
-          <w:color w:val="000000" w:themeColor="text1"/>
-          <w:sz w:val="22"/>
-          <w:szCs w:val="22"/>
-        </w:rPr>
-        <w:t xml:space="preserve"> command do you want to use to start the app?   → [Type</w:t>
-      </w:r>
-      <w:proofErr w:type="gramStart"/>
-      <w:r>
-        <w:rPr>
-          <w:color w:val="000000" w:themeColor="text1"/>
-          <w:sz w:val="22"/>
-          <w:szCs w:val="22"/>
-        </w:rPr>
-        <w:t>] .</w:t>
-      </w:r>
-      <w:proofErr w:type="gramEnd"/>
-      <w:r>
-        <w:rPr>
-          <w:color w:val="000000" w:themeColor="text1"/>
-          <w:sz w:val="22"/>
-          <w:szCs w:val="22"/>
-        </w:rPr>
-        <w:t>/</w:t>
-      </w:r>
-      <w:proofErr w:type="spellStart"/>
-      <w:r>
-        <w:rPr>
-          <w:color w:val="000000" w:themeColor="text1"/>
-          <w:sz w:val="22"/>
-          <w:szCs w:val="22"/>
-        </w:rPr>
-        <w:t>mvnw</w:t>
-      </w:r>
-      <w:proofErr w:type="spellEnd"/>
-      <w:r>
-        <w:rPr>
-          <w:color w:val="000000" w:themeColor="text1"/>
-          <w:sz w:val="22"/>
-          <w:szCs w:val="22"/>
-        </w:rPr>
-        <w:t xml:space="preserve"> </w:t>
-      </w:r>
-      <w:proofErr w:type="spellStart"/>
-      <w:r>
-        <w:rPr>
-          <w:color w:val="000000" w:themeColor="text1"/>
-          <w:sz w:val="22"/>
-          <w:szCs w:val="22"/>
-        </w:rPr>
-        <w:t>spring-</w:t>
-      </w:r>
-      <w:proofErr w:type="gramStart"/>
-      <w:r>
-        <w:rPr>
-          <w:color w:val="000000" w:themeColor="text1"/>
-          <w:sz w:val="22"/>
-          <w:szCs w:val="22"/>
-        </w:rPr>
-        <w:t>boot:run</w:t>
-      </w:r>
-      <w:proofErr w:type="spellEnd"/>
-      <w:proofErr w:type="gramEnd"/>
-      <w:r>
-        <w:rPr>
-          <w:color w:val="000000" w:themeColor="text1"/>
-          <w:sz w:val="22"/>
-          <w:szCs w:val="22"/>
-        </w:rPr>
-        <w:t xml:space="preserve">  </w:t>
-      </w:r>
-      <w:proofErr w:type="gramStart"/>
-      <w:r>
-        <w:rPr>
-          <w:color w:val="000000" w:themeColor="text1"/>
-          <w:sz w:val="22"/>
-          <w:szCs w:val="22"/>
-        </w:rPr>
-        <w:t>OR  java</w:t>
-      </w:r>
-      <w:proofErr w:type="gramEnd"/>
-      <w:r>
-        <w:rPr>
-          <w:color w:val="000000" w:themeColor="text1"/>
-          <w:sz w:val="22"/>
-          <w:szCs w:val="22"/>
-        </w:rPr>
-        <w:t xml:space="preserve"> -jar target/*.jar? </w:t>
-      </w:r>
-    </w:p>
-    <w:p>
-      <w:pPr>
-        <w:rPr>
-          <w:color w:val="000000" w:themeColor="text1"/>
-          <w:sz w:val="22"/>
-          <w:szCs w:val="22"/>
-        </w:rPr>
-      </w:pPr>
-      <w:r>
-        <w:rPr>
-          <w:color w:val="000000" w:themeColor="text1"/>
-          <w:sz w:val="22"/>
-          <w:szCs w:val="22"/>
-        </w:rPr>
-        <w:t>What port does your server listen on?   → [Type] 8080 (default for Spring Boot)</w:t>
-      </w:r>
-    </w:p>
-    <w:p>
-      <w:pPr>
-        <w:rPr>
-          <w:color w:val="000000" w:themeColor="text1"/>
-          <w:sz w:val="22"/>
-          <w:szCs w:val="22"/>
-        </w:rPr>
-      </w:pPr>
-    </w:p>
-    <w:p>
-      <w:pPr>
-        <w:rPr>
-          <w:color w:val="EE0000"/>
-        </w:rPr>
-      </w:pPr>
-      <w:r>
-        <w:rPr>
-          <w:color w:val="EE0000"/>
-        </w:rPr>
-        <w:t>docker build -t ddd-</w:t>
-      </w:r>
-      <w:proofErr w:type="gramStart"/>
-      <w:r>
-        <w:rPr>
-          <w:color w:val="EE0000"/>
-        </w:rPr>
-        <w:t>book:ch8.node</w:t>
-      </w:r>
-      <w:proofErr w:type="gramEnd"/>
-      <w:r>
-        <w:rPr>
-          <w:color w:val="EE0000"/>
-        </w:rPr>
-        <w:t xml:space="preserve"> .</w:t>
-      </w:r>
-      <w:r>
-        <w:rPr>
-          <w:color w:val="EE0000"/>
-        </w:rPr>
-        <w:t xml:space="preserve">   </w:t>
-      </w:r>
-      <w:r>
-        <w:rPr>
-          <w:color w:val="EE0000"/>
-        </w:rPr>
-        <w:sym w:font="Wingdings" w:char="F0E0"/>
-      </w:r>
-      <w:r>
-        <w:rPr>
-          <w:color w:val="EE0000"/>
-        </w:rPr>
-        <w:t xml:space="preserve"> explanation</w:t>
-      </w:r>
-    </w:p>
-    <w:p>
-      <w:pPr>
-        <w:rPr>
-          <w:color w:val="000000" w:themeColor="text1"/>
-          <w:sz w:val="22"/>
-          <w:szCs w:val="22"/>
-        </w:rPr>
-      </w:pPr>
-      <w:r>
-        <w:rPr>
-          <w:color w:val="000000" w:themeColor="text1"/>
-          <w:sz w:val="22"/>
-          <w:szCs w:val="22"/>
-        </w:rPr>
-        <w:t xml:space="preserve">docker build is the way to create an image from a docker file, the -t flag is to give that image a name instead of giving it a random id, and the </w:t>
-      </w:r>
-      <w:proofErr w:type="spellStart"/>
-      <w:r>
-        <w:rPr>
-          <w:color w:val="000000" w:themeColor="text1"/>
-          <w:sz w:val="22"/>
-          <w:szCs w:val="22"/>
-        </w:rPr>
-        <w:t>ddd</w:t>
-      </w:r>
-      <w:proofErr w:type="spellEnd"/>
-      <w:r>
-        <w:rPr>
-          <w:color w:val="000000" w:themeColor="text1"/>
-          <w:sz w:val="22"/>
-          <w:szCs w:val="22"/>
-        </w:rPr>
-        <w:t xml:space="preserve">-book </w:t>
-      </w:r>
-      <w:r>
-        <w:rPr>
-          <w:color w:val="000000" w:themeColor="text1"/>
-          <w:sz w:val="22"/>
-          <w:szCs w:val="22"/>
-        </w:rPr>
-        <w:sym w:font="Wingdings" w:char="F0E0"/>
-      </w:r>
-      <w:r>
-        <w:rPr>
-          <w:color w:val="000000" w:themeColor="text1"/>
-          <w:sz w:val="22"/>
-          <w:szCs w:val="22"/>
-        </w:rPr>
-        <w:t xml:space="preserve"> is the image name, the ch8.node is the version or tag name </w:t>
-      </w:r>
-      <w:proofErr w:type="gramStart"/>
-      <w:r>
-        <w:rPr>
-          <w:color w:val="000000" w:themeColor="text1"/>
-          <w:sz w:val="22"/>
-          <w:szCs w:val="22"/>
-        </w:rPr>
-        <w:t>the .</w:t>
-      </w:r>
-      <w:proofErr w:type="gramEnd"/>
-      <w:r>
-        <w:rPr>
-          <w:color w:val="000000" w:themeColor="text1"/>
-          <w:sz w:val="22"/>
-          <w:szCs w:val="22"/>
-        </w:rPr>
-        <w:t xml:space="preserve"> is to tell the docker terminal to look for the docker file in the current directory.</w:t>
-      </w:r>
-    </w:p>
-    <w:p>
-      <w:pPr>
-        <w:rPr>
-          <w:color w:val="000000" w:themeColor="text1"/>
-          <w:sz w:val="22"/>
-          <w:szCs w:val="22"/>
-        </w:rPr>
-      </w:pPr>
-    </w:p>
-    <w:p>
-      <w:pPr>
-        <w:rPr>
-          <w:color w:val="000000" w:themeColor="text1"/>
-          <w:sz w:val="22"/>
-          <w:szCs w:val="22"/>
-        </w:rPr>
-      </w:pPr>
-    </w:p>
-    <w:p>
-      <w:pPr>
+      </w:pPr>
+      <w:r>
         <w:rPr>
           <w:b/>
           <w:bCs/>
@@ -6034,8 +6033,573 @@
           <w:szCs w:val="28"/>
           <w:u w:val="single"/>
         </w:rPr>
-      </w:pPr>
-      <w:r>
+        <w:t>adding and pushing to docker hub:</w:t>
+      </w:r>
+    </w:p>
+    <w:p>
+      <w:pPr>
+        <w:rPr>
+          <w:color w:val="000000" w:themeColor="text1"/>
+          <w:sz w:val="22"/>
+          <w:szCs w:val="22"/>
+        </w:rPr>
+      </w:pPr>
+    </w:p>
+    <w:p>
+      <w:pPr>
+        <w:rPr>
+          <w:color w:val="EE0000"/>
+        </w:rPr>
+      </w:pPr>
+      <w:r>
+        <w:rPr>
+          <w:color w:val="EE0000"/>
+        </w:rPr>
+        <w:t>docker tag</w:t>
+      </w:r>
+    </w:p>
+    <w:p>
+      <w:pPr>
+        <w:rPr>
+          <w:color w:val="EE0000"/>
+        </w:rPr>
+      </w:pPr>
+      <w:r>
+        <w:rPr>
+          <w:color w:val="EE0000"/>
+        </w:rPr>
+        <w:t>YOUR_ORIGINAL_IMAGE_</w:t>
+      </w:r>
+      <w:proofErr w:type="gramStart"/>
+      <w:r>
+        <w:rPr>
+          <w:color w:val="EE0000"/>
+        </w:rPr>
+        <w:t>NAME:ORIGINAL</w:t>
+      </w:r>
+      <w:proofErr w:type="gramEnd"/>
+      <w:r>
+        <w:rPr>
+          <w:color w:val="EE0000"/>
+        </w:rPr>
+        <w:t>_TAG YOUR_DOCKERHUB_USERNAME/NEW_IMAGE_</w:t>
+      </w:r>
+      <w:proofErr w:type="gramStart"/>
+      <w:r>
+        <w:rPr>
+          <w:color w:val="EE0000"/>
+        </w:rPr>
+        <w:t>NAME:NEW</w:t>
+      </w:r>
+      <w:proofErr w:type="gramEnd"/>
+      <w:r>
+        <w:rPr>
+          <w:color w:val="EE0000"/>
+        </w:rPr>
+        <w:t>_TAG</w:t>
+      </w:r>
+    </w:p>
+    <w:p>
+      <w:pPr>
+        <w:rPr>
+          <w:color w:val="000000" w:themeColor="text1"/>
+          <w:sz w:val="22"/>
+          <w:szCs w:val="22"/>
+        </w:rPr>
+      </w:pPr>
+      <w:r>
+        <w:rPr>
+          <w:color w:val="000000" w:themeColor="text1"/>
+          <w:sz w:val="22"/>
+          <w:szCs w:val="22"/>
+        </w:rPr>
+        <w:t xml:space="preserve">this here </w:t>
+      </w:r>
+      <w:r>
+        <w:rPr>
+          <w:color w:val="000000" w:themeColor="text1"/>
+          <w:sz w:val="22"/>
+          <w:szCs w:val="22"/>
+        </w:rPr>
+        <w:t xml:space="preserve">creates a new tag out of an </w:t>
+      </w:r>
+      <w:proofErr w:type="gramStart"/>
+      <w:r>
+        <w:rPr>
+          <w:color w:val="000000" w:themeColor="text1"/>
+          <w:sz w:val="22"/>
+          <w:szCs w:val="22"/>
+        </w:rPr>
+        <w:t>existing images</w:t>
+      </w:r>
+      <w:proofErr w:type="gramEnd"/>
+      <w:r>
+        <w:rPr>
+          <w:color w:val="000000" w:themeColor="text1"/>
+          <w:sz w:val="22"/>
+          <w:szCs w:val="22"/>
+        </w:rPr>
+        <w:t xml:space="preserve"> </w:t>
+      </w:r>
+    </w:p>
+    <w:p>
+      <w:pPr>
+        <w:rPr>
+          <w:color w:val="EE0000"/>
+        </w:rPr>
+      </w:pPr>
+      <w:r>
+        <w:rPr>
+          <w:color w:val="EE0000"/>
+        </w:rPr>
+        <w:t>docker push YOUR_DOCKERHUB_USERNAME/IMAGE_</w:t>
+      </w:r>
+      <w:proofErr w:type="gramStart"/>
+      <w:r>
+        <w:rPr>
+          <w:color w:val="EE0000"/>
+        </w:rPr>
+        <w:t>NAME:TAG</w:t>
+      </w:r>
+      <w:proofErr w:type="gramEnd"/>
+    </w:p>
+    <w:p>
+      <w:pPr>
+        <w:rPr>
+          <w:color w:val="000000" w:themeColor="text1"/>
+          <w:sz w:val="22"/>
+          <w:szCs w:val="22"/>
+        </w:rPr>
+      </w:pPr>
+    </w:p>
+    <w:p>
+      <w:pPr>
+        <w:rPr>
+          <w:color w:val="000000" w:themeColor="text1"/>
+          <w:sz w:val="22"/>
+          <w:szCs w:val="22"/>
+        </w:rPr>
+      </w:pPr>
+      <w:r>
+        <w:rPr>
+          <w:color w:val="000000" w:themeColor="text1"/>
+          <w:sz w:val="22"/>
+          <w:szCs w:val="22"/>
+        </w:rPr>
+        <w:t>T</w:t>
+      </w:r>
+      <w:r>
+        <w:rPr>
+          <w:color w:val="000000" w:themeColor="text1"/>
+          <w:sz w:val="22"/>
+          <w:szCs w:val="22"/>
+        </w:rPr>
+        <w:t>he image name becomes a new repository on my docker hub</w:t>
+      </w:r>
+    </w:p>
+    <w:p>
+      <w:pPr>
+        <w:rPr>
+          <w:color w:val="000000" w:themeColor="text1"/>
+          <w:sz w:val="22"/>
+          <w:szCs w:val="22"/>
+        </w:rPr>
+      </w:pPr>
+      <w:r>
+        <w:rPr>
+          <w:color w:val="000000" w:themeColor="text1"/>
+          <w:sz w:val="22"/>
+          <w:szCs w:val="22"/>
+        </w:rPr>
+        <w:t>i</w:t>
+      </w:r>
+      <w:r>
+        <w:rPr>
+          <w:color w:val="000000" w:themeColor="text1"/>
+          <w:sz w:val="22"/>
+          <w:szCs w:val="22"/>
+        </w:rPr>
+        <w:t>f i add and push an image called my-app but with the tag v2 it will be in the same repo is my-</w:t>
+      </w:r>
+      <w:proofErr w:type="gramStart"/>
+      <w:r>
+        <w:rPr>
+          <w:color w:val="000000" w:themeColor="text1"/>
+          <w:sz w:val="22"/>
+          <w:szCs w:val="22"/>
+        </w:rPr>
+        <w:t>app:v</w:t>
+      </w:r>
+      <w:proofErr w:type="gramEnd"/>
+      <w:r>
+        <w:rPr>
+          <w:color w:val="000000" w:themeColor="text1"/>
+          <w:sz w:val="22"/>
+          <w:szCs w:val="22"/>
+        </w:rPr>
+        <w:t>2</w:t>
+      </w:r>
+    </w:p>
+    <w:p>
+      <w:pPr>
+        <w:rPr>
+          <w:color w:val="EE0000"/>
+        </w:rPr>
+      </w:pPr>
+    </w:p>
+    <w:p>
+      <w:pPr>
+        <w:rPr>
+          <w:color w:val="EE0000"/>
+        </w:rPr>
+      </w:pPr>
+    </w:p>
+    <w:p>
+      <w:pPr>
+        <w:rPr>
+          <w:color w:val="EE0000"/>
+        </w:rPr>
+      </w:pPr>
+      <w:r>
+        <w:rPr>
+          <w:color w:val="EE0000"/>
+        </w:rPr>
+        <w:lastRenderedPageBreak/>
+        <w:t xml:space="preserve">docker run-d--name c1 \-p 5005:8080 \ </w:t>
+      </w:r>
+      <w:proofErr w:type="spellStart"/>
+      <w:r>
+        <w:rPr>
+          <w:color w:val="EE0000"/>
+        </w:rPr>
+        <w:t>nigelpoulton</w:t>
+      </w:r>
+      <w:proofErr w:type="spellEnd"/>
+      <w:r>
+        <w:rPr>
+          <w:color w:val="EE0000"/>
+        </w:rPr>
+        <w:t>/ddd-</w:t>
+      </w:r>
+      <w:proofErr w:type="gramStart"/>
+      <w:r>
+        <w:rPr>
+          <w:color w:val="EE0000"/>
+        </w:rPr>
+        <w:t>book:ch8.node</w:t>
+      </w:r>
+      <w:proofErr w:type="gramEnd"/>
+    </w:p>
+    <w:p>
+      <w:pPr>
+        <w:rPr>
+          <w:color w:val="000000" w:themeColor="text1"/>
+          <w:sz w:val="22"/>
+          <w:szCs w:val="22"/>
+        </w:rPr>
+      </w:pPr>
+      <w:r>
+        <w:rPr>
+          <w:color w:val="000000" w:themeColor="text1"/>
+          <w:sz w:val="22"/>
+          <w:szCs w:val="22"/>
+        </w:rPr>
+        <w:t xml:space="preserve">so docker run creates a new container from an image -d runs in the background, --name is to name the container, -p means that our app is running on 5005 and the container is running on port 8080 the </w:t>
+      </w:r>
+      <w:proofErr w:type="spellStart"/>
+      <w:r>
+        <w:rPr>
+          <w:color w:val="000000" w:themeColor="text1"/>
+          <w:sz w:val="22"/>
+          <w:szCs w:val="22"/>
+        </w:rPr>
+        <w:t>nigelpoulton</w:t>
+      </w:r>
+      <w:proofErr w:type="spellEnd"/>
+      <w:r>
+        <w:rPr>
+          <w:color w:val="000000" w:themeColor="text1"/>
+          <w:sz w:val="22"/>
+          <w:szCs w:val="22"/>
+        </w:rPr>
+        <w:t>/ddd-</w:t>
+      </w:r>
+      <w:proofErr w:type="gramStart"/>
+      <w:r>
+        <w:rPr>
+          <w:color w:val="000000" w:themeColor="text1"/>
+          <w:sz w:val="22"/>
+          <w:szCs w:val="22"/>
+        </w:rPr>
+        <w:t>book:ch8.node</w:t>
+      </w:r>
+      <w:proofErr w:type="gramEnd"/>
+      <w:r>
+        <w:rPr>
+          <w:color w:val="000000" w:themeColor="text1"/>
+          <w:sz w:val="22"/>
+          <w:szCs w:val="22"/>
+        </w:rPr>
+        <w:t xml:space="preserve"> is the image name and tag</w:t>
+      </w:r>
+    </w:p>
+    <w:p>
+      <w:pPr>
+        <w:rPr>
+          <w:color w:val="000000" w:themeColor="text1"/>
+          <w:sz w:val="22"/>
+          <w:szCs w:val="22"/>
+        </w:rPr>
+      </w:pPr>
+    </w:p>
+    <w:p>
+      <w:pPr>
+        <w:rPr>
+          <w:color w:val="000000" w:themeColor="text1"/>
+          <w:sz w:val="22"/>
+          <w:szCs w:val="22"/>
+        </w:rPr>
+      </w:pPr>
+      <w:proofErr w:type="gramStart"/>
+      <w:r>
+        <w:rPr>
+          <w:color w:val="000000" w:themeColor="text1"/>
+          <w:sz w:val="22"/>
+          <w:szCs w:val="22"/>
+        </w:rPr>
+        <w:t>so</w:t>
+      </w:r>
+      <w:proofErr w:type="gramEnd"/>
+      <w:r>
+        <w:rPr>
+          <w:color w:val="000000" w:themeColor="text1"/>
+          <w:sz w:val="22"/>
+          <w:szCs w:val="22"/>
+        </w:rPr>
+        <w:t xml:space="preserve"> the 5005 means we are forcing our app to run on that specified port we don’t actually care what the code or the default of the app run on so when we go to the browser after running it on port </w:t>
+      </w:r>
+      <w:proofErr w:type="gramStart"/>
+      <w:r>
+        <w:rPr>
+          <w:color w:val="000000" w:themeColor="text1"/>
+          <w:sz w:val="22"/>
+          <w:szCs w:val="22"/>
+        </w:rPr>
+        <w:t>5005</w:t>
+      </w:r>
+      <w:proofErr w:type="gramEnd"/>
+      <w:r>
+        <w:rPr>
+          <w:color w:val="000000" w:themeColor="text1"/>
+          <w:sz w:val="22"/>
+          <w:szCs w:val="22"/>
+        </w:rPr>
+        <w:t xml:space="preserve"> we can expect it to be found on 5005 even if the app’s original code runs on 8081</w:t>
+      </w:r>
+    </w:p>
+    <w:p>
+      <w:pPr>
+        <w:rPr>
+          <w:color w:val="000000" w:themeColor="text1"/>
+          <w:sz w:val="22"/>
+          <w:szCs w:val="22"/>
+        </w:rPr>
+      </w:pPr>
+    </w:p>
+    <w:p>
+      <w:pPr>
+        <w:rPr>
+          <w:color w:val="000000" w:themeColor="text1"/>
+          <w:sz w:val="22"/>
+          <w:szCs w:val="22"/>
+        </w:rPr>
+      </w:pPr>
+      <w:r>
+        <w:rPr>
+          <w:color w:val="000000" w:themeColor="text1"/>
+          <w:sz w:val="22"/>
+          <w:szCs w:val="22"/>
+        </w:rPr>
+        <w:t xml:space="preserve">Examples of instructions that create new layers are </w:t>
+      </w:r>
+      <w:r>
+        <w:rPr>
+          <w:b/>
+          <w:bCs/>
+          <w:color w:val="000000" w:themeColor="text1"/>
+          <w:sz w:val="22"/>
+          <w:szCs w:val="22"/>
+        </w:rPr>
+        <w:t>FROM, RUN, COPY and WORKDIR.</w:t>
+      </w:r>
+      <w:r>
+        <w:rPr>
+          <w:color w:val="000000" w:themeColor="text1"/>
+          <w:sz w:val="22"/>
+          <w:szCs w:val="22"/>
+        </w:rPr>
+        <w:t xml:space="preserve"> </w:t>
+      </w:r>
+    </w:p>
+    <w:p>
+      <w:pPr>
+        <w:rPr>
+          <w:color w:val="000000" w:themeColor="text1"/>
+          <w:sz w:val="22"/>
+          <w:szCs w:val="22"/>
+        </w:rPr>
+      </w:pPr>
+      <w:r>
+        <w:rPr>
+          <w:color w:val="000000" w:themeColor="text1"/>
+          <w:sz w:val="22"/>
+          <w:szCs w:val="22"/>
+        </w:rPr>
+        <w:t xml:space="preserve">Examples that create metadata include </w:t>
+      </w:r>
+      <w:r>
+        <w:rPr>
+          <w:b/>
+          <w:bCs/>
+          <w:color w:val="000000" w:themeColor="text1"/>
+          <w:sz w:val="22"/>
+          <w:szCs w:val="22"/>
+        </w:rPr>
+        <w:t xml:space="preserve">EXPOSE, ENV, CMD, and ENTRYPOINT. </w:t>
+      </w:r>
+    </w:p>
+    <w:p>
+      <w:pPr>
+        <w:rPr>
+          <w:color w:val="000000" w:themeColor="text1"/>
+          <w:sz w:val="22"/>
+          <w:szCs w:val="22"/>
+        </w:rPr>
+      </w:pPr>
+      <w:r>
+        <w:rPr>
+          <w:color w:val="000000" w:themeColor="text1"/>
+          <w:sz w:val="22"/>
+          <w:szCs w:val="22"/>
+        </w:rPr>
+        <w:t xml:space="preserve">The premise is this: </w:t>
+      </w:r>
+    </w:p>
+    <w:p>
+      <w:pPr>
+        <w:ind w:left="720"/>
+        <w:rPr>
+          <w:color w:val="000000" w:themeColor="text1"/>
+          <w:sz w:val="22"/>
+          <w:szCs w:val="22"/>
+        </w:rPr>
+      </w:pPr>
+      <w:r>
+        <w:rPr>
+          <w:color w:val="000000" w:themeColor="text1"/>
+          <w:sz w:val="22"/>
+          <w:szCs w:val="22"/>
+        </w:rPr>
+        <w:t xml:space="preserve">• Instructions that add content, such as files and programs, create new layers </w:t>
+      </w:r>
+    </w:p>
+    <w:p>
+      <w:pPr>
+        <w:ind w:left="720"/>
+        <w:rPr>
+          <w:color w:val="000000" w:themeColor="text1"/>
+          <w:sz w:val="22"/>
+          <w:szCs w:val="22"/>
+        </w:rPr>
+      </w:pPr>
+      <w:r>
+        <w:rPr>
+          <w:color w:val="000000" w:themeColor="text1"/>
+          <w:sz w:val="22"/>
+          <w:szCs w:val="22"/>
+        </w:rPr>
+        <w:t>• Instructions that don’t add content don’t add layers and only create metadata</w:t>
+      </w:r>
+    </w:p>
+    <w:p>
+      <w:pPr>
+        <w:rPr>
+          <w:color w:val="000000" w:themeColor="text1"/>
+          <w:sz w:val="22"/>
+          <w:szCs w:val="22"/>
+        </w:rPr>
+      </w:pPr>
+      <w:r>
+        <w:rPr>
+          <w:color w:val="000000" w:themeColor="text1"/>
+          <w:sz w:val="22"/>
+          <w:szCs w:val="22"/>
+        </w:rPr>
+        <w:t>You can run a</w:t>
+      </w:r>
+      <w:r>
+        <w:rPr>
+          <w:color w:val="000000" w:themeColor="text1"/>
+          <w:sz w:val="22"/>
+          <w:szCs w:val="22"/>
+        </w:rPr>
+        <w:t xml:space="preserve"> </w:t>
+      </w:r>
+      <w:r>
+        <w:rPr>
+          <w:b/>
+          <w:bCs/>
+          <w:color w:val="000000" w:themeColor="text1"/>
+          <w:sz w:val="22"/>
+          <w:szCs w:val="22"/>
+        </w:rPr>
+        <w:t>docker history</w:t>
+      </w:r>
+      <w:r>
+        <w:rPr>
+          <w:color w:val="000000" w:themeColor="text1"/>
+          <w:sz w:val="22"/>
+          <w:szCs w:val="22"/>
+        </w:rPr>
+        <w:t xml:space="preserve"> command</w:t>
+      </w:r>
+      <w:r>
+        <w:rPr>
+          <w:color w:val="000000" w:themeColor="text1"/>
+          <w:sz w:val="22"/>
+          <w:szCs w:val="22"/>
+        </w:rPr>
+        <w:t xml:space="preserve"> </w:t>
+      </w:r>
+      <w:r>
+        <w:rPr>
+          <w:color w:val="000000" w:themeColor="text1"/>
+          <w:sz w:val="22"/>
+          <w:szCs w:val="22"/>
+        </w:rPr>
+        <w:t>against any image to see the instructions that created it.</w:t>
+      </w:r>
+    </w:p>
+    <w:p>
+      <w:pPr>
+        <w:rPr>
+          <w:color w:val="000000" w:themeColor="text1"/>
+          <w:sz w:val="22"/>
+          <w:szCs w:val="22"/>
+        </w:rPr>
+      </w:pPr>
+    </w:p>
+    <w:p>
+      <w:pPr>
+        <w:rPr>
+          <w:color w:val="000000" w:themeColor="text1"/>
+          <w:sz w:val="22"/>
+          <w:szCs w:val="22"/>
+        </w:rPr>
+      </w:pPr>
+    </w:p>
+    <w:p>
+      <w:pPr>
         <w:rPr>
           <w:b/>
           <w:bCs/>
@@ -6044,579 +6608,8 @@
           <w:szCs w:val="28"/>
           <w:u w:val="single"/>
         </w:rPr>
-        <w:t>adding and pushing to docker hub:</w:t>
-      </w:r>
-    </w:p>
-    <w:p>
-      <w:pPr>
-        <w:rPr>
-          <w:color w:val="000000" w:themeColor="text1"/>
-          <w:sz w:val="22"/>
-          <w:szCs w:val="22"/>
-        </w:rPr>
-      </w:pPr>
-    </w:p>
-    <w:p>
-      <w:pPr>
-        <w:rPr>
-          <w:color w:val="EE0000"/>
-        </w:rPr>
-      </w:pPr>
-      <w:r>
-        <w:rPr>
-          <w:color w:val="EE0000"/>
-        </w:rPr>
-        <w:t>docker tag</w:t>
-      </w:r>
-    </w:p>
-    <w:p>
-      <w:pPr>
-        <w:rPr>
-          <w:color w:val="EE0000"/>
-        </w:rPr>
-      </w:pPr>
-      <w:r>
-        <w:rPr>
-          <w:color w:val="EE0000"/>
-        </w:rPr>
-        <w:t>YOUR_ORIGINAL_IMAGE_</w:t>
-      </w:r>
-      <w:proofErr w:type="gramStart"/>
-      <w:r>
-        <w:rPr>
-          <w:color w:val="EE0000"/>
-        </w:rPr>
-        <w:t>NAME:ORIGINAL</w:t>
-      </w:r>
-      <w:proofErr w:type="gramEnd"/>
-      <w:r>
-        <w:rPr>
-          <w:color w:val="EE0000"/>
-        </w:rPr>
-        <w:t>_TAG YOUR_DOCKERHUB_USERNAME/NEW_IMAGE_</w:t>
-      </w:r>
-      <w:proofErr w:type="gramStart"/>
-      <w:r>
-        <w:rPr>
-          <w:color w:val="EE0000"/>
-        </w:rPr>
-        <w:t>NAME:NEW</w:t>
-      </w:r>
-      <w:proofErr w:type="gramEnd"/>
-      <w:r>
-        <w:rPr>
-          <w:color w:val="EE0000"/>
-        </w:rPr>
-        <w:t>_TAG</w:t>
-      </w:r>
-    </w:p>
-    <w:p>
-      <w:pPr>
-        <w:rPr>
-          <w:color w:val="000000" w:themeColor="text1"/>
-          <w:sz w:val="22"/>
-          <w:szCs w:val="22"/>
-        </w:rPr>
-      </w:pPr>
-      <w:r>
-        <w:rPr>
-          <w:color w:val="000000" w:themeColor="text1"/>
-          <w:sz w:val="22"/>
-          <w:szCs w:val="22"/>
-        </w:rPr>
-        <w:t xml:space="preserve">this here </w:t>
-      </w:r>
-      <w:r>
-        <w:rPr>
-          <w:color w:val="000000" w:themeColor="text1"/>
-          <w:sz w:val="22"/>
-          <w:szCs w:val="22"/>
-        </w:rPr>
-        <w:t xml:space="preserve">creates a new tag out of an </w:t>
-      </w:r>
-      <w:proofErr w:type="gramStart"/>
-      <w:r>
-        <w:rPr>
-          <w:color w:val="000000" w:themeColor="text1"/>
-          <w:sz w:val="22"/>
-          <w:szCs w:val="22"/>
-        </w:rPr>
-        <w:t>existing images</w:t>
-      </w:r>
-      <w:proofErr w:type="gramEnd"/>
-      <w:r>
-        <w:rPr>
-          <w:color w:val="000000" w:themeColor="text1"/>
-          <w:sz w:val="22"/>
-          <w:szCs w:val="22"/>
-        </w:rPr>
-        <w:t xml:space="preserve"> </w:t>
-      </w:r>
-    </w:p>
-    <w:p>
-      <w:pPr>
-        <w:rPr>
-          <w:color w:val="EE0000"/>
-        </w:rPr>
-      </w:pPr>
-      <w:r>
-        <w:rPr>
-          <w:color w:val="EE0000"/>
-        </w:rPr>
-        <w:t>docker push YOUR_DOCKERHUB_USERNAME/IMAGE_</w:t>
-      </w:r>
-      <w:proofErr w:type="gramStart"/>
-      <w:r>
-        <w:rPr>
-          <w:color w:val="EE0000"/>
-        </w:rPr>
-        <w:t>NAME:TAG</w:t>
-      </w:r>
-      <w:proofErr w:type="gramEnd"/>
-    </w:p>
-    <w:p>
-      <w:pPr>
-        <w:rPr>
-          <w:color w:val="000000" w:themeColor="text1"/>
-          <w:sz w:val="22"/>
-          <w:szCs w:val="22"/>
-        </w:rPr>
-      </w:pPr>
-    </w:p>
-    <w:p>
-      <w:pPr>
-        <w:rPr>
-          <w:color w:val="000000" w:themeColor="text1"/>
-          <w:sz w:val="22"/>
-          <w:szCs w:val="22"/>
-        </w:rPr>
-      </w:pPr>
-      <w:r>
-        <w:rPr>
-          <w:color w:val="000000" w:themeColor="text1"/>
-          <w:sz w:val="22"/>
-          <w:szCs w:val="22"/>
-        </w:rPr>
-        <w:t>T</w:t>
-      </w:r>
-      <w:r>
-        <w:rPr>
-          <w:color w:val="000000" w:themeColor="text1"/>
-          <w:sz w:val="22"/>
-          <w:szCs w:val="22"/>
-        </w:rPr>
-        <w:t>he image name becomes a new repository on my docker hub</w:t>
-      </w:r>
-    </w:p>
-    <w:p>
-      <w:pPr>
-        <w:rPr>
-          <w:color w:val="000000" w:themeColor="text1"/>
-          <w:sz w:val="22"/>
-          <w:szCs w:val="22"/>
-        </w:rPr>
-      </w:pPr>
-      <w:r>
-        <w:rPr>
-          <w:color w:val="000000" w:themeColor="text1"/>
-          <w:sz w:val="22"/>
-          <w:szCs w:val="22"/>
-        </w:rPr>
-        <w:t>i</w:t>
-      </w:r>
-      <w:r>
-        <w:rPr>
-          <w:color w:val="000000" w:themeColor="text1"/>
-          <w:sz w:val="22"/>
-          <w:szCs w:val="22"/>
-        </w:rPr>
-        <w:t>f i add and push an image called my-app but with the tag v2 it will be in the same repo is my-</w:t>
-      </w:r>
-      <w:proofErr w:type="gramStart"/>
-      <w:r>
-        <w:rPr>
-          <w:color w:val="000000" w:themeColor="text1"/>
-          <w:sz w:val="22"/>
-          <w:szCs w:val="22"/>
-        </w:rPr>
-        <w:t>app:v</w:t>
-      </w:r>
-      <w:proofErr w:type="gramEnd"/>
-      <w:r>
-        <w:rPr>
-          <w:color w:val="000000" w:themeColor="text1"/>
-          <w:sz w:val="22"/>
-          <w:szCs w:val="22"/>
-        </w:rPr>
-        <w:t>2</w:t>
-      </w:r>
-    </w:p>
-    <w:p>
-      <w:pPr>
-        <w:rPr>
-          <w:color w:val="EE0000"/>
-        </w:rPr>
-      </w:pPr>
-    </w:p>
-    <w:p>
-      <w:pPr>
-        <w:rPr>
-          <w:color w:val="EE0000"/>
-        </w:rPr>
-      </w:pPr>
-    </w:p>
-    <w:p>
-      <w:pPr>
-        <w:rPr>
-          <w:color w:val="EE0000"/>
-        </w:rPr>
-      </w:pPr>
-      <w:r>
-        <w:rPr>
-          <w:color w:val="EE0000"/>
-        </w:rPr>
-        <w:lastRenderedPageBreak/>
-        <w:t>dock</w:t>
-      </w:r>
-      <w:r>
-        <w:rPr>
-          <w:color w:val="EE0000"/>
-        </w:rPr>
-        <w:t xml:space="preserve">er run-d--name c1 \-p 5005:8080 \ </w:t>
-      </w:r>
-      <w:proofErr w:type="spellStart"/>
-      <w:r>
-        <w:rPr>
-          <w:color w:val="EE0000"/>
-        </w:rPr>
-        <w:t>nigelpoulton</w:t>
-      </w:r>
-      <w:proofErr w:type="spellEnd"/>
-      <w:r>
-        <w:rPr>
-          <w:color w:val="EE0000"/>
-        </w:rPr>
-        <w:t>/ddd-</w:t>
-      </w:r>
-      <w:proofErr w:type="gramStart"/>
-      <w:r>
-        <w:rPr>
-          <w:color w:val="EE0000"/>
-        </w:rPr>
-        <w:t>book:ch8.node</w:t>
-      </w:r>
-      <w:proofErr w:type="gramEnd"/>
-    </w:p>
-    <w:p>
-      <w:pPr>
-        <w:rPr>
-          <w:color w:val="000000" w:themeColor="text1"/>
-          <w:sz w:val="22"/>
-          <w:szCs w:val="22"/>
-        </w:rPr>
-      </w:pPr>
-      <w:r>
-        <w:rPr>
-          <w:color w:val="000000" w:themeColor="text1"/>
-          <w:sz w:val="22"/>
-          <w:szCs w:val="22"/>
-        </w:rPr>
-        <w:t xml:space="preserve">so docker run creates a new container from an image -d runs in the background, --name is to name the container, -p means that our app is running on 5005 and the container is running on port 8080 the </w:t>
-      </w:r>
-      <w:proofErr w:type="spellStart"/>
-      <w:r>
-        <w:rPr>
-          <w:color w:val="000000" w:themeColor="text1"/>
-          <w:sz w:val="22"/>
-          <w:szCs w:val="22"/>
-        </w:rPr>
-        <w:t>nigelpoulton</w:t>
-      </w:r>
-      <w:proofErr w:type="spellEnd"/>
-      <w:r>
-        <w:rPr>
-          <w:color w:val="000000" w:themeColor="text1"/>
-          <w:sz w:val="22"/>
-          <w:szCs w:val="22"/>
-        </w:rPr>
-        <w:t>/ddd-</w:t>
-      </w:r>
-      <w:proofErr w:type="gramStart"/>
-      <w:r>
-        <w:rPr>
-          <w:color w:val="000000" w:themeColor="text1"/>
-          <w:sz w:val="22"/>
-          <w:szCs w:val="22"/>
-        </w:rPr>
-        <w:t>book:ch8.node</w:t>
-      </w:r>
-      <w:proofErr w:type="gramEnd"/>
-      <w:r>
-        <w:rPr>
-          <w:color w:val="000000" w:themeColor="text1"/>
-          <w:sz w:val="22"/>
-          <w:szCs w:val="22"/>
-        </w:rPr>
-        <w:t xml:space="preserve"> is the image name and tag</w:t>
-      </w:r>
-    </w:p>
-    <w:p>
-      <w:pPr>
-        <w:rPr>
-          <w:color w:val="000000" w:themeColor="text1"/>
-          <w:sz w:val="22"/>
-          <w:szCs w:val="22"/>
-        </w:rPr>
-      </w:pPr>
-    </w:p>
-    <w:p>
-      <w:pPr>
-        <w:rPr>
-          <w:color w:val="000000" w:themeColor="text1"/>
-          <w:sz w:val="22"/>
-          <w:szCs w:val="22"/>
-        </w:rPr>
-      </w:pPr>
-      <w:proofErr w:type="gramStart"/>
-      <w:r>
-        <w:rPr>
-          <w:color w:val="000000" w:themeColor="text1"/>
-          <w:sz w:val="22"/>
-          <w:szCs w:val="22"/>
-        </w:rPr>
-        <w:t>so</w:t>
-      </w:r>
-      <w:proofErr w:type="gramEnd"/>
-      <w:r>
-        <w:rPr>
-          <w:color w:val="000000" w:themeColor="text1"/>
-          <w:sz w:val="22"/>
-          <w:szCs w:val="22"/>
-        </w:rPr>
-        <w:t xml:space="preserve"> the 5005 means we are forcing our app to run on that specified port we don’t actually care what the code or the default of the app run on so when we go to the browser after running it on port </w:t>
-      </w:r>
-      <w:proofErr w:type="gramStart"/>
-      <w:r>
-        <w:rPr>
-          <w:color w:val="000000" w:themeColor="text1"/>
-          <w:sz w:val="22"/>
-          <w:szCs w:val="22"/>
-        </w:rPr>
-        <w:t>5005</w:t>
-      </w:r>
-      <w:proofErr w:type="gramEnd"/>
-      <w:r>
-        <w:rPr>
-          <w:color w:val="000000" w:themeColor="text1"/>
-          <w:sz w:val="22"/>
-          <w:szCs w:val="22"/>
-        </w:rPr>
-        <w:t xml:space="preserve"> we can expect it to be found on 5005 even if the app’s original code runs on 8081</w:t>
-      </w:r>
-    </w:p>
-    <w:p>
-      <w:pPr>
-        <w:rPr>
-          <w:color w:val="000000" w:themeColor="text1"/>
-          <w:sz w:val="22"/>
-          <w:szCs w:val="22"/>
-        </w:rPr>
-      </w:pPr>
-    </w:p>
-    <w:p>
-      <w:pPr>
-        <w:rPr>
-          <w:color w:val="000000" w:themeColor="text1"/>
-          <w:sz w:val="22"/>
-          <w:szCs w:val="22"/>
-        </w:rPr>
-      </w:pPr>
-      <w:r>
-        <w:rPr>
-          <w:color w:val="000000" w:themeColor="text1"/>
-          <w:sz w:val="22"/>
-          <w:szCs w:val="22"/>
-        </w:rPr>
-        <w:t xml:space="preserve">Examples of instructions that create new layers are </w:t>
-      </w:r>
-      <w:r>
-        <w:rPr>
-          <w:b/>
-          <w:bCs/>
-          <w:color w:val="000000" w:themeColor="text1"/>
-          <w:sz w:val="22"/>
-          <w:szCs w:val="22"/>
-        </w:rPr>
-        <w:t>FROM, RUN, COPY and WORKDIR.</w:t>
-      </w:r>
-      <w:r>
-        <w:rPr>
-          <w:color w:val="000000" w:themeColor="text1"/>
-          <w:sz w:val="22"/>
-          <w:szCs w:val="22"/>
-        </w:rPr>
-        <w:t xml:space="preserve"> </w:t>
-      </w:r>
-    </w:p>
-    <w:p>
-      <w:pPr>
-        <w:rPr>
-          <w:color w:val="000000" w:themeColor="text1"/>
-          <w:sz w:val="22"/>
-          <w:szCs w:val="22"/>
-        </w:rPr>
-      </w:pPr>
-      <w:r>
-        <w:rPr>
-          <w:color w:val="000000" w:themeColor="text1"/>
-          <w:sz w:val="22"/>
-          <w:szCs w:val="22"/>
-        </w:rPr>
-        <w:t xml:space="preserve">Examples that create metadata include </w:t>
-      </w:r>
-      <w:r>
-        <w:rPr>
-          <w:b/>
-          <w:bCs/>
-          <w:color w:val="000000" w:themeColor="text1"/>
-          <w:sz w:val="22"/>
-          <w:szCs w:val="22"/>
-        </w:rPr>
-        <w:t xml:space="preserve">EXPOSE, ENV, CMD, and ENTRYPOINT. </w:t>
-      </w:r>
-    </w:p>
-    <w:p>
-      <w:pPr>
-        <w:rPr>
-          <w:color w:val="000000" w:themeColor="text1"/>
-          <w:sz w:val="22"/>
-          <w:szCs w:val="22"/>
-        </w:rPr>
-      </w:pPr>
-      <w:r>
-        <w:rPr>
-          <w:color w:val="000000" w:themeColor="text1"/>
-          <w:sz w:val="22"/>
-          <w:szCs w:val="22"/>
-        </w:rPr>
-        <w:t xml:space="preserve">The premise is this: </w:t>
-      </w:r>
-    </w:p>
-    <w:p>
-      <w:pPr>
-        <w:ind w:left="720"/>
-        <w:rPr>
-          <w:color w:val="000000" w:themeColor="text1"/>
-          <w:sz w:val="22"/>
-          <w:szCs w:val="22"/>
-        </w:rPr>
-      </w:pPr>
-      <w:r>
-        <w:rPr>
-          <w:color w:val="000000" w:themeColor="text1"/>
-          <w:sz w:val="22"/>
-          <w:szCs w:val="22"/>
-        </w:rPr>
-        <w:t xml:space="preserve">• Instructions that add content, such as files and programs, create new layers </w:t>
-      </w:r>
-    </w:p>
-    <w:p>
-      <w:pPr>
-        <w:ind w:left="720"/>
-        <w:rPr>
-          <w:color w:val="000000" w:themeColor="text1"/>
-          <w:sz w:val="22"/>
-          <w:szCs w:val="22"/>
-        </w:rPr>
-      </w:pPr>
-      <w:r>
-        <w:rPr>
-          <w:color w:val="000000" w:themeColor="text1"/>
-          <w:sz w:val="22"/>
-          <w:szCs w:val="22"/>
-        </w:rPr>
-        <w:t>• Instructions that don’t add content don’t add layers and only create metadata</w:t>
-      </w:r>
-    </w:p>
-    <w:p>
-      <w:pPr>
-        <w:rPr>
-          <w:color w:val="000000" w:themeColor="text1"/>
-          <w:sz w:val="22"/>
-          <w:szCs w:val="22"/>
-        </w:rPr>
-      </w:pPr>
-      <w:r>
-        <w:rPr>
-          <w:color w:val="000000" w:themeColor="text1"/>
-          <w:sz w:val="22"/>
-          <w:szCs w:val="22"/>
-        </w:rPr>
-        <w:t>You can run a</w:t>
-      </w:r>
-      <w:r>
-        <w:rPr>
-          <w:color w:val="000000" w:themeColor="text1"/>
-          <w:sz w:val="22"/>
-          <w:szCs w:val="22"/>
-        </w:rPr>
-        <w:t xml:space="preserve"> </w:t>
-      </w:r>
-      <w:r>
-        <w:rPr>
-          <w:b/>
-          <w:bCs/>
-          <w:color w:val="000000" w:themeColor="text1"/>
-          <w:sz w:val="22"/>
-          <w:szCs w:val="22"/>
-        </w:rPr>
-        <w:t>docker history</w:t>
-      </w:r>
-      <w:r>
-        <w:rPr>
-          <w:color w:val="000000" w:themeColor="text1"/>
-          <w:sz w:val="22"/>
-          <w:szCs w:val="22"/>
-        </w:rPr>
-        <w:t xml:space="preserve"> command</w:t>
-      </w:r>
-      <w:r>
-        <w:rPr>
-          <w:color w:val="000000" w:themeColor="text1"/>
-          <w:sz w:val="22"/>
-          <w:szCs w:val="22"/>
-        </w:rPr>
-        <w:t xml:space="preserve"> </w:t>
-      </w:r>
-      <w:r>
-        <w:rPr>
-          <w:color w:val="000000" w:themeColor="text1"/>
-          <w:sz w:val="22"/>
-          <w:szCs w:val="22"/>
-        </w:rPr>
-        <w:t>against any image to see the instructions that created it.</w:t>
-      </w:r>
-    </w:p>
-    <w:p>
-      <w:pPr>
-        <w:rPr>
-          <w:color w:val="000000" w:themeColor="text1"/>
-          <w:sz w:val="22"/>
-          <w:szCs w:val="22"/>
-        </w:rPr>
-      </w:pPr>
-    </w:p>
-    <w:p>
-      <w:pPr>
-        <w:rPr>
-          <w:color w:val="000000" w:themeColor="text1"/>
-          <w:sz w:val="22"/>
-          <w:szCs w:val="22"/>
-        </w:rPr>
-      </w:pPr>
-    </w:p>
-    <w:p>
-      <w:pPr>
+      </w:pPr>
+      <w:r>
         <w:rPr>
           <w:b/>
           <w:bCs/>
@@ -6625,28 +6618,7 @@
           <w:szCs w:val="28"/>
           <w:u w:val="single"/>
         </w:rPr>
-      </w:pPr>
-      <w:r>
-        <w:rPr>
-          <w:b/>
-          <w:bCs/>
-          <w:color w:val="000000" w:themeColor="text1"/>
-          <w:sz w:val="28"/>
-          <w:szCs w:val="28"/>
-          <w:u w:val="single"/>
-        </w:rPr>
-        <w:t>Moving to production with multi-stage builds</w:t>
-      </w:r>
-      <w:r>
-        <w:rPr>
-          <w:b/>
-          <w:bCs/>
-          <w:color w:val="000000" w:themeColor="text1"/>
-          <w:sz w:val="28"/>
-          <w:szCs w:val="28"/>
-          <w:u w:val="single"/>
-        </w:rPr>
-        <w:t>:</w:t>
+        <w:t>Moving to production with multi-stage builds:</w:t>
       </w:r>
     </w:p>
     <w:p>
@@ -6683,6 +6655,1108 @@
           <w:szCs w:val="22"/>
         </w:rPr>
       </w:pPr>
+      <w:r>
+        <w:rPr>
+          <w:color w:val="000000" w:themeColor="text1"/>
+          <w:sz w:val="22"/>
+          <w:szCs w:val="22"/>
+        </w:rPr>
+        <w:t xml:space="preserve">A multi-stage build uses multiple FROM statements in one </w:t>
+      </w:r>
+      <w:proofErr w:type="spellStart"/>
+      <w:r>
+        <w:rPr>
+          <w:color w:val="000000" w:themeColor="text1"/>
+          <w:sz w:val="22"/>
+          <w:szCs w:val="22"/>
+        </w:rPr>
+        <w:t>Dockerfile</w:t>
+      </w:r>
+      <w:proofErr w:type="spellEnd"/>
+      <w:r>
+        <w:rPr>
+          <w:color w:val="000000" w:themeColor="text1"/>
+          <w:sz w:val="22"/>
+          <w:szCs w:val="22"/>
+        </w:rPr>
+        <w:t>. Each FROM is a separate stage. The last stage creates the final image</w:t>
+      </w:r>
+      <w:r>
+        <w:rPr>
+          <w:color w:val="000000" w:themeColor="text1"/>
+          <w:sz w:val="22"/>
+          <w:szCs w:val="22"/>
+        </w:rPr>
+        <w:t xml:space="preserve"> using from that copies another build image</w:t>
+      </w:r>
+      <w:r>
+        <w:rPr>
+          <w:color w:val="000000" w:themeColor="text1"/>
+          <w:sz w:val="22"/>
+          <w:szCs w:val="22"/>
+        </w:rPr>
+        <w:t xml:space="preserve"> </w:t>
+      </w:r>
+      <w:r>
+        <w:rPr>
+          <w:color w:val="000000" w:themeColor="text1"/>
+          <w:sz w:val="22"/>
+          <w:szCs w:val="22"/>
+        </w:rPr>
+        <w:t>from the earlier (builder) stages. The result is a slim, production-ready image.</w:t>
+      </w:r>
+    </w:p>
+    <w:p>
+      <w:pPr>
+        <w:rPr>
+          <w:color w:val="000000" w:themeColor="text1"/>
+          <w:sz w:val="22"/>
+          <w:szCs w:val="22"/>
+        </w:rPr>
+      </w:pPr>
+      <w:r>
+        <w:rPr>
+          <w:color w:val="000000" w:themeColor="text1"/>
+          <w:sz w:val="22"/>
+          <w:szCs w:val="22"/>
+        </w:rPr>
+        <w:t>example with comments:</w:t>
+      </w:r>
+    </w:p>
+    <w:p>
+      <w:pPr>
+        <w:rPr>
+          <w:color w:val="000000" w:themeColor="text1"/>
+          <w:sz w:val="22"/>
+          <w:szCs w:val="22"/>
+        </w:rPr>
+      </w:pPr>
+      <w:r>
+        <w:rPr>
+          <w:color w:val="000000" w:themeColor="text1"/>
+          <w:sz w:val="22"/>
+          <w:szCs w:val="22"/>
+        </w:rPr>
+        <w:t># Stage 1: Build stage (large image with Maven and JDK)</w:t>
+      </w:r>
+    </w:p>
+    <w:p>
+      <w:pPr>
+        <w:rPr>
+          <w:color w:val="EE0000"/>
+          <w:sz w:val="22"/>
+          <w:szCs w:val="22"/>
+        </w:rPr>
+      </w:pPr>
+      <w:r>
+        <w:rPr>
+          <w:color w:val="EE0000"/>
+          <w:sz w:val="22"/>
+          <w:szCs w:val="22"/>
+        </w:rPr>
+        <w:t>FROM maven:3.8.4-openjdk-17 AS builder</w:t>
+      </w:r>
+    </w:p>
+    <w:p>
+      <w:pPr>
+        <w:rPr>
+          <w:color w:val="000000" w:themeColor="text1"/>
+          <w:sz w:val="22"/>
+          <w:szCs w:val="22"/>
+        </w:rPr>
+      </w:pPr>
+      <w:r>
+        <w:rPr>
+          <w:color w:val="000000" w:themeColor="text1"/>
+          <w:sz w:val="22"/>
+          <w:szCs w:val="22"/>
+        </w:rPr>
+        <w:t># ^ Starts first stage using Maven image that includes JDK 17.</w:t>
+      </w:r>
+    </w:p>
+    <w:p>
+      <w:pPr>
+        <w:rPr>
+          <w:color w:val="000000" w:themeColor="text1"/>
+          <w:sz w:val="22"/>
+          <w:szCs w:val="22"/>
+        </w:rPr>
+      </w:pPr>
+      <w:r>
+        <w:rPr>
+          <w:color w:val="000000" w:themeColor="text1"/>
+          <w:sz w:val="22"/>
+          <w:szCs w:val="22"/>
+        </w:rPr>
+        <w:t>#   This image is large (~700MB) because it has Maven, JDK, and all build tools.</w:t>
+      </w:r>
+    </w:p>
+    <w:p>
+      <w:pPr>
+        <w:rPr>
+          <w:color w:val="000000" w:themeColor="text1"/>
+          <w:sz w:val="22"/>
+          <w:szCs w:val="22"/>
+        </w:rPr>
+      </w:pPr>
+      <w:r>
+        <w:rPr>
+          <w:color w:val="000000" w:themeColor="text1"/>
+          <w:sz w:val="22"/>
+          <w:szCs w:val="22"/>
+        </w:rPr>
+        <w:t>#   Names this stage "builder" for later reference.</w:t>
+      </w:r>
+    </w:p>
+    <w:p>
+      <w:pPr>
+        <w:rPr>
+          <w:color w:val="000000" w:themeColor="text1"/>
+          <w:sz w:val="22"/>
+          <w:szCs w:val="22"/>
+        </w:rPr>
+      </w:pPr>
+    </w:p>
+    <w:p>
+      <w:pPr>
+        <w:rPr>
+          <w:color w:val="EE0000"/>
+          <w:sz w:val="22"/>
+          <w:szCs w:val="22"/>
+        </w:rPr>
+      </w:pPr>
+      <w:r>
+        <w:rPr>
+          <w:color w:val="EE0000"/>
+          <w:sz w:val="22"/>
+          <w:szCs w:val="22"/>
+        </w:rPr>
+        <w:t>WORKDIR /app</w:t>
+      </w:r>
+    </w:p>
+    <w:p>
+      <w:pPr>
+        <w:rPr>
+          <w:color w:val="000000" w:themeColor="text1"/>
+          <w:sz w:val="22"/>
+          <w:szCs w:val="22"/>
+        </w:rPr>
+      </w:pPr>
+      <w:r>
+        <w:rPr>
+          <w:color w:val="000000" w:themeColor="text1"/>
+          <w:sz w:val="22"/>
+          <w:szCs w:val="22"/>
+        </w:rPr>
+        <w:t># ^ Creates /app directory inside the container and switches to it.</w:t>
+      </w:r>
+    </w:p>
+    <w:p>
+      <w:pPr>
+        <w:rPr>
+          <w:color w:val="000000" w:themeColor="text1"/>
+          <w:sz w:val="22"/>
+          <w:szCs w:val="22"/>
+        </w:rPr>
+      </w:pPr>
+      <w:r>
+        <w:rPr>
+          <w:color w:val="000000" w:themeColor="text1"/>
+          <w:sz w:val="22"/>
+          <w:szCs w:val="22"/>
+        </w:rPr>
+        <w:t>#   All following commands will run from here.</w:t>
+      </w:r>
+    </w:p>
+    <w:p>
+      <w:pPr>
+        <w:rPr>
+          <w:color w:val="000000" w:themeColor="text1"/>
+          <w:sz w:val="22"/>
+          <w:szCs w:val="22"/>
+        </w:rPr>
+      </w:pPr>
+    </w:p>
+    <w:p>
+      <w:pPr>
+        <w:rPr>
+          <w:color w:val="EE0000"/>
+          <w:sz w:val="22"/>
+          <w:szCs w:val="22"/>
+        </w:rPr>
+      </w:pPr>
+      <w:r>
+        <w:rPr>
+          <w:color w:val="EE0000"/>
+          <w:sz w:val="22"/>
+          <w:szCs w:val="22"/>
+        </w:rPr>
+        <w:t xml:space="preserve">COPY </w:t>
+      </w:r>
+      <w:proofErr w:type="gramStart"/>
+      <w:r>
+        <w:rPr>
+          <w:color w:val="EE0000"/>
+          <w:sz w:val="22"/>
+          <w:szCs w:val="22"/>
+        </w:rPr>
+        <w:t>pom.xml .</w:t>
+      </w:r>
+      <w:proofErr w:type="gramEnd"/>
+    </w:p>
+    <w:p>
+      <w:pPr>
+        <w:rPr>
+          <w:color w:val="000000" w:themeColor="text1"/>
+          <w:sz w:val="22"/>
+          <w:szCs w:val="22"/>
+        </w:rPr>
+      </w:pPr>
+      <w:r>
+        <w:rPr>
+          <w:color w:val="000000" w:themeColor="text1"/>
+          <w:sz w:val="22"/>
+          <w:szCs w:val="22"/>
+        </w:rPr>
+        <w:t># ^ Copies the Maven configuration file (pom.xml) from your project</w:t>
+      </w:r>
+    </w:p>
+    <w:p>
+      <w:pPr>
+        <w:rPr>
+          <w:color w:val="000000" w:themeColor="text1"/>
+          <w:sz w:val="22"/>
+          <w:szCs w:val="22"/>
+        </w:rPr>
+      </w:pPr>
+      <w:r>
+        <w:rPr>
+          <w:color w:val="000000" w:themeColor="text1"/>
+          <w:sz w:val="22"/>
+          <w:szCs w:val="22"/>
+        </w:rPr>
+        <w:t>#   into the /app directory inside the container.</w:t>
+      </w:r>
+    </w:p>
+    <w:p>
+      <w:pPr>
+        <w:rPr>
+          <w:color w:val="000000" w:themeColor="text1"/>
+          <w:sz w:val="22"/>
+          <w:szCs w:val="22"/>
+        </w:rPr>
+      </w:pPr>
+      <w:r>
+        <w:rPr>
+          <w:color w:val="000000" w:themeColor="text1"/>
+          <w:sz w:val="22"/>
+          <w:szCs w:val="22"/>
+        </w:rPr>
+        <w:t>#   This file lists all dependencies (Spring Boot, JPA, database drivers, etc.)</w:t>
+      </w:r>
+    </w:p>
+    <w:p>
+      <w:pPr>
+        <w:rPr>
+          <w:color w:val="000000" w:themeColor="text1"/>
+          <w:sz w:val="22"/>
+          <w:szCs w:val="22"/>
+        </w:rPr>
+      </w:pPr>
+    </w:p>
+    <w:p>
+      <w:pPr>
+        <w:rPr>
+          <w:color w:val="EE0000"/>
+          <w:sz w:val="22"/>
+          <w:szCs w:val="22"/>
+        </w:rPr>
+      </w:pPr>
+      <w:r>
+        <w:rPr>
+          <w:color w:val="EE0000"/>
+          <w:sz w:val="22"/>
+          <w:szCs w:val="22"/>
+        </w:rPr>
+        <w:t xml:space="preserve">RUN </w:t>
+      </w:r>
+      <w:proofErr w:type="spellStart"/>
+      <w:r>
+        <w:rPr>
+          <w:color w:val="EE0000"/>
+          <w:sz w:val="22"/>
+          <w:szCs w:val="22"/>
+        </w:rPr>
+        <w:t>mvn</w:t>
+      </w:r>
+      <w:proofErr w:type="spellEnd"/>
+      <w:r>
+        <w:rPr>
+          <w:color w:val="EE0000"/>
+          <w:sz w:val="22"/>
+          <w:szCs w:val="22"/>
+        </w:rPr>
+        <w:t xml:space="preserve"> </w:t>
+      </w:r>
+      <w:proofErr w:type="spellStart"/>
+      <w:proofErr w:type="gramStart"/>
+      <w:r>
+        <w:rPr>
+          <w:color w:val="EE0000"/>
+          <w:sz w:val="22"/>
+          <w:szCs w:val="22"/>
+        </w:rPr>
+        <w:t>dependency:go</w:t>
+      </w:r>
+      <w:proofErr w:type="gramEnd"/>
+      <w:r>
+        <w:rPr>
+          <w:color w:val="EE0000"/>
+          <w:sz w:val="22"/>
+          <w:szCs w:val="22"/>
+        </w:rPr>
+        <w:t>-offline</w:t>
+      </w:r>
+      <w:proofErr w:type="spellEnd"/>
+    </w:p>
+    <w:p>
+      <w:pPr>
+        <w:rPr>
+          <w:color w:val="000000" w:themeColor="text1"/>
+          <w:sz w:val="22"/>
+          <w:szCs w:val="22"/>
+        </w:rPr>
+      </w:pPr>
+      <w:r>
+        <w:rPr>
+          <w:color w:val="000000" w:themeColor="text1"/>
+          <w:sz w:val="22"/>
+          <w:szCs w:val="22"/>
+        </w:rPr>
+        <w:t># ^ Downloads all dependencies listed in pom.xml BEFORE copying source code.</w:t>
+      </w:r>
+    </w:p>
+    <w:p>
+      <w:pPr>
+        <w:rPr>
+          <w:color w:val="000000" w:themeColor="text1"/>
+          <w:sz w:val="22"/>
+          <w:szCs w:val="22"/>
+        </w:rPr>
+      </w:pPr>
+      <w:r>
+        <w:rPr>
+          <w:color w:val="000000" w:themeColor="text1"/>
+          <w:sz w:val="22"/>
+          <w:szCs w:val="22"/>
+        </w:rPr>
+        <w:t>#   This is a performance optimization - dependencies won't need to be re-downloaded</w:t>
+      </w:r>
+    </w:p>
+    <w:p>
+      <w:pPr>
+        <w:rPr>
+          <w:color w:val="000000" w:themeColor="text1"/>
+          <w:sz w:val="22"/>
+          <w:szCs w:val="22"/>
+        </w:rPr>
+      </w:pPr>
+      <w:r>
+        <w:rPr>
+          <w:color w:val="000000" w:themeColor="text1"/>
+          <w:sz w:val="22"/>
+          <w:szCs w:val="22"/>
+        </w:rPr>
+        <w:t xml:space="preserve">#   </w:t>
+      </w:r>
+      <w:proofErr w:type="gramStart"/>
+      <w:r>
+        <w:rPr>
+          <w:color w:val="000000" w:themeColor="text1"/>
+          <w:sz w:val="22"/>
+          <w:szCs w:val="22"/>
+        </w:rPr>
+        <w:t>unless</w:t>
+      </w:r>
+      <w:proofErr w:type="gramEnd"/>
+      <w:r>
+        <w:rPr>
+          <w:color w:val="000000" w:themeColor="text1"/>
+          <w:sz w:val="22"/>
+          <w:szCs w:val="22"/>
+        </w:rPr>
+        <w:t xml:space="preserve"> pom.xml changes. Saves time on subsequent builds.</w:t>
+      </w:r>
+    </w:p>
+    <w:p>
+      <w:pPr>
+        <w:rPr>
+          <w:color w:val="000000" w:themeColor="text1"/>
+          <w:sz w:val="22"/>
+          <w:szCs w:val="22"/>
+        </w:rPr>
+      </w:pPr>
+    </w:p>
+    <w:p>
+      <w:pPr>
+        <w:rPr>
+          <w:color w:val="EE0000"/>
+          <w:sz w:val="22"/>
+          <w:szCs w:val="22"/>
+        </w:rPr>
+      </w:pPr>
+      <w:r>
+        <w:rPr>
+          <w:color w:val="EE0000"/>
+          <w:sz w:val="22"/>
+          <w:szCs w:val="22"/>
+        </w:rPr>
+        <w:t xml:space="preserve">COPY </w:t>
+      </w:r>
+      <w:proofErr w:type="spellStart"/>
+      <w:proofErr w:type="gramStart"/>
+      <w:r>
+        <w:rPr>
+          <w:color w:val="EE0000"/>
+          <w:sz w:val="22"/>
+          <w:szCs w:val="22"/>
+        </w:rPr>
+        <w:t>src</w:t>
+      </w:r>
+      <w:proofErr w:type="spellEnd"/>
+      <w:r>
+        <w:rPr>
+          <w:color w:val="EE0000"/>
+          <w:sz w:val="22"/>
+          <w:szCs w:val="22"/>
+        </w:rPr>
+        <w:t xml:space="preserve"> .</w:t>
+      </w:r>
+      <w:proofErr w:type="gramEnd"/>
+      <w:r>
+        <w:rPr>
+          <w:color w:val="EE0000"/>
+          <w:sz w:val="22"/>
+          <w:szCs w:val="22"/>
+        </w:rPr>
+        <w:t>/</w:t>
+      </w:r>
+      <w:proofErr w:type="spellStart"/>
+      <w:r>
+        <w:rPr>
+          <w:color w:val="EE0000"/>
+          <w:sz w:val="22"/>
+          <w:szCs w:val="22"/>
+        </w:rPr>
+        <w:t>src</w:t>
+      </w:r>
+      <w:proofErr w:type="spellEnd"/>
+    </w:p>
+    <w:p>
+      <w:pPr>
+        <w:rPr>
+          <w:color w:val="000000" w:themeColor="text1"/>
+          <w:sz w:val="22"/>
+          <w:szCs w:val="22"/>
+        </w:rPr>
+      </w:pPr>
+      <w:r>
+        <w:rPr>
+          <w:color w:val="000000" w:themeColor="text1"/>
+          <w:sz w:val="22"/>
+          <w:szCs w:val="22"/>
+        </w:rPr>
+        <w:t># ^ Copies the entire source code folder (</w:t>
+      </w:r>
+      <w:proofErr w:type="spellStart"/>
+      <w:r>
+        <w:rPr>
+          <w:color w:val="000000" w:themeColor="text1"/>
+          <w:sz w:val="22"/>
+          <w:szCs w:val="22"/>
+        </w:rPr>
+        <w:t>src</w:t>
+      </w:r>
+      <w:proofErr w:type="spellEnd"/>
+      <w:r>
+        <w:rPr>
+          <w:color w:val="000000" w:themeColor="text1"/>
+          <w:sz w:val="22"/>
+          <w:szCs w:val="22"/>
+        </w:rPr>
+        <w:t xml:space="preserve">/main/java, </w:t>
+      </w:r>
+      <w:proofErr w:type="spellStart"/>
+      <w:r>
+        <w:rPr>
+          <w:color w:val="000000" w:themeColor="text1"/>
+          <w:sz w:val="22"/>
+          <w:szCs w:val="22"/>
+        </w:rPr>
+        <w:t>src</w:t>
+      </w:r>
+      <w:proofErr w:type="spellEnd"/>
+      <w:r>
+        <w:rPr>
+          <w:color w:val="000000" w:themeColor="text1"/>
+          <w:sz w:val="22"/>
+          <w:szCs w:val="22"/>
+        </w:rPr>
+        <w:t>/main/resources, etc.)</w:t>
+      </w:r>
+    </w:p>
+    <w:p>
+      <w:pPr>
+        <w:rPr>
+          <w:color w:val="000000" w:themeColor="text1"/>
+          <w:sz w:val="22"/>
+          <w:szCs w:val="22"/>
+        </w:rPr>
+      </w:pPr>
+      <w:r>
+        <w:rPr>
+          <w:color w:val="000000" w:themeColor="text1"/>
+          <w:sz w:val="22"/>
+          <w:szCs w:val="22"/>
+        </w:rPr>
+        <w:t>#   from your project into the /app/</w:t>
+      </w:r>
+      <w:proofErr w:type="spellStart"/>
+      <w:r>
+        <w:rPr>
+          <w:color w:val="000000" w:themeColor="text1"/>
+          <w:sz w:val="22"/>
+          <w:szCs w:val="22"/>
+        </w:rPr>
+        <w:t>src</w:t>
+      </w:r>
+      <w:proofErr w:type="spellEnd"/>
+      <w:r>
+        <w:rPr>
+          <w:color w:val="000000" w:themeColor="text1"/>
+          <w:sz w:val="22"/>
+          <w:szCs w:val="22"/>
+        </w:rPr>
+        <w:t xml:space="preserve"> directory inside the container.</w:t>
+      </w:r>
+    </w:p>
+    <w:p>
+      <w:pPr>
+        <w:rPr>
+          <w:color w:val="EE0000"/>
+          <w:sz w:val="22"/>
+          <w:szCs w:val="22"/>
+        </w:rPr>
+      </w:pPr>
+    </w:p>
+    <w:p>
+      <w:pPr>
+        <w:rPr>
+          <w:color w:val="EE0000"/>
+          <w:sz w:val="22"/>
+          <w:szCs w:val="22"/>
+        </w:rPr>
+      </w:pPr>
+      <w:r>
+        <w:rPr>
+          <w:color w:val="EE0000"/>
+          <w:sz w:val="22"/>
+          <w:szCs w:val="22"/>
+        </w:rPr>
+        <w:t xml:space="preserve">RUN </w:t>
+      </w:r>
+      <w:proofErr w:type="spellStart"/>
+      <w:r>
+        <w:rPr>
+          <w:color w:val="EE0000"/>
+          <w:sz w:val="22"/>
+          <w:szCs w:val="22"/>
+        </w:rPr>
+        <w:t>mvn</w:t>
+      </w:r>
+      <w:proofErr w:type="spellEnd"/>
+      <w:r>
+        <w:rPr>
+          <w:color w:val="EE0000"/>
+          <w:sz w:val="22"/>
+          <w:szCs w:val="22"/>
+        </w:rPr>
+        <w:t xml:space="preserve"> package -</w:t>
+      </w:r>
+      <w:proofErr w:type="spellStart"/>
+      <w:r>
+        <w:rPr>
+          <w:color w:val="EE0000"/>
+          <w:sz w:val="22"/>
+          <w:szCs w:val="22"/>
+        </w:rPr>
+        <w:t>DskipTests</w:t>
+      </w:r>
+      <w:proofErr w:type="spellEnd"/>
+    </w:p>
+    <w:p>
+      <w:pPr>
+        <w:rPr>
+          <w:color w:val="000000" w:themeColor="text1"/>
+          <w:sz w:val="22"/>
+          <w:szCs w:val="22"/>
+        </w:rPr>
+      </w:pPr>
+      <w:r>
+        <w:rPr>
+          <w:color w:val="000000" w:themeColor="text1"/>
+          <w:sz w:val="22"/>
+          <w:szCs w:val="22"/>
+        </w:rPr>
+        <w:t># ^ Compiles the Java code and packages it into a .jar file.</w:t>
+      </w:r>
+    </w:p>
+    <w:p>
+      <w:pPr>
+        <w:rPr>
+          <w:color w:val="000000" w:themeColor="text1"/>
+          <w:sz w:val="22"/>
+          <w:szCs w:val="22"/>
+        </w:rPr>
+      </w:pPr>
+      <w:r>
+        <w:rPr>
+          <w:color w:val="000000" w:themeColor="text1"/>
+          <w:sz w:val="22"/>
+          <w:szCs w:val="22"/>
+        </w:rPr>
+        <w:t>#   -</w:t>
+      </w:r>
+      <w:proofErr w:type="spellStart"/>
+      <w:r>
+        <w:rPr>
+          <w:color w:val="000000" w:themeColor="text1"/>
+          <w:sz w:val="22"/>
+          <w:szCs w:val="22"/>
+        </w:rPr>
+        <w:t>DskipTests</w:t>
+      </w:r>
+      <w:proofErr w:type="spellEnd"/>
+      <w:r>
+        <w:rPr>
+          <w:color w:val="000000" w:themeColor="text1"/>
+          <w:sz w:val="22"/>
+          <w:szCs w:val="22"/>
+        </w:rPr>
+        <w:t xml:space="preserve"> skips running tests (faster build, but use carefully).</w:t>
+      </w:r>
+    </w:p>
+    <w:p>
+      <w:pPr>
+        <w:rPr>
+          <w:color w:val="000000" w:themeColor="text1"/>
+          <w:sz w:val="22"/>
+          <w:szCs w:val="22"/>
+        </w:rPr>
+      </w:pPr>
+      <w:r>
+        <w:rPr>
+          <w:color w:val="000000" w:themeColor="text1"/>
+          <w:sz w:val="22"/>
+          <w:szCs w:val="22"/>
+        </w:rPr>
+        <w:t>#   The resulting .jar file is created at: /app/target/*.jar</w:t>
+      </w:r>
+    </w:p>
+    <w:p>
+      <w:pPr>
+        <w:rPr>
+          <w:color w:val="000000" w:themeColor="text1"/>
+          <w:sz w:val="22"/>
+          <w:szCs w:val="22"/>
+        </w:rPr>
+      </w:pPr>
+    </w:p>
+    <w:p>
+      <w:pPr>
+        <w:rPr>
+          <w:color w:val="000000" w:themeColor="text1"/>
+          <w:sz w:val="22"/>
+          <w:szCs w:val="22"/>
+        </w:rPr>
+      </w:pPr>
+      <w:r>
+        <w:rPr>
+          <w:color w:val="000000" w:themeColor="text1"/>
+          <w:sz w:val="22"/>
+          <w:szCs w:val="22"/>
+        </w:rPr>
+        <w:t># Stage 2: Final stage (tiny image with just JRE to run the .jar)</w:t>
+      </w:r>
+    </w:p>
+    <w:p>
+      <w:pPr>
+        <w:rPr>
+          <w:color w:val="EE0000"/>
+          <w:sz w:val="22"/>
+          <w:szCs w:val="22"/>
+        </w:rPr>
+      </w:pPr>
+      <w:r>
+        <w:rPr>
+          <w:color w:val="EE0000"/>
+          <w:sz w:val="22"/>
+          <w:szCs w:val="22"/>
+        </w:rPr>
+        <w:t>FROM openjdk:17-jdk-slim</w:t>
+      </w:r>
+    </w:p>
+    <w:p>
+      <w:pPr>
+        <w:rPr>
+          <w:color w:val="000000" w:themeColor="text1"/>
+          <w:sz w:val="22"/>
+          <w:szCs w:val="22"/>
+        </w:rPr>
+      </w:pPr>
+      <w:r>
+        <w:rPr>
+          <w:color w:val="000000" w:themeColor="text1"/>
+          <w:sz w:val="22"/>
+          <w:szCs w:val="22"/>
+        </w:rPr>
+        <w:t># ^ Starts second (final) stage using slim OpenJDK image (~200MB).</w:t>
+      </w:r>
+    </w:p>
+    <w:p>
+      <w:pPr>
+        <w:rPr>
+          <w:color w:val="000000" w:themeColor="text1"/>
+          <w:sz w:val="22"/>
+          <w:szCs w:val="22"/>
+        </w:rPr>
+      </w:pPr>
+      <w:r>
+        <w:rPr>
+          <w:color w:val="000000" w:themeColor="text1"/>
+          <w:sz w:val="22"/>
+          <w:szCs w:val="22"/>
+        </w:rPr>
+        <w:lastRenderedPageBreak/>
+        <w:t>#   This only has the Java Runtime Environment (JRE), NOT Maven or build tools.</w:t>
+      </w:r>
+    </w:p>
+    <w:p>
+      <w:pPr>
+        <w:rPr>
+          <w:color w:val="000000" w:themeColor="text1"/>
+          <w:sz w:val="22"/>
+          <w:szCs w:val="22"/>
+        </w:rPr>
+      </w:pPr>
+      <w:r>
+        <w:rPr>
+          <w:color w:val="000000" w:themeColor="text1"/>
+          <w:sz w:val="22"/>
+          <w:szCs w:val="22"/>
+        </w:rPr>
+        <w:t>#   Much smaller than the full Maven image.</w:t>
+      </w:r>
+    </w:p>
+    <w:p>
+      <w:pPr>
+        <w:rPr>
+          <w:color w:val="000000" w:themeColor="text1"/>
+          <w:sz w:val="22"/>
+          <w:szCs w:val="22"/>
+        </w:rPr>
+      </w:pPr>
+    </w:p>
+    <w:p>
+      <w:pPr>
+        <w:rPr>
+          <w:color w:val="EE0000"/>
+          <w:sz w:val="22"/>
+          <w:szCs w:val="22"/>
+        </w:rPr>
+      </w:pPr>
+      <w:r>
+        <w:rPr>
+          <w:color w:val="EE0000"/>
+          <w:sz w:val="22"/>
+          <w:szCs w:val="22"/>
+        </w:rPr>
+        <w:t>WORKDIR /app</w:t>
+      </w:r>
+    </w:p>
+    <w:p>
+      <w:pPr>
+        <w:rPr>
+          <w:color w:val="000000" w:themeColor="text1"/>
+          <w:sz w:val="22"/>
+          <w:szCs w:val="22"/>
+        </w:rPr>
+      </w:pPr>
+      <w:r>
+        <w:rPr>
+          <w:color w:val="000000" w:themeColor="text1"/>
+          <w:sz w:val="22"/>
+          <w:szCs w:val="22"/>
+        </w:rPr>
+        <w:t># ^ Creates /app directory in the final container.</w:t>
+      </w:r>
+    </w:p>
+    <w:p>
+      <w:pPr>
+        <w:rPr>
+          <w:color w:val="000000" w:themeColor="text1"/>
+          <w:sz w:val="22"/>
+          <w:szCs w:val="22"/>
+        </w:rPr>
+      </w:pPr>
+    </w:p>
+    <w:p>
+      <w:pPr>
+        <w:rPr>
+          <w:color w:val="EE0000"/>
+          <w:sz w:val="22"/>
+          <w:szCs w:val="22"/>
+        </w:rPr>
+      </w:pPr>
+      <w:r>
+        <w:rPr>
+          <w:color w:val="EE0000"/>
+          <w:sz w:val="22"/>
+          <w:szCs w:val="22"/>
+        </w:rPr>
+        <w:t>COPY --from=builder /app/target/*.jar app.jar</w:t>
+      </w:r>
+    </w:p>
+    <w:p>
+      <w:pPr>
+        <w:rPr>
+          <w:color w:val="000000" w:themeColor="text1"/>
+          <w:sz w:val="22"/>
+          <w:szCs w:val="22"/>
+        </w:rPr>
+      </w:pPr>
+      <w:r>
+        <w:rPr>
+          <w:color w:val="000000" w:themeColor="text1"/>
+          <w:sz w:val="22"/>
+          <w:szCs w:val="22"/>
+        </w:rPr>
+        <w:t># ^ Copies the compiled .jar file from the BUILDER stage's /app/target/ folder</w:t>
+      </w:r>
+    </w:p>
+    <w:p>
+      <w:pPr>
+        <w:rPr>
+          <w:color w:val="000000" w:themeColor="text1"/>
+          <w:sz w:val="22"/>
+          <w:szCs w:val="22"/>
+        </w:rPr>
+      </w:pPr>
+      <w:r>
+        <w:rPr>
+          <w:color w:val="000000" w:themeColor="text1"/>
+          <w:sz w:val="22"/>
+          <w:szCs w:val="22"/>
+        </w:rPr>
+        <w:t>#   into the FINAL stage's /app/ folder and renames it to "app.jar".</w:t>
+      </w:r>
+    </w:p>
+    <w:p>
+      <w:pPr>
+        <w:rPr>
+          <w:color w:val="000000" w:themeColor="text1"/>
+          <w:sz w:val="22"/>
+          <w:szCs w:val="22"/>
+        </w:rPr>
+      </w:pPr>
+      <w:r>
+        <w:rPr>
+          <w:color w:val="000000" w:themeColor="text1"/>
+          <w:sz w:val="22"/>
+          <w:szCs w:val="22"/>
+        </w:rPr>
+        <w:t>#   The * wildcard matches the generated jar name (e.g., myapp-0.0.1-SNAPSHOT.jar)</w:t>
+      </w:r>
+    </w:p>
+    <w:p>
+      <w:pPr>
+        <w:rPr>
+          <w:color w:val="000000" w:themeColor="text1"/>
+          <w:sz w:val="22"/>
+          <w:szCs w:val="22"/>
+        </w:rPr>
+      </w:pPr>
+    </w:p>
+    <w:p>
+      <w:pPr>
+        <w:rPr>
+          <w:color w:val="EE0000"/>
+          <w:sz w:val="22"/>
+          <w:szCs w:val="22"/>
+        </w:rPr>
+      </w:pPr>
+      <w:r>
+        <w:rPr>
+          <w:color w:val="EE0000"/>
+          <w:sz w:val="22"/>
+          <w:szCs w:val="22"/>
+        </w:rPr>
+        <w:t>EXPOSE 8080</w:t>
+      </w:r>
+    </w:p>
+    <w:p>
+      <w:pPr>
+        <w:rPr>
+          <w:color w:val="000000" w:themeColor="text1"/>
+          <w:sz w:val="22"/>
+          <w:szCs w:val="22"/>
+        </w:rPr>
+      </w:pPr>
+      <w:r>
+        <w:rPr>
+          <w:color w:val="000000" w:themeColor="text1"/>
+          <w:sz w:val="22"/>
+          <w:szCs w:val="22"/>
+        </w:rPr>
+        <w:t># ^ Informs Docker that the container will listen on port 8080 (default Spring Boot port).</w:t>
+      </w:r>
+    </w:p>
+    <w:p>
+      <w:pPr>
+        <w:rPr>
+          <w:color w:val="000000" w:themeColor="text1"/>
+          <w:sz w:val="22"/>
+          <w:szCs w:val="22"/>
+        </w:rPr>
+      </w:pPr>
+      <w:r>
+        <w:rPr>
+          <w:color w:val="000000" w:themeColor="text1"/>
+          <w:sz w:val="22"/>
+          <w:szCs w:val="22"/>
+        </w:rPr>
+        <w:t>#   This is documentation - doesn't actually publish the port (use -p 8080:8080 for that).</w:t>
+      </w:r>
+    </w:p>
+    <w:p>
+      <w:pPr>
+        <w:rPr>
+          <w:color w:val="000000" w:themeColor="text1"/>
+          <w:sz w:val="22"/>
+          <w:szCs w:val="22"/>
+        </w:rPr>
+      </w:pPr>
+    </w:p>
+    <w:p>
+      <w:pPr>
+        <w:rPr>
+          <w:color w:val="EE0000"/>
+          <w:sz w:val="22"/>
+          <w:szCs w:val="22"/>
+        </w:rPr>
+      </w:pPr>
+      <w:r>
+        <w:rPr>
+          <w:color w:val="EE0000"/>
+          <w:sz w:val="22"/>
+          <w:szCs w:val="22"/>
+        </w:rPr>
+        <w:t>ENTRYPOINT ["java", "-jar", "app.jar"]</w:t>
+      </w:r>
+    </w:p>
+    <w:p>
+      <w:pPr>
+        <w:rPr>
+          <w:color w:val="000000" w:themeColor="text1"/>
+          <w:sz w:val="22"/>
+          <w:szCs w:val="22"/>
+        </w:rPr>
+      </w:pPr>
+      <w:r>
+        <w:rPr>
+          <w:color w:val="000000" w:themeColor="text1"/>
+          <w:sz w:val="22"/>
+          <w:szCs w:val="22"/>
+        </w:rPr>
+        <w:t># ^ Command that runs when the container starts.</w:t>
+      </w:r>
+    </w:p>
+    <w:p>
+      <w:pPr>
+        <w:rPr>
+          <w:color w:val="000000" w:themeColor="text1"/>
+          <w:sz w:val="22"/>
+          <w:szCs w:val="22"/>
+        </w:rPr>
+      </w:pPr>
+      <w:r>
+        <w:rPr>
+          <w:color w:val="000000" w:themeColor="text1"/>
+          <w:sz w:val="22"/>
+          <w:szCs w:val="22"/>
+        </w:rPr>
+        <w:t>#   Executes: java -jar app.jar</w:t>
+      </w:r>
+    </w:p>
+    <w:p>
+      <w:pPr>
+        <w:rPr>
+          <w:color w:val="000000" w:themeColor="text1"/>
+          <w:sz w:val="22"/>
+          <w:szCs w:val="22"/>
+        </w:rPr>
+      </w:pPr>
+      <w:r>
+        <w:rPr>
+          <w:color w:val="000000" w:themeColor="text1"/>
+          <w:sz w:val="22"/>
+          <w:szCs w:val="22"/>
+        </w:rPr>
+        <w:t>#   This launches your Spring Boot application with JPA and all its features.</w:t>
+      </w:r>
+    </w:p>
+    <w:p>
+      <w:pPr>
+        <w:rPr>
+          <w:color w:val="000000" w:themeColor="text1"/>
+          <w:sz w:val="22"/>
+          <w:szCs w:val="22"/>
+        </w:rPr>
+      </w:pPr>
+    </w:p>
+    <w:p>
+      <w:pPr>
+        <w:rPr>
+          <w:color w:val="000000" w:themeColor="text1"/>
+          <w:sz w:val="22"/>
+          <w:szCs w:val="22"/>
+        </w:rPr>
+      </w:pPr>
+      <w:r>
+        <w:rPr>
+          <w:color w:val="000000" w:themeColor="text1"/>
+          <w:sz w:val="22"/>
+          <w:szCs w:val="22"/>
+        </w:rPr>
+        <w:t># No database drivers or build tools are in the final image - just your app and the JRE.</w:t>
+      </w:r>
+    </w:p>
+    <w:p>
+      <w:pPr>
+        <w:rPr>
+          <w:color w:val="000000" w:themeColor="text1"/>
+          <w:sz w:val="22"/>
+          <w:szCs w:val="22"/>
+        </w:rPr>
+      </w:pPr>
+      <w:r>
+        <w:rPr>
+          <w:color w:val="000000" w:themeColor="text1"/>
+          <w:sz w:val="22"/>
+          <w:szCs w:val="22"/>
+        </w:rPr>
+        <w:t># Final image size: ~200MB instead of ~700MB+.</w:t>
+      </w:r>
     </w:p>
     <w:sectPr>
       <w:pgSz w:w="12240" w:h="15840"/>

</xml_diff>